<commit_message>
Restart the server on .env changes and drop 다시-시작하기.bat
launch.ps1 now compares .env's modified time with the running server's
start time and restarts it when the settings changed after launch, so
the desktop icon covers the last job 다시-시작하기.bat still had. The
batch file is removed and README/manual point to the icon instead.

Co-Authored-By: Claude Opus 5.5 <noreply@anthropic.com>
Claude-Session: https://claude.ai/code/session_017FR5ax1LqrJ8cSHVrQSVhn
</commit_message>
<xml_diff>
--- a/docs/아틀리에말리-사용설명서.docx
+++ b/docs/아틀리에말리-사용설명서.docx
@@ -877,7 +877,7 @@
     <w:sdt>
       <w:sdtPr>
         <w:alias w:val="목차"/>
-        <w:id w:val="1729963310"/>
+        <w:id w:val="2104069625"/>
       </w:sdtPr>
       <w:sdtEndPr/>
       <w:sdtContent>
@@ -904,7 +904,7 @@
           <w:r>
             <w:fldChar w:fldCharType="separate"/>
           </w:r>
-          <w:hyperlink w:anchor="_Toc241499587" w:history="1">
+          <w:hyperlink w:anchor="_Toc241501557" w:history="1">
             <w:r>
               <w:rPr>
                 <w:rStyle w:val="a5"/>
@@ -928,7 +928,7 @@
               <w:rPr>
                 <w:noProof/>
               </w:rPr>
-              <w:instrText xml:space="preserve"> PAGEREF _Toc241499587 \h </w:instrText>
+              <w:instrText xml:space="preserve"> PAGEREF _Toc241501557 \h </w:instrText>
             </w:r>
             <w:r>
               <w:rPr>
@@ -969,7 +969,7 @@
               <w:szCs w:val="22"/>
             </w:rPr>
           </w:pPr>
-          <w:hyperlink w:anchor="_Toc241499588" w:history="1">
+          <w:hyperlink w:anchor="_Toc241501558" w:history="1">
             <w:r>
               <w:rPr>
                 <w:rStyle w:val="a5"/>
@@ -993,7 +993,7 @@
               <w:rPr>
                 <w:noProof/>
               </w:rPr>
-              <w:instrText xml:space="preserve"> PAGEREF _Toc241499588 \h </w:instrText>
+              <w:instrText xml:space="preserve"> PAGEREF _Toc241501558 \h </w:instrText>
             </w:r>
             <w:r>
               <w:rPr>
@@ -1035,7 +1035,7 @@
               <w:szCs w:val="22"/>
             </w:rPr>
           </w:pPr>
-          <w:hyperlink w:anchor="_Toc241499589" w:history="1">
+          <w:hyperlink w:anchor="_Toc241501559" w:history="1">
             <w:r>
               <w:rPr>
                 <w:rStyle w:val="a5"/>
@@ -1059,7 +1059,7 @@
               <w:rPr>
                 <w:noProof/>
               </w:rPr>
-              <w:instrText xml:space="preserve"> PAGEREF _Toc241499589 \h </w:instrText>
+              <w:instrText xml:space="preserve"> PAGEREF _Toc241501559 \h </w:instrText>
             </w:r>
             <w:r>
               <w:rPr>
@@ -1101,7 +1101,7 @@
               <w:szCs w:val="22"/>
             </w:rPr>
           </w:pPr>
-          <w:hyperlink w:anchor="_Toc241499590" w:history="1">
+          <w:hyperlink w:anchor="_Toc241501560" w:history="1">
             <w:r>
               <w:rPr>
                 <w:rStyle w:val="a5"/>
@@ -1125,7 +1125,7 @@
               <w:rPr>
                 <w:noProof/>
               </w:rPr>
-              <w:instrText xml:space="preserve"> PAGEREF _Toc241499590 \h </w:instrText>
+              <w:instrText xml:space="preserve"> PAGEREF _Toc241501560 \h </w:instrText>
             </w:r>
             <w:r>
               <w:rPr>
@@ -1167,7 +1167,7 @@
               <w:szCs w:val="22"/>
             </w:rPr>
           </w:pPr>
-          <w:hyperlink w:anchor="_Toc241499591" w:history="1">
+          <w:hyperlink w:anchor="_Toc241501561" w:history="1">
             <w:r>
               <w:rPr>
                 <w:rStyle w:val="a5"/>
@@ -1191,7 +1191,7 @@
               <w:rPr>
                 <w:noProof/>
               </w:rPr>
-              <w:instrText xml:space="preserve"> PAGEREF _Toc241499591 \h </w:instrText>
+              <w:instrText xml:space="preserve"> PAGEREF _Toc241501561 \h </w:instrText>
             </w:r>
             <w:r>
               <w:rPr>
@@ -1233,7 +1233,7 @@
               <w:szCs w:val="22"/>
             </w:rPr>
           </w:pPr>
-          <w:hyperlink w:anchor="_Toc241499592" w:history="1">
+          <w:hyperlink w:anchor="_Toc241501562" w:history="1">
             <w:r>
               <w:rPr>
                 <w:rStyle w:val="a5"/>
@@ -1257,7 +1257,7 @@
               <w:rPr>
                 <w:noProof/>
               </w:rPr>
-              <w:instrText xml:space="preserve"> PAGEREF _Toc241499592 \h </w:instrText>
+              <w:instrText xml:space="preserve"> PAGEREF _Toc241501562 \h </w:instrText>
             </w:r>
             <w:r>
               <w:rPr>
@@ -1298,7 +1298,7 @@
               <w:szCs w:val="22"/>
             </w:rPr>
           </w:pPr>
-          <w:hyperlink w:anchor="_Toc241499593" w:history="1">
+          <w:hyperlink w:anchor="_Toc241501563" w:history="1">
             <w:r>
               <w:rPr>
                 <w:rStyle w:val="a5"/>
@@ -1322,7 +1322,7 @@
               <w:rPr>
                 <w:noProof/>
               </w:rPr>
-              <w:instrText xml:space="preserve"> PAGEREF _Toc241499593 \h </w:instrText>
+              <w:instrText xml:space="preserve"> PAGEREF _Toc241501563 \h </w:instrText>
             </w:r>
             <w:r>
               <w:rPr>
@@ -1364,7 +1364,7 @@
               <w:szCs w:val="22"/>
             </w:rPr>
           </w:pPr>
-          <w:hyperlink w:anchor="_Toc241499594" w:history="1">
+          <w:hyperlink w:anchor="_Toc241501564" w:history="1">
             <w:r>
               <w:rPr>
                 <w:rStyle w:val="a5"/>
@@ -1388,7 +1388,7 @@
               <w:rPr>
                 <w:noProof/>
               </w:rPr>
-              <w:instrText xml:space="preserve"> PAGEREF _Toc241499594 \h </w:instrText>
+              <w:instrText xml:space="preserve"> PAGEREF _Toc241501564 \h </w:instrText>
             </w:r>
             <w:r>
               <w:rPr>
@@ -1430,7 +1430,7 @@
               <w:szCs w:val="22"/>
             </w:rPr>
           </w:pPr>
-          <w:hyperlink w:anchor="_Toc241499595" w:history="1">
+          <w:hyperlink w:anchor="_Toc241501565" w:history="1">
             <w:r>
               <w:rPr>
                 <w:rStyle w:val="a5"/>
@@ -1454,7 +1454,7 @@
               <w:rPr>
                 <w:noProof/>
               </w:rPr>
-              <w:instrText xml:space="preserve"> PAGEREF _Toc241499595 \h </w:instrText>
+              <w:instrText xml:space="preserve"> PAGEREF _Toc241501565 \h </w:instrText>
             </w:r>
             <w:r>
               <w:rPr>
@@ -1496,7 +1496,7 @@
               <w:szCs w:val="22"/>
             </w:rPr>
           </w:pPr>
-          <w:hyperlink w:anchor="_Toc241499596" w:history="1">
+          <w:hyperlink w:anchor="_Toc241501566" w:history="1">
             <w:r>
               <w:rPr>
                 <w:rStyle w:val="a5"/>
@@ -1520,7 +1520,7 @@
               <w:rPr>
                 <w:noProof/>
               </w:rPr>
-              <w:instrText xml:space="preserve"> PAGEREF _Toc241499596 \h </w:instrText>
+              <w:instrText xml:space="preserve"> PAGEREF _Toc241501566 \h </w:instrText>
             </w:r>
             <w:r>
               <w:rPr>
@@ -1562,7 +1562,7 @@
               <w:szCs w:val="22"/>
             </w:rPr>
           </w:pPr>
-          <w:hyperlink w:anchor="_Toc241499597" w:history="1">
+          <w:hyperlink w:anchor="_Toc241501567" w:history="1">
             <w:r>
               <w:rPr>
                 <w:rStyle w:val="a5"/>
@@ -1586,7 +1586,7 @@
               <w:rPr>
                 <w:noProof/>
               </w:rPr>
-              <w:instrText xml:space="preserve"> PAGEREF _Toc241499597 \h </w:instrText>
+              <w:instrText xml:space="preserve"> PAGEREF _Toc241501567 \h </w:instrText>
             </w:r>
             <w:r>
               <w:rPr>
@@ -1627,7 +1627,7 @@
               <w:szCs w:val="22"/>
             </w:rPr>
           </w:pPr>
-          <w:hyperlink w:anchor="_Toc241499598" w:history="1">
+          <w:hyperlink w:anchor="_Toc241501568" w:history="1">
             <w:r>
               <w:rPr>
                 <w:rStyle w:val="a5"/>
@@ -1651,7 +1651,7 @@
               <w:rPr>
                 <w:noProof/>
               </w:rPr>
-              <w:instrText xml:space="preserve"> PAGEREF _Toc241499598 \h </w:instrText>
+              <w:instrText xml:space="preserve"> PAGEREF _Toc241501568 \h </w:instrText>
             </w:r>
             <w:r>
               <w:rPr>
@@ -1693,7 +1693,7 @@
               <w:szCs w:val="22"/>
             </w:rPr>
           </w:pPr>
-          <w:hyperlink w:anchor="_Toc241499599" w:history="1">
+          <w:hyperlink w:anchor="_Toc241501569" w:history="1">
             <w:r>
               <w:rPr>
                 <w:rStyle w:val="a5"/>
@@ -1717,7 +1717,7 @@
               <w:rPr>
                 <w:noProof/>
               </w:rPr>
-              <w:instrText xml:space="preserve"> PAGEREF _Toc241499599 \h </w:instrText>
+              <w:instrText xml:space="preserve"> PAGEREF _Toc241501569 \h </w:instrText>
             </w:r>
             <w:r>
               <w:rPr>
@@ -1759,7 +1759,7 @@
               <w:szCs w:val="22"/>
             </w:rPr>
           </w:pPr>
-          <w:hyperlink w:anchor="_Toc241499600" w:history="1">
+          <w:hyperlink w:anchor="_Toc241501570" w:history="1">
             <w:r>
               <w:rPr>
                 <w:rStyle w:val="a5"/>
@@ -1783,7 +1783,7 @@
               <w:rPr>
                 <w:noProof/>
               </w:rPr>
-              <w:instrText xml:space="preserve"> PAGEREF _Toc241499600 \h </w:instrText>
+              <w:instrText xml:space="preserve"> PAGEREF _Toc241501570 \h </w:instrText>
             </w:r>
             <w:r>
               <w:rPr>
@@ -1825,7 +1825,7 @@
               <w:szCs w:val="22"/>
             </w:rPr>
           </w:pPr>
-          <w:hyperlink w:anchor="_Toc241499601" w:history="1">
+          <w:hyperlink w:anchor="_Toc241501571" w:history="1">
             <w:r>
               <w:rPr>
                 <w:rStyle w:val="a5"/>
@@ -1849,7 +1849,7 @@
               <w:rPr>
                 <w:noProof/>
               </w:rPr>
-              <w:instrText xml:space="preserve"> PAGEREF _Toc241499601 \h </w:instrText>
+              <w:instrText xml:space="preserve"> PAGEREF _Toc241501571 \h </w:instrText>
             </w:r>
             <w:r>
               <w:rPr>
@@ -1890,7 +1890,7 @@
               <w:szCs w:val="22"/>
             </w:rPr>
           </w:pPr>
-          <w:hyperlink w:anchor="_Toc241499602" w:history="1">
+          <w:hyperlink w:anchor="_Toc241501572" w:history="1">
             <w:r>
               <w:rPr>
                 <w:rStyle w:val="a5"/>
@@ -1914,7 +1914,7 @@
               <w:rPr>
                 <w:noProof/>
               </w:rPr>
-              <w:instrText xml:space="preserve"> PAGEREF _Toc241499602 \h </w:instrText>
+              <w:instrText xml:space="preserve"> PAGEREF _Toc241501572 \h </w:instrText>
             </w:r>
             <w:r>
               <w:rPr>
@@ -1956,7 +1956,7 @@
               <w:szCs w:val="22"/>
             </w:rPr>
           </w:pPr>
-          <w:hyperlink w:anchor="_Toc241499603" w:history="1">
+          <w:hyperlink w:anchor="_Toc241501573" w:history="1">
             <w:r>
               <w:rPr>
                 <w:rStyle w:val="a5"/>
@@ -1980,7 +1980,7 @@
               <w:rPr>
                 <w:noProof/>
               </w:rPr>
-              <w:instrText xml:space="preserve"> PAGEREF _Toc241499603 \h </w:instrText>
+              <w:instrText xml:space="preserve"> PAGEREF _Toc241501573 \h </w:instrText>
             </w:r>
             <w:r>
               <w:rPr>
@@ -2022,7 +2022,7 @@
               <w:szCs w:val="22"/>
             </w:rPr>
           </w:pPr>
-          <w:hyperlink w:anchor="_Toc241499604" w:history="1">
+          <w:hyperlink w:anchor="_Toc241501574" w:history="1">
             <w:r>
               <w:rPr>
                 <w:rStyle w:val="a5"/>
@@ -2046,7 +2046,7 @@
               <w:rPr>
                 <w:noProof/>
               </w:rPr>
-              <w:instrText xml:space="preserve"> PAGEREF _Toc241499604 \h </w:instrText>
+              <w:instrText xml:space="preserve"> PAGEREF _Toc241501574 \h </w:instrText>
             </w:r>
             <w:r>
               <w:rPr>
@@ -2088,7 +2088,7 @@
               <w:szCs w:val="22"/>
             </w:rPr>
           </w:pPr>
-          <w:hyperlink w:anchor="_Toc241499605" w:history="1">
+          <w:hyperlink w:anchor="_Toc241501575" w:history="1">
             <w:r>
               <w:rPr>
                 <w:rStyle w:val="a5"/>
@@ -2112,7 +2112,7 @@
               <w:rPr>
                 <w:noProof/>
               </w:rPr>
-              <w:instrText xml:space="preserve"> PAGEREF _Toc241499605 \h </w:instrText>
+              <w:instrText xml:space="preserve"> PAGEREF _Toc241501575 \h </w:instrText>
             </w:r>
             <w:r>
               <w:rPr>
@@ -2153,7 +2153,7 @@
               <w:szCs w:val="22"/>
             </w:rPr>
           </w:pPr>
-          <w:hyperlink w:anchor="_Toc241499606" w:history="1">
+          <w:hyperlink w:anchor="_Toc241501576" w:history="1">
             <w:r>
               <w:rPr>
                 <w:rStyle w:val="a5"/>
@@ -2177,7 +2177,7 @@
               <w:rPr>
                 <w:noProof/>
               </w:rPr>
-              <w:instrText xml:space="preserve"> PAGEREF _Toc241499606 \h </w:instrText>
+              <w:instrText xml:space="preserve"> PAGEREF _Toc241501576 \h </w:instrText>
             </w:r>
             <w:r>
               <w:rPr>
@@ -2219,7 +2219,7 @@
               <w:szCs w:val="22"/>
             </w:rPr>
           </w:pPr>
-          <w:hyperlink w:anchor="_Toc241499607" w:history="1">
+          <w:hyperlink w:anchor="_Toc241501577" w:history="1">
             <w:r>
               <w:rPr>
                 <w:rStyle w:val="a5"/>
@@ -2243,7 +2243,7 @@
               <w:rPr>
                 <w:noProof/>
               </w:rPr>
-              <w:instrText xml:space="preserve"> PAGEREF _Toc241499607 \h </w:instrText>
+              <w:instrText xml:space="preserve"> PAGEREF _Toc241501577 \h </w:instrText>
             </w:r>
             <w:r>
               <w:rPr>
@@ -2285,7 +2285,7 @@
               <w:szCs w:val="22"/>
             </w:rPr>
           </w:pPr>
-          <w:hyperlink w:anchor="_Toc241499608" w:history="1">
+          <w:hyperlink w:anchor="_Toc241501578" w:history="1">
             <w:r>
               <w:rPr>
                 <w:rStyle w:val="a5"/>
@@ -2309,7 +2309,7 @@
               <w:rPr>
                 <w:noProof/>
               </w:rPr>
-              <w:instrText xml:space="preserve"> PAGEREF _Toc241499608 \h </w:instrText>
+              <w:instrText xml:space="preserve"> PAGEREF _Toc241501578 \h </w:instrText>
             </w:r>
             <w:r>
               <w:rPr>
@@ -2350,7 +2350,7 @@
               <w:szCs w:val="22"/>
             </w:rPr>
           </w:pPr>
-          <w:hyperlink w:anchor="_Toc241499609" w:history="1">
+          <w:hyperlink w:anchor="_Toc241501579" w:history="1">
             <w:r>
               <w:rPr>
                 <w:rStyle w:val="a5"/>
@@ -2374,7 +2374,7 @@
               <w:rPr>
                 <w:noProof/>
               </w:rPr>
-              <w:instrText xml:space="preserve"> PAGEREF _Toc241499609 \h </w:instrText>
+              <w:instrText xml:space="preserve"> PAGEREF _Toc241501579 \h </w:instrText>
             </w:r>
             <w:r>
               <w:rPr>
@@ -2415,7 +2415,7 @@
               <w:szCs w:val="22"/>
             </w:rPr>
           </w:pPr>
-          <w:hyperlink w:anchor="_Toc241499610" w:history="1">
+          <w:hyperlink w:anchor="_Toc241501580" w:history="1">
             <w:r>
               <w:rPr>
                 <w:rStyle w:val="a5"/>
@@ -2439,7 +2439,7 @@
               <w:rPr>
                 <w:noProof/>
               </w:rPr>
-              <w:instrText xml:space="preserve"> PAGEREF _Toc241499610 \h </w:instrText>
+              <w:instrText xml:space="preserve"> PAGEREF _Toc241501580 \h </w:instrText>
             </w:r>
             <w:r>
               <w:rPr>
@@ -2481,7 +2481,7 @@
               <w:szCs w:val="22"/>
             </w:rPr>
           </w:pPr>
-          <w:hyperlink w:anchor="_Toc241499611" w:history="1">
+          <w:hyperlink w:anchor="_Toc241501581" w:history="1">
             <w:r>
               <w:rPr>
                 <w:rStyle w:val="a5"/>
@@ -2505,7 +2505,7 @@
               <w:rPr>
                 <w:noProof/>
               </w:rPr>
-              <w:instrText xml:space="preserve"> PAGEREF _Toc241499611 \h </w:instrText>
+              <w:instrText xml:space="preserve"> PAGEREF _Toc241501581 \h </w:instrText>
             </w:r>
             <w:r>
               <w:rPr>
@@ -2547,7 +2547,7 @@
               <w:szCs w:val="22"/>
             </w:rPr>
           </w:pPr>
-          <w:hyperlink w:anchor="_Toc241499612" w:history="1">
+          <w:hyperlink w:anchor="_Toc241501582" w:history="1">
             <w:r>
               <w:rPr>
                 <w:rStyle w:val="a5"/>
@@ -2571,7 +2571,7 @@
               <w:rPr>
                 <w:noProof/>
               </w:rPr>
-              <w:instrText xml:space="preserve"> PAGEREF _Toc241499612 \h </w:instrText>
+              <w:instrText xml:space="preserve"> PAGEREF _Toc241501582 \h </w:instrText>
             </w:r>
             <w:r>
               <w:rPr>
@@ -2613,7 +2613,7 @@
               <w:szCs w:val="22"/>
             </w:rPr>
           </w:pPr>
-          <w:hyperlink w:anchor="_Toc241499613" w:history="1">
+          <w:hyperlink w:anchor="_Toc241501583" w:history="1">
             <w:r>
               <w:rPr>
                 <w:rStyle w:val="a5"/>
@@ -2637,7 +2637,7 @@
               <w:rPr>
                 <w:noProof/>
               </w:rPr>
-              <w:instrText xml:space="preserve"> PAGEREF _Toc241499613 \h </w:instrText>
+              <w:instrText xml:space="preserve"> PAGEREF _Toc241501583 \h </w:instrText>
             </w:r>
             <w:r>
               <w:rPr>
@@ -2679,7 +2679,7 @@
               <w:szCs w:val="22"/>
             </w:rPr>
           </w:pPr>
-          <w:hyperlink w:anchor="_Toc241499614" w:history="1">
+          <w:hyperlink w:anchor="_Toc241501584" w:history="1">
             <w:r>
               <w:rPr>
                 <w:rStyle w:val="a5"/>
@@ -2703,7 +2703,7 @@
               <w:rPr>
                 <w:noProof/>
               </w:rPr>
-              <w:instrText xml:space="preserve"> PAGEREF _Toc241499614 \h </w:instrText>
+              <w:instrText xml:space="preserve"> PAGEREF _Toc241501584 \h </w:instrText>
             </w:r>
             <w:r>
               <w:rPr>
@@ -2742,7 +2742,7 @@
         <w:pStyle w:val="1"/>
         <w:pageBreakBefore/>
       </w:pPr>
-      <w:bookmarkStart w:id="0" w:name="_Toc241499587"/>
+      <w:bookmarkStart w:id="0" w:name="_Toc241501557"/>
       <w:r>
         <w:lastRenderedPageBreak/>
         <w:t xml:space="preserve">1. </w:t>
@@ -4229,34 +4229,6 @@
                 <w:sz w:val="19"/>
                 <w:szCs w:val="19"/>
               </w:rPr>
-              <w:t>.bat', '</w:t>
-            </w:r>
-            <w:r>
-              <w:rPr>
-                <w:sz w:val="19"/>
-                <w:szCs w:val="19"/>
-              </w:rPr>
-              <w:t>다시</w:t>
-            </w:r>
-            <w:r>
-              <w:rPr>
-                <w:sz w:val="19"/>
-                <w:szCs w:val="19"/>
-              </w:rPr>
-              <w:t>-</w:t>
-            </w:r>
-            <w:r>
-              <w:rPr>
-                <w:sz w:val="19"/>
-                <w:szCs w:val="19"/>
-              </w:rPr>
-              <w:t>시작하기</w:t>
-            </w:r>
-            <w:r>
-              <w:rPr>
-                <w:sz w:val="19"/>
-                <w:szCs w:val="19"/>
-              </w:rPr>
               <w:t>.bat'</w:t>
             </w:r>
             <w:r>
@@ -4394,7 +4366,7 @@
         <w:pStyle w:val="1"/>
         <w:pageBreakBefore/>
       </w:pPr>
-      <w:bookmarkStart w:id="1" w:name="_Toc241499588"/>
+      <w:bookmarkStart w:id="1" w:name="_Toc241501558"/>
       <w:r>
         <w:lastRenderedPageBreak/>
         <w:t xml:space="preserve">2. </w:t>
@@ -4414,7 +4386,7 @@
       <w:pPr>
         <w:pStyle w:val="2"/>
       </w:pPr>
-      <w:bookmarkStart w:id="2" w:name="_Toc241499589"/>
+      <w:bookmarkStart w:id="2" w:name="_Toc241501559"/>
       <w:r>
         <w:t xml:space="preserve">2-1. </w:t>
       </w:r>
@@ -4775,7 +4747,7 @@
       <w:pPr>
         <w:pStyle w:val="2"/>
       </w:pPr>
-      <w:bookmarkStart w:id="3" w:name="_Toc241499590"/>
+      <w:bookmarkStart w:id="3" w:name="_Toc241501560"/>
       <w:r>
         <w:t xml:space="preserve">2-2. </w:t>
       </w:r>
@@ -5113,7 +5085,7 @@
       <w:pPr>
         <w:pStyle w:val="2"/>
       </w:pPr>
-      <w:bookmarkStart w:id="4" w:name="_Toc241499591"/>
+      <w:bookmarkStart w:id="4" w:name="_Toc241501561"/>
       <w:r>
         <w:t xml:space="preserve">2-3. </w:t>
       </w:r>
@@ -5197,7 +5169,7 @@
       <w:pPr>
         <w:pStyle w:val="2"/>
       </w:pPr>
-      <w:bookmarkStart w:id="5" w:name="_Toc241499592"/>
+      <w:bookmarkStart w:id="5" w:name="_Toc241501562"/>
       <w:r>
         <w:t xml:space="preserve">2-4. </w:t>
       </w:r>
@@ -5366,7 +5338,7 @@
           <w:noProof/>
         </w:rPr>
         <w:drawing>
-          <wp:inline distT="0" distB="0" distL="0" distR="0" wp14:anchorId="442603F3" wp14:editId="01726204">
+          <wp:inline distT="0" distB="0" distL="0" distR="0" wp14:anchorId="3BB89E29" wp14:editId="3498524D">
             <wp:extent cx="5715000" cy="1343025"/>
             <wp:effectExtent l="0" t="0" r="0" b="0"/>
             <wp:docPr id="1" name="그림 1"/>
@@ -5968,7 +5940,7 @@
         </w:rPr>
         <w:lastRenderedPageBreak/>
         <w:drawing>
-          <wp:inline distT="0" distB="0" distL="0" distR="0" wp14:anchorId="1C26D3AD" wp14:editId="18934B60">
+          <wp:inline distT="0" distB="0" distL="0" distR="0" wp14:anchorId="529A31C8" wp14:editId="0074AF62">
             <wp:extent cx="4476750" cy="3171825"/>
             <wp:effectExtent l="0" t="0" r="0" b="0"/>
             <wp:docPr id="2" name="그림 2"/>
@@ -6074,7 +6046,7 @@
         <w:pStyle w:val="1"/>
         <w:pageBreakBefore/>
       </w:pPr>
-      <w:bookmarkStart w:id="6" w:name="_Toc241499593"/>
+      <w:bookmarkStart w:id="6" w:name="_Toc241501563"/>
       <w:r>
         <w:lastRenderedPageBreak/>
         <w:t xml:space="preserve">3. </w:t>
@@ -6113,7 +6085,7 @@
           <w:noProof/>
         </w:rPr>
         <w:drawing>
-          <wp:inline distT="0" distB="0" distL="0" distR="0" wp14:anchorId="65BF5157" wp14:editId="77A06648">
+          <wp:inline distT="0" distB="0" distL="0" distR="0" wp14:anchorId="17790165" wp14:editId="18373B6A">
             <wp:extent cx="5715000" cy="3657600"/>
             <wp:effectExtent l="0" t="0" r="0" b="0"/>
             <wp:docPr id="3" name="그림 3"/>
@@ -6218,7 +6190,7 @@
       <w:pPr>
         <w:pStyle w:val="2"/>
       </w:pPr>
-      <w:bookmarkStart w:id="7" w:name="_Toc241499594"/>
+      <w:bookmarkStart w:id="7" w:name="_Toc241501564"/>
       <w:r>
         <w:t xml:space="preserve">3-1. </w:t>
       </w:r>
@@ -7386,7 +7358,7 @@
       <w:pPr>
         <w:pStyle w:val="2"/>
       </w:pPr>
-      <w:bookmarkStart w:id="8" w:name="_Toc241499595"/>
+      <w:bookmarkStart w:id="8" w:name="_Toc241501565"/>
       <w:r>
         <w:lastRenderedPageBreak/>
         <w:t xml:space="preserve">3-2. </w:t>
@@ -8507,7 +8479,7 @@
       <w:pPr>
         <w:pStyle w:val="2"/>
       </w:pPr>
-      <w:bookmarkStart w:id="9" w:name="_Toc241499596"/>
+      <w:bookmarkStart w:id="9" w:name="_Toc241501566"/>
       <w:r>
         <w:t xml:space="preserve">3-3. </w:t>
       </w:r>
@@ -8845,7 +8817,7 @@
           <w:noProof/>
         </w:rPr>
         <w:drawing>
-          <wp:inline distT="0" distB="0" distL="0" distR="0" wp14:anchorId="5F80E16C" wp14:editId="6E54E371">
+          <wp:inline distT="0" distB="0" distL="0" distR="0" wp14:anchorId="19EF0792" wp14:editId="020234C3">
             <wp:extent cx="5715000" cy="1876425"/>
             <wp:effectExtent l="0" t="0" r="0" b="0"/>
             <wp:docPr id="4" name="그림 4"/>
@@ -8958,7 +8930,7 @@
       <w:pPr>
         <w:pStyle w:val="2"/>
       </w:pPr>
-      <w:bookmarkStart w:id="10" w:name="_Toc241499597"/>
+      <w:bookmarkStart w:id="10" w:name="_Toc241501567"/>
       <w:r>
         <w:t xml:space="preserve">3-4. </w:t>
       </w:r>
@@ -9080,7 +9052,7 @@
         <w:pStyle w:val="1"/>
         <w:pageBreakBefore/>
       </w:pPr>
-      <w:bookmarkStart w:id="11" w:name="_Toc241499598"/>
+      <w:bookmarkStart w:id="11" w:name="_Toc241501568"/>
       <w:r>
         <w:lastRenderedPageBreak/>
         <w:t xml:space="preserve">4. </w:t>
@@ -9119,7 +9091,7 @@
           <w:noProof/>
         </w:rPr>
         <w:drawing>
-          <wp:inline distT="0" distB="0" distL="0" distR="0" wp14:anchorId="49A665E1" wp14:editId="0F9F3E16">
+          <wp:inline distT="0" distB="0" distL="0" distR="0" wp14:anchorId="29AEC7F6" wp14:editId="313A0385">
             <wp:extent cx="4476750" cy="4448175"/>
             <wp:effectExtent l="0" t="0" r="0" b="0"/>
             <wp:docPr id="5" name="그림 5"/>
@@ -9240,7 +9212,7 @@
       <w:pPr>
         <w:pStyle w:val="2"/>
       </w:pPr>
-      <w:bookmarkStart w:id="12" w:name="_Toc241499599"/>
+      <w:bookmarkStart w:id="12" w:name="_Toc241501569"/>
       <w:r>
         <w:t xml:space="preserve">4-1. </w:t>
       </w:r>
@@ -9859,7 +9831,7 @@
       <w:pPr>
         <w:pStyle w:val="2"/>
       </w:pPr>
-      <w:bookmarkStart w:id="13" w:name="_Toc241499600"/>
+      <w:bookmarkStart w:id="13" w:name="_Toc241501570"/>
       <w:r>
         <w:lastRenderedPageBreak/>
         <w:t xml:space="preserve">4-2. </w:t>
@@ -9969,7 +9941,7 @@
       <w:pPr>
         <w:pStyle w:val="2"/>
       </w:pPr>
-      <w:bookmarkStart w:id="14" w:name="_Toc241499601"/>
+      <w:bookmarkStart w:id="14" w:name="_Toc241501571"/>
       <w:r>
         <w:t xml:space="preserve">4-3. </w:t>
       </w:r>
@@ -10140,7 +10112,7 @@
         <w:pStyle w:val="1"/>
         <w:pageBreakBefore/>
       </w:pPr>
-      <w:bookmarkStart w:id="15" w:name="_Toc241499602"/>
+      <w:bookmarkStart w:id="15" w:name="_Toc241501572"/>
       <w:r>
         <w:lastRenderedPageBreak/>
         <w:t xml:space="preserve">5. </w:t>
@@ -10504,7 +10476,7 @@
           <w:noProof/>
         </w:rPr>
         <w:drawing>
-          <wp:inline distT="0" distB="0" distL="0" distR="0" wp14:anchorId="6B1D8132" wp14:editId="65F245A3">
+          <wp:inline distT="0" distB="0" distL="0" distR="0" wp14:anchorId="19A5E1AB" wp14:editId="0BCF1EE0">
             <wp:extent cx="5143500" cy="3914775"/>
             <wp:effectExtent l="0" t="0" r="0" b="0"/>
             <wp:docPr id="6" name="그림 6"/>
@@ -10705,7 +10677,7 @@
       <w:pPr>
         <w:pStyle w:val="2"/>
       </w:pPr>
-      <w:bookmarkStart w:id="16" w:name="_Toc241499603"/>
+      <w:bookmarkStart w:id="16" w:name="_Toc241501573"/>
       <w:r>
         <w:t xml:space="preserve">5-1. </w:t>
       </w:r>
@@ -10867,7 +10839,7 @@
       <w:pPr>
         <w:pStyle w:val="2"/>
       </w:pPr>
-      <w:bookmarkStart w:id="17" w:name="_Toc241499604"/>
+      <w:bookmarkStart w:id="17" w:name="_Toc241501574"/>
       <w:r>
         <w:t xml:space="preserve">5-2. </w:t>
       </w:r>
@@ -11202,7 +11174,7 @@
       <w:pPr>
         <w:pStyle w:val="2"/>
       </w:pPr>
-      <w:bookmarkStart w:id="18" w:name="_Toc241499605"/>
+      <w:bookmarkStart w:id="18" w:name="_Toc241501575"/>
       <w:r>
         <w:lastRenderedPageBreak/>
         <w:t xml:space="preserve">5-3. </w:t>
@@ -11419,7 +11391,7 @@
         <w:pStyle w:val="1"/>
         <w:pageBreakBefore/>
       </w:pPr>
-      <w:bookmarkStart w:id="19" w:name="_Toc241499606"/>
+      <w:bookmarkStart w:id="19" w:name="_Toc241501576"/>
       <w:r>
         <w:lastRenderedPageBreak/>
         <w:t xml:space="preserve">6. </w:t>
@@ -11454,7 +11426,7 @@
       <w:pPr>
         <w:pStyle w:val="2"/>
       </w:pPr>
-      <w:bookmarkStart w:id="20" w:name="_Toc241499607"/>
+      <w:bookmarkStart w:id="20" w:name="_Toc241501577"/>
       <w:r>
         <w:t xml:space="preserve">6-1. </w:t>
       </w:r>
@@ -11480,7 +11452,7 @@
           <w:noProof/>
         </w:rPr>
         <w:drawing>
-          <wp:inline distT="0" distB="0" distL="0" distR="0" wp14:anchorId="1A665C67" wp14:editId="63F39B41">
+          <wp:inline distT="0" distB="0" distL="0" distR="0" wp14:anchorId="23E0269F" wp14:editId="6936562C">
             <wp:extent cx="3238500" cy="3048000"/>
             <wp:effectExtent l="0" t="0" r="0" b="0"/>
             <wp:docPr id="7" name="그림 7"/>
@@ -12334,7 +12306,7 @@
       <w:pPr>
         <w:pStyle w:val="2"/>
       </w:pPr>
-      <w:bookmarkStart w:id="21" w:name="_Toc241499608"/>
+      <w:bookmarkStart w:id="21" w:name="_Toc241501578"/>
       <w:r>
         <w:lastRenderedPageBreak/>
         <w:t xml:space="preserve">6-2. </w:t>
@@ -12367,7 +12339,7 @@
           <w:noProof/>
         </w:rPr>
         <w:drawing>
-          <wp:inline distT="0" distB="0" distL="0" distR="0" wp14:anchorId="13980387" wp14:editId="49CC0FA2">
+          <wp:inline distT="0" distB="0" distL="0" distR="0" wp14:anchorId="6494C537" wp14:editId="3A5EAE71">
             <wp:extent cx="3810000" cy="4371975"/>
             <wp:effectExtent l="0" t="0" r="0" b="0"/>
             <wp:docPr id="8" name="그림 8"/>
@@ -12682,7 +12654,7 @@
         <w:pStyle w:val="1"/>
         <w:pageBreakBefore/>
       </w:pPr>
-      <w:bookmarkStart w:id="22" w:name="_Toc241499609"/>
+      <w:bookmarkStart w:id="22" w:name="_Toc241501579"/>
       <w:r>
         <w:lastRenderedPageBreak/>
         <w:t xml:space="preserve">7. </w:t>
@@ -14602,7 +14574,7 @@
         <w:pStyle w:val="1"/>
         <w:pageBreakBefore/>
       </w:pPr>
-      <w:bookmarkStart w:id="23" w:name="_Toc241499610"/>
+      <w:bookmarkStart w:id="23" w:name="_Toc241501580"/>
       <w:r>
         <w:lastRenderedPageBreak/>
         <w:t xml:space="preserve">8. </w:t>
@@ -14622,7 +14594,7 @@
       <w:pPr>
         <w:pStyle w:val="2"/>
       </w:pPr>
-      <w:bookmarkStart w:id="24" w:name="_Toc241499611"/>
+      <w:bookmarkStart w:id="24" w:name="_Toc241501581"/>
       <w:r>
         <w:t xml:space="preserve">8-1. </w:t>
       </w:r>
@@ -14985,101 +14957,76 @@
         <w:spacing w:after="80" w:line="300" w:lineRule="auto"/>
       </w:pPr>
       <w:r>
-        <w:t>사용자에게</w:t>
-      </w:r>
-      <w:r>
-        <w:t xml:space="preserve"> </w:t>
-      </w:r>
-      <w:r>
-        <w:t>보이는</w:t>
-      </w:r>
-      <w:r>
-        <w:t xml:space="preserve"> </w:t>
-      </w:r>
-      <w:r>
-        <w:t>변경을</w:t>
-      </w:r>
-      <w:r>
-        <w:t xml:space="preserve"> </w:t>
-      </w:r>
-      <w:r>
-        <w:t>올릴</w:t>
-      </w:r>
-      <w:r>
-        <w:t xml:space="preserve"> </w:t>
-      </w:r>
-      <w:r>
-        <w:t>때는</w:t>
-      </w:r>
-      <w:r>
-        <w:t xml:space="preserve"> </w:t>
-      </w:r>
-      <w:r>
-        <w:rPr>
-          <w:b/>
-          <w:bCs/>
-        </w:rPr>
-        <w:t>src/changelog.js</w:t>
-      </w:r>
-      <w:r>
-        <w:t xml:space="preserve"> </w:t>
-      </w:r>
-      <w:r>
-        <w:t>맨</w:t>
-      </w:r>
-      <w:r>
-        <w:t xml:space="preserve"> </w:t>
-      </w:r>
-      <w:r>
-        <w:t>위에</w:t>
-      </w:r>
-      <w:r>
-        <w:t xml:space="preserve"> </w:t>
-      </w:r>
-      <w:r>
-        <w:t>항목을</w:t>
-      </w:r>
-      <w:r>
-        <w:t xml:space="preserve"> </w:t>
-      </w:r>
-      <w:r>
-        <w:t>추가하세요</w:t>
-      </w:r>
-      <w:r>
-        <w:t xml:space="preserve">. </w:t>
-      </w:r>
-      <w:r>
-        <w:t>매장</w:t>
-      </w:r>
-      <w:r>
-        <w:t xml:space="preserve"> PC</w:t>
-      </w:r>
-      <w:r>
-        <w:t>의</w:t>
-      </w:r>
-      <w:r>
-        <w:t xml:space="preserve"> </w:t>
-      </w:r>
-      <w:r>
-        <w:t>가이드</w:t>
-      </w:r>
-      <w:r>
-        <w:t xml:space="preserve"> </w:t>
-      </w:r>
-      <w:r>
-        <w:t>버튼이</w:t>
-      </w:r>
-      <w:r>
-        <w:t xml:space="preserve"> </w:t>
-      </w:r>
-      <w:r>
-        <w:t>파랗게</w:t>
-      </w:r>
-      <w:r>
-        <w:t xml:space="preserve"> </w:t>
-      </w:r>
-      <w:r>
-        <w:t>강조됩니다</w:t>
+        <w:t xml:space="preserve">.env </w:t>
+      </w:r>
+      <w:r>
+        <w:t>를</w:t>
+      </w:r>
+      <w:r>
+        <w:t xml:space="preserve"> </w:t>
+      </w:r>
+      <w:r>
+        <w:t>고친</w:t>
+      </w:r>
+      <w:r>
+        <w:t xml:space="preserve"> </w:t>
+      </w:r>
+      <w:r>
+        <w:t>뒤</w:t>
+      </w:r>
+      <w:r>
+        <w:t xml:space="preserve"> </w:t>
+      </w:r>
+      <w:r>
+        <w:t>바탕화면</w:t>
+      </w:r>
+      <w:r>
+        <w:t xml:space="preserve"> </w:t>
+      </w:r>
+      <w:r>
+        <w:t>아이콘을</w:t>
+      </w:r>
+      <w:r>
+        <w:t xml:space="preserve"> </w:t>
+      </w:r>
+      <w:r>
+        <w:t>누르면</w:t>
+      </w:r>
+      <w:r>
+        <w:t xml:space="preserve"> </w:t>
+      </w:r>
+      <w:r>
+        <w:t>바뀐</w:t>
+      </w:r>
+      <w:r>
+        <w:t xml:space="preserve"> </w:t>
+      </w:r>
+      <w:r>
+        <w:t>것을</w:t>
+      </w:r>
+      <w:r>
+        <w:t xml:space="preserve"> </w:t>
+      </w:r>
+      <w:r>
+        <w:t>알아채고</w:t>
+      </w:r>
+      <w:r>
+        <w:t xml:space="preserve"> </w:t>
+      </w:r>
+      <w:r>
+        <w:t>자동으로</w:t>
+      </w:r>
+      <w:r>
+        <w:t xml:space="preserve"> </w:t>
+      </w:r>
+      <w:r>
+        <w:t>재시작해서</w:t>
+      </w:r>
+      <w:r>
+        <w:t xml:space="preserve"> </w:t>
+      </w:r>
+      <w:r>
+        <w:t>반영합니다</w:t>
       </w:r>
       <w:r>
         <w:t>.</w:t>
@@ -15095,6 +15042,116 @@
         <w:spacing w:after="80" w:line="300" w:lineRule="auto"/>
       </w:pPr>
       <w:r>
+        <w:t>사용자에게</w:t>
+      </w:r>
+      <w:r>
+        <w:t xml:space="preserve"> </w:t>
+      </w:r>
+      <w:r>
+        <w:t>보이는</w:t>
+      </w:r>
+      <w:r>
+        <w:t xml:space="preserve"> </w:t>
+      </w:r>
+      <w:r>
+        <w:t>변경을</w:t>
+      </w:r>
+      <w:r>
+        <w:t xml:space="preserve"> </w:t>
+      </w:r>
+      <w:r>
+        <w:t>올릴</w:t>
+      </w:r>
+      <w:r>
+        <w:t xml:space="preserve"> </w:t>
+      </w:r>
+      <w:r>
+        <w:t>때는</w:t>
+      </w:r>
+      <w:r>
+        <w:t xml:space="preserve"> </w:t>
+      </w:r>
+      <w:r>
+        <w:rPr>
+          <w:b/>
+          <w:bCs/>
+        </w:rPr>
+        <w:t>src/changelog.js</w:t>
+      </w:r>
+      <w:r>
+        <w:t xml:space="preserve"> </w:t>
+      </w:r>
+      <w:r>
+        <w:t>맨</w:t>
+      </w:r>
+      <w:r>
+        <w:t xml:space="preserve"> </w:t>
+      </w:r>
+      <w:r>
+        <w:t>위에</w:t>
+      </w:r>
+      <w:r>
+        <w:t xml:space="preserve"> </w:t>
+      </w:r>
+      <w:r>
+        <w:t>항목을</w:t>
+      </w:r>
+      <w:r>
+        <w:t xml:space="preserve"> </w:t>
+      </w:r>
+      <w:r>
+        <w:t>추가하세요</w:t>
+      </w:r>
+      <w:r>
+        <w:t xml:space="preserve">. </w:t>
+      </w:r>
+      <w:r>
+        <w:t>매장</w:t>
+      </w:r>
+      <w:r>
+        <w:t xml:space="preserve"> PC</w:t>
+      </w:r>
+      <w:r>
+        <w:t>의</w:t>
+      </w:r>
+      <w:r>
+        <w:t xml:space="preserve"> </w:t>
+      </w:r>
+      <w:r>
+        <w:t>가이드</w:t>
+      </w:r>
+      <w:r>
+        <w:t xml:space="preserve"> </w:t>
+      </w:r>
+      <w:r>
+        <w:t>버튼이</w:t>
+      </w:r>
+      <w:r>
+        <w:t xml:space="preserve"> </w:t>
+      </w:r>
+      <w:r>
+        <w:t>파랗게</w:t>
+      </w:r>
+      <w:r>
+        <w:t xml:space="preserve"> </w:t>
+      </w:r>
+      <w:r>
+        <w:t>강조됩니다</w:t>
+      </w:r>
+      <w:r>
+        <w:t>.</w:t>
+      </w:r>
+    </w:p>
+    <w:p>
+      <w:pPr>
+        <w:pStyle w:val="a4"/>
+        <w:numPr>
+          <w:ilvl w:val="0"/>
+          <w:numId w:val="5"/>
+        </w:numPr>
+        <w:spacing w:after="80" w:line="300" w:lineRule="auto"/>
+      </w:pPr>
+      <w:r>
         <w:t>이</w:t>
       </w:r>
       <w:r>
@@ -15143,14 +15200,7 @@
           <w:b/>
           <w:bCs/>
         </w:rPr>
-        <w:t>node build-manual.</w:t>
-      </w:r>
-      <w:r>
-        <w:rPr>
-          <w:b/>
-          <w:bCs/>
-        </w:rPr>
-        <w:t>js</w:t>
+        <w:t>node build-manual.js</w:t>
       </w:r>
       <w:r>
         <w:t>로</w:t>
@@ -15205,7 +15255,7 @@
       <w:pPr>
         <w:pStyle w:val="2"/>
       </w:pPr>
-      <w:bookmarkStart w:id="25" w:name="_Toc241499612"/>
+      <w:bookmarkStart w:id="25" w:name="_Toc241501582"/>
       <w:r>
         <w:t xml:space="preserve">8-2. </w:t>
       </w:r>
@@ -15565,7 +15615,7 @@
       <w:pPr>
         <w:pStyle w:val="2"/>
       </w:pPr>
-      <w:bookmarkStart w:id="26" w:name="_Toc241499613"/>
+      <w:bookmarkStart w:id="26" w:name="_Toc241501583"/>
       <w:r>
         <w:t xml:space="preserve">8-3. </w:t>
       </w:r>
@@ -15810,7 +15860,7 @@
       <w:pPr>
         <w:pStyle w:val="2"/>
       </w:pPr>
-      <w:bookmarkStart w:id="27" w:name="_Toc241499614"/>
+      <w:bookmarkStart w:id="27" w:name="_Toc241501584"/>
       <w:r>
         <w:lastRenderedPageBreak/>
         <w:t xml:space="preserve">8-4. </w:t>
@@ -16871,10 +16921,10 @@
 <file path=word/numbering.xml><?xml version="1.0" encoding="utf-8"?>
 <w:numbering xmlns:wpc="http://schemas.microsoft.com/office/word/2010/wordprocessingCanvas" xmlns:cx="http://schemas.microsoft.com/office/drawing/2014/chartex" xmlns:cx1="http://schemas.microsoft.com/office/drawing/2015/9/8/chartex" xmlns:cx2="http://schemas.microsoft.com/office/drawing/2015/10/21/chartex" xmlns:cx3="http://schemas.microsoft.com/office/drawing/2016/5/9/chartex" xmlns:cx4="http://schemas.microsoft.com/office/drawing/2016/5/10/chartex" xmlns:cx5="http://schemas.microsoft.com/office/drawing/2016/5/11/chartex" xmlns:cx6="http://schemas.microsoft.com/office/drawing/2016/5/12/chartex" xmlns:cx7="http://schemas.microsoft.com/office/drawing/2016/5/13/chartex" xmlns:cx8="http://schemas.microsoft.com/office/drawing/2016/5/14/chartex" xmlns:mc="http://schemas.openxmlformats.org/markup-compatibility/2006" xmlns:aink="http://schemas.microsoft.com/office/drawing/2016/ink" xmlns:am3d="http://schemas.microsoft.com/office/drawing/2017/model3d" xmlns:o="urn:schemas-microsoft-com:office:office" xmlns:r="http://schemas.openxmlformats.org/officeDocument/2006/relationships" xmlns:m="http://schemas.openxmlformats.org/officeDocument/2006/math" xmlns:v="urn:schemas-microsoft-com:vml" xmlns:wp14="http://schemas.microsoft.com/office/word/2010/wordprocessingDrawing" xmlns:wp="http://schemas.openxmlformats.org/drawingml/2006/wordprocessingDrawing" xmlns:w10="urn:schemas-microsoft-com:office:word" xmlns:w="http://schemas.openxmlformats.org/wordprocessingml/2006/main" xmlns:w14="http://schemas.microsoft.com/office/word/2010/wordml" xmlns:w15="http://schemas.microsoft.com/office/word/2012/wordml" xmlns:w16cex="http://schemas.microsoft.com/office/word/2018/wordml/cex" xmlns:w16cid="http://schemas.microsoft.com/office/word/2016/wordml/cid" xmlns:w16="http://schemas.microsoft.com/office/word/2018/wordml" xmlns:w16sdtdh="http://schemas.microsoft.com/office/word/2020/wordml/sdtdatahash" xmlns:w16se="http://schemas.microsoft.com/office/word/2015/wordml/symex" xmlns:wpg="http://schemas.microsoft.com/office/word/2010/wordprocessingGroup" xmlns:wpi="http://schemas.microsoft.com/office/word/2010/wordprocessingInk" xmlns:wne="http://schemas.microsoft.com/office/word/2006/wordml" xmlns:wps="http://schemas.microsoft.com/office/word/2010/wordprocessingShape" mc:Ignorable="w14 w15 w16se w16cid w16 w16cex w16sdtdh wp14">
   <w:abstractNum w:abstractNumId="0" w15:restartNumberingAfterBreak="0">
-    <w:nsid w:val="01D573D7"/>
+    <w:nsid w:val="1A085552"/>
     <w:multiLevelType w:val="hybridMultilevel"/>
-    <w:tmpl w:val="BE160CFA"/>
-    <w:lvl w:ilvl="0" w:tplc="5866B9F0">
+    <w:tmpl w:val="EE200230"/>
+    <w:lvl w:ilvl="0" w:tplc="33443C68">
       <w:start w:val="1"/>
       <w:numFmt w:val="decimal"/>
       <w:lvlText w:val="%1."/>
@@ -16883,52 +16933,52 @@
         <w:ind w:left="440" w:hanging="300"/>
       </w:pPr>
     </w:lvl>
-    <w:lvl w:ilvl="1" w:tplc="E3909962">
+    <w:lvl w:ilvl="1" w:tplc="E94A755C">
       <w:numFmt w:val="decimal"/>
       <w:lvlText w:val=""/>
       <w:lvlJc w:val="left"/>
     </w:lvl>
-    <w:lvl w:ilvl="2" w:tplc="EB0A7E82">
+    <w:lvl w:ilvl="2" w:tplc="E7FC7550">
       <w:numFmt w:val="decimal"/>
       <w:lvlText w:val=""/>
       <w:lvlJc w:val="left"/>
     </w:lvl>
-    <w:lvl w:ilvl="3" w:tplc="A8F09E86">
+    <w:lvl w:ilvl="3" w:tplc="14406384">
       <w:numFmt w:val="decimal"/>
       <w:lvlText w:val=""/>
       <w:lvlJc w:val="left"/>
     </w:lvl>
-    <w:lvl w:ilvl="4" w:tplc="0AF2200E">
+    <w:lvl w:ilvl="4" w:tplc="2E7233B0">
       <w:numFmt w:val="decimal"/>
       <w:lvlText w:val=""/>
       <w:lvlJc w:val="left"/>
     </w:lvl>
-    <w:lvl w:ilvl="5" w:tplc="1A268E36">
+    <w:lvl w:ilvl="5" w:tplc="6F520FE0">
       <w:numFmt w:val="decimal"/>
       <w:lvlText w:val=""/>
       <w:lvlJc w:val="left"/>
     </w:lvl>
-    <w:lvl w:ilvl="6" w:tplc="187E1D82">
+    <w:lvl w:ilvl="6" w:tplc="654EC9AE">
       <w:numFmt w:val="decimal"/>
       <w:lvlText w:val=""/>
       <w:lvlJc w:val="left"/>
     </w:lvl>
-    <w:lvl w:ilvl="7" w:tplc="886C419A">
+    <w:lvl w:ilvl="7" w:tplc="8DB276C2">
       <w:numFmt w:val="decimal"/>
       <w:lvlText w:val=""/>
       <w:lvlJc w:val="left"/>
     </w:lvl>
-    <w:lvl w:ilvl="8" w:tplc="2FCAA880">
+    <w:lvl w:ilvl="8" w:tplc="51FEE0EC">
       <w:numFmt w:val="decimal"/>
       <w:lvlText w:val=""/>
       <w:lvlJc w:val="left"/>
     </w:lvl>
   </w:abstractNum>
   <w:abstractNum w:abstractNumId="1" w15:restartNumberingAfterBreak="0">
-    <w:nsid w:val="0FA855AD"/>
+    <w:nsid w:val="1F9841A8"/>
     <w:multiLevelType w:val="hybridMultilevel"/>
-    <w:tmpl w:val="34F4C23A"/>
-    <w:lvl w:ilvl="0" w:tplc="A4722CD0">
+    <w:tmpl w:val="F90AB102"/>
+    <w:lvl w:ilvl="0" w:tplc="2F5E8818">
       <w:start w:val="1"/>
       <w:numFmt w:val="decimal"/>
       <w:lvlText w:val="%1."/>
@@ -16937,52 +16987,52 @@
         <w:ind w:left="440" w:hanging="300"/>
       </w:pPr>
     </w:lvl>
-    <w:lvl w:ilvl="1" w:tplc="6D421412">
+    <w:lvl w:ilvl="1" w:tplc="7026CD32">
       <w:numFmt w:val="decimal"/>
       <w:lvlText w:val=""/>
       <w:lvlJc w:val="left"/>
     </w:lvl>
-    <w:lvl w:ilvl="2" w:tplc="76FE9440">
+    <w:lvl w:ilvl="2" w:tplc="7E9CC7B4">
       <w:numFmt w:val="decimal"/>
       <w:lvlText w:val=""/>
       <w:lvlJc w:val="left"/>
     </w:lvl>
-    <w:lvl w:ilvl="3" w:tplc="EB62D170">
+    <w:lvl w:ilvl="3" w:tplc="BF161E64">
       <w:numFmt w:val="decimal"/>
       <w:lvlText w:val=""/>
       <w:lvlJc w:val="left"/>
     </w:lvl>
-    <w:lvl w:ilvl="4" w:tplc="47FE47CA">
+    <w:lvl w:ilvl="4" w:tplc="45505988">
       <w:numFmt w:val="decimal"/>
       <w:lvlText w:val=""/>
       <w:lvlJc w:val="left"/>
     </w:lvl>
-    <w:lvl w:ilvl="5" w:tplc="8EC0CF96">
+    <w:lvl w:ilvl="5" w:tplc="15DC18B4">
       <w:numFmt w:val="decimal"/>
       <w:lvlText w:val=""/>
       <w:lvlJc w:val="left"/>
     </w:lvl>
-    <w:lvl w:ilvl="6" w:tplc="44D29AD2">
+    <w:lvl w:ilvl="6" w:tplc="FB98BFE6">
       <w:numFmt w:val="decimal"/>
       <w:lvlText w:val=""/>
       <w:lvlJc w:val="left"/>
     </w:lvl>
-    <w:lvl w:ilvl="7" w:tplc="19BA6F44">
+    <w:lvl w:ilvl="7" w:tplc="61BE4172">
       <w:numFmt w:val="decimal"/>
       <w:lvlText w:val=""/>
       <w:lvlJc w:val="left"/>
     </w:lvl>
-    <w:lvl w:ilvl="8" w:tplc="EAA0C408">
+    <w:lvl w:ilvl="8" w:tplc="3BFEC9B6">
       <w:numFmt w:val="decimal"/>
       <w:lvlText w:val=""/>
       <w:lvlJc w:val="left"/>
     </w:lvl>
   </w:abstractNum>
   <w:abstractNum w:abstractNumId="2" w15:restartNumberingAfterBreak="0">
-    <w:nsid w:val="28B72D24"/>
+    <w:nsid w:val="38D33977"/>
     <w:multiLevelType w:val="hybridMultilevel"/>
-    <w:tmpl w:val="D714AF7E"/>
-    <w:lvl w:ilvl="0" w:tplc="F634CE32">
+    <w:tmpl w:val="7C0C3BFA"/>
+    <w:lvl w:ilvl="0" w:tplc="56321134">
       <w:start w:val="1"/>
       <w:numFmt w:val="decimal"/>
       <w:lvlText w:val="%1."/>
@@ -16991,52 +17041,160 @@
         <w:ind w:left="440" w:hanging="300"/>
       </w:pPr>
     </w:lvl>
-    <w:lvl w:ilvl="1" w:tplc="C8BC91D0">
+    <w:lvl w:ilvl="1" w:tplc="351CF6D8">
       <w:numFmt w:val="decimal"/>
       <w:lvlText w:val=""/>
       <w:lvlJc w:val="left"/>
     </w:lvl>
-    <w:lvl w:ilvl="2" w:tplc="5BFEBABE">
+    <w:lvl w:ilvl="2" w:tplc="6E2AAB24">
       <w:numFmt w:val="decimal"/>
       <w:lvlText w:val=""/>
       <w:lvlJc w:val="left"/>
     </w:lvl>
-    <w:lvl w:ilvl="3" w:tplc="C2129FDA">
+    <w:lvl w:ilvl="3" w:tplc="0CCEB2B0">
       <w:numFmt w:val="decimal"/>
       <w:lvlText w:val=""/>
       <w:lvlJc w:val="left"/>
     </w:lvl>
-    <w:lvl w:ilvl="4" w:tplc="D8B4EB6C">
+    <w:lvl w:ilvl="4" w:tplc="BD40EEC0">
       <w:numFmt w:val="decimal"/>
       <w:lvlText w:val=""/>
       <w:lvlJc w:val="left"/>
     </w:lvl>
-    <w:lvl w:ilvl="5" w:tplc="52E0F186">
+    <w:lvl w:ilvl="5" w:tplc="F848A06A">
       <w:numFmt w:val="decimal"/>
       <w:lvlText w:val=""/>
       <w:lvlJc w:val="left"/>
     </w:lvl>
-    <w:lvl w:ilvl="6" w:tplc="3162C2DE">
+    <w:lvl w:ilvl="6" w:tplc="A9B06834">
       <w:numFmt w:val="decimal"/>
       <w:lvlText w:val=""/>
       <w:lvlJc w:val="left"/>
     </w:lvl>
-    <w:lvl w:ilvl="7" w:tplc="62CC8CA0">
+    <w:lvl w:ilvl="7" w:tplc="F716A610">
       <w:numFmt w:val="decimal"/>
       <w:lvlText w:val=""/>
       <w:lvlJc w:val="left"/>
     </w:lvl>
-    <w:lvl w:ilvl="8" w:tplc="78ACE0E4">
+    <w:lvl w:ilvl="8" w:tplc="4088294E">
       <w:numFmt w:val="decimal"/>
       <w:lvlText w:val=""/>
       <w:lvlJc w:val="left"/>
     </w:lvl>
   </w:abstractNum>
   <w:abstractNum w:abstractNumId="3" w15:restartNumberingAfterBreak="0">
-    <w:nsid w:val="2F0751D0"/>
+    <w:nsid w:val="52013152"/>
     <w:multiLevelType w:val="hybridMultilevel"/>
-    <w:tmpl w:val="BD028184"/>
-    <w:lvl w:ilvl="0" w:tplc="0B841488" w:tentative="1">
+    <w:tmpl w:val="BFE09272"/>
+    <w:lvl w:ilvl="0" w:tplc="932219A6">
+      <w:start w:val="1"/>
+      <w:numFmt w:val="decimal"/>
+      <w:lvlText w:val="%1."/>
+      <w:lvlJc w:val="left"/>
+      <w:pPr>
+        <w:ind w:left="440" w:hanging="300"/>
+      </w:pPr>
+    </w:lvl>
+    <w:lvl w:ilvl="1" w:tplc="3982A236">
+      <w:numFmt w:val="decimal"/>
+      <w:lvlText w:val=""/>
+      <w:lvlJc w:val="left"/>
+    </w:lvl>
+    <w:lvl w:ilvl="2" w:tplc="8ED610CA">
+      <w:numFmt w:val="decimal"/>
+      <w:lvlText w:val=""/>
+      <w:lvlJc w:val="left"/>
+    </w:lvl>
+    <w:lvl w:ilvl="3" w:tplc="62DAB494">
+      <w:numFmt w:val="decimal"/>
+      <w:lvlText w:val=""/>
+      <w:lvlJc w:val="left"/>
+    </w:lvl>
+    <w:lvl w:ilvl="4" w:tplc="0AC80922">
+      <w:numFmt w:val="decimal"/>
+      <w:lvlText w:val=""/>
+      <w:lvlJc w:val="left"/>
+    </w:lvl>
+    <w:lvl w:ilvl="5" w:tplc="DBEC9BB0">
+      <w:numFmt w:val="decimal"/>
+      <w:lvlText w:val=""/>
+      <w:lvlJc w:val="left"/>
+    </w:lvl>
+    <w:lvl w:ilvl="6" w:tplc="367C8E54">
+      <w:numFmt w:val="decimal"/>
+      <w:lvlText w:val=""/>
+      <w:lvlJc w:val="left"/>
+    </w:lvl>
+    <w:lvl w:ilvl="7" w:tplc="C472CE2C">
+      <w:numFmt w:val="decimal"/>
+      <w:lvlText w:val=""/>
+      <w:lvlJc w:val="left"/>
+    </w:lvl>
+    <w:lvl w:ilvl="8" w:tplc="24F8AF16">
+      <w:numFmt w:val="decimal"/>
+      <w:lvlText w:val=""/>
+      <w:lvlJc w:val="left"/>
+    </w:lvl>
+  </w:abstractNum>
+  <w:abstractNum w:abstractNumId="4" w15:restartNumberingAfterBreak="0">
+    <w:nsid w:val="555F7356"/>
+    <w:multiLevelType w:val="hybridMultilevel"/>
+    <w:tmpl w:val="F85CAC90"/>
+    <w:lvl w:ilvl="0" w:tplc="BD56057E">
+      <w:start w:val="1"/>
+      <w:numFmt w:val="decimal"/>
+      <w:lvlText w:val="%1."/>
+      <w:lvlJc w:val="left"/>
+      <w:pPr>
+        <w:ind w:left="440" w:hanging="300"/>
+      </w:pPr>
+    </w:lvl>
+    <w:lvl w:ilvl="1" w:tplc="FC2CB04E">
+      <w:numFmt w:val="decimal"/>
+      <w:lvlText w:val=""/>
+      <w:lvlJc w:val="left"/>
+    </w:lvl>
+    <w:lvl w:ilvl="2" w:tplc="46D00692">
+      <w:numFmt w:val="decimal"/>
+      <w:lvlText w:val=""/>
+      <w:lvlJc w:val="left"/>
+    </w:lvl>
+    <w:lvl w:ilvl="3" w:tplc="8B08179C">
+      <w:numFmt w:val="decimal"/>
+      <w:lvlText w:val=""/>
+      <w:lvlJc w:val="left"/>
+    </w:lvl>
+    <w:lvl w:ilvl="4" w:tplc="2E387526">
+      <w:numFmt w:val="decimal"/>
+      <w:lvlText w:val=""/>
+      <w:lvlJc w:val="left"/>
+    </w:lvl>
+    <w:lvl w:ilvl="5" w:tplc="C01462C0">
+      <w:numFmt w:val="decimal"/>
+      <w:lvlText w:val=""/>
+      <w:lvlJc w:val="left"/>
+    </w:lvl>
+    <w:lvl w:ilvl="6" w:tplc="C5863278">
+      <w:numFmt w:val="decimal"/>
+      <w:lvlText w:val=""/>
+      <w:lvlJc w:val="left"/>
+    </w:lvl>
+    <w:lvl w:ilvl="7" w:tplc="8326D1DA">
+      <w:numFmt w:val="decimal"/>
+      <w:lvlText w:val=""/>
+      <w:lvlJc w:val="left"/>
+    </w:lvl>
+    <w:lvl w:ilvl="8" w:tplc="2258EC8C">
+      <w:numFmt w:val="decimal"/>
+      <w:lvlText w:val=""/>
+      <w:lvlJc w:val="left"/>
+    </w:lvl>
+  </w:abstractNum>
+  <w:abstractNum w:abstractNumId="5" w15:restartNumberingAfterBreak="0">
+    <w:nsid w:val="5AAC4621"/>
+    <w:multiLevelType w:val="hybridMultilevel"/>
+    <w:tmpl w:val="404404FA"/>
+    <w:lvl w:ilvl="0" w:tplc="69403C3E" w:tentative="1">
       <w:start w:val="1"/>
       <w:numFmt w:val="bullet"/>
       <w:lvlText w:val="●"/>
@@ -17045,7 +17203,7 @@
         <w:ind w:left="720" w:hanging="360"/>
       </w:pPr>
     </w:lvl>
-    <w:lvl w:ilvl="1" w:tplc="1D8AA7A6" w:tentative="1">
+    <w:lvl w:ilvl="1" w:tplc="946C9C52" w:tentative="1">
       <w:start w:val="1"/>
       <w:numFmt w:val="bullet"/>
       <w:lvlText w:val="○"/>
@@ -17054,7 +17212,7 @@
         <w:ind w:left="1440" w:hanging="360"/>
       </w:pPr>
     </w:lvl>
-    <w:lvl w:ilvl="2" w:tplc="12D4AC90" w:tentative="1">
+    <w:lvl w:ilvl="2" w:tplc="65C0EEFC" w:tentative="1">
       <w:start w:val="1"/>
       <w:numFmt w:val="bullet"/>
       <w:lvlText w:val="■"/>
@@ -17063,7 +17221,7 @@
         <w:ind w:left="2160" w:hanging="360"/>
       </w:pPr>
     </w:lvl>
-    <w:lvl w:ilvl="3" w:tplc="95380B36" w:tentative="1">
+    <w:lvl w:ilvl="3" w:tplc="F81AA612" w:tentative="1">
       <w:start w:val="1"/>
       <w:numFmt w:val="bullet"/>
       <w:lvlText w:val="●"/>
@@ -17072,7 +17230,7 @@
         <w:ind w:left="2880" w:hanging="360"/>
       </w:pPr>
     </w:lvl>
-    <w:lvl w:ilvl="4" w:tplc="52C23DE8" w:tentative="1">
+    <w:lvl w:ilvl="4" w:tplc="7DD495B4" w:tentative="1">
       <w:start w:val="1"/>
       <w:numFmt w:val="bullet"/>
       <w:lvlText w:val="○"/>
@@ -17081,7 +17239,7 @@
         <w:ind w:left="3600" w:hanging="360"/>
       </w:pPr>
     </w:lvl>
-    <w:lvl w:ilvl="5" w:tplc="4F04A9C6" w:tentative="1">
+    <w:lvl w:ilvl="5" w:tplc="8858FB42" w:tentative="1">
       <w:start w:val="1"/>
       <w:numFmt w:val="bullet"/>
       <w:lvlText w:val="■"/>
@@ -17090,7 +17248,7 @@
         <w:ind w:left="4320" w:hanging="360"/>
       </w:pPr>
     </w:lvl>
-    <w:lvl w:ilvl="6" w:tplc="8DBC1074" w:tentative="1">
+    <w:lvl w:ilvl="6" w:tplc="CBEE09FE" w:tentative="1">
       <w:start w:val="1"/>
       <w:numFmt w:val="bullet"/>
       <w:lvlText w:val="●"/>
@@ -17099,7 +17257,7 @@
         <w:ind w:left="5040" w:hanging="360"/>
       </w:pPr>
     </w:lvl>
-    <w:lvl w:ilvl="7" w:tplc="82DCC240" w:tentative="1">
+    <w:lvl w:ilvl="7" w:tplc="B3869C9C" w:tentative="1">
       <w:start w:val="1"/>
       <w:numFmt w:val="bullet"/>
       <w:lvlText w:val="●"/>
@@ -17108,7 +17266,7 @@
         <w:ind w:left="5760" w:hanging="360"/>
       </w:pPr>
     </w:lvl>
-    <w:lvl w:ilvl="8" w:tplc="B9D0E4C2" w:tentative="1">
+    <w:lvl w:ilvl="8" w:tplc="9C1C75B4" w:tentative="1">
       <w:start w:val="1"/>
       <w:numFmt w:val="bullet"/>
       <w:lvlText w:val="●"/>
@@ -17118,11 +17276,65 @@
       </w:pPr>
     </w:lvl>
   </w:abstractNum>
-  <w:abstractNum w:abstractNumId="4" w15:restartNumberingAfterBreak="0">
-    <w:nsid w:val="44E55449"/>
+  <w:abstractNum w:abstractNumId="6" w15:restartNumberingAfterBreak="0">
+    <w:nsid w:val="6C8A4823"/>
     <w:multiLevelType w:val="hybridMultilevel"/>
-    <w:tmpl w:val="8EFA75AA"/>
-    <w:lvl w:ilvl="0" w:tplc="552C0BA2">
+    <w:tmpl w:val="54A2427C"/>
+    <w:lvl w:ilvl="0" w:tplc="181AE4A6">
+      <w:start w:val="1"/>
+      <w:numFmt w:val="decimal"/>
+      <w:lvlText w:val="%1."/>
+      <w:lvlJc w:val="left"/>
+      <w:pPr>
+        <w:ind w:left="440" w:hanging="300"/>
+      </w:pPr>
+    </w:lvl>
+    <w:lvl w:ilvl="1" w:tplc="79147CCE">
+      <w:numFmt w:val="decimal"/>
+      <w:lvlText w:val=""/>
+      <w:lvlJc w:val="left"/>
+    </w:lvl>
+    <w:lvl w:ilvl="2" w:tplc="51708446">
+      <w:numFmt w:val="decimal"/>
+      <w:lvlText w:val=""/>
+      <w:lvlJc w:val="left"/>
+    </w:lvl>
+    <w:lvl w:ilvl="3" w:tplc="0436E8BC">
+      <w:numFmt w:val="decimal"/>
+      <w:lvlText w:val=""/>
+      <w:lvlJc w:val="left"/>
+    </w:lvl>
+    <w:lvl w:ilvl="4" w:tplc="00EA4AA4">
+      <w:numFmt w:val="decimal"/>
+      <w:lvlText w:val=""/>
+      <w:lvlJc w:val="left"/>
+    </w:lvl>
+    <w:lvl w:ilvl="5" w:tplc="D7E4FFC0">
+      <w:numFmt w:val="decimal"/>
+      <w:lvlText w:val=""/>
+      <w:lvlJc w:val="left"/>
+    </w:lvl>
+    <w:lvl w:ilvl="6" w:tplc="F7D41294">
+      <w:numFmt w:val="decimal"/>
+      <w:lvlText w:val=""/>
+      <w:lvlJc w:val="left"/>
+    </w:lvl>
+    <w:lvl w:ilvl="7" w:tplc="FB187D3E">
+      <w:numFmt w:val="decimal"/>
+      <w:lvlText w:val=""/>
+      <w:lvlJc w:val="left"/>
+    </w:lvl>
+    <w:lvl w:ilvl="8" w:tplc="1A72C986">
+      <w:numFmt w:val="decimal"/>
+      <w:lvlText w:val=""/>
+      <w:lvlJc w:val="left"/>
+    </w:lvl>
+  </w:abstractNum>
+  <w:abstractNum w:abstractNumId="7" w15:restartNumberingAfterBreak="0">
+    <w:nsid w:val="6CF1396B"/>
+    <w:multiLevelType w:val="hybridMultilevel"/>
+    <w:tmpl w:val="F0A200AA"/>
+    <w:lvl w:ilvl="0" w:tplc="BBC62B8E">
       <w:start w:val="1"/>
       <w:numFmt w:val="bullet"/>
       <w:lvlText w:val="•"/>
@@ -17131,52 +17343,52 @@
         <w:ind w:left="440" w:hanging="260"/>
       </w:pPr>
     </w:lvl>
-    <w:lvl w:ilvl="1" w:tplc="A0C073A6">
+    <w:lvl w:ilvl="1" w:tplc="3DF41158">
       <w:numFmt w:val="decimal"/>
       <w:lvlText w:val=""/>
       <w:lvlJc w:val="left"/>
     </w:lvl>
-    <w:lvl w:ilvl="2" w:tplc="430A4D44">
+    <w:lvl w:ilvl="2" w:tplc="AB88FDFA">
       <w:numFmt w:val="decimal"/>
       <w:lvlText w:val=""/>
       <w:lvlJc w:val="left"/>
     </w:lvl>
-    <w:lvl w:ilvl="3" w:tplc="8B00FBA8">
+    <w:lvl w:ilvl="3" w:tplc="0260977A">
       <w:numFmt w:val="decimal"/>
       <w:lvlText w:val=""/>
       <w:lvlJc w:val="left"/>
     </w:lvl>
-    <w:lvl w:ilvl="4" w:tplc="0E9CB45C">
+    <w:lvl w:ilvl="4" w:tplc="AA5E5C1C">
       <w:numFmt w:val="decimal"/>
       <w:lvlText w:val=""/>
       <w:lvlJc w:val="left"/>
     </w:lvl>
-    <w:lvl w:ilvl="5" w:tplc="D92E64C6">
+    <w:lvl w:ilvl="5" w:tplc="33AEFC36">
       <w:numFmt w:val="decimal"/>
       <w:lvlText w:val=""/>
       <w:lvlJc w:val="left"/>
     </w:lvl>
-    <w:lvl w:ilvl="6" w:tplc="6562DD6E">
+    <w:lvl w:ilvl="6" w:tplc="3B2EE428">
       <w:numFmt w:val="decimal"/>
       <w:lvlText w:val=""/>
       <w:lvlJc w:val="left"/>
     </w:lvl>
-    <w:lvl w:ilvl="7" w:tplc="6F383580">
+    <w:lvl w:ilvl="7" w:tplc="585A03C2">
       <w:numFmt w:val="decimal"/>
       <w:lvlText w:val=""/>
       <w:lvlJc w:val="left"/>
     </w:lvl>
-    <w:lvl w:ilvl="8" w:tplc="C3D08B64">
+    <w:lvl w:ilvl="8" w:tplc="A6F242A8">
       <w:numFmt w:val="decimal"/>
       <w:lvlText w:val=""/>
       <w:lvlJc w:val="left"/>
     </w:lvl>
   </w:abstractNum>
-  <w:abstractNum w:abstractNumId="5" w15:restartNumberingAfterBreak="0">
-    <w:nsid w:val="47CD3E13"/>
+  <w:abstractNum w:abstractNumId="8" w15:restartNumberingAfterBreak="0">
+    <w:nsid w:val="7F22202E"/>
     <w:multiLevelType w:val="hybridMultilevel"/>
-    <w:tmpl w:val="4F74635A"/>
-    <w:lvl w:ilvl="0" w:tplc="D862D22C">
+    <w:tmpl w:val="769A6B30"/>
+    <w:lvl w:ilvl="0" w:tplc="ACFCD3F6">
       <w:start w:val="1"/>
       <w:numFmt w:val="decimal"/>
       <w:lvlText w:val="%1."/>
@@ -17185,259 +17397,97 @@
         <w:ind w:left="440" w:hanging="300"/>
       </w:pPr>
     </w:lvl>
-    <w:lvl w:ilvl="1" w:tplc="8228CBC4">
+    <w:lvl w:ilvl="1" w:tplc="41D642FC">
       <w:numFmt w:val="decimal"/>
       <w:lvlText w:val=""/>
       <w:lvlJc w:val="left"/>
     </w:lvl>
-    <w:lvl w:ilvl="2" w:tplc="D520E8F4">
+    <w:lvl w:ilvl="2" w:tplc="4DBA58EC">
       <w:numFmt w:val="decimal"/>
       <w:lvlText w:val=""/>
       <w:lvlJc w:val="left"/>
     </w:lvl>
-    <w:lvl w:ilvl="3" w:tplc="7AA47A6C">
+    <w:lvl w:ilvl="3" w:tplc="D5FA7DF6">
       <w:numFmt w:val="decimal"/>
       <w:lvlText w:val=""/>
       <w:lvlJc w:val="left"/>
     </w:lvl>
-    <w:lvl w:ilvl="4" w:tplc="180A8426">
+    <w:lvl w:ilvl="4" w:tplc="C144059A">
       <w:numFmt w:val="decimal"/>
       <w:lvlText w:val=""/>
       <w:lvlJc w:val="left"/>
     </w:lvl>
-    <w:lvl w:ilvl="5" w:tplc="4482BBF2">
+    <w:lvl w:ilvl="5" w:tplc="4768C15C">
       <w:numFmt w:val="decimal"/>
       <w:lvlText w:val=""/>
       <w:lvlJc w:val="left"/>
     </w:lvl>
-    <w:lvl w:ilvl="6" w:tplc="EA8206EE">
+    <w:lvl w:ilvl="6" w:tplc="79089852">
       <w:numFmt w:val="decimal"/>
       <w:lvlText w:val=""/>
       <w:lvlJc w:val="left"/>
     </w:lvl>
-    <w:lvl w:ilvl="7" w:tplc="33C0DB1E">
+    <w:lvl w:ilvl="7" w:tplc="FE1E6A8A">
       <w:numFmt w:val="decimal"/>
       <w:lvlText w:val=""/>
       <w:lvlJc w:val="left"/>
     </w:lvl>
-    <w:lvl w:ilvl="8" w:tplc="C1C64144">
-      <w:numFmt w:val="decimal"/>
-      <w:lvlText w:val=""/>
-      <w:lvlJc w:val="left"/>
-    </w:lvl>
-  </w:abstractNum>
-  <w:abstractNum w:abstractNumId="6" w15:restartNumberingAfterBreak="0">
-    <w:nsid w:val="574E21AE"/>
-    <w:multiLevelType w:val="hybridMultilevel"/>
-    <w:tmpl w:val="6D84BA8C"/>
-    <w:lvl w:ilvl="0" w:tplc="16367566">
-      <w:start w:val="1"/>
-      <w:numFmt w:val="decimal"/>
-      <w:lvlText w:val="%1."/>
-      <w:lvlJc w:val="left"/>
-      <w:pPr>
-        <w:ind w:left="440" w:hanging="300"/>
-      </w:pPr>
-    </w:lvl>
-    <w:lvl w:ilvl="1" w:tplc="54166908">
-      <w:numFmt w:val="decimal"/>
-      <w:lvlText w:val=""/>
-      <w:lvlJc w:val="left"/>
-    </w:lvl>
-    <w:lvl w:ilvl="2" w:tplc="F8FA477A">
-      <w:numFmt w:val="decimal"/>
-      <w:lvlText w:val=""/>
-      <w:lvlJc w:val="left"/>
-    </w:lvl>
-    <w:lvl w:ilvl="3" w:tplc="6DB65D42">
-      <w:numFmt w:val="decimal"/>
-      <w:lvlText w:val=""/>
-      <w:lvlJc w:val="left"/>
-    </w:lvl>
-    <w:lvl w:ilvl="4" w:tplc="08FACD1C">
-      <w:numFmt w:val="decimal"/>
-      <w:lvlText w:val=""/>
-      <w:lvlJc w:val="left"/>
-    </w:lvl>
-    <w:lvl w:ilvl="5" w:tplc="317CC444">
-      <w:numFmt w:val="decimal"/>
-      <w:lvlText w:val=""/>
-      <w:lvlJc w:val="left"/>
-    </w:lvl>
-    <w:lvl w:ilvl="6" w:tplc="ED624666">
-      <w:numFmt w:val="decimal"/>
-      <w:lvlText w:val=""/>
-      <w:lvlJc w:val="left"/>
-    </w:lvl>
-    <w:lvl w:ilvl="7" w:tplc="4B7AEFDE">
-      <w:numFmt w:val="decimal"/>
-      <w:lvlText w:val=""/>
-      <w:lvlJc w:val="left"/>
-    </w:lvl>
-    <w:lvl w:ilvl="8" w:tplc="9D44CBA6">
-      <w:numFmt w:val="decimal"/>
-      <w:lvlText w:val=""/>
-      <w:lvlJc w:val="left"/>
-    </w:lvl>
-  </w:abstractNum>
-  <w:abstractNum w:abstractNumId="7" w15:restartNumberingAfterBreak="0">
-    <w:nsid w:val="5E012635"/>
-    <w:multiLevelType w:val="hybridMultilevel"/>
-    <w:tmpl w:val="1624A626"/>
-    <w:lvl w:ilvl="0" w:tplc="9574143E">
-      <w:start w:val="1"/>
-      <w:numFmt w:val="decimal"/>
-      <w:lvlText w:val="%1."/>
-      <w:lvlJc w:val="left"/>
-      <w:pPr>
-        <w:ind w:left="440" w:hanging="300"/>
-      </w:pPr>
-    </w:lvl>
-    <w:lvl w:ilvl="1" w:tplc="F5F2001C">
-      <w:numFmt w:val="decimal"/>
-      <w:lvlText w:val=""/>
-      <w:lvlJc w:val="left"/>
-    </w:lvl>
-    <w:lvl w:ilvl="2" w:tplc="7494BA18">
-      <w:numFmt w:val="decimal"/>
-      <w:lvlText w:val=""/>
-      <w:lvlJc w:val="left"/>
-    </w:lvl>
-    <w:lvl w:ilvl="3" w:tplc="D6FAEE0A">
-      <w:numFmt w:val="decimal"/>
-      <w:lvlText w:val=""/>
-      <w:lvlJc w:val="left"/>
-    </w:lvl>
-    <w:lvl w:ilvl="4" w:tplc="889093E6">
-      <w:numFmt w:val="decimal"/>
-      <w:lvlText w:val=""/>
-      <w:lvlJc w:val="left"/>
-    </w:lvl>
-    <w:lvl w:ilvl="5" w:tplc="6C6614DE">
-      <w:numFmt w:val="decimal"/>
-      <w:lvlText w:val=""/>
-      <w:lvlJc w:val="left"/>
-    </w:lvl>
-    <w:lvl w:ilvl="6" w:tplc="108E6DC8">
-      <w:numFmt w:val="decimal"/>
-      <w:lvlText w:val=""/>
-      <w:lvlJc w:val="left"/>
-    </w:lvl>
-    <w:lvl w:ilvl="7" w:tplc="0A6AF230">
-      <w:numFmt w:val="decimal"/>
-      <w:lvlText w:val=""/>
-      <w:lvlJc w:val="left"/>
-    </w:lvl>
-    <w:lvl w:ilvl="8" w:tplc="DB46B830">
-      <w:numFmt w:val="decimal"/>
-      <w:lvlText w:val=""/>
-      <w:lvlJc w:val="left"/>
-    </w:lvl>
-  </w:abstractNum>
-  <w:abstractNum w:abstractNumId="8" w15:restartNumberingAfterBreak="0">
-    <w:nsid w:val="7D446104"/>
-    <w:multiLevelType w:val="hybridMultilevel"/>
-    <w:tmpl w:val="24DA1260"/>
-    <w:lvl w:ilvl="0" w:tplc="37B459D2">
-      <w:start w:val="1"/>
-      <w:numFmt w:val="decimal"/>
-      <w:lvlText w:val="%1."/>
-      <w:lvlJc w:val="left"/>
-      <w:pPr>
-        <w:ind w:left="440" w:hanging="300"/>
-      </w:pPr>
-    </w:lvl>
-    <w:lvl w:ilvl="1" w:tplc="61F2F2F0">
-      <w:numFmt w:val="decimal"/>
-      <w:lvlText w:val=""/>
-      <w:lvlJc w:val="left"/>
-    </w:lvl>
-    <w:lvl w:ilvl="2" w:tplc="6758FB7A">
-      <w:numFmt w:val="decimal"/>
-      <w:lvlText w:val=""/>
-      <w:lvlJc w:val="left"/>
-    </w:lvl>
-    <w:lvl w:ilvl="3" w:tplc="2ADCB058">
-      <w:numFmt w:val="decimal"/>
-      <w:lvlText w:val=""/>
-      <w:lvlJc w:val="left"/>
-    </w:lvl>
-    <w:lvl w:ilvl="4" w:tplc="9FB8F27A">
-      <w:numFmt w:val="decimal"/>
-      <w:lvlText w:val=""/>
-      <w:lvlJc w:val="left"/>
-    </w:lvl>
-    <w:lvl w:ilvl="5" w:tplc="D974D562">
-      <w:numFmt w:val="decimal"/>
-      <w:lvlText w:val=""/>
-      <w:lvlJc w:val="left"/>
-    </w:lvl>
-    <w:lvl w:ilvl="6" w:tplc="B58A2026">
-      <w:numFmt w:val="decimal"/>
-      <w:lvlText w:val=""/>
-      <w:lvlJc w:val="left"/>
-    </w:lvl>
-    <w:lvl w:ilvl="7" w:tplc="B9F0D782">
-      <w:numFmt w:val="decimal"/>
-      <w:lvlText w:val=""/>
-      <w:lvlJc w:val="left"/>
-    </w:lvl>
-    <w:lvl w:ilvl="8" w:tplc="155AA162">
+    <w:lvl w:ilvl="8" w:tplc="B378792C">
       <w:numFmt w:val="decimal"/>
       <w:lvlText w:val=""/>
       <w:lvlJc w:val="left"/>
     </w:lvl>
   </w:abstractNum>
   <w:num w:numId="1">
-    <w:abstractNumId w:val="3"/>
+    <w:abstractNumId w:val="5"/>
     <w:lvlOverride w:ilvl="0">
       <w:startOverride w:val="1"/>
     </w:lvlOverride>
   </w:num>
   <w:num w:numId="2">
+    <w:abstractNumId w:val="4"/>
+    <w:lvlOverride w:ilvl="0">
+      <w:startOverride w:val="1"/>
+    </w:lvlOverride>
+  </w:num>
+  <w:num w:numId="3">
+    <w:abstractNumId w:val="2"/>
+    <w:lvlOverride w:ilvl="0">
+      <w:startOverride w:val="1"/>
+    </w:lvlOverride>
+  </w:num>
+  <w:num w:numId="4">
     <w:abstractNumId w:val="8"/>
     <w:lvlOverride w:ilvl="0">
       <w:startOverride w:val="1"/>
     </w:lvlOverride>
   </w:num>
-  <w:num w:numId="3">
+  <w:num w:numId="5">
+    <w:abstractNumId w:val="7"/>
+    <w:lvlOverride w:ilvl="0">
+      <w:startOverride w:val="1"/>
+    </w:lvlOverride>
+  </w:num>
+  <w:num w:numId="6">
+    <w:abstractNumId w:val="0"/>
+    <w:lvlOverride w:ilvl="0">
+      <w:startOverride w:val="1"/>
+    </w:lvlOverride>
+  </w:num>
+  <w:num w:numId="7">
+    <w:abstractNumId w:val="1"/>
+    <w:lvlOverride w:ilvl="0">
+      <w:startOverride w:val="1"/>
+    </w:lvlOverride>
+  </w:num>
+  <w:num w:numId="8">
     <w:abstractNumId w:val="6"/>
     <w:lvlOverride w:ilvl="0">
       <w:startOverride w:val="1"/>
     </w:lvlOverride>
   </w:num>
-  <w:num w:numId="4">
-    <w:abstractNumId w:val="2"/>
-    <w:lvlOverride w:ilvl="0">
-      <w:startOverride w:val="1"/>
-    </w:lvlOverride>
-  </w:num>
-  <w:num w:numId="5">
-    <w:abstractNumId w:val="4"/>
-    <w:lvlOverride w:ilvl="0">
-      <w:startOverride w:val="1"/>
-    </w:lvlOverride>
-  </w:num>
-  <w:num w:numId="6">
-    <w:abstractNumId w:val="1"/>
-    <w:lvlOverride w:ilvl="0">
-      <w:startOverride w:val="1"/>
-    </w:lvlOverride>
-  </w:num>
-  <w:num w:numId="7">
-    <w:abstractNumId w:val="0"/>
-    <w:lvlOverride w:ilvl="0">
-      <w:startOverride w:val="1"/>
-    </w:lvlOverride>
-  </w:num>
-  <w:num w:numId="8">
-    <w:abstractNumId w:val="7"/>
-    <w:lvlOverride w:ilvl="0">
-      <w:startOverride w:val="1"/>
-    </w:lvlOverride>
-  </w:num>
   <w:num w:numId="9">
-    <w:abstractNumId w:val="5"/>
+    <w:abstractNumId w:val="3"/>
     <w:lvlOverride w:ilvl="0">
       <w:startOverride w:val="1"/>
     </w:lvlOverride>
@@ -18068,7 +18118,7 @@
     <w:autoRedefine/>
     <w:uiPriority w:val="39"/>
     <w:unhideWhenUsed/>
-    <w:rsid w:val="004D7A49"/>
+    <w:rsid w:val="00E045D3"/>
   </w:style>
   <w:style w:type="paragraph" w:styleId="20">
     <w:name w:val="toc 2"/>
@@ -18077,7 +18127,7 @@
     <w:autoRedefine/>
     <w:uiPriority w:val="39"/>
     <w:unhideWhenUsed/>
-    <w:rsid w:val="004D7A49"/>
+    <w:rsid w:val="00E045D3"/>
     <w:pPr>
       <w:ind w:leftChars="200" w:left="425"/>
     </w:pPr>
@@ -18088,7 +18138,7 @@
     <w:link w:val="Char1"/>
     <w:uiPriority w:val="99"/>
     <w:unhideWhenUsed/>
-    <w:rsid w:val="004D7A49"/>
+    <w:rsid w:val="00E045D3"/>
     <w:pPr>
       <w:tabs>
         <w:tab w:val="center" w:pos="4513"/>
@@ -18102,7 +18152,7 @@
     <w:basedOn w:val="a0"/>
     <w:link w:val="aa"/>
     <w:uiPriority w:val="99"/>
-    <w:rsid w:val="004D7A49"/>
+    <w:rsid w:val="00E045D3"/>
   </w:style>
   <w:style w:type="paragraph" w:styleId="ab">
     <w:name w:val="footer"/>
@@ -18110,7 +18160,7 @@
     <w:link w:val="Char2"/>
     <w:uiPriority w:val="99"/>
     <w:unhideWhenUsed/>
-    <w:rsid w:val="004D7A49"/>
+    <w:rsid w:val="00E045D3"/>
     <w:pPr>
       <w:tabs>
         <w:tab w:val="center" w:pos="4513"/>
@@ -18124,7 +18174,7 @@
     <w:basedOn w:val="a0"/>
     <w:link w:val="ab"/>
     <w:uiPriority w:val="99"/>
-    <w:rsid w:val="004D7A49"/>
+    <w:rsid w:val="00E045D3"/>
   </w:style>
 </w:styles>
 </file>

</xml_diff>

<commit_message>
Split order sheet into vendor/items steps with pinned top bars
- Order sheet: vendor picker first, then an items screen whose summary,
  "메일 내용 만들기" and add-item search stay pinned while the list scrolls;
  mail screen pins the record bar and mail buttons
- Main list: tabs, search, label filter and table header stick below the top bar
- Label/vendor list rows show "변경 저장" only when edited; warn once before
  closing or switching tabs with unsaved edits; keep unsaved rows across re-render
- Fix list bleeding through around the sticky bulk bar in assign panes
- e2e: order/main/labels checks for the new layout; manual and changelog updated

Co-Authored-By: Claude Opus 5.5 <noreply@anthropic.com>
Claude-Session: https://claude.ai/code/session_017FR5ax1LqrJ8cSHVrQSVhn
</commit_message>
<xml_diff>
--- a/docs/아틀리에말리-사용설명서.docx
+++ b/docs/아틀리에말리-사용설명서.docx
@@ -306,7 +306,7 @@
           <w:left w:w="10" w:type="dxa"/>
           <w:right w:w="10" w:type="dxa"/>
         </w:tblCellMar>
-        <w:tblLook w:val="0000" w:firstRow="0" w:lastRow="0" w:firstColumn="0" w:lastColumn="0" w:noHBand="0" w:noVBand="0"/>
+        <w:tblLook w:val="04A0" w:firstRow="1" w:lastRow="0" w:firstColumn="1" w:lastColumn="0" w:noHBand="0" w:noVBand="1"/>
       </w:tblPr>
       <w:tblGrid>
         <w:gridCol w:w="2250"/>
@@ -877,7 +877,7 @@
     <w:sdt>
       <w:sdtPr>
         <w:alias w:val="목차"/>
-        <w:id w:val="-1343470357"/>
+        <w:id w:val="-1177425612"/>
       </w:sdtPr>
       <w:sdtEndPr/>
       <w:sdtContent>
@@ -904,7 +904,7 @@
           <w:r>
             <w:fldChar w:fldCharType="separate"/>
           </w:r>
-          <w:hyperlink w:anchor="_Toc241585245" w:history="1">
+          <w:hyperlink w:anchor="_Toc241590055" w:history="1">
             <w:r>
               <w:rPr>
                 <w:rStyle w:val="a5"/>
@@ -928,7 +928,7 @@
               <w:rPr>
                 <w:noProof/>
               </w:rPr>
-              <w:instrText xml:space="preserve"> PAGEREF _Toc241585245 \h </w:instrText>
+              <w:instrText xml:space="preserve"> PAGEREF _Toc241590055 \h </w:instrText>
             </w:r>
             <w:r>
               <w:rPr>
@@ -969,7 +969,7 @@
               <w:szCs w:val="22"/>
             </w:rPr>
           </w:pPr>
-          <w:hyperlink w:anchor="_Toc241585246" w:history="1">
+          <w:hyperlink w:anchor="_Toc241590056" w:history="1">
             <w:r>
               <w:rPr>
                 <w:rStyle w:val="a5"/>
@@ -993,7 +993,7 @@
               <w:rPr>
                 <w:noProof/>
               </w:rPr>
-              <w:instrText xml:space="preserve"> PAGEREF _Toc241585246 \h </w:instrText>
+              <w:instrText xml:space="preserve"> PAGEREF _Toc241590056 \h </w:instrText>
             </w:r>
             <w:r>
               <w:rPr>
@@ -1035,7 +1035,7 @@
               <w:szCs w:val="22"/>
             </w:rPr>
           </w:pPr>
-          <w:hyperlink w:anchor="_Toc241585247" w:history="1">
+          <w:hyperlink w:anchor="_Toc241590057" w:history="1">
             <w:r>
               <w:rPr>
                 <w:rStyle w:val="a5"/>
@@ -1059,7 +1059,7 @@
               <w:rPr>
                 <w:noProof/>
               </w:rPr>
-              <w:instrText xml:space="preserve"> PAGEREF _Toc241585247 \h </w:instrText>
+              <w:instrText xml:space="preserve"> PAGEREF _Toc241590057 \h </w:instrText>
             </w:r>
             <w:r>
               <w:rPr>
@@ -1101,7 +1101,7 @@
               <w:szCs w:val="22"/>
             </w:rPr>
           </w:pPr>
-          <w:hyperlink w:anchor="_Toc241585248" w:history="1">
+          <w:hyperlink w:anchor="_Toc241590058" w:history="1">
             <w:r>
               <w:rPr>
                 <w:rStyle w:val="a5"/>
@@ -1125,7 +1125,7 @@
               <w:rPr>
                 <w:noProof/>
               </w:rPr>
-              <w:instrText xml:space="preserve"> PAGEREF _Toc241585248 \h </w:instrText>
+              <w:instrText xml:space="preserve"> PAGEREF _Toc241590058 \h </w:instrText>
             </w:r>
             <w:r>
               <w:rPr>
@@ -1167,7 +1167,7 @@
               <w:szCs w:val="22"/>
             </w:rPr>
           </w:pPr>
-          <w:hyperlink w:anchor="_Toc241585249" w:history="1">
+          <w:hyperlink w:anchor="_Toc241590059" w:history="1">
             <w:r>
               <w:rPr>
                 <w:rStyle w:val="a5"/>
@@ -1191,7 +1191,7 @@
               <w:rPr>
                 <w:noProof/>
               </w:rPr>
-              <w:instrText xml:space="preserve"> PAGEREF _Toc241585249 \h </w:instrText>
+              <w:instrText xml:space="preserve"> PAGEREF _Toc241590059 \h </w:instrText>
             </w:r>
             <w:r>
               <w:rPr>
@@ -1233,7 +1233,7 @@
               <w:szCs w:val="22"/>
             </w:rPr>
           </w:pPr>
-          <w:hyperlink w:anchor="_Toc241585250" w:history="1">
+          <w:hyperlink w:anchor="_Toc241590060" w:history="1">
             <w:r>
               <w:rPr>
                 <w:rStyle w:val="a5"/>
@@ -1257,7 +1257,7 @@
               <w:rPr>
                 <w:noProof/>
               </w:rPr>
-              <w:instrText xml:space="preserve"> PAGEREF _Toc241585250 \h </w:instrText>
+              <w:instrText xml:space="preserve"> PAGEREF _Toc241590060 \h </w:instrText>
             </w:r>
             <w:r>
               <w:rPr>
@@ -1298,7 +1298,7 @@
               <w:szCs w:val="22"/>
             </w:rPr>
           </w:pPr>
-          <w:hyperlink w:anchor="_Toc241585251" w:history="1">
+          <w:hyperlink w:anchor="_Toc241590061" w:history="1">
             <w:r>
               <w:rPr>
                 <w:rStyle w:val="a5"/>
@@ -1322,7 +1322,7 @@
               <w:rPr>
                 <w:noProof/>
               </w:rPr>
-              <w:instrText xml:space="preserve"> PAGEREF _Toc241585251 \h </w:instrText>
+              <w:instrText xml:space="preserve"> PAGEREF _Toc241590061 \h </w:instrText>
             </w:r>
             <w:r>
               <w:rPr>
@@ -1364,7 +1364,7 @@
               <w:szCs w:val="22"/>
             </w:rPr>
           </w:pPr>
-          <w:hyperlink w:anchor="_Toc241585252" w:history="1">
+          <w:hyperlink w:anchor="_Toc241590062" w:history="1">
             <w:r>
               <w:rPr>
                 <w:rStyle w:val="a5"/>
@@ -1388,7 +1388,7 @@
               <w:rPr>
                 <w:noProof/>
               </w:rPr>
-              <w:instrText xml:space="preserve"> PAGEREF _Toc241585252 \h </w:instrText>
+              <w:instrText xml:space="preserve"> PAGEREF _Toc241590062 \h </w:instrText>
             </w:r>
             <w:r>
               <w:rPr>
@@ -1430,7 +1430,7 @@
               <w:szCs w:val="22"/>
             </w:rPr>
           </w:pPr>
-          <w:hyperlink w:anchor="_Toc241585253" w:history="1">
+          <w:hyperlink w:anchor="_Toc241590063" w:history="1">
             <w:r>
               <w:rPr>
                 <w:rStyle w:val="a5"/>
@@ -1454,7 +1454,7 @@
               <w:rPr>
                 <w:noProof/>
               </w:rPr>
-              <w:instrText xml:space="preserve"> PAGEREF _Toc241585253 \h </w:instrText>
+              <w:instrText xml:space="preserve"> PAGEREF _Toc241590063 \h </w:instrText>
             </w:r>
             <w:r>
               <w:rPr>
@@ -1496,7 +1496,7 @@
               <w:szCs w:val="22"/>
             </w:rPr>
           </w:pPr>
-          <w:hyperlink w:anchor="_Toc241585254" w:history="1">
+          <w:hyperlink w:anchor="_Toc241590064" w:history="1">
             <w:r>
               <w:rPr>
                 <w:rStyle w:val="a5"/>
@@ -1520,7 +1520,7 @@
               <w:rPr>
                 <w:noProof/>
               </w:rPr>
-              <w:instrText xml:space="preserve"> PAGEREF _Toc241585254 \h </w:instrText>
+              <w:instrText xml:space="preserve"> PAGEREF _Toc241590064 \h </w:instrText>
             </w:r>
             <w:r>
               <w:rPr>
@@ -1562,7 +1562,7 @@
               <w:szCs w:val="22"/>
             </w:rPr>
           </w:pPr>
-          <w:hyperlink w:anchor="_Toc241585255" w:history="1">
+          <w:hyperlink w:anchor="_Toc241590065" w:history="1">
             <w:r>
               <w:rPr>
                 <w:rStyle w:val="a5"/>
@@ -1586,7 +1586,7 @@
               <w:rPr>
                 <w:noProof/>
               </w:rPr>
-              <w:instrText xml:space="preserve"> PAGEREF _Toc241585255 \h </w:instrText>
+              <w:instrText xml:space="preserve"> PAGEREF _Toc241590065 \h </w:instrText>
             </w:r>
             <w:r>
               <w:rPr>
@@ -1603,7 +1603,7 @@
               <w:rPr>
                 <w:noProof/>
               </w:rPr>
-              <w:t>7</w:t>
+              <w:t>8</w:t>
             </w:r>
             <w:r>
               <w:rPr>
@@ -1628,7 +1628,7 @@
               <w:szCs w:val="22"/>
             </w:rPr>
           </w:pPr>
-          <w:hyperlink w:anchor="_Toc241585256" w:history="1">
+          <w:hyperlink w:anchor="_Toc241590066" w:history="1">
             <w:r>
               <w:rPr>
                 <w:rStyle w:val="a5"/>
@@ -1652,7 +1652,7 @@
               <w:rPr>
                 <w:noProof/>
               </w:rPr>
-              <w:instrText xml:space="preserve"> PAGEREF _Toc241585256 \h </w:instrText>
+              <w:instrText xml:space="preserve"> PAGEREF _Toc241590066 \h </w:instrText>
             </w:r>
             <w:r>
               <w:rPr>
@@ -1693,7 +1693,7 @@
               <w:szCs w:val="22"/>
             </w:rPr>
           </w:pPr>
-          <w:hyperlink w:anchor="_Toc241585257" w:history="1">
+          <w:hyperlink w:anchor="_Toc241590067" w:history="1">
             <w:r>
               <w:rPr>
                 <w:rStyle w:val="a5"/>
@@ -1717,7 +1717,7 @@
               <w:rPr>
                 <w:noProof/>
               </w:rPr>
-              <w:instrText xml:space="preserve"> PAGEREF _Toc241585257 \h </w:instrText>
+              <w:instrText xml:space="preserve"> PAGEREF _Toc241590067 \h </w:instrText>
             </w:r>
             <w:r>
               <w:rPr>
@@ -1759,7 +1759,7 @@
               <w:szCs w:val="22"/>
             </w:rPr>
           </w:pPr>
-          <w:hyperlink w:anchor="_Toc241585258" w:history="1">
+          <w:hyperlink w:anchor="_Toc241590068" w:history="1">
             <w:r>
               <w:rPr>
                 <w:rStyle w:val="a5"/>
@@ -1783,7 +1783,7 @@
               <w:rPr>
                 <w:noProof/>
               </w:rPr>
-              <w:instrText xml:space="preserve"> PAGEREF _Toc241585258 \h </w:instrText>
+              <w:instrText xml:space="preserve"> PAGEREF _Toc241590068 \h </w:instrText>
             </w:r>
             <w:r>
               <w:rPr>
@@ -1825,7 +1825,7 @@
               <w:szCs w:val="22"/>
             </w:rPr>
           </w:pPr>
-          <w:hyperlink w:anchor="_Toc241585259" w:history="1">
+          <w:hyperlink w:anchor="_Toc241590069" w:history="1">
             <w:r>
               <w:rPr>
                 <w:rStyle w:val="a5"/>
@@ -1849,7 +1849,7 @@
               <w:rPr>
                 <w:noProof/>
               </w:rPr>
-              <w:instrText xml:space="preserve"> PAGEREF _Toc241585259 \h </w:instrText>
+              <w:instrText xml:space="preserve"> PAGEREF _Toc241590069 \h </w:instrText>
             </w:r>
             <w:r>
               <w:rPr>
@@ -1891,7 +1891,7 @@
               <w:szCs w:val="22"/>
             </w:rPr>
           </w:pPr>
-          <w:hyperlink w:anchor="_Toc241585260" w:history="1">
+          <w:hyperlink w:anchor="_Toc241590070" w:history="1">
             <w:r>
               <w:rPr>
                 <w:rStyle w:val="a5"/>
@@ -1915,7 +1915,7 @@
               <w:rPr>
                 <w:noProof/>
               </w:rPr>
-              <w:instrText xml:space="preserve"> PAGEREF _Toc241585260 \h </w:instrText>
+              <w:instrText xml:space="preserve"> PAGEREF _Toc241590070 \h </w:instrText>
             </w:r>
             <w:r>
               <w:rPr>
@@ -1957,7 +1957,7 @@
               <w:szCs w:val="22"/>
             </w:rPr>
           </w:pPr>
-          <w:hyperlink w:anchor="_Toc241585261" w:history="1">
+          <w:hyperlink w:anchor="_Toc241590071" w:history="1">
             <w:r>
               <w:rPr>
                 <w:rStyle w:val="a5"/>
@@ -1981,7 +1981,7 @@
               <w:rPr>
                 <w:noProof/>
               </w:rPr>
-              <w:instrText xml:space="preserve"> PAGEREF _Toc241585261 \h </w:instrText>
+              <w:instrText xml:space="preserve"> PAGEREF _Toc241590071 \h </w:instrText>
             </w:r>
             <w:r>
               <w:rPr>
@@ -2023,7 +2023,7 @@
               <w:szCs w:val="22"/>
             </w:rPr>
           </w:pPr>
-          <w:hyperlink w:anchor="_Toc241585262" w:history="1">
+          <w:hyperlink w:anchor="_Toc241590072" w:history="1">
             <w:r>
               <w:rPr>
                 <w:rStyle w:val="a5"/>
@@ -2047,7 +2047,7 @@
               <w:rPr>
                 <w:noProof/>
               </w:rPr>
-              <w:instrText xml:space="preserve"> PAGEREF _Toc241585262 \h </w:instrText>
+              <w:instrText xml:space="preserve"> PAGEREF _Toc241590072 \h </w:instrText>
             </w:r>
             <w:r>
               <w:rPr>
@@ -2064,7 +2064,7 @@
               <w:rPr>
                 <w:noProof/>
               </w:rPr>
-              <w:t>12</w:t>
+              <w:t>13</w:t>
             </w:r>
             <w:r>
               <w:rPr>
@@ -2088,7 +2088,7 @@
               <w:szCs w:val="22"/>
             </w:rPr>
           </w:pPr>
-          <w:hyperlink w:anchor="_Toc241585263" w:history="1">
+          <w:hyperlink w:anchor="_Toc241590073" w:history="1">
             <w:r>
               <w:rPr>
                 <w:rStyle w:val="a5"/>
@@ -2112,7 +2112,7 @@
               <w:rPr>
                 <w:noProof/>
               </w:rPr>
-              <w:instrText xml:space="preserve"> PAGEREF _Toc241585263 \h </w:instrText>
+              <w:instrText xml:space="preserve"> PAGEREF _Toc241590073 \h </w:instrText>
             </w:r>
             <w:r>
               <w:rPr>
@@ -2154,7 +2154,7 @@
               <w:szCs w:val="22"/>
             </w:rPr>
           </w:pPr>
-          <w:hyperlink w:anchor="_Toc241585264" w:history="1">
+          <w:hyperlink w:anchor="_Toc241590074" w:history="1">
             <w:r>
               <w:rPr>
                 <w:rStyle w:val="a5"/>
@@ -2178,7 +2178,7 @@
               <w:rPr>
                 <w:noProof/>
               </w:rPr>
-              <w:instrText xml:space="preserve"> PAGEREF _Toc241585264 \h </w:instrText>
+              <w:instrText xml:space="preserve"> PAGEREF _Toc241590074 \h </w:instrText>
             </w:r>
             <w:r>
               <w:rPr>
@@ -2220,7 +2220,7 @@
               <w:szCs w:val="22"/>
             </w:rPr>
           </w:pPr>
-          <w:hyperlink w:anchor="_Toc241585265" w:history="1">
+          <w:hyperlink w:anchor="_Toc241590075" w:history="1">
             <w:r>
               <w:rPr>
                 <w:rStyle w:val="a5"/>
@@ -2244,7 +2244,7 @@
               <w:rPr>
                 <w:noProof/>
               </w:rPr>
-              <w:instrText xml:space="preserve"> PAGEREF _Toc241585265 \h </w:instrText>
+              <w:instrText xml:space="preserve"> PAGEREF _Toc241590075 \h </w:instrText>
             </w:r>
             <w:r>
               <w:rPr>
@@ -2286,7 +2286,7 @@
               <w:szCs w:val="22"/>
             </w:rPr>
           </w:pPr>
-          <w:hyperlink w:anchor="_Toc241585266" w:history="1">
+          <w:hyperlink w:anchor="_Toc241590076" w:history="1">
             <w:r>
               <w:rPr>
                 <w:rStyle w:val="a5"/>
@@ -2310,7 +2310,7 @@
               <w:rPr>
                 <w:noProof/>
               </w:rPr>
-              <w:instrText xml:space="preserve"> PAGEREF _Toc241585266 \h </w:instrText>
+              <w:instrText xml:space="preserve"> PAGEREF _Toc241590076 \h </w:instrText>
             </w:r>
             <w:r>
               <w:rPr>
@@ -2351,7 +2351,7 @@
               <w:szCs w:val="22"/>
             </w:rPr>
           </w:pPr>
-          <w:hyperlink w:anchor="_Toc241585267" w:history="1">
+          <w:hyperlink w:anchor="_Toc241590077" w:history="1">
             <w:r>
               <w:rPr>
                 <w:rStyle w:val="a5"/>
@@ -2375,7 +2375,7 @@
               <w:rPr>
                 <w:noProof/>
               </w:rPr>
-              <w:instrText xml:space="preserve"> PAGEREF _Toc241585267 \h </w:instrText>
+              <w:instrText xml:space="preserve"> PAGEREF _Toc241590077 \h </w:instrText>
             </w:r>
             <w:r>
               <w:rPr>
@@ -2417,7 +2417,7 @@
               <w:szCs w:val="22"/>
             </w:rPr>
           </w:pPr>
-          <w:hyperlink w:anchor="_Toc241585268" w:history="1">
+          <w:hyperlink w:anchor="_Toc241590078" w:history="1">
             <w:r>
               <w:rPr>
                 <w:rStyle w:val="a5"/>
@@ -2441,7 +2441,7 @@
               <w:rPr>
                 <w:noProof/>
               </w:rPr>
-              <w:instrText xml:space="preserve"> PAGEREF _Toc241585268 \h </w:instrText>
+              <w:instrText xml:space="preserve"> PAGEREF _Toc241590078 \h </w:instrText>
             </w:r>
             <w:r>
               <w:rPr>
@@ -2483,7 +2483,7 @@
               <w:szCs w:val="22"/>
             </w:rPr>
           </w:pPr>
-          <w:hyperlink w:anchor="_Toc241585269" w:history="1">
+          <w:hyperlink w:anchor="_Toc241590079" w:history="1">
             <w:r>
               <w:rPr>
                 <w:rStyle w:val="a5"/>
@@ -2507,7 +2507,7 @@
               <w:rPr>
                 <w:noProof/>
               </w:rPr>
-              <w:instrText xml:space="preserve"> PAGEREF _Toc241585269 \h </w:instrText>
+              <w:instrText xml:space="preserve"> PAGEREF _Toc241590079 \h </w:instrText>
             </w:r>
             <w:r>
               <w:rPr>
@@ -2548,7 +2548,7 @@
               <w:szCs w:val="22"/>
             </w:rPr>
           </w:pPr>
-          <w:hyperlink w:anchor="_Toc241585270" w:history="1">
+          <w:hyperlink w:anchor="_Toc241590080" w:history="1">
             <w:r>
               <w:rPr>
                 <w:rStyle w:val="a5"/>
@@ -2572,7 +2572,7 @@
               <w:rPr>
                 <w:noProof/>
               </w:rPr>
-              <w:instrText xml:space="preserve"> PAGEREF _Toc241585270 \h </w:instrText>
+              <w:instrText xml:space="preserve"> PAGEREF _Toc241590080 \h </w:instrText>
             </w:r>
             <w:r>
               <w:rPr>
@@ -2614,7 +2614,7 @@
               <w:szCs w:val="22"/>
             </w:rPr>
           </w:pPr>
-          <w:hyperlink w:anchor="_Toc241585271" w:history="1">
+          <w:hyperlink w:anchor="_Toc241590081" w:history="1">
             <w:r>
               <w:rPr>
                 <w:rStyle w:val="a5"/>
@@ -2638,7 +2638,7 @@
               <w:rPr>
                 <w:noProof/>
               </w:rPr>
-              <w:instrText xml:space="preserve"> PAGEREF _Toc241585271 \h </w:instrText>
+              <w:instrText xml:space="preserve"> PAGEREF _Toc241590081 \h </w:instrText>
             </w:r>
             <w:r>
               <w:rPr>
@@ -2680,7 +2680,7 @@
               <w:szCs w:val="22"/>
             </w:rPr>
           </w:pPr>
-          <w:hyperlink w:anchor="_Toc241585272" w:history="1">
+          <w:hyperlink w:anchor="_Toc241590082" w:history="1">
             <w:r>
               <w:rPr>
                 <w:rStyle w:val="a5"/>
@@ -2704,7 +2704,7 @@
               <w:rPr>
                 <w:noProof/>
               </w:rPr>
-              <w:instrText xml:space="preserve"> PAGEREF _Toc241585272 \h </w:instrText>
+              <w:instrText xml:space="preserve"> PAGEREF _Toc241590082 \h </w:instrText>
             </w:r>
             <w:r>
               <w:rPr>
@@ -2745,7 +2745,7 @@
               <w:szCs w:val="22"/>
             </w:rPr>
           </w:pPr>
-          <w:hyperlink w:anchor="_Toc241585273" w:history="1">
+          <w:hyperlink w:anchor="_Toc241590083" w:history="1">
             <w:r>
               <w:rPr>
                 <w:rStyle w:val="a5"/>
@@ -2769,7 +2769,7 @@
               <w:rPr>
                 <w:noProof/>
               </w:rPr>
-              <w:instrText xml:space="preserve"> PAGEREF _Toc241585273 \h </w:instrText>
+              <w:instrText xml:space="preserve"> PAGEREF _Toc241590083 \h </w:instrText>
             </w:r>
             <w:r>
               <w:rPr>
@@ -2810,7 +2810,7 @@
               <w:szCs w:val="22"/>
             </w:rPr>
           </w:pPr>
-          <w:hyperlink w:anchor="_Toc241585274" w:history="1">
+          <w:hyperlink w:anchor="_Toc241590084" w:history="1">
             <w:r>
               <w:rPr>
                 <w:rStyle w:val="a5"/>
@@ -2834,7 +2834,7 @@
               <w:rPr>
                 <w:noProof/>
               </w:rPr>
-              <w:instrText xml:space="preserve"> PAGEREF _Toc241585274 \h </w:instrText>
+              <w:instrText xml:space="preserve"> PAGEREF _Toc241590084 \h </w:instrText>
             </w:r>
             <w:r>
               <w:rPr>
@@ -2876,7 +2876,7 @@
               <w:szCs w:val="22"/>
             </w:rPr>
           </w:pPr>
-          <w:hyperlink w:anchor="_Toc241585275" w:history="1">
+          <w:hyperlink w:anchor="_Toc241590085" w:history="1">
             <w:r>
               <w:rPr>
                 <w:rStyle w:val="a5"/>
@@ -2900,7 +2900,7 @@
               <w:rPr>
                 <w:noProof/>
               </w:rPr>
-              <w:instrText xml:space="preserve"> PAGEREF _Toc241585275 \h </w:instrText>
+              <w:instrText xml:space="preserve"> PAGEREF _Toc241590085 \h </w:instrText>
             </w:r>
             <w:r>
               <w:rPr>
@@ -2942,7 +2942,7 @@
               <w:szCs w:val="22"/>
             </w:rPr>
           </w:pPr>
-          <w:hyperlink w:anchor="_Toc241585276" w:history="1">
+          <w:hyperlink w:anchor="_Toc241590086" w:history="1">
             <w:r>
               <w:rPr>
                 <w:rStyle w:val="a5"/>
@@ -2966,7 +2966,7 @@
               <w:rPr>
                 <w:noProof/>
               </w:rPr>
-              <w:instrText xml:space="preserve"> PAGEREF _Toc241585276 \h </w:instrText>
+              <w:instrText xml:space="preserve"> PAGEREF _Toc241590086 \h </w:instrText>
             </w:r>
             <w:r>
               <w:rPr>
@@ -3008,7 +3008,7 @@
               <w:szCs w:val="22"/>
             </w:rPr>
           </w:pPr>
-          <w:hyperlink w:anchor="_Toc241585277" w:history="1">
+          <w:hyperlink w:anchor="_Toc241590087" w:history="1">
             <w:r>
               <w:rPr>
                 <w:rStyle w:val="a5"/>
@@ -3032,7 +3032,7 @@
               <w:rPr>
                 <w:noProof/>
               </w:rPr>
-              <w:instrText xml:space="preserve"> PAGEREF _Toc241585277 \h </w:instrText>
+              <w:instrText xml:space="preserve"> PAGEREF _Toc241590087 \h </w:instrText>
             </w:r>
             <w:r>
               <w:rPr>
@@ -3074,7 +3074,7 @@
               <w:szCs w:val="22"/>
             </w:rPr>
           </w:pPr>
-          <w:hyperlink w:anchor="_Toc241585278" w:history="1">
+          <w:hyperlink w:anchor="_Toc241590088" w:history="1">
             <w:r>
               <w:rPr>
                 <w:rStyle w:val="a5"/>
@@ -3098,7 +3098,7 @@
               <w:rPr>
                 <w:noProof/>
               </w:rPr>
-              <w:instrText xml:space="preserve"> PAGEREF _Toc241585278 \h </w:instrText>
+              <w:instrText xml:space="preserve"> PAGEREF _Toc241590088 \h </w:instrText>
             </w:r>
             <w:r>
               <w:rPr>
@@ -3137,7 +3137,7 @@
         <w:pStyle w:val="1"/>
         <w:pageBreakBefore/>
       </w:pPr>
-      <w:bookmarkStart w:id="0" w:name="_Toc241585245"/>
+      <w:bookmarkStart w:id="0" w:name="_Toc241590055"/>
       <w:r>
         <w:lastRenderedPageBreak/>
         <w:t xml:space="preserve">1. </w:t>
@@ -3209,7 +3209,7 @@
           <w:left w:w="10" w:type="dxa"/>
           <w:right w:w="10" w:type="dxa"/>
         </w:tblCellMar>
-        <w:tblLook w:val="0000" w:firstRow="0" w:lastRow="0" w:firstColumn="0" w:lastColumn="0" w:noHBand="0" w:noVBand="0"/>
+        <w:tblLook w:val="04A0" w:firstRow="1" w:lastRow="0" w:firstColumn="1" w:lastColumn="0" w:noHBand="0" w:noVBand="1"/>
       </w:tblPr>
       <w:tblGrid>
         <w:gridCol w:w="2647"/>
@@ -4280,7 +4280,7 @@
                 <w:sz w:val="19"/>
                 <w:szCs w:val="19"/>
               </w:rPr>
-              <w:t>발주서</w:t>
+              <w:t>메일</w:t>
             </w:r>
             <w:r>
               <w:rPr>
@@ -4298,7 +4298,7 @@
                 <w:sz w:val="19"/>
                 <w:szCs w:val="19"/>
               </w:rPr>
-              <w:t>맨</w:t>
+              <w:t>화면</w:t>
             </w:r>
             <w:r>
               <w:rPr>
@@ -4316,7 +4316,7 @@
                 <w:sz w:val="19"/>
                 <w:szCs w:val="19"/>
               </w:rPr>
-              <w:t>아래</w:t>
+              <w:t>위쪽</w:t>
             </w:r>
             <w:r>
               <w:rPr>
@@ -4751,7 +4751,7 @@
           <w:left w:w="10" w:type="dxa"/>
           <w:right w:w="10" w:type="dxa"/>
         </w:tblCellMar>
-        <w:tblLook w:val="0000" w:firstRow="0" w:lastRow="0" w:firstColumn="0" w:lastColumn="0" w:noHBand="0" w:noVBand="0"/>
+        <w:tblLook w:val="04A0" w:firstRow="1" w:lastRow="0" w:firstColumn="1" w:lastColumn="0" w:noHBand="0" w:noVBand="1"/>
       </w:tblPr>
       <w:tblGrid>
         <w:gridCol w:w="9000"/>
@@ -5230,7 +5230,7 @@
         <w:pStyle w:val="1"/>
         <w:pageBreakBefore/>
       </w:pPr>
-      <w:bookmarkStart w:id="1" w:name="_Toc241585246"/>
+      <w:bookmarkStart w:id="1" w:name="_Toc241590056"/>
       <w:r>
         <w:lastRenderedPageBreak/>
         <w:t xml:space="preserve">2. </w:t>
@@ -5250,7 +5250,7 @@
       <w:pPr>
         <w:pStyle w:val="2"/>
       </w:pPr>
-      <w:bookmarkStart w:id="2" w:name="_Toc241585247"/>
+      <w:bookmarkStart w:id="2" w:name="_Toc241590057"/>
       <w:r>
         <w:t xml:space="preserve">2-1. </w:t>
       </w:r>
@@ -5611,7 +5611,7 @@
       <w:pPr>
         <w:pStyle w:val="2"/>
       </w:pPr>
-      <w:bookmarkStart w:id="3" w:name="_Toc241585248"/>
+      <w:bookmarkStart w:id="3" w:name="_Toc241590058"/>
       <w:r>
         <w:t xml:space="preserve">2-2. </w:t>
       </w:r>
@@ -5949,7 +5949,7 @@
       <w:pPr>
         <w:pStyle w:val="2"/>
       </w:pPr>
-      <w:bookmarkStart w:id="4" w:name="_Toc241585249"/>
+      <w:bookmarkStart w:id="4" w:name="_Toc241590059"/>
       <w:r>
         <w:t xml:space="preserve">2-3. </w:t>
       </w:r>
@@ -6033,7 +6033,7 @@
       <w:pPr>
         <w:pStyle w:val="2"/>
       </w:pPr>
-      <w:bookmarkStart w:id="5" w:name="_Toc241585250"/>
+      <w:bookmarkStart w:id="5" w:name="_Toc241590060"/>
       <w:r>
         <w:t xml:space="preserve">2-4. </w:t>
       </w:r>
@@ -6202,7 +6202,7 @@
           <w:noProof/>
         </w:rPr>
         <w:drawing>
-          <wp:inline distT="0" distB="0" distL="0" distR="0" wp14:anchorId="10262DB7" wp14:editId="23B47EF4">
+          <wp:inline distT="0" distB="0" distL="0" distR="0" wp14:anchorId="70AF8AC7" wp14:editId="196BE609">
             <wp:extent cx="5715000" cy="1343025"/>
             <wp:effectExtent l="0" t="0" r="0" b="0"/>
             <wp:docPr id="1" name="그림 1"/>
@@ -6332,7 +6332,15 @@
           <w:sz w:val="17"/>
           <w:szCs w:val="17"/>
         </w:rPr>
-        <w:t>버튼과</w:t>
+        <w:t>버튼</w:t>
+      </w:r>
+      <w:r>
+        <w:rPr>
+          <w:color w:val="6F737A"/>
+          <w:sz w:val="17"/>
+          <w:szCs w:val="17"/>
+        </w:rPr>
+        <w:t>과</w:t>
       </w:r>
       <w:r>
         <w:rPr>
@@ -6464,14 +6472,7 @@
           <w:b/>
           <w:bCs/>
         </w:rPr>
-        <w:t>바뀌</w:t>
-      </w:r>
-      <w:r>
-        <w:rPr>
-          <w:b/>
-          <w:bCs/>
-        </w:rPr>
-        <w:t>었는지</w:t>
+        <w:t>바뀌었는지</w:t>
       </w:r>
       <w:r>
         <w:rPr>
@@ -6894,7 +6895,7 @@
           <w:noProof/>
         </w:rPr>
         <w:drawing>
-          <wp:inline distT="0" distB="0" distL="0" distR="0" wp14:anchorId="5E771654" wp14:editId="19A07D7E">
+          <wp:inline distT="0" distB="0" distL="0" distR="0" wp14:anchorId="5B64B6EB" wp14:editId="41CA326F">
             <wp:extent cx="4476750" cy="3962400"/>
             <wp:effectExtent l="0" t="0" r="0" b="0"/>
             <wp:docPr id="2" name="그림 2"/>
@@ -7000,7 +7001,7 @@
         <w:pStyle w:val="1"/>
         <w:pageBreakBefore/>
       </w:pPr>
-      <w:bookmarkStart w:id="6" w:name="_Toc241585251"/>
+      <w:bookmarkStart w:id="6" w:name="_Toc241590061"/>
       <w:r>
         <w:lastRenderedPageBreak/>
         <w:t xml:space="preserve">3. </w:t>
@@ -7018,7 +7019,10 @@
         <w:t xml:space="preserve"> </w:t>
       </w:r>
       <w:r>
-        <w:t>보는</w:t>
+        <w:t>보</w:t>
+      </w:r>
+      <w:r>
+        <w:t>는</w:t>
       </w:r>
       <w:r>
         <w:t xml:space="preserve"> </w:t>
@@ -7039,7 +7043,7 @@
           <w:noProof/>
         </w:rPr>
         <w:drawing>
-          <wp:inline distT="0" distB="0" distL="0" distR="0" wp14:anchorId="3CFB109B" wp14:editId="06B8EF3E">
+          <wp:inline distT="0" distB="0" distL="0" distR="0" wp14:anchorId="04FD96BB" wp14:editId="0F8C4593">
             <wp:extent cx="5715000" cy="3657600"/>
             <wp:effectExtent l="0" t="0" r="0" b="0"/>
             <wp:docPr id="3" name="그림 3"/>
@@ -7160,7 +7164,7 @@
       <w:pPr>
         <w:pStyle w:val="2"/>
       </w:pPr>
-      <w:bookmarkStart w:id="7" w:name="_Toc241585252"/>
+      <w:bookmarkStart w:id="7" w:name="_Toc241590062"/>
       <w:r>
         <w:t xml:space="preserve">3-1. </w:t>
       </w:r>
@@ -7364,7 +7368,7 @@
           <w:left w:w="10" w:type="dxa"/>
           <w:right w:w="10" w:type="dxa"/>
         </w:tblCellMar>
-        <w:tblLook w:val="0000" w:firstRow="0" w:lastRow="0" w:firstColumn="0" w:lastColumn="0" w:noHBand="0" w:noVBand="0"/>
+        <w:tblLook w:val="04A0" w:firstRow="1" w:lastRow="0" w:firstColumn="1" w:lastColumn="0" w:noHBand="0" w:noVBand="1"/>
       </w:tblPr>
       <w:tblGrid>
         <w:gridCol w:w="2700"/>
@@ -8626,7 +8630,7 @@
       <w:pPr>
         <w:pStyle w:val="2"/>
       </w:pPr>
-      <w:bookmarkStart w:id="8" w:name="_Toc241585253"/>
+      <w:bookmarkStart w:id="8" w:name="_Toc241590063"/>
       <w:r>
         <w:lastRenderedPageBreak/>
         <w:t xml:space="preserve">3-2. </w:t>
@@ -8663,7 +8667,7 @@
           <w:left w:w="10" w:type="dxa"/>
           <w:right w:w="10" w:type="dxa"/>
         </w:tblCellMar>
-        <w:tblLook w:val="0000" w:firstRow="0" w:lastRow="0" w:firstColumn="0" w:lastColumn="0" w:noHBand="0" w:noVBand="0"/>
+        <w:tblLook w:val="04A0" w:firstRow="1" w:lastRow="0" w:firstColumn="1" w:lastColumn="0" w:noHBand="0" w:noVBand="1"/>
       </w:tblPr>
       <w:tblGrid>
         <w:gridCol w:w="2925"/>
@@ -10307,7 +10311,7 @@
       <w:pPr>
         <w:pStyle w:val="2"/>
       </w:pPr>
-      <w:bookmarkStart w:id="9" w:name="_Toc241585254"/>
+      <w:bookmarkStart w:id="9" w:name="_Toc241590064"/>
       <w:r>
         <w:t xml:space="preserve">3-3. </w:t>
       </w:r>
@@ -10664,6 +10668,142 @@
     </w:p>
     <w:p>
       <w:pPr>
+        <w:pStyle w:val="a4"/>
+        <w:numPr>
+          <w:ilvl w:val="0"/>
+          <w:numId w:val="5"/>
+        </w:numPr>
+        <w:spacing w:after="80" w:line="300" w:lineRule="auto"/>
+      </w:pPr>
+      <w:r>
+        <w:t>목록을</w:t>
+      </w:r>
+      <w:r>
+        <w:t xml:space="preserve"> </w:t>
+      </w:r>
+      <w:r>
+        <w:t>아래로</w:t>
+      </w:r>
+      <w:r>
+        <w:t xml:space="preserve"> </w:t>
+      </w:r>
+      <w:r>
+        <w:t>내려도</w:t>
+      </w:r>
+      <w:r>
+        <w:t xml:space="preserve"> </w:t>
+      </w:r>
+      <w:r>
+        <w:t>탭</w:t>
+      </w:r>
+      <w:r>
+        <w:t xml:space="preserve"> · </w:t>
+      </w:r>
+      <w:r>
+        <w:t>검색</w:t>
+      </w:r>
+      <w:r>
+        <w:t xml:space="preserve"> · </w:t>
+      </w:r>
+      <w:r>
+        <w:t>라벨</w:t>
+      </w:r>
+      <w:r>
+        <w:t xml:space="preserve"> </w:t>
+      </w:r>
+      <w:r>
+        <w:t>필터와</w:t>
+      </w:r>
+      <w:r>
+        <w:t xml:space="preserve"> </w:t>
+      </w:r>
+      <w:r>
+        <w:t>표</w:t>
+      </w:r>
+      <w:r>
+        <w:t xml:space="preserve"> </w:t>
+      </w:r>
+      <w:r>
+        <w:t>제목</w:t>
+      </w:r>
+      <w:r>
+        <w:t xml:space="preserve"> </w:t>
+      </w:r>
+      <w:r>
+        <w:t>줄은</w:t>
+      </w:r>
+      <w:r>
+        <w:t xml:space="preserve"> </w:t>
+      </w:r>
+      <w:r>
+        <w:t>화면</w:t>
+      </w:r>
+      <w:r>
+        <w:t xml:space="preserve"> </w:t>
+      </w:r>
+      <w:r>
+        <w:t>위에</w:t>
+      </w:r>
+      <w:r>
+        <w:t xml:space="preserve"> </w:t>
+      </w:r>
+      <w:r>
+        <w:t>붙어</w:t>
+      </w:r>
+      <w:r>
+        <w:t xml:space="preserve"> </w:t>
+      </w:r>
+      <w:r>
+        <w:t>있어서</w:t>
+      </w:r>
+      <w:r>
+        <w:t xml:space="preserve">, </w:t>
+      </w:r>
+      <w:r>
+        <w:t>긴</w:t>
+      </w:r>
+      <w:r>
+        <w:t xml:space="preserve"> </w:t>
+      </w:r>
+      <w:r>
+        <w:t>목록</w:t>
+      </w:r>
+      <w:r>
+        <w:t xml:space="preserve"> </w:t>
+      </w:r>
+      <w:r>
+        <w:t>중간에서도</w:t>
+      </w:r>
+      <w:r>
+        <w:t xml:space="preserve"> </w:t>
+      </w:r>
+      <w:r>
+        <w:t>바로</w:t>
+      </w:r>
+      <w:r>
+        <w:t xml:space="preserve"> </w:t>
+      </w:r>
+      <w:r>
+        <w:t>바꿀</w:t>
+      </w:r>
+      <w:r>
+        <w:t xml:space="preserve"> </w:t>
+      </w:r>
+      <w:r>
+        <w:t>수</w:t>
+      </w:r>
+      <w:r>
+        <w:t xml:space="preserve"> </w:t>
+      </w:r>
+      <w:r>
+        <w:t>있어요</w:t>
+      </w:r>
+      <w:r>
+        <w:t>.</w:t>
+      </w:r>
+    </w:p>
+    <w:p>
+      <w:pPr>
         <w:keepNext/>
         <w:spacing w:before="120" w:after="80"/>
         <w:jc w:val="center"/>
@@ -10673,7 +10813,7 @@
           <w:noProof/>
         </w:rPr>
         <w:drawing>
-          <wp:inline distT="0" distB="0" distL="0" distR="0" wp14:anchorId="7FBEC455" wp14:editId="547EF487">
+          <wp:inline distT="0" distB="0" distL="0" distR="0" wp14:anchorId="1355D060" wp14:editId="5E27C0A6">
             <wp:extent cx="5715000" cy="1876425"/>
             <wp:effectExtent l="0" t="0" r="0" b="0"/>
             <wp:docPr id="4" name="그림 4"/>
@@ -10786,8 +10926,9 @@
       <w:pPr>
         <w:pStyle w:val="2"/>
       </w:pPr>
-      <w:bookmarkStart w:id="10" w:name="_Toc241585255"/>
-      <w:r>
+      <w:bookmarkStart w:id="10" w:name="_Toc241590065"/>
+      <w:r>
+        <w:lastRenderedPageBreak/>
         <w:t xml:space="preserve">3-4. </w:t>
       </w:r>
       <w:r>
@@ -10938,9 +11079,8 @@
         <w:rPr>
           <w:noProof/>
         </w:rPr>
-        <w:lastRenderedPageBreak/>
         <w:drawing>
-          <wp:inline distT="0" distB="0" distL="0" distR="0" wp14:anchorId="2577BE6E" wp14:editId="7DD13E33">
+          <wp:inline distT="0" distB="0" distL="0" distR="0" wp14:anchorId="36168EFA" wp14:editId="1A77CB2A">
             <wp:extent cx="5715000" cy="3390900"/>
             <wp:effectExtent l="0" t="0" r="0" b="0"/>
             <wp:docPr id="5" name="그림 5"/>
@@ -11507,7 +11647,7 @@
       <w:pPr>
         <w:pStyle w:val="2"/>
       </w:pPr>
-      <w:bookmarkStart w:id="11" w:name="_Toc241585256"/>
+      <w:bookmarkStart w:id="11" w:name="_Toc241590066"/>
       <w:r>
         <w:t xml:space="preserve">3-5. </w:t>
       </w:r>
@@ -11588,7 +11728,10 @@
         <w:t xml:space="preserve">. </w:t>
       </w:r>
       <w:r>
-        <w:t>받아오는</w:t>
+        <w:t>받아</w:t>
+      </w:r>
+      <w:r>
+        <w:t>오는</w:t>
       </w:r>
       <w:r>
         <w:t xml:space="preserve"> </w:t>
@@ -11629,7 +11772,7 @@
         <w:pStyle w:val="1"/>
         <w:pageBreakBefore/>
       </w:pPr>
-      <w:bookmarkStart w:id="12" w:name="_Toc241585257"/>
+      <w:bookmarkStart w:id="12" w:name="_Toc241590067"/>
       <w:r>
         <w:lastRenderedPageBreak/>
         <w:t xml:space="preserve">4. </w:t>
@@ -11856,7 +11999,7 @@
       <w:pPr>
         <w:pStyle w:val="2"/>
       </w:pPr>
-      <w:bookmarkStart w:id="13" w:name="_Toc241585258"/>
+      <w:bookmarkStart w:id="13" w:name="_Toc241590068"/>
       <w:r>
         <w:t xml:space="preserve">4-1. </w:t>
       </w:r>
@@ -11888,7 +12031,7 @@
           <w:noProof/>
         </w:rPr>
         <w:drawing>
-          <wp:inline distT="0" distB="0" distL="0" distR="0" wp14:anchorId="5F4C2C3A" wp14:editId="08499719">
+          <wp:inline distT="0" distB="0" distL="0" distR="0" wp14:anchorId="00B9C288" wp14:editId="71689EB0">
             <wp:extent cx="5143500" cy="4648200"/>
             <wp:effectExtent l="0" t="0" r="0" b="0"/>
             <wp:docPr id="6" name="그림 6"/>
@@ -11970,7 +12113,7 @@
           <w:sz w:val="17"/>
           <w:szCs w:val="17"/>
         </w:rPr>
-        <w:t>그</w:t>
+        <w:t>품목</w:t>
       </w:r>
       <w:r>
         <w:rPr>
@@ -11986,7 +12129,7 @@
           <w:sz w:val="17"/>
           <w:szCs w:val="17"/>
         </w:rPr>
-        <w:t>업체</w:t>
+        <w:t>화면으로</w:t>
       </w:r>
       <w:r>
         <w:rPr>
@@ -12002,7 +12145,7 @@
           <w:sz w:val="17"/>
           <w:szCs w:val="17"/>
         </w:rPr>
-        <w:t>품목이</w:t>
+        <w:t>넘어가요</w:t>
       </w:r>
       <w:r>
         <w:rPr>
@@ -12010,7 +12153,7 @@
           <w:sz w:val="17"/>
           <w:szCs w:val="17"/>
         </w:rPr>
-        <w:t xml:space="preserve"> </w:t>
+        <w:t xml:space="preserve"> — </w:t>
       </w:r>
       <w:r>
         <w:rPr>
@@ -12018,7 +12161,7 @@
           <w:sz w:val="17"/>
           <w:szCs w:val="17"/>
         </w:rPr>
-        <w:t>나와요</w:t>
+        <w:t>위쪽</w:t>
       </w:r>
       <w:r>
         <w:rPr>
@@ -12026,7 +12169,7 @@
           <w:sz w:val="17"/>
           <w:szCs w:val="17"/>
         </w:rPr>
-        <w:t xml:space="preserve"> (</w:t>
+        <w:t xml:space="preserve"> </w:t>
       </w:r>
       <w:r>
         <w:rPr>
@@ -12034,7 +12177,7 @@
           <w:sz w:val="17"/>
           <w:szCs w:val="17"/>
         </w:rPr>
-        <w:t>발주</w:t>
+        <w:t>요약</w:t>
       </w:r>
       <w:r>
         <w:rPr>
@@ -12042,7 +12185,7 @@
           <w:sz w:val="17"/>
           <w:szCs w:val="17"/>
         </w:rPr>
-        <w:t xml:space="preserve"> </w:t>
+        <w:t>·</w:t>
       </w:r>
       <w:r>
         <w:rPr>
@@ -12050,7 +12193,7 @@
           <w:sz w:val="17"/>
           <w:szCs w:val="17"/>
         </w:rPr>
-        <w:t>필요</w:t>
+        <w:t>버튼은</w:t>
       </w:r>
       <w:r>
         <w:rPr>
@@ -12066,7 +12209,7 @@
           <w:sz w:val="17"/>
           <w:szCs w:val="17"/>
         </w:rPr>
-        <w:t>품목은</w:t>
+        <w:t>고정되고</w:t>
       </w:r>
       <w:r>
         <w:rPr>
@@ -12082,7 +12225,7 @@
           <w:sz w:val="17"/>
           <w:szCs w:val="17"/>
         </w:rPr>
-        <w:t>미리</w:t>
+        <w:t>품목만</w:t>
       </w:r>
       <w:r>
         <w:rPr>
@@ -12098,15 +12241,7 @@
           <w:sz w:val="17"/>
           <w:szCs w:val="17"/>
         </w:rPr>
-        <w:t>체크</w:t>
-      </w:r>
-      <w:r>
-        <w:rPr>
-          <w:color w:val="6F737A"/>
-          <w:sz w:val="17"/>
-          <w:szCs w:val="17"/>
-        </w:rPr>
-        <w:t>)</w:t>
+        <w:t>스크롤돼요</w:t>
       </w:r>
     </w:p>
     <w:p>
@@ -12278,7 +12413,85 @@
         <w:t>보여요</w:t>
       </w:r>
       <w:r>
-        <w:t>.</w:t>
+        <w:t>. (</w:t>
+      </w:r>
+      <w:r>
+        <w:t>첫</w:t>
+      </w:r>
+      <w:r>
+        <w:t xml:space="preserve"> </w:t>
+      </w:r>
+      <w:r>
+        <w:t>화면</w:t>
+      </w:r>
+      <w:r>
+        <w:t xml:space="preserve"> '○○</w:t>
+      </w:r>
+      <w:r>
+        <w:t>에</w:t>
+      </w:r>
+      <w:r>
+        <w:t xml:space="preserve"> </w:t>
+      </w:r>
+      <w:r>
+        <w:t>발주하기</w:t>
+      </w:r>
+      <w:r>
+        <w:t>'</w:t>
+      </w:r>
+      <w:r>
+        <w:t>로</w:t>
+      </w:r>
+      <w:r>
+        <w:t xml:space="preserve"> </w:t>
+      </w:r>
+      <w:r>
+        <w:t>열면</w:t>
+      </w:r>
+      <w:r>
+        <w:t xml:space="preserve"> </w:t>
+      </w:r>
+      <w:r>
+        <w:t>이</w:t>
+      </w:r>
+      <w:r>
+        <w:t xml:space="preserve"> </w:t>
+      </w:r>
+      <w:r>
+        <w:t>단계</w:t>
+      </w:r>
+      <w:r>
+        <w:t xml:space="preserve"> </w:t>
+      </w:r>
+      <w:r>
+        <w:t>없이</w:t>
+      </w:r>
+      <w:r>
+        <w:t xml:space="preserve"> </w:t>
+      </w:r>
+      <w:r>
+        <w:t>바로</w:t>
+      </w:r>
+      <w:r>
+        <w:t xml:space="preserve"> </w:t>
+      </w:r>
+      <w:r>
+        <w:t>품목</w:t>
+      </w:r>
+      <w:r>
+        <w:t xml:space="preserve"> </w:t>
+      </w:r>
+      <w:r>
+        <w:t>화면이</w:t>
+      </w:r>
+      <w:r>
+        <w:t xml:space="preserve"> </w:t>
+      </w:r>
+      <w:r>
+        <w:t>나와요</w:t>
+      </w:r>
+      <w:r>
+        <w:t>.)</w:t>
       </w:r>
     </w:p>
     <w:p>
@@ -12303,93 +12516,99 @@
         <w:t xml:space="preserve"> </w:t>
       </w:r>
       <w:r>
-        <w:t>품목이</w:t>
-      </w:r>
-      <w:r>
-        <w:t xml:space="preserve"> </w:t>
-      </w:r>
-      <w:r>
-        <w:t>나오고</w:t>
+        <w:t>품목</w:t>
+      </w:r>
+      <w:r>
+        <w:t xml:space="preserve"> </w:t>
+      </w:r>
+      <w:r>
+        <w:t>화면으로</w:t>
+      </w:r>
+      <w:r>
+        <w:t xml:space="preserve"> </w:t>
+      </w:r>
+      <w:r>
+        <w:t>넘어가요</w:t>
+      </w:r>
+      <w:r>
+        <w:t xml:space="preserve">. </w:t>
+      </w:r>
+      <w:r>
+        <w:rPr>
+          <w:b/>
+          <w:bCs/>
+        </w:rPr>
+        <w:t>발주가</w:t>
+      </w:r>
+      <w:r>
+        <w:rPr>
+          <w:b/>
+          <w:bCs/>
+        </w:rPr>
+        <w:t xml:space="preserve"> </w:t>
+      </w:r>
+      <w:r>
+        <w:rPr>
+          <w:b/>
+          <w:bCs/>
+        </w:rPr>
+        <w:t>필요한</w:t>
+      </w:r>
+      <w:r>
+        <w:rPr>
+          <w:b/>
+          <w:bCs/>
+        </w:rPr>
+        <w:t xml:space="preserve"> </w:t>
+      </w:r>
+      <w:r>
+        <w:rPr>
+          <w:b/>
+          <w:bCs/>
+        </w:rPr>
+        <w:t>품목은</w:t>
+      </w:r>
+      <w:r>
+        <w:rPr>
+          <w:b/>
+          <w:bCs/>
+        </w:rPr>
+        <w:t xml:space="preserve"> </w:t>
+      </w:r>
+      <w:r>
+        <w:rPr>
+          <w:b/>
+          <w:bCs/>
+        </w:rPr>
+        <w:t>미리</w:t>
+      </w:r>
+      <w:r>
+        <w:rPr>
+          <w:b/>
+          <w:bCs/>
+        </w:rPr>
+        <w:t xml:space="preserve"> </w:t>
+      </w:r>
+      <w:r>
+        <w:rPr>
+          <w:b/>
+          <w:bCs/>
+        </w:rPr>
+        <w:t>체크</w:t>
+      </w:r>
+      <w:r>
+        <w:t>돼</w:t>
+      </w:r>
+      <w:r>
+        <w:t xml:space="preserve"> </w:t>
+      </w:r>
+      <w:r>
+        <w:t>있고</w:t>
       </w:r>
       <w:r>
         <w:t xml:space="preserve">, </w:t>
       </w:r>
       <w:r>
-        <w:rPr>
-          <w:b/>
-          <w:bCs/>
-        </w:rPr>
-        <w:t>발주가</w:t>
-      </w:r>
-      <w:r>
-        <w:rPr>
-          <w:b/>
-          <w:bCs/>
-        </w:rPr>
-        <w:t xml:space="preserve"> </w:t>
-      </w:r>
-      <w:r>
-        <w:rPr>
-          <w:b/>
-          <w:bCs/>
-        </w:rPr>
-        <w:t>필요한</w:t>
-      </w:r>
-      <w:r>
-        <w:rPr>
-          <w:b/>
-          <w:bCs/>
-        </w:rPr>
-        <w:t xml:space="preserve"> </w:t>
-      </w:r>
-      <w:r>
-        <w:rPr>
-          <w:b/>
-          <w:bCs/>
-        </w:rPr>
-        <w:t>품목은</w:t>
-      </w:r>
-      <w:r>
-        <w:rPr>
-          <w:b/>
-          <w:bCs/>
-        </w:rPr>
-        <w:t xml:space="preserve"> </w:t>
-      </w:r>
-      <w:r>
-        <w:rPr>
-          <w:b/>
-          <w:bCs/>
-        </w:rPr>
-        <w:t>미리</w:t>
-      </w:r>
-      <w:r>
-        <w:rPr>
-          <w:b/>
-          <w:bCs/>
-        </w:rPr>
-        <w:t xml:space="preserve"> </w:t>
-      </w:r>
-      <w:r>
-        <w:rPr>
-          <w:b/>
-          <w:bCs/>
-        </w:rPr>
-        <w:t>체크</w:t>
-      </w:r>
-      <w:r>
-        <w:t>돼</w:t>
-      </w:r>
-      <w:r>
-        <w:t xml:space="preserve"> </w:t>
-      </w:r>
-      <w:r>
-        <w:t>있어요</w:t>
-      </w:r>
-      <w:r>
-        <w:t xml:space="preserve">. </w:t>
-      </w:r>
-      <w:r>
         <w:t>수량은</w:t>
       </w:r>
       <w:r>
@@ -12420,10 +12639,10 @@
         <w:t xml:space="preserve"> </w:t>
       </w:r>
       <w:r>
-        <w:t>있고</w:t>
-      </w:r>
-      <w:r>
-        <w:t xml:space="preserve">, </w:t>
+        <w:t>있어</w:t>
+      </w:r>
+      <w:r>
+        <w:t xml:space="preserve"> </w:t>
       </w:r>
       <w:r>
         <w:t>칸을</w:t>
@@ -12520,7 +12739,7 @@
         <w:t xml:space="preserve"> </w:t>
       </w:r>
       <w:r>
-        <w:t>아래</w:t>
+        <w:t>위쪽</w:t>
       </w:r>
       <w:r>
         <w:t xml:space="preserve"> </w:t>
@@ -12612,7 +12831,8 @@
         <w:spacing w:after="100" w:line="300" w:lineRule="auto"/>
       </w:pPr>
       <w:r>
-        <w:t>아래</w:t>
+        <w:lastRenderedPageBreak/>
+        <w:t>위쪽</w:t>
       </w:r>
       <w:r>
         <w:t xml:space="preserve"> '</w:t>
@@ -12671,7 +12891,14 @@
           <w:b/>
           <w:bCs/>
         </w:rPr>
-        <w:t>메일</w:t>
+        <w:t>메</w:t>
+      </w:r>
+      <w:r>
+        <w:rPr>
+          <w:b/>
+          <w:bCs/>
+        </w:rPr>
+        <w:t>일</w:t>
       </w:r>
       <w:r>
         <w:rPr>
@@ -12716,6 +12943,54 @@
       </w:r>
       <w:r>
         <w:t>누릅니다</w:t>
+      </w:r>
+      <w:r>
+        <w:t xml:space="preserve">. </w:t>
+      </w:r>
+      <w:r>
+        <w:t>품목을</w:t>
+      </w:r>
+      <w:r>
+        <w:t xml:space="preserve"> </w:t>
+      </w:r>
+      <w:r>
+        <w:t>아래로</w:t>
+      </w:r>
+      <w:r>
+        <w:t xml:space="preserve"> </w:t>
+      </w:r>
+      <w:r>
+        <w:t>내려도</w:t>
+      </w:r>
+      <w:r>
+        <w:t xml:space="preserve"> </w:t>
+      </w:r>
+      <w:r>
+        <w:t>이</w:t>
+      </w:r>
+      <w:r>
+        <w:t xml:space="preserve"> </w:t>
+      </w:r>
+      <w:r>
+        <w:t>줄은</w:t>
+      </w:r>
+      <w:r>
+        <w:t xml:space="preserve"> </w:t>
+      </w:r>
+      <w:r>
+        <w:t>위에</w:t>
+      </w:r>
+      <w:r>
+        <w:t xml:space="preserve"> </w:t>
+      </w:r>
+      <w:r>
+        <w:t>그대로</w:t>
+      </w:r>
+      <w:r>
+        <w:t xml:space="preserve"> </w:t>
+      </w:r>
+      <w:r>
+        <w:t>있어요</w:t>
       </w:r>
       <w:r>
         <w:t>.</w:t>
@@ -12725,9 +13000,8 @@
       <w:pPr>
         <w:pStyle w:val="2"/>
       </w:pPr>
-      <w:bookmarkStart w:id="14" w:name="_Toc241585259"/>
-      <w:r>
-        <w:lastRenderedPageBreak/>
+      <w:bookmarkStart w:id="14" w:name="_Toc241590069"/>
+      <w:r>
         <w:t xml:space="preserve">4-2. </w:t>
       </w:r>
       <w:r>
@@ -12758,8 +13032,8 @@
           <w:noProof/>
         </w:rPr>
         <w:drawing>
-          <wp:inline distT="0" distB="0" distL="0" distR="0" wp14:anchorId="0A364E63" wp14:editId="6069D732">
-            <wp:extent cx="5143500" cy="5943600"/>
+          <wp:inline distT="0" distB="0" distL="0" distR="0" wp14:anchorId="559CCA7C" wp14:editId="7B10E8DC">
+            <wp:extent cx="5143500" cy="5962650"/>
             <wp:effectExtent l="0" t="0" r="0" b="0"/>
             <wp:docPr id="7" name="그림 7"/>
             <wp:cNvGraphicFramePr>
@@ -12784,7 +13058,7 @@
                   <pic:spPr bwMode="auto">
                     <a:xfrm>
                       <a:off x="0" y="0"/>
-                      <a:ext cx="5143500" cy="5943600"/>
+                      <a:ext cx="5143500" cy="5962650"/>
                     </a:xfrm>
                     <a:prstGeom prst="rect">
                       <a:avLst/>
@@ -13260,6 +13534,7 @@
         <w:spacing w:after="80" w:line="300" w:lineRule="auto"/>
       </w:pPr>
       <w:r>
+        <w:lastRenderedPageBreak/>
         <w:t>제목</w:t>
       </w:r>
       <w:r>
@@ -13442,6 +13717,83 @@
         <w:t>있어요</w:t>
       </w:r>
       <w:r>
+        <w:t xml:space="preserve">. </w:t>
+      </w:r>
+      <w:r>
+        <w:t>다른</w:t>
+      </w:r>
+      <w:r>
+        <w:t xml:space="preserve"> </w:t>
+      </w:r>
+      <w:r>
+        <w:t>업체로</w:t>
+      </w:r>
+      <w:r>
+        <w:t xml:space="preserve"> </w:t>
+      </w:r>
+      <w:r>
+        <w:t>바꾸려면</w:t>
+      </w:r>
+      <w:r>
+        <w:t xml:space="preserve"> </w:t>
+      </w:r>
+      <w:r>
+        <w:t>품목</w:t>
+      </w:r>
+      <w:r>
+        <w:t xml:space="preserve"> </w:t>
+      </w:r>
+      <w:r>
+        <w:t>화면의</w:t>
+      </w:r>
+      <w:r>
+        <w:t xml:space="preserve"> </w:t>
+      </w:r>
+      <w:r>
+        <w:rPr>
+          <w:b/>
+          <w:bCs/>
+        </w:rPr>
+        <w:t>'</w:t>
+      </w:r>
+      <w:r>
+        <w:rPr>
+          <w:b/>
+          <w:bCs/>
+        </w:rPr>
+        <w:t>업체</w:t>
+      </w:r>
+      <w:r>
+        <w:rPr>
+          <w:b/>
+          <w:bCs/>
+        </w:rPr>
+        <w:t xml:space="preserve"> </w:t>
+      </w:r>
+      <w:r>
+        <w:rPr>
+          <w:b/>
+          <w:bCs/>
+        </w:rPr>
+        <w:t>바꾸기</w:t>
+      </w:r>
+      <w:r>
+        <w:rPr>
+          <w:b/>
+          <w:bCs/>
+        </w:rPr>
+        <w:t>'</w:t>
+      </w:r>
+      <w:r>
+        <w:t>를</w:t>
+      </w:r>
+      <w:r>
+        <w:t xml:space="preserve"> </w:t>
+      </w:r>
+      <w:r>
+        <w:t>누르세요</w:t>
+      </w:r>
+      <w:r>
         <w:t>.</w:t>
       </w:r>
     </w:p>
@@ -13455,7 +13807,6 @@
         <w:spacing w:after="80" w:line="300" w:lineRule="auto"/>
       </w:pPr>
       <w:r>
-        <w:lastRenderedPageBreak/>
         <w:t>PC</w:t>
       </w:r>
       <w:r>
@@ -13584,7 +13935,7 @@
       <w:pPr>
         <w:pStyle w:val="2"/>
       </w:pPr>
-      <w:bookmarkStart w:id="15" w:name="_Toc241585260"/>
+      <w:bookmarkStart w:id="15" w:name="_Toc241590070"/>
       <w:r>
         <w:t xml:space="preserve">4-3. </w:t>
       </w:r>
@@ -13763,7 +14114,7 @@
           <w:left w:w="10" w:type="dxa"/>
           <w:right w:w="10" w:type="dxa"/>
         </w:tblCellMar>
-        <w:tblLook w:val="0000" w:firstRow="0" w:lastRow="0" w:firstColumn="0" w:lastColumn="0" w:noHBand="0" w:noVBand="0"/>
+        <w:tblLook w:val="04A0" w:firstRow="1" w:lastRow="0" w:firstColumn="1" w:lastColumn="0" w:noHBand="0" w:noVBand="1"/>
       </w:tblPr>
       <w:tblGrid>
         <w:gridCol w:w="1674"/>
@@ -14482,10 +14833,30 @@
           <w:b/>
           <w:bCs/>
         </w:rPr>
+        <w:t>변경</w:t>
+      </w:r>
+      <w:r>
+        <w:rPr>
+          <w:b/>
+          <w:bCs/>
+        </w:rPr>
+        <w:t xml:space="preserve"> </w:t>
+      </w:r>
+      <w:r>
+        <w:rPr>
+          <w:b/>
+          <w:bCs/>
+        </w:rPr>
         <w:t>저장</w:t>
       </w:r>
       <w:r>
-        <w:t>합니다</w:t>
+        <w:t>을</w:t>
+      </w:r>
+      <w:r>
+        <w:t xml:space="preserve"> </w:t>
+      </w:r>
+      <w:r>
+        <w:t>누릅니다</w:t>
       </w:r>
       <w:r>
         <w:t>.</w:t>
@@ -14721,7 +15092,7 @@
           <w:left w:w="10" w:type="dxa"/>
           <w:right w:w="10" w:type="dxa"/>
         </w:tblCellMar>
-        <w:tblLook w:val="0000" w:firstRow="0" w:lastRow="0" w:firstColumn="0" w:lastColumn="0" w:noHBand="0" w:noVBand="0"/>
+        <w:tblLook w:val="04A0" w:firstRow="1" w:lastRow="0" w:firstColumn="1" w:lastColumn="0" w:noHBand="0" w:noVBand="1"/>
       </w:tblPr>
       <w:tblGrid>
         <w:gridCol w:w="9000"/>
@@ -15101,7 +15472,7 @@
       <w:pPr>
         <w:pStyle w:val="2"/>
       </w:pPr>
-      <w:bookmarkStart w:id="16" w:name="_Toc241585261"/>
+      <w:bookmarkStart w:id="16" w:name="_Toc241590071"/>
       <w:r>
         <w:t xml:space="preserve">4-4. </w:t>
       </w:r>
@@ -15281,9 +15652,10 @@
         <w:rPr>
           <w:noProof/>
         </w:rPr>
+        <w:lastRenderedPageBreak/>
         <w:drawing>
-          <wp:inline distT="0" distB="0" distL="0" distR="0" wp14:anchorId="577191F3" wp14:editId="3AF8E9A0">
-            <wp:extent cx="5143500" cy="1038225"/>
+          <wp:inline distT="0" distB="0" distL="0" distR="0" wp14:anchorId="52C23CC0" wp14:editId="00A18345">
+            <wp:extent cx="5143500" cy="1304925"/>
             <wp:effectExtent l="0" t="0" r="0" b="0"/>
             <wp:docPr id="8" name="그림 8"/>
             <wp:cNvGraphicFramePr>
@@ -15308,7 +15680,7 @@
                   <pic:spPr bwMode="auto">
                     <a:xfrm>
                       <a:off x="0" y="0"/>
-                      <a:ext cx="5143500" cy="1038225"/>
+                      <a:ext cx="5143500" cy="1304925"/>
                     </a:xfrm>
                     <a:prstGeom prst="rect">
                       <a:avLst/>
@@ -15364,23 +15736,7 @@
           <w:sz w:val="17"/>
           <w:szCs w:val="17"/>
         </w:rPr>
-        <w:t>맨</w:t>
-      </w:r>
-      <w:r>
-        <w:rPr>
-          <w:color w:val="6F737A"/>
-          <w:sz w:val="17"/>
-          <w:szCs w:val="17"/>
-        </w:rPr>
-        <w:t xml:space="preserve"> </w:t>
-      </w:r>
-      <w:r>
-        <w:rPr>
-          <w:color w:val="6F737A"/>
-          <w:sz w:val="17"/>
-          <w:szCs w:val="17"/>
-        </w:rPr>
-        <w:t>아래</w:t>
+        <w:t>위쪽</w:t>
       </w:r>
       <w:r>
         <w:rPr>
@@ -15519,19 +15875,19 @@
         <w:t xml:space="preserve">, </w:t>
       </w:r>
       <w:r>
-        <w:t>발주서</w:t>
-      </w:r>
-      <w:r>
-        <w:t xml:space="preserve"> </w:t>
-      </w:r>
-      <w:r>
-        <w:t>맨</w:t>
-      </w:r>
-      <w:r>
-        <w:t xml:space="preserve"> </w:t>
-      </w:r>
-      <w:r>
-        <w:t>아래</w:t>
+        <w:t>메일</w:t>
+      </w:r>
+      <w:r>
+        <w:t xml:space="preserve"> </w:t>
+      </w:r>
+      <w:r>
+        <w:t>화면</w:t>
+      </w:r>
+      <w:r>
+        <w:t xml:space="preserve"> </w:t>
+      </w:r>
+      <w:r>
+        <w:t>위쪽</w:t>
       </w:r>
       <w:r>
         <w:t xml:space="preserve"> </w:t>
@@ -15593,6 +15949,51 @@
       </w:r>
       <w:r>
         <w:t>누릅니다</w:t>
+      </w:r>
+      <w:r>
+        <w:t xml:space="preserve">. </w:t>
+      </w:r>
+      <w:r>
+        <w:t>본문을</w:t>
+      </w:r>
+      <w:r>
+        <w:t xml:space="preserve"> </w:t>
+      </w:r>
+      <w:r>
+        <w:t>내려도</w:t>
+      </w:r>
+      <w:r>
+        <w:t xml:space="preserve"> </w:t>
+      </w:r>
+      <w:r>
+        <w:t>이</w:t>
+      </w:r>
+      <w:r>
+        <w:t xml:space="preserve"> </w:t>
+      </w:r>
+      <w:r>
+        <w:t>칸은</w:t>
+      </w:r>
+      <w:r>
+        <w:t xml:space="preserve"> </w:t>
+      </w:r>
+      <w:r>
+        <w:t>위에</w:t>
+      </w:r>
+      <w:r>
+        <w:t xml:space="preserve"> </w:t>
+      </w:r>
+      <w:r>
+        <w:t>그대로</w:t>
+      </w:r>
+      <w:r>
+        <w:t xml:space="preserve"> </w:t>
+      </w:r>
+      <w:r>
+        <w:t>있어</w:t>
+      </w:r>
+      <w:r>
+        <w:t>요</w:t>
       </w:r>
       <w:r>
         <w:t>.</w:t>
@@ -15608,7 +16009,6 @@
         <w:spacing w:after="100" w:line="300" w:lineRule="auto"/>
       </w:pPr>
       <w:r>
-        <w:lastRenderedPageBreak/>
         <w:t>기록한</w:t>
       </w:r>
       <w:r>
@@ -15954,7 +16354,7 @@
           <w:noProof/>
         </w:rPr>
         <w:drawing>
-          <wp:inline distT="0" distB="0" distL="0" distR="0" wp14:anchorId="7A276A80" wp14:editId="552DA65C">
+          <wp:inline distT="0" distB="0" distL="0" distR="0" wp14:anchorId="4F35A8A9" wp14:editId="589436E2">
             <wp:extent cx="5715000" cy="1876425"/>
             <wp:effectExtent l="0" t="0" r="0" b="0"/>
             <wp:docPr id="9" name="그림 9"/>
@@ -16211,8 +16611,9 @@
       <w:pPr>
         <w:pStyle w:val="2"/>
       </w:pPr>
-      <w:bookmarkStart w:id="17" w:name="_Toc241585262"/>
-      <w:r>
+      <w:bookmarkStart w:id="17" w:name="_Toc241590072"/>
+      <w:r>
+        <w:lastRenderedPageBreak/>
         <w:t xml:space="preserve">4-5. </w:t>
       </w:r>
       <w:r>
@@ -16237,7 +16638,7 @@
           <w:noProof/>
         </w:rPr>
         <w:drawing>
-          <wp:inline distT="0" distB="0" distL="0" distR="0" wp14:anchorId="53540CFC" wp14:editId="5A82F929">
+          <wp:inline distT="0" distB="0" distL="0" distR="0" wp14:anchorId="490A5916" wp14:editId="2D088ACB">
             <wp:extent cx="5143500" cy="4552950"/>
             <wp:effectExtent l="0" t="0" r="0" b="0"/>
             <wp:docPr id="10" name="그림 10"/>
@@ -16396,7 +16797,6 @@
         <w:spacing w:after="100" w:line="300" w:lineRule="auto"/>
       </w:pPr>
       <w:r>
-        <w:lastRenderedPageBreak/>
         <w:t>첫</w:t>
       </w:r>
       <w:r>
@@ -17077,7 +17477,7 @@
         <w:pStyle w:val="1"/>
         <w:pageBreakBefore/>
       </w:pPr>
-      <w:bookmarkStart w:id="18" w:name="_Toc241585263"/>
+      <w:bookmarkStart w:id="18" w:name="_Toc241590073"/>
       <w:r>
         <w:lastRenderedPageBreak/>
         <w:t xml:space="preserve">5. </w:t>
@@ -17428,7 +17828,7 @@
       <w:pPr>
         <w:pStyle w:val="2"/>
       </w:pPr>
-      <w:bookmarkStart w:id="19" w:name="_Toc241585264"/>
+      <w:bookmarkStart w:id="19" w:name="_Toc241590074"/>
       <w:r>
         <w:t xml:space="preserve">5-1. </w:t>
       </w:r>
@@ -17478,7 +17878,7 @@
           <w:noProof/>
         </w:rPr>
         <w:drawing>
-          <wp:inline distT="0" distB="0" distL="0" distR="0" wp14:anchorId="6D9D7D06" wp14:editId="4DD234EF">
+          <wp:inline distT="0" distB="0" distL="0" distR="0" wp14:anchorId="3BC15381" wp14:editId="02AD59D4">
             <wp:extent cx="5143500" cy="4552950"/>
             <wp:effectExtent l="0" t="0" r="0" b="0"/>
             <wp:docPr id="11" name="그림 11"/>
@@ -17887,9 +18287,54 @@
         <w:t xml:space="preserve"> </w:t>
       </w:r>
       <w:r>
-        <w:t>고치고</w:t>
-      </w:r>
-      <w:r>
+        <w:t>고칩니다</w:t>
+      </w:r>
+      <w:r>
+        <w:t xml:space="preserve">. </w:t>
+      </w:r>
+      <w:r>
+        <w:t>고친</w:t>
+      </w:r>
+      <w:r>
+        <w:t xml:space="preserve"> </w:t>
+      </w:r>
+      <w:r>
+        <w:t>줄은</w:t>
+      </w:r>
+      <w:r>
+        <w:t xml:space="preserve"> </w:t>
+      </w:r>
+      <w:r>
+        <w:t>노랗게</w:t>
+      </w:r>
+      <w:r>
+        <w:t xml:space="preserve"> </w:t>
+      </w:r>
+      <w:r>
+        <w:t>바뀌고</w:t>
+      </w:r>
+      <w:r>
+        <w:t xml:space="preserve"> </w:t>
+      </w:r>
+      <w:r>
+        <w:rPr>
+          <w:b/>
+          <w:bCs/>
+        </w:rPr>
+        <w:t>'</w:t>
+      </w:r>
+      <w:r>
+        <w:rPr>
+          <w:b/>
+          <w:bCs/>
+        </w:rPr>
+        <w:t>변경</w:t>
+      </w:r>
+      <w:r>
+        <w:rPr>
+          <w:b/>
+          <w:bCs/>
+        </w:rPr>
         <w:t xml:space="preserve"> </w:t>
       </w:r>
       <w:r>
@@ -17900,13 +18345,41 @@
         <w:t>저장</w:t>
       </w:r>
       <w:r>
-        <w:t>을</w:t>
-      </w:r>
-      <w:r>
-        <w:t xml:space="preserve"> </w:t>
-      </w:r>
-      <w:r>
-        <w:t>누릅니다</w:t>
+        <w:rPr>
+          <w:b/>
+          <w:bCs/>
+        </w:rPr>
+        <w:t>'</w:t>
+      </w:r>
+      <w:r>
+        <w:t xml:space="preserve"> </w:t>
+      </w:r>
+      <w:r>
+        <w:t>버튼이</w:t>
+      </w:r>
+      <w:r>
+        <w:t xml:space="preserve"> </w:t>
+      </w:r>
+      <w:r>
+        <w:t>나타나요</w:t>
+      </w:r>
+      <w:r>
+        <w:t xml:space="preserve">. </w:t>
+      </w:r>
+      <w:r>
+        <w:t>누르거나</w:t>
+      </w:r>
+      <w:r>
+        <w:t xml:space="preserve"> Enter </w:t>
+      </w:r>
+      <w:r>
+        <w:t>로</w:t>
+      </w:r>
+      <w:r>
+        <w:t xml:space="preserve"> </w:t>
+      </w:r>
+      <w:r>
+        <w:t>저장해요</w:t>
       </w:r>
       <w:r>
         <w:t xml:space="preserve">. </w:t>
@@ -18118,7 +18591,7 @@
       <w:pPr>
         <w:pStyle w:val="2"/>
       </w:pPr>
-      <w:bookmarkStart w:id="20" w:name="_Toc241585265"/>
+      <w:bookmarkStart w:id="20" w:name="_Toc241590075"/>
       <w:r>
         <w:t xml:space="preserve">5-2. </w:t>
       </w:r>
@@ -18180,7 +18653,7 @@
           <w:noProof/>
         </w:rPr>
         <w:drawing>
-          <wp:inline distT="0" distB="0" distL="0" distR="0" wp14:anchorId="14458214" wp14:editId="499BF728">
+          <wp:inline distT="0" distB="0" distL="0" distR="0" wp14:anchorId="4F5BC4F3" wp14:editId="0E9F7B32">
             <wp:extent cx="5143500" cy="4552950"/>
             <wp:effectExtent l="0" t="0" r="0" b="0"/>
             <wp:docPr id="12" name="그림 12"/>
@@ -18899,7 +19372,7 @@
       <w:pPr>
         <w:pStyle w:val="2"/>
       </w:pPr>
-      <w:bookmarkStart w:id="21" w:name="_Toc241585266"/>
+      <w:bookmarkStart w:id="21" w:name="_Toc241590076"/>
       <w:r>
         <w:lastRenderedPageBreak/>
         <w:t xml:space="preserve">5-3. </w:t>
@@ -18944,7 +19417,7 @@
           <w:noProof/>
         </w:rPr>
         <w:drawing>
-          <wp:inline distT="0" distB="0" distL="0" distR="0" wp14:anchorId="7F6594B7" wp14:editId="770732DA">
+          <wp:inline distT="0" distB="0" distL="0" distR="0" wp14:anchorId="1745DA46" wp14:editId="6DD3703D">
             <wp:extent cx="4476750" cy="5381625"/>
             <wp:effectExtent l="0" t="0" r="0" b="0"/>
             <wp:docPr id="13" name="그림 13"/>
@@ -19521,7 +19994,7 @@
         <w:pStyle w:val="1"/>
         <w:pageBreakBefore/>
       </w:pPr>
-      <w:bookmarkStart w:id="22" w:name="_Toc241585267"/>
+      <w:bookmarkStart w:id="22" w:name="_Toc241590077"/>
       <w:r>
         <w:lastRenderedPageBreak/>
         <w:t xml:space="preserve">6. </w:t>
@@ -20000,7 +20473,7 @@
       <w:pPr>
         <w:pStyle w:val="2"/>
       </w:pPr>
-      <w:bookmarkStart w:id="23" w:name="_Toc241585268"/>
+      <w:bookmarkStart w:id="23" w:name="_Toc241590078"/>
       <w:r>
         <w:t xml:space="preserve">6-1. </w:t>
       </w:r>
@@ -20212,6 +20685,33 @@
         <w:t>고치고</w:t>
       </w:r>
       <w:r>
+        <w:t xml:space="preserve">, </w:t>
+      </w:r>
+      <w:r>
+        <w:t>나타나는</w:t>
+      </w:r>
+      <w:r>
+        <w:t xml:space="preserve"> </w:t>
+      </w:r>
+      <w:r>
+        <w:rPr>
+          <w:b/>
+          <w:bCs/>
+        </w:rPr>
+        <w:t>'</w:t>
+      </w:r>
+      <w:r>
+        <w:rPr>
+          <w:b/>
+          <w:bCs/>
+        </w:rPr>
+        <w:t>변경</w:t>
+      </w:r>
+      <w:r>
+        <w:rPr>
+          <w:b/>
+          <w:bCs/>
+        </w:rPr>
         <w:t xml:space="preserve"> </w:t>
       </w:r>
       <w:r>
@@ -20222,6 +20722,13 @@
         <w:t>저장</w:t>
       </w:r>
       <w:r>
+        <w:rPr>
+          <w:b/>
+          <w:bCs/>
+        </w:rPr>
+        <w:t>'</w:t>
+      </w:r>
+      <w:r>
         <w:t>을</w:t>
       </w:r>
       <w:r>
@@ -20229,6 +20736,54 @@
       </w:r>
       <w:r>
         <w:t>누릅니다</w:t>
+      </w:r>
+      <w:r>
+        <w:t xml:space="preserve">. </w:t>
+      </w:r>
+      <w:r>
+        <w:t>저장하지</w:t>
+      </w:r>
+      <w:r>
+        <w:t xml:space="preserve"> </w:t>
+      </w:r>
+      <w:r>
+        <w:t>않고</w:t>
+      </w:r>
+      <w:r>
+        <w:t xml:space="preserve"> </w:t>
+      </w:r>
+      <w:r>
+        <w:t>창을</w:t>
+      </w:r>
+      <w:r>
+        <w:t xml:space="preserve"> </w:t>
+      </w:r>
+      <w:r>
+        <w:t>닫으려</w:t>
+      </w:r>
+      <w:r>
+        <w:t xml:space="preserve"> </w:t>
+      </w:r>
+      <w:r>
+        <w:t>하면</w:t>
+      </w:r>
+      <w:r>
+        <w:t xml:space="preserve"> </w:t>
+      </w:r>
+      <w:r>
+        <w:t>한</w:t>
+      </w:r>
+      <w:r>
+        <w:t xml:space="preserve"> </w:t>
+      </w:r>
+      <w:r>
+        <w:t>번</w:t>
+      </w:r>
+      <w:r>
+        <w:t xml:space="preserve"> </w:t>
+      </w:r>
+      <w:r>
+        <w:t>알려줘요</w:t>
       </w:r>
       <w:r>
         <w:t>.</w:t>
@@ -20257,10 +20812,7 @@
         <w:t xml:space="preserve"> </w:t>
       </w:r>
       <w:r>
-        <w:t>실</w:t>
-      </w:r>
-      <w:r>
-        <w:t>수</w:t>
+        <w:t>실수</w:t>
       </w:r>
       <w:r>
         <w:t xml:space="preserve"> </w:t>
@@ -20372,7 +20924,7 @@
       <w:pPr>
         <w:pStyle w:val="2"/>
       </w:pPr>
-      <w:bookmarkStart w:id="24" w:name="_Toc241585269"/>
+      <w:bookmarkStart w:id="24" w:name="_Toc241590079"/>
       <w:r>
         <w:lastRenderedPageBreak/>
         <w:t xml:space="preserve">6-2. </w:t>
@@ -20435,7 +20987,7 @@
           <w:noProof/>
         </w:rPr>
         <w:drawing>
-          <wp:inline distT="0" distB="0" distL="0" distR="0" wp14:anchorId="6A36D77E" wp14:editId="54F5F82E">
+          <wp:inline distT="0" distB="0" distL="0" distR="0" wp14:anchorId="6385D8EE" wp14:editId="20E01D92">
             <wp:extent cx="5143500" cy="4552950"/>
             <wp:effectExtent l="0" t="0" r="0" b="0"/>
             <wp:docPr id="14" name="그림 14"/>
@@ -21064,7 +21616,7 @@
         <w:pStyle w:val="1"/>
         <w:pageBreakBefore/>
       </w:pPr>
-      <w:bookmarkStart w:id="25" w:name="_Toc241585270"/>
+      <w:bookmarkStart w:id="25" w:name="_Toc241590080"/>
       <w:r>
         <w:lastRenderedPageBreak/>
         <w:t xml:space="preserve">7. </w:t>
@@ -21096,7 +21648,7 @@
       <w:pPr>
         <w:pStyle w:val="2"/>
       </w:pPr>
-      <w:bookmarkStart w:id="26" w:name="_Toc241585271"/>
+      <w:bookmarkStart w:id="26" w:name="_Toc241590081"/>
       <w:r>
         <w:t xml:space="preserve">7-1. </w:t>
       </w:r>
@@ -21122,7 +21674,7 @@
           <w:noProof/>
         </w:rPr>
         <w:drawing>
-          <wp:inline distT="0" distB="0" distL="0" distR="0" wp14:anchorId="7B3EDCC4" wp14:editId="35A84629">
+          <wp:inline distT="0" distB="0" distL="0" distR="0" wp14:anchorId="50DB2E39" wp14:editId="038925CA">
             <wp:extent cx="3238500" cy="3048000"/>
             <wp:effectExtent l="0" t="0" r="0" b="0"/>
             <wp:docPr id="15" name="그림 15"/>
@@ -21238,7 +21790,7 @@
           <w:left w:w="10" w:type="dxa"/>
           <w:right w:w="10" w:type="dxa"/>
         </w:tblCellMar>
-        <w:tblLook w:val="0000" w:firstRow="0" w:lastRow="0" w:firstColumn="0" w:lastColumn="0" w:noHBand="0" w:noVBand="0"/>
+        <w:tblLook w:val="04A0" w:firstRow="1" w:lastRow="0" w:firstColumn="1" w:lastColumn="0" w:noHBand="0" w:noVBand="1"/>
       </w:tblPr>
       <w:tblGrid>
         <w:gridCol w:w="2438"/>
@@ -21976,7 +22528,7 @@
       <w:pPr>
         <w:pStyle w:val="2"/>
       </w:pPr>
-      <w:bookmarkStart w:id="27" w:name="_Toc241585272"/>
+      <w:bookmarkStart w:id="27" w:name="_Toc241590082"/>
       <w:r>
         <w:lastRenderedPageBreak/>
         <w:t xml:space="preserve">7-2. </w:t>
@@ -22009,7 +22561,7 @@
           <w:noProof/>
         </w:rPr>
         <w:drawing>
-          <wp:inline distT="0" distB="0" distL="0" distR="0" wp14:anchorId="13986F95" wp14:editId="59FD750E">
+          <wp:inline distT="0" distB="0" distL="0" distR="0" wp14:anchorId="3F7B6B22" wp14:editId="7CC9CC64">
             <wp:extent cx="3810000" cy="4676775"/>
             <wp:effectExtent l="0" t="0" r="0" b="0"/>
             <wp:docPr id="16" name="그림 16"/>
@@ -22357,7 +22909,7 @@
           <w:left w:w="10" w:type="dxa"/>
           <w:right w:w="10" w:type="dxa"/>
         </w:tblCellMar>
-        <w:tblLook w:val="0000" w:firstRow="0" w:lastRow="0" w:firstColumn="0" w:lastColumn="0" w:noHBand="0" w:noVBand="0"/>
+        <w:tblLook w:val="04A0" w:firstRow="1" w:lastRow="0" w:firstColumn="1" w:lastColumn="0" w:noHBand="0" w:noVBand="1"/>
       </w:tblPr>
       <w:tblGrid>
         <w:gridCol w:w="2925"/>
@@ -23562,7 +24114,7 @@
         <w:pStyle w:val="1"/>
         <w:pageBreakBefore/>
       </w:pPr>
-      <w:bookmarkStart w:id="28" w:name="_Toc241585273"/>
+      <w:bookmarkStart w:id="28" w:name="_Toc241590083"/>
       <w:r>
         <w:lastRenderedPageBreak/>
         <w:t xml:space="preserve">8. </w:t>
@@ -23599,7 +24151,7 @@
           <w:left w:w="10" w:type="dxa"/>
           <w:right w:w="10" w:type="dxa"/>
         </w:tblCellMar>
-        <w:tblLook w:val="0000" w:firstRow="0" w:lastRow="0" w:firstColumn="0" w:lastColumn="0" w:noHBand="0" w:noVBand="0"/>
+        <w:tblLook w:val="04A0" w:firstRow="1" w:lastRow="0" w:firstColumn="1" w:lastColumn="0" w:noHBand="0" w:noVBand="1"/>
       </w:tblPr>
       <w:tblGrid>
         <w:gridCol w:w="3150"/>
@@ -24191,7 +24743,16 @@
                 <w:sz w:val="19"/>
                 <w:szCs w:val="19"/>
               </w:rPr>
-              <w:t>새로고침을</w:t>
+              <w:t>새로고침</w:t>
+            </w:r>
+            <w:r>
+              <w:rPr>
+                <w:b/>
+                <w:bCs/>
+                <w:sz w:val="19"/>
+                <w:szCs w:val="19"/>
+              </w:rPr>
+              <w:t>을</w:t>
             </w:r>
             <w:r>
               <w:rPr>
@@ -24561,16 +25122,7 @@
                 <w:sz w:val="19"/>
                 <w:szCs w:val="19"/>
               </w:rPr>
-              <w:t xml:space="preserve"> </w:t>
-            </w:r>
-            <w:r>
-              <w:rPr>
-                <w:b/>
-                <w:bCs/>
-                <w:sz w:val="19"/>
-                <w:szCs w:val="19"/>
-              </w:rPr>
-              <w:t xml:space="preserve">server-log.txt, launcher-log.txt </w:t>
+              <w:t xml:space="preserve"> server-log.txt, launcher-log.txt </w:t>
             </w:r>
             <w:r>
               <w:rPr>
@@ -25112,7 +25664,16 @@
                 <w:sz w:val="19"/>
                 <w:szCs w:val="19"/>
               </w:rPr>
-              <w:t>관리에서</w:t>
+              <w:t>관리</w:t>
+            </w:r>
+            <w:r>
+              <w:rPr>
+                <w:b/>
+                <w:bCs/>
+                <w:sz w:val="19"/>
+                <w:szCs w:val="19"/>
+              </w:rPr>
+              <w:t>에서</w:t>
             </w:r>
             <w:r>
               <w:rPr>
@@ -26197,7 +26758,7 @@
           <w:left w:w="10" w:type="dxa"/>
           <w:right w:w="10" w:type="dxa"/>
         </w:tblCellMar>
-        <w:tblLook w:val="0000" w:firstRow="0" w:lastRow="0" w:firstColumn="0" w:lastColumn="0" w:noHBand="0" w:noVBand="0"/>
+        <w:tblLook w:val="04A0" w:firstRow="1" w:lastRow="0" w:firstColumn="1" w:lastColumn="0" w:noHBand="0" w:noVBand="1"/>
       </w:tblPr>
       <w:tblGrid>
         <w:gridCol w:w="9000"/>
@@ -26484,7 +27045,7 @@
         <w:pStyle w:val="1"/>
         <w:pageBreakBefore/>
       </w:pPr>
-      <w:bookmarkStart w:id="29" w:name="_Toc241585274"/>
+      <w:bookmarkStart w:id="29" w:name="_Toc241590084"/>
       <w:r>
         <w:lastRenderedPageBreak/>
         <w:t xml:space="preserve">9. </w:t>
@@ -26504,7 +27065,7 @@
       <w:pPr>
         <w:pStyle w:val="2"/>
       </w:pPr>
-      <w:bookmarkStart w:id="30" w:name="_Toc241585275"/>
+      <w:bookmarkStart w:id="30" w:name="_Toc241590085"/>
       <w:r>
         <w:t xml:space="preserve">9-1. </w:t>
       </w:r>
@@ -26930,10 +27491,7 @@
         <w:t xml:space="preserve"> </w:t>
       </w:r>
       <w:r>
-        <w:t>재시</w:t>
-      </w:r>
-      <w:r>
-        <w:t>작해서</w:t>
+        <w:t>재시작해서</w:t>
       </w:r>
       <w:r>
         <w:t xml:space="preserve"> </w:t>
@@ -27168,7 +27726,7 @@
       <w:pPr>
         <w:pStyle w:val="2"/>
       </w:pPr>
-      <w:bookmarkStart w:id="31" w:name="_Toc241585276"/>
+      <w:bookmarkStart w:id="31" w:name="_Toc241590086"/>
       <w:r>
         <w:t xml:space="preserve">9-2. </w:t>
       </w:r>
@@ -27280,7 +27838,14 @@
           <w:b/>
           <w:bCs/>
         </w:rPr>
-        <w:t>git clone https://github.com/tms01274/naver-reorder-app.git C:\naver-reorder-app</w:t>
+        <w:t>git clone https://github.com/tms01274/naver-reorder-app.git C:\naver-reor</w:t>
+      </w:r>
+      <w:r>
+        <w:rPr>
+          <w:b/>
+          <w:bCs/>
+        </w:rPr>
+        <w:t>der-app</w:t>
       </w:r>
       <w:r>
         <w:t xml:space="preserve"> (</w:t>
@@ -27528,7 +28093,7 @@
       <w:pPr>
         <w:pStyle w:val="2"/>
       </w:pPr>
-      <w:bookmarkStart w:id="32" w:name="_Toc241585277"/>
+      <w:bookmarkStart w:id="32" w:name="_Toc241590087"/>
       <w:r>
         <w:t xml:space="preserve">9-3. </w:t>
       </w:r>
@@ -27770,7 +28335,7 @@
       <w:pPr>
         <w:pStyle w:val="2"/>
       </w:pPr>
-      <w:bookmarkStart w:id="33" w:name="_Toc241585278"/>
+      <w:bookmarkStart w:id="33" w:name="_Toc241590088"/>
       <w:r>
         <w:lastRenderedPageBreak/>
         <w:t xml:space="preserve">9-4. </w:t>
@@ -27801,7 +28366,7 @@
           <w:left w:w="10" w:type="dxa"/>
           <w:right w:w="10" w:type="dxa"/>
         </w:tblCellMar>
-        <w:tblLook w:val="0000" w:firstRow="0" w:lastRow="0" w:firstColumn="0" w:lastColumn="0" w:noHBand="0" w:noVBand="0"/>
+        <w:tblLook w:val="04A0" w:firstRow="1" w:lastRow="0" w:firstColumn="1" w:lastColumn="0" w:noHBand="0" w:noVBand="1"/>
       </w:tblPr>
       <w:tblGrid>
         <w:gridCol w:w="3600"/>
@@ -29057,10 +29622,10 @@
 <file path=word/numbering.xml><?xml version="1.0" encoding="utf-8"?>
 <w:numbering xmlns:wpc="http://schemas.microsoft.com/office/word/2010/wordprocessingCanvas" xmlns:cx="http://schemas.microsoft.com/office/drawing/2014/chartex" xmlns:cx1="http://schemas.microsoft.com/office/drawing/2015/9/8/chartex" xmlns:cx2="http://schemas.microsoft.com/office/drawing/2015/10/21/chartex" xmlns:cx3="http://schemas.microsoft.com/office/drawing/2016/5/9/chartex" xmlns:cx4="http://schemas.microsoft.com/office/drawing/2016/5/10/chartex" xmlns:cx5="http://schemas.microsoft.com/office/drawing/2016/5/11/chartex" xmlns:cx6="http://schemas.microsoft.com/office/drawing/2016/5/12/chartex" xmlns:cx7="http://schemas.microsoft.com/office/drawing/2016/5/13/chartex" xmlns:cx8="http://schemas.microsoft.com/office/drawing/2016/5/14/chartex" xmlns:mc="http://schemas.openxmlformats.org/markup-compatibility/2006" xmlns:aink="http://schemas.microsoft.com/office/drawing/2016/ink" xmlns:am3d="http://schemas.microsoft.com/office/drawing/2017/model3d" xmlns:o="urn:schemas-microsoft-com:office:office" xmlns:r="http://schemas.openxmlformats.org/officeDocument/2006/relationships" xmlns:m="http://schemas.openxmlformats.org/officeDocument/2006/math" xmlns:v="urn:schemas-microsoft-com:vml" xmlns:wp14="http://schemas.microsoft.com/office/word/2010/wordprocessingDrawing" xmlns:wp="http://schemas.openxmlformats.org/drawingml/2006/wordprocessingDrawing" xmlns:w10="urn:schemas-microsoft-com:office:word" xmlns:w="http://schemas.openxmlformats.org/wordprocessingml/2006/main" xmlns:w14="http://schemas.microsoft.com/office/word/2010/wordml" xmlns:w15="http://schemas.microsoft.com/office/word/2012/wordml" xmlns:w16cex="http://schemas.microsoft.com/office/word/2018/wordml/cex" xmlns:w16cid="http://schemas.microsoft.com/office/word/2016/wordml/cid" xmlns:w16="http://schemas.microsoft.com/office/word/2018/wordml" xmlns:w16sdtdh="http://schemas.microsoft.com/office/word/2020/wordml/sdtdatahash" xmlns:w16se="http://schemas.microsoft.com/office/word/2015/wordml/symex" xmlns:wpg="http://schemas.microsoft.com/office/word/2010/wordprocessingGroup" xmlns:wpi="http://schemas.microsoft.com/office/word/2010/wordprocessingInk" xmlns:wne="http://schemas.microsoft.com/office/word/2006/wordml" xmlns:wps="http://schemas.microsoft.com/office/word/2010/wordprocessingShape" mc:Ignorable="w14 w15 w16se w16cid w16 w16cex w16sdtdh wp14">
   <w:abstractNum w:abstractNumId="0" w15:restartNumberingAfterBreak="0">
-    <w:nsid w:val="0A1D201B"/>
+    <w:nsid w:val="007C360B"/>
     <w:multiLevelType w:val="hybridMultilevel"/>
-    <w:tmpl w:val="DD4C2CEA"/>
-    <w:lvl w:ilvl="0" w:tplc="82CE82DA">
+    <w:tmpl w:val="EA02E768"/>
+    <w:lvl w:ilvl="0" w:tplc="2002670E">
       <w:start w:val="1"/>
       <w:numFmt w:val="decimal"/>
       <w:lvlText w:val="%1."/>
@@ -29069,52 +29634,52 @@
         <w:ind w:left="440" w:hanging="300"/>
       </w:pPr>
     </w:lvl>
-    <w:lvl w:ilvl="1" w:tplc="60BC8A46">
+    <w:lvl w:ilvl="1" w:tplc="FA449CDC">
       <w:numFmt w:val="decimal"/>
       <w:lvlText w:val=""/>
       <w:lvlJc w:val="left"/>
     </w:lvl>
-    <w:lvl w:ilvl="2" w:tplc="0388C538">
+    <w:lvl w:ilvl="2" w:tplc="09DA5D28">
       <w:numFmt w:val="decimal"/>
       <w:lvlText w:val=""/>
       <w:lvlJc w:val="left"/>
     </w:lvl>
-    <w:lvl w:ilvl="3" w:tplc="9A0670A0">
+    <w:lvl w:ilvl="3" w:tplc="6414AF46">
       <w:numFmt w:val="decimal"/>
       <w:lvlText w:val=""/>
       <w:lvlJc w:val="left"/>
     </w:lvl>
-    <w:lvl w:ilvl="4" w:tplc="06CAEFC6">
+    <w:lvl w:ilvl="4" w:tplc="95D0DCCE">
       <w:numFmt w:val="decimal"/>
       <w:lvlText w:val=""/>
       <w:lvlJc w:val="left"/>
     </w:lvl>
-    <w:lvl w:ilvl="5" w:tplc="0CC66CC2">
+    <w:lvl w:ilvl="5" w:tplc="5BD0A342">
       <w:numFmt w:val="decimal"/>
       <w:lvlText w:val=""/>
       <w:lvlJc w:val="left"/>
     </w:lvl>
-    <w:lvl w:ilvl="6" w:tplc="E7043E88">
+    <w:lvl w:ilvl="6" w:tplc="C01EB3D8">
       <w:numFmt w:val="decimal"/>
       <w:lvlText w:val=""/>
       <w:lvlJc w:val="left"/>
     </w:lvl>
-    <w:lvl w:ilvl="7" w:tplc="7BB651F8">
+    <w:lvl w:ilvl="7" w:tplc="0EDAFFFA">
       <w:numFmt w:val="decimal"/>
       <w:lvlText w:val=""/>
       <w:lvlJc w:val="left"/>
     </w:lvl>
-    <w:lvl w:ilvl="8" w:tplc="EEEA2044">
+    <w:lvl w:ilvl="8" w:tplc="B03EEC88">
       <w:numFmt w:val="decimal"/>
       <w:lvlText w:val=""/>
       <w:lvlJc w:val="left"/>
     </w:lvl>
   </w:abstractNum>
   <w:abstractNum w:abstractNumId="1" w15:restartNumberingAfterBreak="0">
-    <w:nsid w:val="16101496"/>
+    <w:nsid w:val="01890AED"/>
     <w:multiLevelType w:val="hybridMultilevel"/>
-    <w:tmpl w:val="DDBAACD0"/>
-    <w:lvl w:ilvl="0" w:tplc="33C8E744">
+    <w:tmpl w:val="980C86B4"/>
+    <w:lvl w:ilvl="0" w:tplc="18B2AC6A">
       <w:start w:val="1"/>
       <w:numFmt w:val="decimal"/>
       <w:lvlText w:val="%1."/>
@@ -29123,592 +29688,52 @@
         <w:ind w:left="440" w:hanging="300"/>
       </w:pPr>
     </w:lvl>
-    <w:lvl w:ilvl="1" w:tplc="B994D404">
+    <w:lvl w:ilvl="1" w:tplc="E1308D62">
       <w:numFmt w:val="decimal"/>
       <w:lvlText w:val=""/>
       <w:lvlJc w:val="left"/>
     </w:lvl>
-    <w:lvl w:ilvl="2" w:tplc="2AC2CEE6">
+    <w:lvl w:ilvl="2" w:tplc="78B412C8">
       <w:numFmt w:val="decimal"/>
       <w:lvlText w:val=""/>
       <w:lvlJc w:val="left"/>
     </w:lvl>
-    <w:lvl w:ilvl="3" w:tplc="C804FD7E">
+    <w:lvl w:ilvl="3" w:tplc="C8561EFA">
       <w:numFmt w:val="decimal"/>
       <w:lvlText w:val=""/>
       <w:lvlJc w:val="left"/>
     </w:lvl>
-    <w:lvl w:ilvl="4" w:tplc="61FA471C">
+    <w:lvl w:ilvl="4" w:tplc="AF722E7A">
       <w:numFmt w:val="decimal"/>
       <w:lvlText w:val=""/>
       <w:lvlJc w:val="left"/>
     </w:lvl>
-    <w:lvl w:ilvl="5" w:tplc="7FA8E3E8">
+    <w:lvl w:ilvl="5" w:tplc="57560BD4">
       <w:numFmt w:val="decimal"/>
       <w:lvlText w:val=""/>
       <w:lvlJc w:val="left"/>
     </w:lvl>
-    <w:lvl w:ilvl="6" w:tplc="C3A071EE">
+    <w:lvl w:ilvl="6" w:tplc="074C3790">
       <w:numFmt w:val="decimal"/>
       <w:lvlText w:val=""/>
       <w:lvlJc w:val="left"/>
     </w:lvl>
-    <w:lvl w:ilvl="7" w:tplc="3CF27A6A">
+    <w:lvl w:ilvl="7" w:tplc="204A42AA">
       <w:numFmt w:val="decimal"/>
       <w:lvlText w:val=""/>
       <w:lvlJc w:val="left"/>
     </w:lvl>
-    <w:lvl w:ilvl="8" w:tplc="A1E446EC">
+    <w:lvl w:ilvl="8" w:tplc="C9263CF2">
       <w:numFmt w:val="decimal"/>
       <w:lvlText w:val=""/>
       <w:lvlJc w:val="left"/>
     </w:lvl>
   </w:abstractNum>
   <w:abstractNum w:abstractNumId="2" w15:restartNumberingAfterBreak="0">
-    <w:nsid w:val="185B7DC0"/>
+    <w:nsid w:val="058F70B9"/>
     <w:multiLevelType w:val="hybridMultilevel"/>
-    <w:tmpl w:val="F5D450FC"/>
-    <w:lvl w:ilvl="0" w:tplc="6112583A">
-      <w:start w:val="1"/>
-      <w:numFmt w:val="decimal"/>
-      <w:lvlText w:val="%1."/>
-      <w:lvlJc w:val="left"/>
-      <w:pPr>
-        <w:ind w:left="440" w:hanging="300"/>
-      </w:pPr>
-    </w:lvl>
-    <w:lvl w:ilvl="1" w:tplc="0C3A6236">
-      <w:numFmt w:val="decimal"/>
-      <w:lvlText w:val=""/>
-      <w:lvlJc w:val="left"/>
-    </w:lvl>
-    <w:lvl w:ilvl="2" w:tplc="28E44090">
-      <w:numFmt w:val="decimal"/>
-      <w:lvlText w:val=""/>
-      <w:lvlJc w:val="left"/>
-    </w:lvl>
-    <w:lvl w:ilvl="3" w:tplc="4E94F0B6">
-      <w:numFmt w:val="decimal"/>
-      <w:lvlText w:val=""/>
-      <w:lvlJc w:val="left"/>
-    </w:lvl>
-    <w:lvl w:ilvl="4" w:tplc="117AE2DE">
-      <w:numFmt w:val="decimal"/>
-      <w:lvlText w:val=""/>
-      <w:lvlJc w:val="left"/>
-    </w:lvl>
-    <w:lvl w:ilvl="5" w:tplc="1A465CCC">
-      <w:numFmt w:val="decimal"/>
-      <w:lvlText w:val=""/>
-      <w:lvlJc w:val="left"/>
-    </w:lvl>
-    <w:lvl w:ilvl="6" w:tplc="5B461290">
-      <w:numFmt w:val="decimal"/>
-      <w:lvlText w:val=""/>
-      <w:lvlJc w:val="left"/>
-    </w:lvl>
-    <w:lvl w:ilvl="7" w:tplc="77C64132">
-      <w:numFmt w:val="decimal"/>
-      <w:lvlText w:val=""/>
-      <w:lvlJc w:val="left"/>
-    </w:lvl>
-    <w:lvl w:ilvl="8" w:tplc="69C64E50">
-      <w:numFmt w:val="decimal"/>
-      <w:lvlText w:val=""/>
-      <w:lvlJc w:val="left"/>
-    </w:lvl>
-  </w:abstractNum>
-  <w:abstractNum w:abstractNumId="3" w15:restartNumberingAfterBreak="0">
-    <w:nsid w:val="26A013B5"/>
-    <w:multiLevelType w:val="hybridMultilevel"/>
-    <w:tmpl w:val="91FA99E8"/>
-    <w:lvl w:ilvl="0" w:tplc="E2F446DE">
-      <w:start w:val="1"/>
-      <w:numFmt w:val="decimal"/>
-      <w:lvlText w:val="%1."/>
-      <w:lvlJc w:val="left"/>
-      <w:pPr>
-        <w:ind w:left="440" w:hanging="300"/>
-      </w:pPr>
-    </w:lvl>
-    <w:lvl w:ilvl="1" w:tplc="0CB27F7E">
-      <w:numFmt w:val="decimal"/>
-      <w:lvlText w:val=""/>
-      <w:lvlJc w:val="left"/>
-    </w:lvl>
-    <w:lvl w:ilvl="2" w:tplc="6914AD02">
-      <w:numFmt w:val="decimal"/>
-      <w:lvlText w:val=""/>
-      <w:lvlJc w:val="left"/>
-    </w:lvl>
-    <w:lvl w:ilvl="3" w:tplc="92DECB6A">
-      <w:numFmt w:val="decimal"/>
-      <w:lvlText w:val=""/>
-      <w:lvlJc w:val="left"/>
-    </w:lvl>
-    <w:lvl w:ilvl="4" w:tplc="55203240">
-      <w:numFmt w:val="decimal"/>
-      <w:lvlText w:val=""/>
-      <w:lvlJc w:val="left"/>
-    </w:lvl>
-    <w:lvl w:ilvl="5" w:tplc="42C60CBC">
-      <w:numFmt w:val="decimal"/>
-      <w:lvlText w:val=""/>
-      <w:lvlJc w:val="left"/>
-    </w:lvl>
-    <w:lvl w:ilvl="6" w:tplc="E566107C">
-      <w:numFmt w:val="decimal"/>
-      <w:lvlText w:val=""/>
-      <w:lvlJc w:val="left"/>
-    </w:lvl>
-    <w:lvl w:ilvl="7" w:tplc="D6C6E324">
-      <w:numFmt w:val="decimal"/>
-      <w:lvlText w:val=""/>
-      <w:lvlJc w:val="left"/>
-    </w:lvl>
-    <w:lvl w:ilvl="8" w:tplc="76701136">
-      <w:numFmt w:val="decimal"/>
-      <w:lvlText w:val=""/>
-      <w:lvlJc w:val="left"/>
-    </w:lvl>
-  </w:abstractNum>
-  <w:abstractNum w:abstractNumId="4" w15:restartNumberingAfterBreak="0">
-    <w:nsid w:val="2EB7530D"/>
-    <w:multiLevelType w:val="hybridMultilevel"/>
-    <w:tmpl w:val="A7922882"/>
-    <w:lvl w:ilvl="0" w:tplc="56BA8274">
-      <w:start w:val="1"/>
-      <w:numFmt w:val="decimal"/>
-      <w:lvlText w:val="%1."/>
-      <w:lvlJc w:val="left"/>
-      <w:pPr>
-        <w:ind w:left="440" w:hanging="300"/>
-      </w:pPr>
-    </w:lvl>
-    <w:lvl w:ilvl="1" w:tplc="29B43BA6">
-      <w:numFmt w:val="decimal"/>
-      <w:lvlText w:val=""/>
-      <w:lvlJc w:val="left"/>
-    </w:lvl>
-    <w:lvl w:ilvl="2" w:tplc="A9081A90">
-      <w:numFmt w:val="decimal"/>
-      <w:lvlText w:val=""/>
-      <w:lvlJc w:val="left"/>
-    </w:lvl>
-    <w:lvl w:ilvl="3" w:tplc="576C2E88">
-      <w:numFmt w:val="decimal"/>
-      <w:lvlText w:val=""/>
-      <w:lvlJc w:val="left"/>
-    </w:lvl>
-    <w:lvl w:ilvl="4" w:tplc="784C8EEA">
-      <w:numFmt w:val="decimal"/>
-      <w:lvlText w:val=""/>
-      <w:lvlJc w:val="left"/>
-    </w:lvl>
-    <w:lvl w:ilvl="5" w:tplc="15DE3598">
-      <w:numFmt w:val="decimal"/>
-      <w:lvlText w:val=""/>
-      <w:lvlJc w:val="left"/>
-    </w:lvl>
-    <w:lvl w:ilvl="6" w:tplc="8550E7C2">
-      <w:numFmt w:val="decimal"/>
-      <w:lvlText w:val=""/>
-      <w:lvlJc w:val="left"/>
-    </w:lvl>
-    <w:lvl w:ilvl="7" w:tplc="93B29D2C">
-      <w:numFmt w:val="decimal"/>
-      <w:lvlText w:val=""/>
-      <w:lvlJc w:val="left"/>
-    </w:lvl>
-    <w:lvl w:ilvl="8" w:tplc="4F42EE54">
-      <w:numFmt w:val="decimal"/>
-      <w:lvlText w:val=""/>
-      <w:lvlJc w:val="left"/>
-    </w:lvl>
-  </w:abstractNum>
-  <w:abstractNum w:abstractNumId="5" w15:restartNumberingAfterBreak="0">
-    <w:nsid w:val="38A00B89"/>
-    <w:multiLevelType w:val="hybridMultilevel"/>
-    <w:tmpl w:val="708AF75C"/>
-    <w:lvl w:ilvl="0" w:tplc="21286B34">
-      <w:start w:val="1"/>
-      <w:numFmt w:val="decimal"/>
-      <w:lvlText w:val="%1."/>
-      <w:lvlJc w:val="left"/>
-      <w:pPr>
-        <w:ind w:left="440" w:hanging="300"/>
-      </w:pPr>
-    </w:lvl>
-    <w:lvl w:ilvl="1" w:tplc="2662E716">
-      <w:numFmt w:val="decimal"/>
-      <w:lvlText w:val=""/>
-      <w:lvlJc w:val="left"/>
-    </w:lvl>
-    <w:lvl w:ilvl="2" w:tplc="D5BC4108">
-      <w:numFmt w:val="decimal"/>
-      <w:lvlText w:val=""/>
-      <w:lvlJc w:val="left"/>
-    </w:lvl>
-    <w:lvl w:ilvl="3" w:tplc="3A344954">
-      <w:numFmt w:val="decimal"/>
-      <w:lvlText w:val=""/>
-      <w:lvlJc w:val="left"/>
-    </w:lvl>
-    <w:lvl w:ilvl="4" w:tplc="793086C0">
-      <w:numFmt w:val="decimal"/>
-      <w:lvlText w:val=""/>
-      <w:lvlJc w:val="left"/>
-    </w:lvl>
-    <w:lvl w:ilvl="5" w:tplc="E326DD30">
-      <w:numFmt w:val="decimal"/>
-      <w:lvlText w:val=""/>
-      <w:lvlJc w:val="left"/>
-    </w:lvl>
-    <w:lvl w:ilvl="6" w:tplc="15FCE4E8">
-      <w:numFmt w:val="decimal"/>
-      <w:lvlText w:val=""/>
-      <w:lvlJc w:val="left"/>
-    </w:lvl>
-    <w:lvl w:ilvl="7" w:tplc="3948E504">
-      <w:numFmt w:val="decimal"/>
-      <w:lvlText w:val=""/>
-      <w:lvlJc w:val="left"/>
-    </w:lvl>
-    <w:lvl w:ilvl="8" w:tplc="69AA0D8C">
-      <w:numFmt w:val="decimal"/>
-      <w:lvlText w:val=""/>
-      <w:lvlJc w:val="left"/>
-    </w:lvl>
-  </w:abstractNum>
-  <w:abstractNum w:abstractNumId="6" w15:restartNumberingAfterBreak="0">
-    <w:nsid w:val="466962FF"/>
-    <w:multiLevelType w:val="hybridMultilevel"/>
-    <w:tmpl w:val="5ED8F00C"/>
-    <w:lvl w:ilvl="0" w:tplc="812CF072">
-      <w:start w:val="1"/>
-      <w:numFmt w:val="decimal"/>
-      <w:lvlText w:val="%1."/>
-      <w:lvlJc w:val="left"/>
-      <w:pPr>
-        <w:ind w:left="440" w:hanging="300"/>
-      </w:pPr>
-    </w:lvl>
-    <w:lvl w:ilvl="1" w:tplc="03B69FB2">
-      <w:numFmt w:val="decimal"/>
-      <w:lvlText w:val=""/>
-      <w:lvlJc w:val="left"/>
-    </w:lvl>
-    <w:lvl w:ilvl="2" w:tplc="DA080FD0">
-      <w:numFmt w:val="decimal"/>
-      <w:lvlText w:val=""/>
-      <w:lvlJc w:val="left"/>
-    </w:lvl>
-    <w:lvl w:ilvl="3" w:tplc="EB04AB86">
-      <w:numFmt w:val="decimal"/>
-      <w:lvlText w:val=""/>
-      <w:lvlJc w:val="left"/>
-    </w:lvl>
-    <w:lvl w:ilvl="4" w:tplc="A1B4F614">
-      <w:numFmt w:val="decimal"/>
-      <w:lvlText w:val=""/>
-      <w:lvlJc w:val="left"/>
-    </w:lvl>
-    <w:lvl w:ilvl="5" w:tplc="1C263B1C">
-      <w:numFmt w:val="decimal"/>
-      <w:lvlText w:val=""/>
-      <w:lvlJc w:val="left"/>
-    </w:lvl>
-    <w:lvl w:ilvl="6" w:tplc="EAD826A4">
-      <w:numFmt w:val="decimal"/>
-      <w:lvlText w:val=""/>
-      <w:lvlJc w:val="left"/>
-    </w:lvl>
-    <w:lvl w:ilvl="7" w:tplc="EE42E360">
-      <w:numFmt w:val="decimal"/>
-      <w:lvlText w:val=""/>
-      <w:lvlJc w:val="left"/>
-    </w:lvl>
-    <w:lvl w:ilvl="8" w:tplc="708E5456">
-      <w:numFmt w:val="decimal"/>
-      <w:lvlText w:val=""/>
-      <w:lvlJc w:val="left"/>
-    </w:lvl>
-  </w:abstractNum>
-  <w:abstractNum w:abstractNumId="7" w15:restartNumberingAfterBreak="0">
-    <w:nsid w:val="4A347921"/>
-    <w:multiLevelType w:val="hybridMultilevel"/>
-    <w:tmpl w:val="96ACC402"/>
-    <w:lvl w:ilvl="0" w:tplc="FABEDBBA">
-      <w:start w:val="1"/>
-      <w:numFmt w:val="decimal"/>
-      <w:lvlText w:val="%1."/>
-      <w:lvlJc w:val="left"/>
-      <w:pPr>
-        <w:ind w:left="440" w:hanging="300"/>
-      </w:pPr>
-    </w:lvl>
-    <w:lvl w:ilvl="1" w:tplc="FAC6053C">
-      <w:numFmt w:val="decimal"/>
-      <w:lvlText w:val=""/>
-      <w:lvlJc w:val="left"/>
-    </w:lvl>
-    <w:lvl w:ilvl="2" w:tplc="457E6F0C">
-      <w:numFmt w:val="decimal"/>
-      <w:lvlText w:val=""/>
-      <w:lvlJc w:val="left"/>
-    </w:lvl>
-    <w:lvl w:ilvl="3" w:tplc="8F60F638">
-      <w:numFmt w:val="decimal"/>
-      <w:lvlText w:val=""/>
-      <w:lvlJc w:val="left"/>
-    </w:lvl>
-    <w:lvl w:ilvl="4" w:tplc="4894C564">
-      <w:numFmt w:val="decimal"/>
-      <w:lvlText w:val=""/>
-      <w:lvlJc w:val="left"/>
-    </w:lvl>
-    <w:lvl w:ilvl="5" w:tplc="1C682682">
-      <w:numFmt w:val="decimal"/>
-      <w:lvlText w:val=""/>
-      <w:lvlJc w:val="left"/>
-    </w:lvl>
-    <w:lvl w:ilvl="6" w:tplc="988260B8">
-      <w:numFmt w:val="decimal"/>
-      <w:lvlText w:val=""/>
-      <w:lvlJc w:val="left"/>
-    </w:lvl>
-    <w:lvl w:ilvl="7" w:tplc="EF74D40C">
-      <w:numFmt w:val="decimal"/>
-      <w:lvlText w:val=""/>
-      <w:lvlJc w:val="left"/>
-    </w:lvl>
-    <w:lvl w:ilvl="8" w:tplc="8E6E9AB4">
-      <w:numFmt w:val="decimal"/>
-      <w:lvlText w:val=""/>
-      <w:lvlJc w:val="left"/>
-    </w:lvl>
-  </w:abstractNum>
-  <w:abstractNum w:abstractNumId="8" w15:restartNumberingAfterBreak="0">
-    <w:nsid w:val="4B554D10"/>
-    <w:multiLevelType w:val="hybridMultilevel"/>
-    <w:tmpl w:val="5D6E9920"/>
-    <w:lvl w:ilvl="0" w:tplc="D78A6108">
-      <w:start w:val="1"/>
-      <w:numFmt w:val="decimal"/>
-      <w:lvlText w:val="%1."/>
-      <w:lvlJc w:val="left"/>
-      <w:pPr>
-        <w:ind w:left="440" w:hanging="300"/>
-      </w:pPr>
-    </w:lvl>
-    <w:lvl w:ilvl="1" w:tplc="ED660B0E">
-      <w:numFmt w:val="decimal"/>
-      <w:lvlText w:val=""/>
-      <w:lvlJc w:val="left"/>
-    </w:lvl>
-    <w:lvl w:ilvl="2" w:tplc="91EA6750">
-      <w:numFmt w:val="decimal"/>
-      <w:lvlText w:val=""/>
-      <w:lvlJc w:val="left"/>
-    </w:lvl>
-    <w:lvl w:ilvl="3" w:tplc="E0BC45D6">
-      <w:numFmt w:val="decimal"/>
-      <w:lvlText w:val=""/>
-      <w:lvlJc w:val="left"/>
-    </w:lvl>
-    <w:lvl w:ilvl="4" w:tplc="8E8AD148">
-      <w:numFmt w:val="decimal"/>
-      <w:lvlText w:val=""/>
-      <w:lvlJc w:val="left"/>
-    </w:lvl>
-    <w:lvl w:ilvl="5" w:tplc="31724B76">
-      <w:numFmt w:val="decimal"/>
-      <w:lvlText w:val=""/>
-      <w:lvlJc w:val="left"/>
-    </w:lvl>
-    <w:lvl w:ilvl="6" w:tplc="5BF2B060">
-      <w:numFmt w:val="decimal"/>
-      <w:lvlText w:val=""/>
-      <w:lvlJc w:val="left"/>
-    </w:lvl>
-    <w:lvl w:ilvl="7" w:tplc="F9D0541A">
-      <w:numFmt w:val="decimal"/>
-      <w:lvlText w:val=""/>
-      <w:lvlJc w:val="left"/>
-    </w:lvl>
-    <w:lvl w:ilvl="8" w:tplc="C53049E0">
-      <w:numFmt w:val="decimal"/>
-      <w:lvlText w:val=""/>
-      <w:lvlJc w:val="left"/>
-    </w:lvl>
-  </w:abstractNum>
-  <w:abstractNum w:abstractNumId="9" w15:restartNumberingAfterBreak="0">
-    <w:nsid w:val="5A122E80"/>
-    <w:multiLevelType w:val="hybridMultilevel"/>
-    <w:tmpl w:val="34086F18"/>
-    <w:lvl w:ilvl="0" w:tplc="89980FDE">
-      <w:start w:val="1"/>
-      <w:numFmt w:val="decimal"/>
-      <w:lvlText w:val="%1."/>
-      <w:lvlJc w:val="left"/>
-      <w:pPr>
-        <w:ind w:left="440" w:hanging="300"/>
-      </w:pPr>
-    </w:lvl>
-    <w:lvl w:ilvl="1" w:tplc="086A3CB6">
-      <w:numFmt w:val="decimal"/>
-      <w:lvlText w:val=""/>
-      <w:lvlJc w:val="left"/>
-    </w:lvl>
-    <w:lvl w:ilvl="2" w:tplc="99D2B240">
-      <w:numFmt w:val="decimal"/>
-      <w:lvlText w:val=""/>
-      <w:lvlJc w:val="left"/>
-    </w:lvl>
-    <w:lvl w:ilvl="3" w:tplc="E856E392">
-      <w:numFmt w:val="decimal"/>
-      <w:lvlText w:val=""/>
-      <w:lvlJc w:val="left"/>
-    </w:lvl>
-    <w:lvl w:ilvl="4" w:tplc="FE721588">
-      <w:numFmt w:val="decimal"/>
-      <w:lvlText w:val=""/>
-      <w:lvlJc w:val="left"/>
-    </w:lvl>
-    <w:lvl w:ilvl="5" w:tplc="48AC54F6">
-      <w:numFmt w:val="decimal"/>
-      <w:lvlText w:val=""/>
-      <w:lvlJc w:val="left"/>
-    </w:lvl>
-    <w:lvl w:ilvl="6" w:tplc="F2C6448A">
-      <w:numFmt w:val="decimal"/>
-      <w:lvlText w:val=""/>
-      <w:lvlJc w:val="left"/>
-    </w:lvl>
-    <w:lvl w:ilvl="7" w:tplc="CD86153E">
-      <w:numFmt w:val="decimal"/>
-      <w:lvlText w:val=""/>
-      <w:lvlJc w:val="left"/>
-    </w:lvl>
-    <w:lvl w:ilvl="8" w:tplc="5C6881B4">
-      <w:numFmt w:val="decimal"/>
-      <w:lvlText w:val=""/>
-      <w:lvlJc w:val="left"/>
-    </w:lvl>
-  </w:abstractNum>
-  <w:abstractNum w:abstractNumId="10" w15:restartNumberingAfterBreak="0">
-    <w:nsid w:val="5EEE2C92"/>
-    <w:multiLevelType w:val="hybridMultilevel"/>
-    <w:tmpl w:val="27986E74"/>
-    <w:lvl w:ilvl="0" w:tplc="E8686652">
-      <w:start w:val="1"/>
-      <w:numFmt w:val="decimal"/>
-      <w:lvlText w:val="%1."/>
-      <w:lvlJc w:val="left"/>
-      <w:pPr>
-        <w:ind w:left="440" w:hanging="300"/>
-      </w:pPr>
-    </w:lvl>
-    <w:lvl w:ilvl="1" w:tplc="AE3804DE">
-      <w:numFmt w:val="decimal"/>
-      <w:lvlText w:val=""/>
-      <w:lvlJc w:val="left"/>
-    </w:lvl>
-    <w:lvl w:ilvl="2" w:tplc="0314675E">
-      <w:numFmt w:val="decimal"/>
-      <w:lvlText w:val=""/>
-      <w:lvlJc w:val="left"/>
-    </w:lvl>
-    <w:lvl w:ilvl="3" w:tplc="EE249B7E">
-      <w:numFmt w:val="decimal"/>
-      <w:lvlText w:val=""/>
-      <w:lvlJc w:val="left"/>
-    </w:lvl>
-    <w:lvl w:ilvl="4" w:tplc="DE701EC0">
-      <w:numFmt w:val="decimal"/>
-      <w:lvlText w:val=""/>
-      <w:lvlJc w:val="left"/>
-    </w:lvl>
-    <w:lvl w:ilvl="5" w:tplc="F406254C">
-      <w:numFmt w:val="decimal"/>
-      <w:lvlText w:val=""/>
-      <w:lvlJc w:val="left"/>
-    </w:lvl>
-    <w:lvl w:ilvl="6" w:tplc="182A51A0">
-      <w:numFmt w:val="decimal"/>
-      <w:lvlText w:val=""/>
-      <w:lvlJc w:val="left"/>
-    </w:lvl>
-    <w:lvl w:ilvl="7" w:tplc="E27EB736">
-      <w:numFmt w:val="decimal"/>
-      <w:lvlText w:val=""/>
-      <w:lvlJc w:val="left"/>
-    </w:lvl>
-    <w:lvl w:ilvl="8" w:tplc="4A48097A">
-      <w:numFmt w:val="decimal"/>
-      <w:lvlText w:val=""/>
-      <w:lvlJc w:val="left"/>
-    </w:lvl>
-  </w:abstractNum>
-  <w:abstractNum w:abstractNumId="11" w15:restartNumberingAfterBreak="0">
-    <w:nsid w:val="61734482"/>
-    <w:multiLevelType w:val="hybridMultilevel"/>
-    <w:tmpl w:val="EFB44C0A"/>
-    <w:lvl w:ilvl="0" w:tplc="A9A4AAA0">
-      <w:start w:val="1"/>
-      <w:numFmt w:val="decimal"/>
-      <w:lvlText w:val="%1."/>
-      <w:lvlJc w:val="left"/>
-      <w:pPr>
-        <w:ind w:left="440" w:hanging="300"/>
-      </w:pPr>
-    </w:lvl>
-    <w:lvl w:ilvl="1" w:tplc="39363A5C">
-      <w:numFmt w:val="decimal"/>
-      <w:lvlText w:val=""/>
-      <w:lvlJc w:val="left"/>
-    </w:lvl>
-    <w:lvl w:ilvl="2" w:tplc="4894E8BE">
-      <w:numFmt w:val="decimal"/>
-      <w:lvlText w:val=""/>
-      <w:lvlJc w:val="left"/>
-    </w:lvl>
-    <w:lvl w:ilvl="3" w:tplc="3ED25A30">
-      <w:numFmt w:val="decimal"/>
-      <w:lvlText w:val=""/>
-      <w:lvlJc w:val="left"/>
-    </w:lvl>
-    <w:lvl w:ilvl="4" w:tplc="44062034">
-      <w:numFmt w:val="decimal"/>
-      <w:lvlText w:val=""/>
-      <w:lvlJc w:val="left"/>
-    </w:lvl>
-    <w:lvl w:ilvl="5" w:tplc="B270E542">
-      <w:numFmt w:val="decimal"/>
-      <w:lvlText w:val=""/>
-      <w:lvlJc w:val="left"/>
-    </w:lvl>
-    <w:lvl w:ilvl="6" w:tplc="A96E8CF0">
-      <w:numFmt w:val="decimal"/>
-      <w:lvlText w:val=""/>
-      <w:lvlJc w:val="left"/>
-    </w:lvl>
-    <w:lvl w:ilvl="7" w:tplc="554A8148">
-      <w:numFmt w:val="decimal"/>
-      <w:lvlText w:val=""/>
-      <w:lvlJc w:val="left"/>
-    </w:lvl>
-    <w:lvl w:ilvl="8" w:tplc="20E4165C">
-      <w:numFmt w:val="decimal"/>
-      <w:lvlText w:val=""/>
-      <w:lvlJc w:val="left"/>
-    </w:lvl>
-  </w:abstractNum>
-  <w:abstractNum w:abstractNumId="12" w15:restartNumberingAfterBreak="0">
-    <w:nsid w:val="62B86815"/>
-    <w:multiLevelType w:val="hybridMultilevel"/>
-    <w:tmpl w:val="8AA8F30A"/>
-    <w:lvl w:ilvl="0" w:tplc="8014F708" w:tentative="1">
+    <w:tmpl w:val="9462D7DC"/>
+    <w:lvl w:ilvl="0" w:tplc="9250794A" w:tentative="1">
       <w:start w:val="1"/>
       <w:numFmt w:val="bullet"/>
       <w:lvlText w:val="●"/>
@@ -29717,7 +29742,7 @@
         <w:ind w:left="720" w:hanging="360"/>
       </w:pPr>
     </w:lvl>
-    <w:lvl w:ilvl="1" w:tplc="B03C947E" w:tentative="1">
+    <w:lvl w:ilvl="1" w:tplc="A788BAD4" w:tentative="1">
       <w:start w:val="1"/>
       <w:numFmt w:val="bullet"/>
       <w:lvlText w:val="○"/>
@@ -29726,7 +29751,7 @@
         <w:ind w:left="1440" w:hanging="360"/>
       </w:pPr>
     </w:lvl>
-    <w:lvl w:ilvl="2" w:tplc="1A72F034" w:tentative="1">
+    <w:lvl w:ilvl="2" w:tplc="03923936" w:tentative="1">
       <w:start w:val="1"/>
       <w:numFmt w:val="bullet"/>
       <w:lvlText w:val="■"/>
@@ -29735,7 +29760,7 @@
         <w:ind w:left="2160" w:hanging="360"/>
       </w:pPr>
     </w:lvl>
-    <w:lvl w:ilvl="3" w:tplc="85766C0E" w:tentative="1">
+    <w:lvl w:ilvl="3" w:tplc="38405900" w:tentative="1">
       <w:start w:val="1"/>
       <w:numFmt w:val="bullet"/>
       <w:lvlText w:val="●"/>
@@ -29744,7 +29769,7 @@
         <w:ind w:left="2880" w:hanging="360"/>
       </w:pPr>
     </w:lvl>
-    <w:lvl w:ilvl="4" w:tplc="C94E43A6" w:tentative="1">
+    <w:lvl w:ilvl="4" w:tplc="BCA6C786" w:tentative="1">
       <w:start w:val="1"/>
       <w:numFmt w:val="bullet"/>
       <w:lvlText w:val="○"/>
@@ -29753,7 +29778,7 @@
         <w:ind w:left="3600" w:hanging="360"/>
       </w:pPr>
     </w:lvl>
-    <w:lvl w:ilvl="5" w:tplc="AFBC748E" w:tentative="1">
+    <w:lvl w:ilvl="5" w:tplc="0EAC35F2" w:tentative="1">
       <w:start w:val="1"/>
       <w:numFmt w:val="bullet"/>
       <w:lvlText w:val="■"/>
@@ -29762,7 +29787,7 @@
         <w:ind w:left="4320" w:hanging="360"/>
       </w:pPr>
     </w:lvl>
-    <w:lvl w:ilvl="6" w:tplc="0F2C5BF2" w:tentative="1">
+    <w:lvl w:ilvl="6" w:tplc="08F2A584" w:tentative="1">
       <w:start w:val="1"/>
       <w:numFmt w:val="bullet"/>
       <w:lvlText w:val="●"/>
@@ -29771,7 +29796,7 @@
         <w:ind w:left="5040" w:hanging="360"/>
       </w:pPr>
     </w:lvl>
-    <w:lvl w:ilvl="7" w:tplc="D86E7ECA" w:tentative="1">
+    <w:lvl w:ilvl="7" w:tplc="521A0504" w:tentative="1">
       <w:start w:val="1"/>
       <w:numFmt w:val="bullet"/>
       <w:lvlText w:val="●"/>
@@ -29780,7 +29805,7 @@
         <w:ind w:left="5760" w:hanging="360"/>
       </w:pPr>
     </w:lvl>
-    <w:lvl w:ilvl="8" w:tplc="81E22A60" w:tentative="1">
+    <w:lvl w:ilvl="8" w:tplc="C5DCFF6C" w:tentative="1">
       <w:start w:val="1"/>
       <w:numFmt w:val="bullet"/>
       <w:lvlText w:val="●"/>
@@ -29790,11 +29815,11 @@
       </w:pPr>
     </w:lvl>
   </w:abstractNum>
-  <w:abstractNum w:abstractNumId="13" w15:restartNumberingAfterBreak="0">
-    <w:nsid w:val="6E255D01"/>
+  <w:abstractNum w:abstractNumId="3" w15:restartNumberingAfterBreak="0">
+    <w:nsid w:val="092215AA"/>
     <w:multiLevelType w:val="hybridMultilevel"/>
-    <w:tmpl w:val="6A8A9F8A"/>
-    <w:lvl w:ilvl="0" w:tplc="14DEEC76">
+    <w:tmpl w:val="7DFEE7A2"/>
+    <w:lvl w:ilvl="0" w:tplc="BA2E2458">
       <w:start w:val="1"/>
       <w:numFmt w:val="decimal"/>
       <w:lvlText w:val="%1."/>
@@ -29803,52 +29828,160 @@
         <w:ind w:left="440" w:hanging="300"/>
       </w:pPr>
     </w:lvl>
-    <w:lvl w:ilvl="1" w:tplc="0F9C3F80">
+    <w:lvl w:ilvl="1" w:tplc="C2DABAF8">
       <w:numFmt w:val="decimal"/>
       <w:lvlText w:val=""/>
       <w:lvlJc w:val="left"/>
     </w:lvl>
-    <w:lvl w:ilvl="2" w:tplc="63205E48">
+    <w:lvl w:ilvl="2" w:tplc="75A0F3C8">
       <w:numFmt w:val="decimal"/>
       <w:lvlText w:val=""/>
       <w:lvlJc w:val="left"/>
     </w:lvl>
-    <w:lvl w:ilvl="3" w:tplc="87D202A8">
+    <w:lvl w:ilvl="3" w:tplc="C7F238D8">
       <w:numFmt w:val="decimal"/>
       <w:lvlText w:val=""/>
       <w:lvlJc w:val="left"/>
     </w:lvl>
-    <w:lvl w:ilvl="4" w:tplc="25964AE8">
+    <w:lvl w:ilvl="4" w:tplc="1F5C84C8">
       <w:numFmt w:val="decimal"/>
       <w:lvlText w:val=""/>
       <w:lvlJc w:val="left"/>
     </w:lvl>
-    <w:lvl w:ilvl="5" w:tplc="3EB29952">
+    <w:lvl w:ilvl="5" w:tplc="73702FC8">
       <w:numFmt w:val="decimal"/>
       <w:lvlText w:val=""/>
       <w:lvlJc w:val="left"/>
     </w:lvl>
-    <w:lvl w:ilvl="6" w:tplc="50F437A8">
+    <w:lvl w:ilvl="6" w:tplc="54EC6C78">
       <w:numFmt w:val="decimal"/>
       <w:lvlText w:val=""/>
       <w:lvlJc w:val="left"/>
     </w:lvl>
-    <w:lvl w:ilvl="7" w:tplc="7E3403F2">
+    <w:lvl w:ilvl="7" w:tplc="B7E8E762">
       <w:numFmt w:val="decimal"/>
       <w:lvlText w:val=""/>
       <w:lvlJc w:val="left"/>
     </w:lvl>
-    <w:lvl w:ilvl="8" w:tplc="9362970C">
+    <w:lvl w:ilvl="8" w:tplc="52A4DDCA">
       <w:numFmt w:val="decimal"/>
       <w:lvlText w:val=""/>
       <w:lvlJc w:val="left"/>
     </w:lvl>
   </w:abstractNum>
-  <w:abstractNum w:abstractNumId="14" w15:restartNumberingAfterBreak="0">
-    <w:nsid w:val="7EA5466B"/>
+  <w:abstractNum w:abstractNumId="4" w15:restartNumberingAfterBreak="0">
+    <w:nsid w:val="217C583A"/>
     <w:multiLevelType w:val="hybridMultilevel"/>
-    <w:tmpl w:val="8A741D2E"/>
-    <w:lvl w:ilvl="0" w:tplc="B0728450">
+    <w:tmpl w:val="FC562E6E"/>
+    <w:lvl w:ilvl="0" w:tplc="83F4B97A">
+      <w:start w:val="1"/>
+      <w:numFmt w:val="decimal"/>
+      <w:lvlText w:val="%1."/>
+      <w:lvlJc w:val="left"/>
+      <w:pPr>
+        <w:ind w:left="440" w:hanging="300"/>
+      </w:pPr>
+    </w:lvl>
+    <w:lvl w:ilvl="1" w:tplc="262E23D4">
+      <w:numFmt w:val="decimal"/>
+      <w:lvlText w:val=""/>
+      <w:lvlJc w:val="left"/>
+    </w:lvl>
+    <w:lvl w:ilvl="2" w:tplc="E3363516">
+      <w:numFmt w:val="decimal"/>
+      <w:lvlText w:val=""/>
+      <w:lvlJc w:val="left"/>
+    </w:lvl>
+    <w:lvl w:ilvl="3" w:tplc="1DA80F6C">
+      <w:numFmt w:val="decimal"/>
+      <w:lvlText w:val=""/>
+      <w:lvlJc w:val="left"/>
+    </w:lvl>
+    <w:lvl w:ilvl="4" w:tplc="DE90F8B8">
+      <w:numFmt w:val="decimal"/>
+      <w:lvlText w:val=""/>
+      <w:lvlJc w:val="left"/>
+    </w:lvl>
+    <w:lvl w:ilvl="5" w:tplc="61B251BA">
+      <w:numFmt w:val="decimal"/>
+      <w:lvlText w:val=""/>
+      <w:lvlJc w:val="left"/>
+    </w:lvl>
+    <w:lvl w:ilvl="6" w:tplc="AFA8382C">
+      <w:numFmt w:val="decimal"/>
+      <w:lvlText w:val=""/>
+      <w:lvlJc w:val="left"/>
+    </w:lvl>
+    <w:lvl w:ilvl="7" w:tplc="4A3C4C76">
+      <w:numFmt w:val="decimal"/>
+      <w:lvlText w:val=""/>
+      <w:lvlJc w:val="left"/>
+    </w:lvl>
+    <w:lvl w:ilvl="8" w:tplc="AD784508">
+      <w:numFmt w:val="decimal"/>
+      <w:lvlText w:val=""/>
+      <w:lvlJc w:val="left"/>
+    </w:lvl>
+  </w:abstractNum>
+  <w:abstractNum w:abstractNumId="5" w15:restartNumberingAfterBreak="0">
+    <w:nsid w:val="27F11112"/>
+    <w:multiLevelType w:val="hybridMultilevel"/>
+    <w:tmpl w:val="2F5AFCEE"/>
+    <w:lvl w:ilvl="0" w:tplc="CB6A1B22">
+      <w:start w:val="1"/>
+      <w:numFmt w:val="decimal"/>
+      <w:lvlText w:val="%1."/>
+      <w:lvlJc w:val="left"/>
+      <w:pPr>
+        <w:ind w:left="440" w:hanging="300"/>
+      </w:pPr>
+    </w:lvl>
+    <w:lvl w:ilvl="1" w:tplc="29B465CA">
+      <w:numFmt w:val="decimal"/>
+      <w:lvlText w:val=""/>
+      <w:lvlJc w:val="left"/>
+    </w:lvl>
+    <w:lvl w:ilvl="2" w:tplc="568CCBBA">
+      <w:numFmt w:val="decimal"/>
+      <w:lvlText w:val=""/>
+      <w:lvlJc w:val="left"/>
+    </w:lvl>
+    <w:lvl w:ilvl="3" w:tplc="52A644F2">
+      <w:numFmt w:val="decimal"/>
+      <w:lvlText w:val=""/>
+      <w:lvlJc w:val="left"/>
+    </w:lvl>
+    <w:lvl w:ilvl="4" w:tplc="45289300">
+      <w:numFmt w:val="decimal"/>
+      <w:lvlText w:val=""/>
+      <w:lvlJc w:val="left"/>
+    </w:lvl>
+    <w:lvl w:ilvl="5" w:tplc="DE40C8EE">
+      <w:numFmt w:val="decimal"/>
+      <w:lvlText w:val=""/>
+      <w:lvlJc w:val="left"/>
+    </w:lvl>
+    <w:lvl w:ilvl="6" w:tplc="0DE0985E">
+      <w:numFmt w:val="decimal"/>
+      <w:lvlText w:val=""/>
+      <w:lvlJc w:val="left"/>
+    </w:lvl>
+    <w:lvl w:ilvl="7" w:tplc="F2D0B798">
+      <w:numFmt w:val="decimal"/>
+      <w:lvlText w:val=""/>
+      <w:lvlJc w:val="left"/>
+    </w:lvl>
+    <w:lvl w:ilvl="8" w:tplc="E3A60FB8">
+      <w:numFmt w:val="decimal"/>
+      <w:lvlText w:val=""/>
+      <w:lvlJc w:val="left"/>
+    </w:lvl>
+  </w:abstractNum>
+  <w:abstractNum w:abstractNumId="6" w15:restartNumberingAfterBreak="0">
+    <w:nsid w:val="2BED5772"/>
+    <w:multiLevelType w:val="hybridMultilevel"/>
+    <w:tmpl w:val="F0A2FD70"/>
+    <w:lvl w:ilvl="0" w:tplc="5EA07B84">
       <w:start w:val="1"/>
       <w:numFmt w:val="bullet"/>
       <w:lvlText w:val="•"/>
@@ -29857,133 +29990,565 @@
         <w:ind w:left="440" w:hanging="260"/>
       </w:pPr>
     </w:lvl>
-    <w:lvl w:ilvl="1" w:tplc="63D42F66">
+    <w:lvl w:ilvl="1" w:tplc="F2D2147E">
       <w:numFmt w:val="decimal"/>
       <w:lvlText w:val=""/>
       <w:lvlJc w:val="left"/>
     </w:lvl>
-    <w:lvl w:ilvl="2" w:tplc="AF5AAF2E">
+    <w:lvl w:ilvl="2" w:tplc="AD08835A">
       <w:numFmt w:val="decimal"/>
       <w:lvlText w:val=""/>
       <w:lvlJc w:val="left"/>
     </w:lvl>
-    <w:lvl w:ilvl="3" w:tplc="1CDEF66E">
+    <w:lvl w:ilvl="3" w:tplc="BD226444">
       <w:numFmt w:val="decimal"/>
       <w:lvlText w:val=""/>
       <w:lvlJc w:val="left"/>
     </w:lvl>
-    <w:lvl w:ilvl="4" w:tplc="99EA129E">
+    <w:lvl w:ilvl="4" w:tplc="0B10C2C6">
       <w:numFmt w:val="decimal"/>
       <w:lvlText w:val=""/>
       <w:lvlJc w:val="left"/>
     </w:lvl>
-    <w:lvl w:ilvl="5" w:tplc="B658CD50">
+    <w:lvl w:ilvl="5" w:tplc="ADD416D6">
       <w:numFmt w:val="decimal"/>
       <w:lvlText w:val=""/>
       <w:lvlJc w:val="left"/>
     </w:lvl>
-    <w:lvl w:ilvl="6" w:tplc="2B802D34">
+    <w:lvl w:ilvl="6" w:tplc="547EF4BA">
       <w:numFmt w:val="decimal"/>
       <w:lvlText w:val=""/>
       <w:lvlJc w:val="left"/>
     </w:lvl>
-    <w:lvl w:ilvl="7" w:tplc="71566C5A">
+    <w:lvl w:ilvl="7" w:tplc="22FCA9E0">
       <w:numFmt w:val="decimal"/>
       <w:lvlText w:val=""/>
       <w:lvlJc w:val="left"/>
     </w:lvl>
-    <w:lvl w:ilvl="8" w:tplc="462C62B0">
+    <w:lvl w:ilvl="8" w:tplc="79B0EFF6">
+      <w:numFmt w:val="decimal"/>
+      <w:lvlText w:val=""/>
+      <w:lvlJc w:val="left"/>
+    </w:lvl>
+  </w:abstractNum>
+  <w:abstractNum w:abstractNumId="7" w15:restartNumberingAfterBreak="0">
+    <w:nsid w:val="344F77C9"/>
+    <w:multiLevelType w:val="hybridMultilevel"/>
+    <w:tmpl w:val="6896B5AC"/>
+    <w:lvl w:ilvl="0" w:tplc="F77E5780">
+      <w:start w:val="1"/>
+      <w:numFmt w:val="decimal"/>
+      <w:lvlText w:val="%1."/>
+      <w:lvlJc w:val="left"/>
+      <w:pPr>
+        <w:ind w:left="440" w:hanging="300"/>
+      </w:pPr>
+    </w:lvl>
+    <w:lvl w:ilvl="1" w:tplc="205E095E">
+      <w:numFmt w:val="decimal"/>
+      <w:lvlText w:val=""/>
+      <w:lvlJc w:val="left"/>
+    </w:lvl>
+    <w:lvl w:ilvl="2" w:tplc="C1D8F38C">
+      <w:numFmt w:val="decimal"/>
+      <w:lvlText w:val=""/>
+      <w:lvlJc w:val="left"/>
+    </w:lvl>
+    <w:lvl w:ilvl="3" w:tplc="F96E9D94">
+      <w:numFmt w:val="decimal"/>
+      <w:lvlText w:val=""/>
+      <w:lvlJc w:val="left"/>
+    </w:lvl>
+    <w:lvl w:ilvl="4" w:tplc="A69A0876">
+      <w:numFmt w:val="decimal"/>
+      <w:lvlText w:val=""/>
+      <w:lvlJc w:val="left"/>
+    </w:lvl>
+    <w:lvl w:ilvl="5" w:tplc="180CC9FA">
+      <w:numFmt w:val="decimal"/>
+      <w:lvlText w:val=""/>
+      <w:lvlJc w:val="left"/>
+    </w:lvl>
+    <w:lvl w:ilvl="6" w:tplc="0DE42102">
+      <w:numFmt w:val="decimal"/>
+      <w:lvlText w:val=""/>
+      <w:lvlJc w:val="left"/>
+    </w:lvl>
+    <w:lvl w:ilvl="7" w:tplc="A900EC68">
+      <w:numFmt w:val="decimal"/>
+      <w:lvlText w:val=""/>
+      <w:lvlJc w:val="left"/>
+    </w:lvl>
+    <w:lvl w:ilvl="8" w:tplc="D78CACCE">
+      <w:numFmt w:val="decimal"/>
+      <w:lvlText w:val=""/>
+      <w:lvlJc w:val="left"/>
+    </w:lvl>
+  </w:abstractNum>
+  <w:abstractNum w:abstractNumId="8" w15:restartNumberingAfterBreak="0">
+    <w:nsid w:val="42B55A8A"/>
+    <w:multiLevelType w:val="hybridMultilevel"/>
+    <w:tmpl w:val="4EFC7FF2"/>
+    <w:lvl w:ilvl="0" w:tplc="DB444152">
+      <w:start w:val="1"/>
+      <w:numFmt w:val="decimal"/>
+      <w:lvlText w:val="%1."/>
+      <w:lvlJc w:val="left"/>
+      <w:pPr>
+        <w:ind w:left="440" w:hanging="300"/>
+      </w:pPr>
+    </w:lvl>
+    <w:lvl w:ilvl="1" w:tplc="77AC6F3E">
+      <w:numFmt w:val="decimal"/>
+      <w:lvlText w:val=""/>
+      <w:lvlJc w:val="left"/>
+    </w:lvl>
+    <w:lvl w:ilvl="2" w:tplc="10A269B4">
+      <w:numFmt w:val="decimal"/>
+      <w:lvlText w:val=""/>
+      <w:lvlJc w:val="left"/>
+    </w:lvl>
+    <w:lvl w:ilvl="3" w:tplc="9AF66494">
+      <w:numFmt w:val="decimal"/>
+      <w:lvlText w:val=""/>
+      <w:lvlJc w:val="left"/>
+    </w:lvl>
+    <w:lvl w:ilvl="4" w:tplc="043E0804">
+      <w:numFmt w:val="decimal"/>
+      <w:lvlText w:val=""/>
+      <w:lvlJc w:val="left"/>
+    </w:lvl>
+    <w:lvl w:ilvl="5" w:tplc="E54E6716">
+      <w:numFmt w:val="decimal"/>
+      <w:lvlText w:val=""/>
+      <w:lvlJc w:val="left"/>
+    </w:lvl>
+    <w:lvl w:ilvl="6" w:tplc="38742C8C">
+      <w:numFmt w:val="decimal"/>
+      <w:lvlText w:val=""/>
+      <w:lvlJc w:val="left"/>
+    </w:lvl>
+    <w:lvl w:ilvl="7" w:tplc="7DEC5990">
+      <w:numFmt w:val="decimal"/>
+      <w:lvlText w:val=""/>
+      <w:lvlJc w:val="left"/>
+    </w:lvl>
+    <w:lvl w:ilvl="8" w:tplc="48A43C3E">
+      <w:numFmt w:val="decimal"/>
+      <w:lvlText w:val=""/>
+      <w:lvlJc w:val="left"/>
+    </w:lvl>
+  </w:abstractNum>
+  <w:abstractNum w:abstractNumId="9" w15:restartNumberingAfterBreak="0">
+    <w:nsid w:val="50D23D45"/>
+    <w:multiLevelType w:val="hybridMultilevel"/>
+    <w:tmpl w:val="8F9E289A"/>
+    <w:lvl w:ilvl="0" w:tplc="F0FE00FE">
+      <w:start w:val="1"/>
+      <w:numFmt w:val="decimal"/>
+      <w:lvlText w:val="%1."/>
+      <w:lvlJc w:val="left"/>
+      <w:pPr>
+        <w:ind w:left="440" w:hanging="300"/>
+      </w:pPr>
+    </w:lvl>
+    <w:lvl w:ilvl="1" w:tplc="5F78F50E">
+      <w:numFmt w:val="decimal"/>
+      <w:lvlText w:val=""/>
+      <w:lvlJc w:val="left"/>
+    </w:lvl>
+    <w:lvl w:ilvl="2" w:tplc="B1769928">
+      <w:numFmt w:val="decimal"/>
+      <w:lvlText w:val=""/>
+      <w:lvlJc w:val="left"/>
+    </w:lvl>
+    <w:lvl w:ilvl="3" w:tplc="1556F116">
+      <w:numFmt w:val="decimal"/>
+      <w:lvlText w:val=""/>
+      <w:lvlJc w:val="left"/>
+    </w:lvl>
+    <w:lvl w:ilvl="4" w:tplc="9DEA9160">
+      <w:numFmt w:val="decimal"/>
+      <w:lvlText w:val=""/>
+      <w:lvlJc w:val="left"/>
+    </w:lvl>
+    <w:lvl w:ilvl="5" w:tplc="AD8688F0">
+      <w:numFmt w:val="decimal"/>
+      <w:lvlText w:val=""/>
+      <w:lvlJc w:val="left"/>
+    </w:lvl>
+    <w:lvl w:ilvl="6" w:tplc="C4E0503E">
+      <w:numFmt w:val="decimal"/>
+      <w:lvlText w:val=""/>
+      <w:lvlJc w:val="left"/>
+    </w:lvl>
+    <w:lvl w:ilvl="7" w:tplc="E0ACBD78">
+      <w:numFmt w:val="decimal"/>
+      <w:lvlText w:val=""/>
+      <w:lvlJc w:val="left"/>
+    </w:lvl>
+    <w:lvl w:ilvl="8" w:tplc="2834D9AA">
+      <w:numFmt w:val="decimal"/>
+      <w:lvlText w:val=""/>
+      <w:lvlJc w:val="left"/>
+    </w:lvl>
+  </w:abstractNum>
+  <w:abstractNum w:abstractNumId="10" w15:restartNumberingAfterBreak="0">
+    <w:nsid w:val="5F9D5AEF"/>
+    <w:multiLevelType w:val="hybridMultilevel"/>
+    <w:tmpl w:val="9EE2F022"/>
+    <w:lvl w:ilvl="0" w:tplc="EC2E2328">
+      <w:start w:val="1"/>
+      <w:numFmt w:val="decimal"/>
+      <w:lvlText w:val="%1."/>
+      <w:lvlJc w:val="left"/>
+      <w:pPr>
+        <w:ind w:left="440" w:hanging="300"/>
+      </w:pPr>
+    </w:lvl>
+    <w:lvl w:ilvl="1" w:tplc="1EBEBE54">
+      <w:numFmt w:val="decimal"/>
+      <w:lvlText w:val=""/>
+      <w:lvlJc w:val="left"/>
+    </w:lvl>
+    <w:lvl w:ilvl="2" w:tplc="30904BB0">
+      <w:numFmt w:val="decimal"/>
+      <w:lvlText w:val=""/>
+      <w:lvlJc w:val="left"/>
+    </w:lvl>
+    <w:lvl w:ilvl="3" w:tplc="1898CBC2">
+      <w:numFmt w:val="decimal"/>
+      <w:lvlText w:val=""/>
+      <w:lvlJc w:val="left"/>
+    </w:lvl>
+    <w:lvl w:ilvl="4" w:tplc="4EA80C02">
+      <w:numFmt w:val="decimal"/>
+      <w:lvlText w:val=""/>
+      <w:lvlJc w:val="left"/>
+    </w:lvl>
+    <w:lvl w:ilvl="5" w:tplc="23584A32">
+      <w:numFmt w:val="decimal"/>
+      <w:lvlText w:val=""/>
+      <w:lvlJc w:val="left"/>
+    </w:lvl>
+    <w:lvl w:ilvl="6" w:tplc="C5BC3262">
+      <w:numFmt w:val="decimal"/>
+      <w:lvlText w:val=""/>
+      <w:lvlJc w:val="left"/>
+    </w:lvl>
+    <w:lvl w:ilvl="7" w:tplc="4CF49382">
+      <w:numFmt w:val="decimal"/>
+      <w:lvlText w:val=""/>
+      <w:lvlJc w:val="left"/>
+    </w:lvl>
+    <w:lvl w:ilvl="8" w:tplc="75583274">
+      <w:numFmt w:val="decimal"/>
+      <w:lvlText w:val=""/>
+      <w:lvlJc w:val="left"/>
+    </w:lvl>
+  </w:abstractNum>
+  <w:abstractNum w:abstractNumId="11" w15:restartNumberingAfterBreak="0">
+    <w:nsid w:val="66CF705B"/>
+    <w:multiLevelType w:val="hybridMultilevel"/>
+    <w:tmpl w:val="24AEA744"/>
+    <w:lvl w:ilvl="0" w:tplc="5C14FB24">
+      <w:start w:val="1"/>
+      <w:numFmt w:val="decimal"/>
+      <w:lvlText w:val="%1."/>
+      <w:lvlJc w:val="left"/>
+      <w:pPr>
+        <w:ind w:left="440" w:hanging="300"/>
+      </w:pPr>
+    </w:lvl>
+    <w:lvl w:ilvl="1" w:tplc="4B206AEA">
+      <w:numFmt w:val="decimal"/>
+      <w:lvlText w:val=""/>
+      <w:lvlJc w:val="left"/>
+    </w:lvl>
+    <w:lvl w:ilvl="2" w:tplc="14C2B5B8">
+      <w:numFmt w:val="decimal"/>
+      <w:lvlText w:val=""/>
+      <w:lvlJc w:val="left"/>
+    </w:lvl>
+    <w:lvl w:ilvl="3" w:tplc="FCFC06CE">
+      <w:numFmt w:val="decimal"/>
+      <w:lvlText w:val=""/>
+      <w:lvlJc w:val="left"/>
+    </w:lvl>
+    <w:lvl w:ilvl="4" w:tplc="806AC4C2">
+      <w:numFmt w:val="decimal"/>
+      <w:lvlText w:val=""/>
+      <w:lvlJc w:val="left"/>
+    </w:lvl>
+    <w:lvl w:ilvl="5" w:tplc="03CAC040">
+      <w:numFmt w:val="decimal"/>
+      <w:lvlText w:val=""/>
+      <w:lvlJc w:val="left"/>
+    </w:lvl>
+    <w:lvl w:ilvl="6" w:tplc="02E8D7E2">
+      <w:numFmt w:val="decimal"/>
+      <w:lvlText w:val=""/>
+      <w:lvlJc w:val="left"/>
+    </w:lvl>
+    <w:lvl w:ilvl="7" w:tplc="96F6E650">
+      <w:numFmt w:val="decimal"/>
+      <w:lvlText w:val=""/>
+      <w:lvlJc w:val="left"/>
+    </w:lvl>
+    <w:lvl w:ilvl="8" w:tplc="1BBA0C4A">
+      <w:numFmt w:val="decimal"/>
+      <w:lvlText w:val=""/>
+      <w:lvlJc w:val="left"/>
+    </w:lvl>
+  </w:abstractNum>
+  <w:abstractNum w:abstractNumId="12" w15:restartNumberingAfterBreak="0">
+    <w:nsid w:val="695A5DC1"/>
+    <w:multiLevelType w:val="hybridMultilevel"/>
+    <w:tmpl w:val="DC009D9C"/>
+    <w:lvl w:ilvl="0" w:tplc="040E0430">
+      <w:start w:val="1"/>
+      <w:numFmt w:val="decimal"/>
+      <w:lvlText w:val="%1."/>
+      <w:lvlJc w:val="left"/>
+      <w:pPr>
+        <w:ind w:left="440" w:hanging="300"/>
+      </w:pPr>
+    </w:lvl>
+    <w:lvl w:ilvl="1" w:tplc="03CCF650">
+      <w:numFmt w:val="decimal"/>
+      <w:lvlText w:val=""/>
+      <w:lvlJc w:val="left"/>
+    </w:lvl>
+    <w:lvl w:ilvl="2" w:tplc="E7C863E6">
+      <w:numFmt w:val="decimal"/>
+      <w:lvlText w:val=""/>
+      <w:lvlJc w:val="left"/>
+    </w:lvl>
+    <w:lvl w:ilvl="3" w:tplc="F8380210">
+      <w:numFmt w:val="decimal"/>
+      <w:lvlText w:val=""/>
+      <w:lvlJc w:val="left"/>
+    </w:lvl>
+    <w:lvl w:ilvl="4" w:tplc="5BBCBD48">
+      <w:numFmt w:val="decimal"/>
+      <w:lvlText w:val=""/>
+      <w:lvlJc w:val="left"/>
+    </w:lvl>
+    <w:lvl w:ilvl="5" w:tplc="F8FA5672">
+      <w:numFmt w:val="decimal"/>
+      <w:lvlText w:val=""/>
+      <w:lvlJc w:val="left"/>
+    </w:lvl>
+    <w:lvl w:ilvl="6" w:tplc="A4083896">
+      <w:numFmt w:val="decimal"/>
+      <w:lvlText w:val=""/>
+      <w:lvlJc w:val="left"/>
+    </w:lvl>
+    <w:lvl w:ilvl="7" w:tplc="1B5A9E9A">
+      <w:numFmt w:val="decimal"/>
+      <w:lvlText w:val=""/>
+      <w:lvlJc w:val="left"/>
+    </w:lvl>
+    <w:lvl w:ilvl="8" w:tplc="2ACC2F2C">
+      <w:numFmt w:val="decimal"/>
+      <w:lvlText w:val=""/>
+      <w:lvlJc w:val="left"/>
+    </w:lvl>
+  </w:abstractNum>
+  <w:abstractNum w:abstractNumId="13" w15:restartNumberingAfterBreak="0">
+    <w:nsid w:val="730603D2"/>
+    <w:multiLevelType w:val="hybridMultilevel"/>
+    <w:tmpl w:val="8A043CBC"/>
+    <w:lvl w:ilvl="0" w:tplc="7F123F0C">
+      <w:start w:val="1"/>
+      <w:numFmt w:val="decimal"/>
+      <w:lvlText w:val="%1."/>
+      <w:lvlJc w:val="left"/>
+      <w:pPr>
+        <w:ind w:left="440" w:hanging="300"/>
+      </w:pPr>
+    </w:lvl>
+    <w:lvl w:ilvl="1" w:tplc="38381EB6">
+      <w:numFmt w:val="decimal"/>
+      <w:lvlText w:val=""/>
+      <w:lvlJc w:val="left"/>
+    </w:lvl>
+    <w:lvl w:ilvl="2" w:tplc="6DA0EEF2">
+      <w:numFmt w:val="decimal"/>
+      <w:lvlText w:val=""/>
+      <w:lvlJc w:val="left"/>
+    </w:lvl>
+    <w:lvl w:ilvl="3" w:tplc="67C6A832">
+      <w:numFmt w:val="decimal"/>
+      <w:lvlText w:val=""/>
+      <w:lvlJc w:val="left"/>
+    </w:lvl>
+    <w:lvl w:ilvl="4" w:tplc="1E785254">
+      <w:numFmt w:val="decimal"/>
+      <w:lvlText w:val=""/>
+      <w:lvlJc w:val="left"/>
+    </w:lvl>
+    <w:lvl w:ilvl="5" w:tplc="EF6CC022">
+      <w:numFmt w:val="decimal"/>
+      <w:lvlText w:val=""/>
+      <w:lvlJc w:val="left"/>
+    </w:lvl>
+    <w:lvl w:ilvl="6" w:tplc="84EA96FC">
+      <w:numFmt w:val="decimal"/>
+      <w:lvlText w:val=""/>
+      <w:lvlJc w:val="left"/>
+    </w:lvl>
+    <w:lvl w:ilvl="7" w:tplc="D9C4D000">
+      <w:numFmt w:val="decimal"/>
+      <w:lvlText w:val=""/>
+      <w:lvlJc w:val="left"/>
+    </w:lvl>
+    <w:lvl w:ilvl="8" w:tplc="29D403AA">
+      <w:numFmt w:val="decimal"/>
+      <w:lvlText w:val=""/>
+      <w:lvlJc w:val="left"/>
+    </w:lvl>
+  </w:abstractNum>
+  <w:abstractNum w:abstractNumId="14" w15:restartNumberingAfterBreak="0">
+    <w:nsid w:val="756F7C12"/>
+    <w:multiLevelType w:val="hybridMultilevel"/>
+    <w:tmpl w:val="0AE8EA98"/>
+    <w:lvl w:ilvl="0" w:tplc="9140D1E0">
+      <w:start w:val="1"/>
+      <w:numFmt w:val="decimal"/>
+      <w:lvlText w:val="%1."/>
+      <w:lvlJc w:val="left"/>
+      <w:pPr>
+        <w:ind w:left="440" w:hanging="300"/>
+      </w:pPr>
+    </w:lvl>
+    <w:lvl w:ilvl="1" w:tplc="0CE2AD76">
+      <w:numFmt w:val="decimal"/>
+      <w:lvlText w:val=""/>
+      <w:lvlJc w:val="left"/>
+    </w:lvl>
+    <w:lvl w:ilvl="2" w:tplc="0A70CFD6">
+      <w:numFmt w:val="decimal"/>
+      <w:lvlText w:val=""/>
+      <w:lvlJc w:val="left"/>
+    </w:lvl>
+    <w:lvl w:ilvl="3" w:tplc="E544F99C">
+      <w:numFmt w:val="decimal"/>
+      <w:lvlText w:val=""/>
+      <w:lvlJc w:val="left"/>
+    </w:lvl>
+    <w:lvl w:ilvl="4" w:tplc="811A445E">
+      <w:numFmt w:val="decimal"/>
+      <w:lvlText w:val=""/>
+      <w:lvlJc w:val="left"/>
+    </w:lvl>
+    <w:lvl w:ilvl="5" w:tplc="593A686A">
+      <w:numFmt w:val="decimal"/>
+      <w:lvlText w:val=""/>
+      <w:lvlJc w:val="left"/>
+    </w:lvl>
+    <w:lvl w:ilvl="6" w:tplc="1116E59E">
+      <w:numFmt w:val="decimal"/>
+      <w:lvlText w:val=""/>
+      <w:lvlJc w:val="left"/>
+    </w:lvl>
+    <w:lvl w:ilvl="7" w:tplc="97B465C8">
+      <w:numFmt w:val="decimal"/>
+      <w:lvlText w:val=""/>
+      <w:lvlJc w:val="left"/>
+    </w:lvl>
+    <w:lvl w:ilvl="8" w:tplc="31C23CEE">
       <w:numFmt w:val="decimal"/>
       <w:lvlText w:val=""/>
       <w:lvlJc w:val="left"/>
     </w:lvl>
   </w:abstractNum>
   <w:num w:numId="1">
+    <w:abstractNumId w:val="2"/>
+    <w:lvlOverride w:ilvl="0">
+      <w:startOverride w:val="1"/>
+    </w:lvlOverride>
+  </w:num>
+  <w:num w:numId="2">
+    <w:abstractNumId w:val="4"/>
+    <w:lvlOverride w:ilvl="0">
+      <w:startOverride w:val="1"/>
+    </w:lvlOverride>
+  </w:num>
+  <w:num w:numId="3">
     <w:abstractNumId w:val="12"/>
     <w:lvlOverride w:ilvl="0">
       <w:startOverride w:val="1"/>
     </w:lvlOverride>
   </w:num>
-  <w:num w:numId="2">
+  <w:num w:numId="4">
+    <w:abstractNumId w:val="1"/>
+    <w:lvlOverride w:ilvl="0">
+      <w:startOverride w:val="1"/>
+    </w:lvlOverride>
+  </w:num>
+  <w:num w:numId="5">
+    <w:abstractNumId w:val="6"/>
+    <w:lvlOverride w:ilvl="0">
+      <w:startOverride w:val="1"/>
+    </w:lvlOverride>
+  </w:num>
+  <w:num w:numId="6">
+    <w:abstractNumId w:val="7"/>
+    <w:lvlOverride w:ilvl="0">
+      <w:startOverride w:val="1"/>
+    </w:lvlOverride>
+  </w:num>
+  <w:num w:numId="7">
+    <w:abstractNumId w:val="0"/>
+    <w:lvlOverride w:ilvl="0">
+      <w:startOverride w:val="1"/>
+    </w:lvlOverride>
+  </w:num>
+  <w:num w:numId="8">
+    <w:abstractNumId w:val="10"/>
+    <w:lvlOverride w:ilvl="0">
+      <w:startOverride w:val="1"/>
+    </w:lvlOverride>
+  </w:num>
+  <w:num w:numId="9">
+    <w:abstractNumId w:val="13"/>
+    <w:lvlOverride w:ilvl="0">
+      <w:startOverride w:val="1"/>
+    </w:lvlOverride>
+  </w:num>
+  <w:num w:numId="10">
+    <w:abstractNumId w:val="3"/>
+    <w:lvlOverride w:ilvl="0">
+      <w:startOverride w:val="1"/>
+    </w:lvlOverride>
+  </w:num>
+  <w:num w:numId="11">
+    <w:abstractNumId w:val="5"/>
+    <w:lvlOverride w:ilvl="0">
+      <w:startOverride w:val="1"/>
+    </w:lvlOverride>
+  </w:num>
+  <w:num w:numId="12">
     <w:abstractNumId w:val="8"/>
     <w:lvlOverride w:ilvl="0">
       <w:startOverride w:val="1"/>
     </w:lvlOverride>
   </w:num>
-  <w:num w:numId="3">
-    <w:abstractNumId w:val="7"/>
-    <w:lvlOverride w:ilvl="0">
-      <w:startOverride w:val="1"/>
-    </w:lvlOverride>
-  </w:num>
-  <w:num w:numId="4">
-    <w:abstractNumId w:val="4"/>
-    <w:lvlOverride w:ilvl="0">
-      <w:startOverride w:val="1"/>
-    </w:lvlOverride>
-  </w:num>
-  <w:num w:numId="5">
-    <w:abstractNumId w:val="14"/>
-    <w:lvlOverride w:ilvl="0">
-      <w:startOverride w:val="1"/>
-    </w:lvlOverride>
-  </w:num>
-  <w:num w:numId="6">
+  <w:num w:numId="13">
     <w:abstractNumId w:val="9"/>
     <w:lvlOverride w:ilvl="0">
       <w:startOverride w:val="1"/>
     </w:lvlOverride>
   </w:num>
-  <w:num w:numId="7">
-    <w:abstractNumId w:val="5"/>
-    <w:lvlOverride w:ilvl="0">
-      <w:startOverride w:val="1"/>
-    </w:lvlOverride>
-  </w:num>
-  <w:num w:numId="8">
-    <w:abstractNumId w:val="2"/>
-    <w:lvlOverride w:ilvl="0">
-      <w:startOverride w:val="1"/>
-    </w:lvlOverride>
-  </w:num>
-  <w:num w:numId="9">
-    <w:abstractNumId w:val="10"/>
-    <w:lvlOverride w:ilvl="0">
-      <w:startOverride w:val="1"/>
-    </w:lvlOverride>
-  </w:num>
-  <w:num w:numId="10">
-    <w:abstractNumId w:val="13"/>
-    <w:lvlOverride w:ilvl="0">
-      <w:startOverride w:val="1"/>
-    </w:lvlOverride>
-  </w:num>
-  <w:num w:numId="11">
-    <w:abstractNumId w:val="0"/>
-    <w:lvlOverride w:ilvl="0">
-      <w:startOverride w:val="1"/>
-    </w:lvlOverride>
-  </w:num>
-  <w:num w:numId="12">
-    <w:abstractNumId w:val="1"/>
-    <w:lvlOverride w:ilvl="0">
-      <w:startOverride w:val="1"/>
-    </w:lvlOverride>
-  </w:num>
-  <w:num w:numId="13">
-    <w:abstractNumId w:val="3"/>
-    <w:lvlOverride w:ilvl="0">
-      <w:startOverride w:val="1"/>
-    </w:lvlOverride>
-  </w:num>
   <w:num w:numId="14">
-    <w:abstractNumId w:val="6"/>
+    <w:abstractNumId w:val="11"/>
     <w:lvlOverride w:ilvl="0">
       <w:startOverride w:val="1"/>
     </w:lvlOverride>
   </w:num>
   <w:num w:numId="15">
-    <w:abstractNumId w:val="11"/>
+    <w:abstractNumId w:val="14"/>
     <w:lvlOverride w:ilvl="0">
       <w:startOverride w:val="1"/>
     </w:lvlOverride>
@@ -30614,7 +31179,7 @@
     <w:autoRedefine/>
     <w:uiPriority w:val="39"/>
     <w:unhideWhenUsed/>
-    <w:rsid w:val="00066BBB"/>
+    <w:rsid w:val="005E31B6"/>
   </w:style>
   <w:style w:type="paragraph" w:styleId="20">
     <w:name w:val="toc 2"/>
@@ -30623,7 +31188,7 @@
     <w:autoRedefine/>
     <w:uiPriority w:val="39"/>
     <w:unhideWhenUsed/>
-    <w:rsid w:val="00066BBB"/>
+    <w:rsid w:val="005E31B6"/>
     <w:pPr>
       <w:ind w:leftChars="200" w:left="425"/>
     </w:pPr>
@@ -30634,7 +31199,7 @@
     <w:link w:val="Char1"/>
     <w:uiPriority w:val="99"/>
     <w:unhideWhenUsed/>
-    <w:rsid w:val="00066BBB"/>
+    <w:rsid w:val="005E31B6"/>
     <w:pPr>
       <w:tabs>
         <w:tab w:val="center" w:pos="4513"/>
@@ -30648,7 +31213,7 @@
     <w:basedOn w:val="a0"/>
     <w:link w:val="aa"/>
     <w:uiPriority w:val="99"/>
-    <w:rsid w:val="00066BBB"/>
+    <w:rsid w:val="005E31B6"/>
   </w:style>
   <w:style w:type="paragraph" w:styleId="ab">
     <w:name w:val="footer"/>
@@ -30656,7 +31221,7 @@
     <w:link w:val="Char2"/>
     <w:uiPriority w:val="99"/>
     <w:unhideWhenUsed/>
-    <w:rsid w:val="00066BBB"/>
+    <w:rsid w:val="005E31B6"/>
     <w:pPr>
       <w:tabs>
         <w:tab w:val="center" w:pos="4513"/>
@@ -30670,7 +31235,7 @@
     <w:basedOn w:val="a0"/>
     <w:link w:val="ab"/>
     <w:uiPriority w:val="99"/>
-    <w:rsid w:val="00066BBB"/>
+    <w:rsid w:val="005E31B6"/>
   </w:style>
 </w:styles>
 </file>

</xml_diff>

<commit_message>
Fall back to paste for long Gmail order bodies
Gmail rejects compose URLs past roughly 8-12k characters (400 Bad Request),
which long order sheets hit since each Korean character becomes 9 chars
when encoded. Above 7000 chars, open Gmail with recipient and subject only,
copy the body to the clipboard, and put a Ctrl+A / Ctrl+V hint in the
Gmail body. Tests, changelog and manual updated.

Co-Authored-By: Claude Opus 5.5 <noreply@anthropic.com>
Claude-Session: https://claude.ai/code/session_018STRj9x3LnkvPAbJ8Pnkr2
</commit_message>
<xml_diff>
--- a/docs/아틀리에말리-사용설명서.docx
+++ b/docs/아틀리에말리-사용설명서.docx
@@ -877,7 +877,7 @@
     <w:sdt>
       <w:sdtPr>
         <w:alias w:val="목차"/>
-        <w:id w:val="1046027782"/>
+        <w:id w:val="-914620132"/>
       </w:sdtPr>
       <w:sdtEndPr/>
       <w:sdtContent>
@@ -904,7 +904,7 @@
           <w:r>
             <w:fldChar w:fldCharType="separate"/>
           </w:r>
-          <w:hyperlink w:anchor="_Toc241683867" w:history="1">
+          <w:hyperlink w:anchor="_Toc241832658" w:history="1">
             <w:r>
               <w:rPr>
                 <w:rStyle w:val="a5"/>
@@ -928,7 +928,7 @@
               <w:rPr>
                 <w:noProof/>
               </w:rPr>
-              <w:instrText xml:space="preserve"> PAGEREF _Toc241683867 \h </w:instrText>
+              <w:instrText xml:space="preserve"> PAGEREF _Toc241832658 \h </w:instrText>
             </w:r>
             <w:r>
               <w:rPr>
@@ -969,7 +969,7 @@
               <w:szCs w:val="22"/>
             </w:rPr>
           </w:pPr>
-          <w:hyperlink w:anchor="_Toc241683868" w:history="1">
+          <w:hyperlink w:anchor="_Toc241832659" w:history="1">
             <w:r>
               <w:rPr>
                 <w:rStyle w:val="a5"/>
@@ -993,7 +993,7 @@
               <w:rPr>
                 <w:noProof/>
               </w:rPr>
-              <w:instrText xml:space="preserve"> PAGEREF _Toc241683868 \h </w:instrText>
+              <w:instrText xml:space="preserve"> PAGEREF _Toc241832659 \h </w:instrText>
             </w:r>
             <w:r>
               <w:rPr>
@@ -1035,7 +1035,7 @@
               <w:szCs w:val="22"/>
             </w:rPr>
           </w:pPr>
-          <w:hyperlink w:anchor="_Toc241683869" w:history="1">
+          <w:hyperlink w:anchor="_Toc241832660" w:history="1">
             <w:r>
               <w:rPr>
                 <w:rStyle w:val="a5"/>
@@ -1059,7 +1059,7 @@
               <w:rPr>
                 <w:noProof/>
               </w:rPr>
-              <w:instrText xml:space="preserve"> PAGEREF _Toc241683869 \h </w:instrText>
+              <w:instrText xml:space="preserve"> PAGEREF _Toc241832660 \h </w:instrText>
             </w:r>
             <w:r>
               <w:rPr>
@@ -1101,7 +1101,7 @@
               <w:szCs w:val="22"/>
             </w:rPr>
           </w:pPr>
-          <w:hyperlink w:anchor="_Toc241683870" w:history="1">
+          <w:hyperlink w:anchor="_Toc241832661" w:history="1">
             <w:r>
               <w:rPr>
                 <w:rStyle w:val="a5"/>
@@ -1125,7 +1125,7 @@
               <w:rPr>
                 <w:noProof/>
               </w:rPr>
-              <w:instrText xml:space="preserve"> PAGEREF _Toc241683870 \h </w:instrText>
+              <w:instrText xml:space="preserve"> PAGEREF _Toc241832661 \h </w:instrText>
             </w:r>
             <w:r>
               <w:rPr>
@@ -1167,7 +1167,7 @@
               <w:szCs w:val="22"/>
             </w:rPr>
           </w:pPr>
-          <w:hyperlink w:anchor="_Toc241683871" w:history="1">
+          <w:hyperlink w:anchor="_Toc241832662" w:history="1">
             <w:r>
               <w:rPr>
                 <w:rStyle w:val="a5"/>
@@ -1191,7 +1191,7 @@
               <w:rPr>
                 <w:noProof/>
               </w:rPr>
-              <w:instrText xml:space="preserve"> PAGEREF _Toc241683871 \h </w:instrText>
+              <w:instrText xml:space="preserve"> PAGEREF _Toc241832662 \h </w:instrText>
             </w:r>
             <w:r>
               <w:rPr>
@@ -1233,7 +1233,7 @@
               <w:szCs w:val="22"/>
             </w:rPr>
           </w:pPr>
-          <w:hyperlink w:anchor="_Toc241683872" w:history="1">
+          <w:hyperlink w:anchor="_Toc241832663" w:history="1">
             <w:r>
               <w:rPr>
                 <w:rStyle w:val="a5"/>
@@ -1257,7 +1257,7 @@
               <w:rPr>
                 <w:noProof/>
               </w:rPr>
-              <w:instrText xml:space="preserve"> PAGEREF _Toc241683872 \h </w:instrText>
+              <w:instrText xml:space="preserve"> PAGEREF _Toc241832663 \h </w:instrText>
             </w:r>
             <w:r>
               <w:rPr>
@@ -1298,7 +1298,7 @@
               <w:szCs w:val="22"/>
             </w:rPr>
           </w:pPr>
-          <w:hyperlink w:anchor="_Toc241683873" w:history="1">
+          <w:hyperlink w:anchor="_Toc241832664" w:history="1">
             <w:r>
               <w:rPr>
                 <w:rStyle w:val="a5"/>
@@ -1322,7 +1322,7 @@
               <w:rPr>
                 <w:noProof/>
               </w:rPr>
-              <w:instrText xml:space="preserve"> PAGEREF _Toc241683873 \h </w:instrText>
+              <w:instrText xml:space="preserve"> PAGEREF _Toc241832664 \h </w:instrText>
             </w:r>
             <w:r>
               <w:rPr>
@@ -1364,7 +1364,7 @@
               <w:szCs w:val="22"/>
             </w:rPr>
           </w:pPr>
-          <w:hyperlink w:anchor="_Toc241683874" w:history="1">
+          <w:hyperlink w:anchor="_Toc241832665" w:history="1">
             <w:r>
               <w:rPr>
                 <w:rStyle w:val="a5"/>
@@ -1388,7 +1388,7 @@
               <w:rPr>
                 <w:noProof/>
               </w:rPr>
-              <w:instrText xml:space="preserve"> PAGEREF _Toc241683874 \h </w:instrText>
+              <w:instrText xml:space="preserve"> PAGEREF _Toc241832665 \h </w:instrText>
             </w:r>
             <w:r>
               <w:rPr>
@@ -1430,7 +1430,7 @@
               <w:szCs w:val="22"/>
             </w:rPr>
           </w:pPr>
-          <w:hyperlink w:anchor="_Toc241683875" w:history="1">
+          <w:hyperlink w:anchor="_Toc241832666" w:history="1">
             <w:r>
               <w:rPr>
                 <w:rStyle w:val="a5"/>
@@ -1454,7 +1454,7 @@
               <w:rPr>
                 <w:noProof/>
               </w:rPr>
-              <w:instrText xml:space="preserve"> PAGEREF _Toc241683875 \h </w:instrText>
+              <w:instrText xml:space="preserve"> PAGEREF _Toc241832666 \h </w:instrText>
             </w:r>
             <w:r>
               <w:rPr>
@@ -1496,7 +1496,7 @@
               <w:szCs w:val="22"/>
             </w:rPr>
           </w:pPr>
-          <w:hyperlink w:anchor="_Toc241683876" w:history="1">
+          <w:hyperlink w:anchor="_Toc241832667" w:history="1">
             <w:r>
               <w:rPr>
                 <w:rStyle w:val="a5"/>
@@ -1520,7 +1520,7 @@
               <w:rPr>
                 <w:noProof/>
               </w:rPr>
-              <w:instrText xml:space="preserve"> PAGEREF _Toc241683876 \h </w:instrText>
+              <w:instrText xml:space="preserve"> PAGEREF _Toc241832667 \h </w:instrText>
             </w:r>
             <w:r>
               <w:rPr>
@@ -1562,7 +1562,7 @@
               <w:szCs w:val="22"/>
             </w:rPr>
           </w:pPr>
-          <w:hyperlink w:anchor="_Toc241683877" w:history="1">
+          <w:hyperlink w:anchor="_Toc241832668" w:history="1">
             <w:r>
               <w:rPr>
                 <w:rStyle w:val="a5"/>
@@ -1586,7 +1586,7 @@
               <w:rPr>
                 <w:noProof/>
               </w:rPr>
-              <w:instrText xml:space="preserve"> PAGEREF _Toc241683877 \h </w:instrText>
+              <w:instrText xml:space="preserve"> PAGEREF _Toc241832668 \h </w:instrText>
             </w:r>
             <w:r>
               <w:rPr>
@@ -1628,7 +1628,7 @@
               <w:szCs w:val="22"/>
             </w:rPr>
           </w:pPr>
-          <w:hyperlink w:anchor="_Toc241683878" w:history="1">
+          <w:hyperlink w:anchor="_Toc241832669" w:history="1">
             <w:r>
               <w:rPr>
                 <w:rStyle w:val="a5"/>
@@ -1652,7 +1652,7 @@
               <w:rPr>
                 <w:noProof/>
               </w:rPr>
-              <w:instrText xml:space="preserve"> PAGEREF _Toc241683878 \h </w:instrText>
+              <w:instrText xml:space="preserve"> PAGEREF _Toc241832669 \h </w:instrText>
             </w:r>
             <w:r>
               <w:rPr>
@@ -1693,7 +1693,7 @@
               <w:szCs w:val="22"/>
             </w:rPr>
           </w:pPr>
-          <w:hyperlink w:anchor="_Toc241683879" w:history="1">
+          <w:hyperlink w:anchor="_Toc241832670" w:history="1">
             <w:r>
               <w:rPr>
                 <w:rStyle w:val="a5"/>
@@ -1717,7 +1717,7 @@
               <w:rPr>
                 <w:noProof/>
               </w:rPr>
-              <w:instrText xml:space="preserve"> PAGEREF _Toc241683879 \h </w:instrText>
+              <w:instrText xml:space="preserve"> PAGEREF _Toc241832670 \h </w:instrText>
             </w:r>
             <w:r>
               <w:rPr>
@@ -1759,7 +1759,7 @@
               <w:szCs w:val="22"/>
             </w:rPr>
           </w:pPr>
-          <w:hyperlink w:anchor="_Toc241683880" w:history="1">
+          <w:hyperlink w:anchor="_Toc241832671" w:history="1">
             <w:r>
               <w:rPr>
                 <w:rStyle w:val="a5"/>
@@ -1783,7 +1783,7 @@
               <w:rPr>
                 <w:noProof/>
               </w:rPr>
-              <w:instrText xml:space="preserve"> PAGEREF _Toc241683880 \h </w:instrText>
+              <w:instrText xml:space="preserve"> PAGEREF _Toc241832671 \h </w:instrText>
             </w:r>
             <w:r>
               <w:rPr>
@@ -1825,7 +1825,7 @@
               <w:szCs w:val="22"/>
             </w:rPr>
           </w:pPr>
-          <w:hyperlink w:anchor="_Toc241683881" w:history="1">
+          <w:hyperlink w:anchor="_Toc241832672" w:history="1">
             <w:r>
               <w:rPr>
                 <w:rStyle w:val="a5"/>
@@ -1849,7 +1849,7 @@
               <w:rPr>
                 <w:noProof/>
               </w:rPr>
-              <w:instrText xml:space="preserve"> PAGEREF _Toc241683881 \h </w:instrText>
+              <w:instrText xml:space="preserve"> PAGEREF _Toc241832672 \h </w:instrText>
             </w:r>
             <w:r>
               <w:rPr>
@@ -1891,7 +1891,7 @@
               <w:szCs w:val="22"/>
             </w:rPr>
           </w:pPr>
-          <w:hyperlink w:anchor="_Toc241683882" w:history="1">
+          <w:hyperlink w:anchor="_Toc241832673" w:history="1">
             <w:r>
               <w:rPr>
                 <w:rStyle w:val="a5"/>
@@ -1915,7 +1915,7 @@
               <w:rPr>
                 <w:noProof/>
               </w:rPr>
-              <w:instrText xml:space="preserve"> PAGEREF _Toc241683882 \h </w:instrText>
+              <w:instrText xml:space="preserve"> PAGEREF _Toc241832673 \h </w:instrText>
             </w:r>
             <w:r>
               <w:rPr>
@@ -1957,7 +1957,7 @@
               <w:szCs w:val="22"/>
             </w:rPr>
           </w:pPr>
-          <w:hyperlink w:anchor="_Toc241683883" w:history="1">
+          <w:hyperlink w:anchor="_Toc241832674" w:history="1">
             <w:r>
               <w:rPr>
                 <w:rStyle w:val="a5"/>
@@ -1981,7 +1981,7 @@
               <w:rPr>
                 <w:noProof/>
               </w:rPr>
-              <w:instrText xml:space="preserve"> PAGEREF _Toc241683883 \h </w:instrText>
+              <w:instrText xml:space="preserve"> PAGEREF _Toc241832674 \h </w:instrText>
             </w:r>
             <w:r>
               <w:rPr>
@@ -2023,7 +2023,7 @@
               <w:szCs w:val="22"/>
             </w:rPr>
           </w:pPr>
-          <w:hyperlink w:anchor="_Toc241683884" w:history="1">
+          <w:hyperlink w:anchor="_Toc241832675" w:history="1">
             <w:r>
               <w:rPr>
                 <w:rStyle w:val="a5"/>
@@ -2047,7 +2047,7 @@
               <w:rPr>
                 <w:noProof/>
               </w:rPr>
-              <w:instrText xml:space="preserve"> PAGEREF _Toc241683884 \h </w:instrText>
+              <w:instrText xml:space="preserve"> PAGEREF _Toc241832675 \h </w:instrText>
             </w:r>
             <w:r>
               <w:rPr>
@@ -2089,7 +2089,7 @@
               <w:szCs w:val="22"/>
             </w:rPr>
           </w:pPr>
-          <w:hyperlink w:anchor="_Toc241683885" w:history="1">
+          <w:hyperlink w:anchor="_Toc241832676" w:history="1">
             <w:r>
               <w:rPr>
                 <w:rStyle w:val="a5"/>
@@ -2113,7 +2113,7 @@
               <w:rPr>
                 <w:noProof/>
               </w:rPr>
-              <w:instrText xml:space="preserve"> PAGEREF _Toc241683885 \h </w:instrText>
+              <w:instrText xml:space="preserve"> PAGEREF _Toc241832676 \h </w:instrText>
             </w:r>
             <w:r>
               <w:rPr>
@@ -2154,7 +2154,7 @@
               <w:szCs w:val="22"/>
             </w:rPr>
           </w:pPr>
-          <w:hyperlink w:anchor="_Toc241683886" w:history="1">
+          <w:hyperlink w:anchor="_Toc241832677" w:history="1">
             <w:r>
               <w:rPr>
                 <w:rStyle w:val="a5"/>
@@ -2178,7 +2178,7 @@
               <w:rPr>
                 <w:noProof/>
               </w:rPr>
-              <w:instrText xml:space="preserve"> PAGEREF _Toc241683886 \h </w:instrText>
+              <w:instrText xml:space="preserve"> PAGEREF _Toc241832677 \h </w:instrText>
             </w:r>
             <w:r>
               <w:rPr>
@@ -2220,7 +2220,7 @@
               <w:szCs w:val="22"/>
             </w:rPr>
           </w:pPr>
-          <w:hyperlink w:anchor="_Toc241683887" w:history="1">
+          <w:hyperlink w:anchor="_Toc241832678" w:history="1">
             <w:r>
               <w:rPr>
                 <w:rStyle w:val="a5"/>
@@ -2244,7 +2244,7 @@
               <w:rPr>
                 <w:noProof/>
               </w:rPr>
-              <w:instrText xml:space="preserve"> PAGEREF _Toc241683887 \h </w:instrText>
+              <w:instrText xml:space="preserve"> PAGEREF _Toc241832678 \h </w:instrText>
             </w:r>
             <w:r>
               <w:rPr>
@@ -2286,7 +2286,7 @@
               <w:szCs w:val="22"/>
             </w:rPr>
           </w:pPr>
-          <w:hyperlink w:anchor="_Toc241683888" w:history="1">
+          <w:hyperlink w:anchor="_Toc241832679" w:history="1">
             <w:r>
               <w:rPr>
                 <w:rStyle w:val="a5"/>
@@ -2310,7 +2310,7 @@
               <w:rPr>
                 <w:noProof/>
               </w:rPr>
-              <w:instrText xml:space="preserve"> PAGEREF _Toc241683888 \h </w:instrText>
+              <w:instrText xml:space="preserve"> PAGEREF _Toc241832679 \h </w:instrText>
             </w:r>
             <w:r>
               <w:rPr>
@@ -2352,7 +2352,7 @@
               <w:szCs w:val="22"/>
             </w:rPr>
           </w:pPr>
-          <w:hyperlink w:anchor="_Toc241683889" w:history="1">
+          <w:hyperlink w:anchor="_Toc241832680" w:history="1">
             <w:r>
               <w:rPr>
                 <w:rStyle w:val="a5"/>
@@ -2376,7 +2376,7 @@
               <w:rPr>
                 <w:noProof/>
               </w:rPr>
-              <w:instrText xml:space="preserve"> PAGEREF _Toc241683889 \h </w:instrText>
+              <w:instrText xml:space="preserve"> PAGEREF _Toc241832680 \h </w:instrText>
             </w:r>
             <w:r>
               <w:rPr>
@@ -2418,7 +2418,7 @@
               <w:szCs w:val="22"/>
             </w:rPr>
           </w:pPr>
-          <w:hyperlink w:anchor="_Toc241683890" w:history="1">
+          <w:hyperlink w:anchor="_Toc241832681" w:history="1">
             <w:r>
               <w:rPr>
                 <w:rStyle w:val="a5"/>
@@ -2442,7 +2442,7 @@
               <w:rPr>
                 <w:noProof/>
               </w:rPr>
-              <w:instrText xml:space="preserve"> PAGEREF _Toc241683890 \h </w:instrText>
+              <w:instrText xml:space="preserve"> PAGEREF _Toc241832681 \h </w:instrText>
             </w:r>
             <w:r>
               <w:rPr>
@@ -2483,7 +2483,7 @@
               <w:szCs w:val="22"/>
             </w:rPr>
           </w:pPr>
-          <w:hyperlink w:anchor="_Toc241683891" w:history="1">
+          <w:hyperlink w:anchor="_Toc241832682" w:history="1">
             <w:r>
               <w:rPr>
                 <w:rStyle w:val="a5"/>
@@ -2507,7 +2507,7 @@
               <w:rPr>
                 <w:noProof/>
               </w:rPr>
-              <w:instrText xml:space="preserve"> PAGEREF _Toc241683891 \h </w:instrText>
+              <w:instrText xml:space="preserve"> PAGEREF _Toc241832682 \h </w:instrText>
             </w:r>
             <w:r>
               <w:rPr>
@@ -2549,7 +2549,7 @@
               <w:szCs w:val="22"/>
             </w:rPr>
           </w:pPr>
-          <w:hyperlink w:anchor="_Toc241683892" w:history="1">
+          <w:hyperlink w:anchor="_Toc241832683" w:history="1">
             <w:r>
               <w:rPr>
                 <w:rStyle w:val="a5"/>
@@ -2573,7 +2573,7 @@
               <w:rPr>
                 <w:noProof/>
               </w:rPr>
-              <w:instrText xml:space="preserve"> PAGEREF _Toc241683892 \h </w:instrText>
+              <w:instrText xml:space="preserve"> PAGEREF _Toc241832683 \h </w:instrText>
             </w:r>
             <w:r>
               <w:rPr>
@@ -2615,7 +2615,7 @@
               <w:szCs w:val="22"/>
             </w:rPr>
           </w:pPr>
-          <w:hyperlink w:anchor="_Toc241683893" w:history="1">
+          <w:hyperlink w:anchor="_Toc241832684" w:history="1">
             <w:r>
               <w:rPr>
                 <w:rStyle w:val="a5"/>
@@ -2639,7 +2639,7 @@
               <w:rPr>
                 <w:noProof/>
               </w:rPr>
-              <w:instrText xml:space="preserve"> PAGEREF _Toc241683893 \h </w:instrText>
+              <w:instrText xml:space="preserve"> PAGEREF _Toc241832684 \h </w:instrText>
             </w:r>
             <w:r>
               <w:rPr>
@@ -2680,7 +2680,7 @@
               <w:szCs w:val="22"/>
             </w:rPr>
           </w:pPr>
-          <w:hyperlink w:anchor="_Toc241683894" w:history="1">
+          <w:hyperlink w:anchor="_Toc241832685" w:history="1">
             <w:r>
               <w:rPr>
                 <w:rStyle w:val="a5"/>
@@ -2704,7 +2704,7 @@
               <w:rPr>
                 <w:noProof/>
               </w:rPr>
-              <w:instrText xml:space="preserve"> PAGEREF _Toc241683894 \h </w:instrText>
+              <w:instrText xml:space="preserve"> PAGEREF _Toc241832685 \h </w:instrText>
             </w:r>
             <w:r>
               <w:rPr>
@@ -2746,7 +2746,7 @@
               <w:szCs w:val="22"/>
             </w:rPr>
           </w:pPr>
-          <w:hyperlink w:anchor="_Toc241683895" w:history="1">
+          <w:hyperlink w:anchor="_Toc241832686" w:history="1">
             <w:r>
               <w:rPr>
                 <w:rStyle w:val="a5"/>
@@ -2770,7 +2770,7 @@
               <w:rPr>
                 <w:noProof/>
               </w:rPr>
-              <w:instrText xml:space="preserve"> PAGEREF _Toc241683895 \h </w:instrText>
+              <w:instrText xml:space="preserve"> PAGEREF _Toc241832686 \h </w:instrText>
             </w:r>
             <w:r>
               <w:rPr>
@@ -2812,7 +2812,7 @@
               <w:szCs w:val="22"/>
             </w:rPr>
           </w:pPr>
-          <w:hyperlink w:anchor="_Toc241683896" w:history="1">
+          <w:hyperlink w:anchor="_Toc241832687" w:history="1">
             <w:r>
               <w:rPr>
                 <w:rStyle w:val="a5"/>
@@ -2836,7 +2836,7 @@
               <w:rPr>
                 <w:noProof/>
               </w:rPr>
-              <w:instrText xml:space="preserve"> PAGEREF _Toc241683896 \h </w:instrText>
+              <w:instrText xml:space="preserve"> PAGEREF _Toc241832687 \h </w:instrText>
             </w:r>
             <w:r>
               <w:rPr>
@@ -2878,7 +2878,7 @@
               <w:szCs w:val="22"/>
             </w:rPr>
           </w:pPr>
-          <w:hyperlink w:anchor="_Toc241683897" w:history="1">
+          <w:hyperlink w:anchor="_Toc241832688" w:history="1">
             <w:r>
               <w:rPr>
                 <w:rStyle w:val="a5"/>
@@ -2902,7 +2902,7 @@
               <w:rPr>
                 <w:noProof/>
               </w:rPr>
-              <w:instrText xml:space="preserve"> PAGEREF _Toc241683897 \h </w:instrText>
+              <w:instrText xml:space="preserve"> PAGEREF _Toc241832688 \h </w:instrText>
             </w:r>
             <w:r>
               <w:rPr>
@@ -2943,7 +2943,7 @@
               <w:szCs w:val="22"/>
             </w:rPr>
           </w:pPr>
-          <w:hyperlink w:anchor="_Toc241683898" w:history="1">
+          <w:hyperlink w:anchor="_Toc241832689" w:history="1">
             <w:r>
               <w:rPr>
                 <w:rStyle w:val="a5"/>
@@ -2967,7 +2967,7 @@
               <w:rPr>
                 <w:noProof/>
               </w:rPr>
-              <w:instrText xml:space="preserve"> PAGEREF _Toc241683898 \h </w:instrText>
+              <w:instrText xml:space="preserve"> PAGEREF _Toc241832689 \h </w:instrText>
             </w:r>
             <w:r>
               <w:rPr>
@@ -3008,7 +3008,7 @@
               <w:szCs w:val="22"/>
             </w:rPr>
           </w:pPr>
-          <w:hyperlink w:anchor="_Toc241683899" w:history="1">
+          <w:hyperlink w:anchor="_Toc241832690" w:history="1">
             <w:r>
               <w:rPr>
                 <w:rStyle w:val="a5"/>
@@ -3032,7 +3032,7 @@
               <w:rPr>
                 <w:noProof/>
               </w:rPr>
-              <w:instrText xml:space="preserve"> PAGEREF _Toc241683899 \h </w:instrText>
+              <w:instrText xml:space="preserve"> PAGEREF _Toc241832690 \h </w:instrText>
             </w:r>
             <w:r>
               <w:rPr>
@@ -3074,7 +3074,7 @@
               <w:szCs w:val="22"/>
             </w:rPr>
           </w:pPr>
-          <w:hyperlink w:anchor="_Toc241683900" w:history="1">
+          <w:hyperlink w:anchor="_Toc241832691" w:history="1">
             <w:r>
               <w:rPr>
                 <w:rStyle w:val="a5"/>
@@ -3098,7 +3098,7 @@
               <w:rPr>
                 <w:noProof/>
               </w:rPr>
-              <w:instrText xml:space="preserve"> PAGEREF _Toc241683900 \h </w:instrText>
+              <w:instrText xml:space="preserve"> PAGEREF _Toc241832691 \h </w:instrText>
             </w:r>
             <w:r>
               <w:rPr>
@@ -3140,7 +3140,7 @@
               <w:szCs w:val="22"/>
             </w:rPr>
           </w:pPr>
-          <w:hyperlink w:anchor="_Toc241683901" w:history="1">
+          <w:hyperlink w:anchor="_Toc241832692" w:history="1">
             <w:r>
               <w:rPr>
                 <w:rStyle w:val="a5"/>
@@ -3164,7 +3164,7 @@
               <w:rPr>
                 <w:noProof/>
               </w:rPr>
-              <w:instrText xml:space="preserve"> PAGEREF _Toc241683901 \h </w:instrText>
+              <w:instrText xml:space="preserve"> PAGEREF _Toc241832692 \h </w:instrText>
             </w:r>
             <w:r>
               <w:rPr>
@@ -3206,7 +3206,7 @@
               <w:szCs w:val="22"/>
             </w:rPr>
           </w:pPr>
-          <w:hyperlink w:anchor="_Toc241683902" w:history="1">
+          <w:hyperlink w:anchor="_Toc241832693" w:history="1">
             <w:r>
               <w:rPr>
                 <w:rStyle w:val="a5"/>
@@ -3230,7 +3230,7 @@
               <w:rPr>
                 <w:noProof/>
               </w:rPr>
-              <w:instrText xml:space="preserve"> PAGEREF _Toc241683902 \h </w:instrText>
+              <w:instrText xml:space="preserve"> PAGEREF _Toc241832693 \h </w:instrText>
             </w:r>
             <w:r>
               <w:rPr>
@@ -3272,7 +3272,7 @@
               <w:szCs w:val="22"/>
             </w:rPr>
           </w:pPr>
-          <w:hyperlink w:anchor="_Toc241683903" w:history="1">
+          <w:hyperlink w:anchor="_Toc241832694" w:history="1">
             <w:r>
               <w:rPr>
                 <w:rStyle w:val="a5"/>
@@ -3296,7 +3296,7 @@
               <w:rPr>
                 <w:noProof/>
               </w:rPr>
-              <w:instrText xml:space="preserve"> PAGEREF _Toc241683903 \h </w:instrText>
+              <w:instrText xml:space="preserve"> PAGEREF _Toc241832694 \h </w:instrText>
             </w:r>
             <w:r>
               <w:rPr>
@@ -3335,7 +3335,7 @@
         <w:pStyle w:val="1"/>
         <w:pageBreakBefore/>
       </w:pPr>
-      <w:bookmarkStart w:id="0" w:name="_Toc241683867"/>
+      <w:bookmarkStart w:id="0" w:name="_Toc241832658"/>
       <w:r>
         <w:lastRenderedPageBreak/>
         <w:t xml:space="preserve">1. </w:t>
@@ -5735,7 +5735,7 @@
         <w:pStyle w:val="1"/>
         <w:pageBreakBefore/>
       </w:pPr>
-      <w:bookmarkStart w:id="1" w:name="_Toc241683868"/>
+      <w:bookmarkStart w:id="1" w:name="_Toc241832659"/>
       <w:r>
         <w:lastRenderedPageBreak/>
         <w:t xml:space="preserve">2. </w:t>
@@ -5755,7 +5755,7 @@
       <w:pPr>
         <w:pStyle w:val="2"/>
       </w:pPr>
-      <w:bookmarkStart w:id="2" w:name="_Toc241683869"/>
+      <w:bookmarkStart w:id="2" w:name="_Toc241832660"/>
       <w:r>
         <w:t xml:space="preserve">2-1. </w:t>
       </w:r>
@@ -6116,7 +6116,7 @@
       <w:pPr>
         <w:pStyle w:val="2"/>
       </w:pPr>
-      <w:bookmarkStart w:id="3" w:name="_Toc241683870"/>
+      <w:bookmarkStart w:id="3" w:name="_Toc241832661"/>
       <w:r>
         <w:t xml:space="preserve">2-2. </w:t>
       </w:r>
@@ -6454,7 +6454,7 @@
       <w:pPr>
         <w:pStyle w:val="2"/>
       </w:pPr>
-      <w:bookmarkStart w:id="4" w:name="_Toc241683871"/>
+      <w:bookmarkStart w:id="4" w:name="_Toc241832662"/>
       <w:r>
         <w:t xml:space="preserve">2-3. </w:t>
       </w:r>
@@ -6538,7 +6538,7 @@
       <w:pPr>
         <w:pStyle w:val="2"/>
       </w:pPr>
-      <w:bookmarkStart w:id="5" w:name="_Toc241683872"/>
+      <w:bookmarkStart w:id="5" w:name="_Toc241832663"/>
       <w:r>
         <w:t xml:space="preserve">2-4. </w:t>
       </w:r>
@@ -6707,7 +6707,7 @@
           <w:noProof/>
         </w:rPr>
         <w:drawing>
-          <wp:inline distT="0" distB="0" distL="0" distR="0" wp14:anchorId="133A8FE3" wp14:editId="48AEC607">
+          <wp:inline distT="0" distB="0" distL="0" distR="0" wp14:anchorId="069E8FBF" wp14:editId="0BFD39CD">
             <wp:extent cx="5715000" cy="1343025"/>
             <wp:effectExtent l="0" t="0" r="0" b="0"/>
             <wp:docPr id="1" name="그림 1"/>
@@ -7392,7 +7392,7 @@
           <w:noProof/>
         </w:rPr>
         <w:drawing>
-          <wp:inline distT="0" distB="0" distL="0" distR="0" wp14:anchorId="73EFD278" wp14:editId="526A3888">
+          <wp:inline distT="0" distB="0" distL="0" distR="0" wp14:anchorId="0C9F35C8" wp14:editId="52DEF7FF">
             <wp:extent cx="4476750" cy="3962400"/>
             <wp:effectExtent l="0" t="0" r="0" b="0"/>
             <wp:docPr id="2" name="그림 2"/>
@@ -7498,7 +7498,7 @@
         <w:pStyle w:val="1"/>
         <w:pageBreakBefore/>
       </w:pPr>
-      <w:bookmarkStart w:id="6" w:name="_Toc241683873"/>
+      <w:bookmarkStart w:id="6" w:name="_Toc241832664"/>
       <w:r>
         <w:lastRenderedPageBreak/>
         <w:t xml:space="preserve">3. </w:t>
@@ -7537,7 +7537,7 @@
           <w:noProof/>
         </w:rPr>
         <w:drawing>
-          <wp:inline distT="0" distB="0" distL="0" distR="0" wp14:anchorId="5007ABD2" wp14:editId="51577F24">
+          <wp:inline distT="0" distB="0" distL="0" distR="0" wp14:anchorId="4EDCD045" wp14:editId="082ED0B8">
             <wp:extent cx="5715000" cy="3657600"/>
             <wp:effectExtent l="0" t="0" r="0" b="0"/>
             <wp:docPr id="3" name="그림 3"/>
@@ -7658,7 +7658,7 @@
       <w:pPr>
         <w:pStyle w:val="2"/>
       </w:pPr>
-      <w:bookmarkStart w:id="7" w:name="_Toc241683874"/>
+      <w:bookmarkStart w:id="7" w:name="_Toc241832665"/>
       <w:r>
         <w:t xml:space="preserve">3-1. </w:t>
       </w:r>
@@ -10830,7 +10830,7 @@
       <w:pPr>
         <w:pStyle w:val="2"/>
       </w:pPr>
-      <w:bookmarkStart w:id="8" w:name="_Toc241683875"/>
+      <w:bookmarkStart w:id="8" w:name="_Toc241832666"/>
       <w:r>
         <w:t xml:space="preserve">3-2. </w:t>
       </w:r>
@@ -13743,7 +13743,7 @@
       <w:pPr>
         <w:pStyle w:val="2"/>
       </w:pPr>
-      <w:bookmarkStart w:id="9" w:name="_Toc241683876"/>
+      <w:bookmarkStart w:id="9" w:name="_Toc241832667"/>
       <w:r>
         <w:t xml:space="preserve">3-3. </w:t>
       </w:r>
@@ -14366,7 +14366,7 @@
           <w:noProof/>
         </w:rPr>
         <w:drawing>
-          <wp:inline distT="0" distB="0" distL="0" distR="0" wp14:anchorId="24B5587A" wp14:editId="5C101656">
+          <wp:inline distT="0" distB="0" distL="0" distR="0" wp14:anchorId="0709DAAB" wp14:editId="201691F6">
             <wp:extent cx="5715000" cy="1876425"/>
             <wp:effectExtent l="0" t="0" r="0" b="0"/>
             <wp:docPr id="4" name="그림 4"/>
@@ -14479,7 +14479,7 @@
       <w:pPr>
         <w:pStyle w:val="2"/>
       </w:pPr>
-      <w:bookmarkStart w:id="10" w:name="_Toc241683877"/>
+      <w:bookmarkStart w:id="10" w:name="_Toc241832668"/>
       <w:r>
         <w:t xml:space="preserve">3-4. </w:t>
       </w:r>
@@ -14633,7 +14633,7 @@
         </w:rPr>
         <w:lastRenderedPageBreak/>
         <w:drawing>
-          <wp:inline distT="0" distB="0" distL="0" distR="0" wp14:anchorId="7035CF29" wp14:editId="5B5943A4">
+          <wp:inline distT="0" distB="0" distL="0" distR="0" wp14:anchorId="1CEA5AEB" wp14:editId="65AEA6F6">
             <wp:extent cx="5715000" cy="3390900"/>
             <wp:effectExtent l="0" t="0" r="0" b="0"/>
             <wp:docPr id="5" name="그림 5"/>
@@ -15203,7 +15203,7 @@
       <w:pPr>
         <w:pStyle w:val="2"/>
       </w:pPr>
-      <w:bookmarkStart w:id="11" w:name="_Toc241683878"/>
+      <w:bookmarkStart w:id="11" w:name="_Toc241832669"/>
       <w:r>
         <w:t xml:space="preserve">3-5. </w:t>
       </w:r>
@@ -15325,7 +15325,7 @@
         <w:pStyle w:val="1"/>
         <w:pageBreakBefore/>
       </w:pPr>
-      <w:bookmarkStart w:id="12" w:name="_Toc241683879"/>
+      <w:bookmarkStart w:id="12" w:name="_Toc241832670"/>
       <w:r>
         <w:lastRenderedPageBreak/>
         <w:t xml:space="preserve">4. </w:t>
@@ -15552,7 +15552,7 @@
       <w:pPr>
         <w:pStyle w:val="2"/>
       </w:pPr>
-      <w:bookmarkStart w:id="13" w:name="_Toc241683880"/>
+      <w:bookmarkStart w:id="13" w:name="_Toc241832671"/>
       <w:r>
         <w:t xml:space="preserve">4-1. </w:t>
       </w:r>
@@ -15584,7 +15584,7 @@
           <w:noProof/>
         </w:rPr>
         <w:drawing>
-          <wp:inline distT="0" distB="0" distL="0" distR="0" wp14:anchorId="0A84CC37" wp14:editId="239B0118">
+          <wp:inline distT="0" distB="0" distL="0" distR="0" wp14:anchorId="7848110B" wp14:editId="7FC2BF7D">
             <wp:extent cx="5143500" cy="4648200"/>
             <wp:effectExtent l="0" t="0" r="0" b="0"/>
             <wp:docPr id="6" name="그림 6"/>
@@ -16546,7 +16546,7 @@
       <w:pPr>
         <w:pStyle w:val="2"/>
       </w:pPr>
-      <w:bookmarkStart w:id="14" w:name="_Toc241683881"/>
+      <w:bookmarkStart w:id="14" w:name="_Toc241832672"/>
       <w:r>
         <w:t>4-2. Gmail</w:t>
       </w:r>
@@ -16572,8 +16572,8 @@
           <w:noProof/>
         </w:rPr>
         <w:drawing>
-          <wp:inline distT="0" distB="0" distL="0" distR="0" wp14:anchorId="0C85C885" wp14:editId="036A3EC8">
-            <wp:extent cx="5143500" cy="5810250"/>
+          <wp:inline distT="0" distB="0" distL="0" distR="0" wp14:anchorId="6D391F36" wp14:editId="436F3DBF">
+            <wp:extent cx="5143500" cy="5962650"/>
             <wp:effectExtent l="0" t="0" r="0" b="0"/>
             <wp:docPr id="7" name="그림 7"/>
             <wp:cNvGraphicFramePr>
@@ -16598,7 +16598,7 @@
                   <pic:spPr bwMode="auto">
                     <a:xfrm>
                       <a:off x="0" y="0"/>
-                      <a:ext cx="5143500" cy="5810250"/>
+                      <a:ext cx="5143500" cy="5962650"/>
                     </a:xfrm>
                     <a:prstGeom prst="rect">
                       <a:avLst/>
@@ -17109,102 +17109,170 @@
       </w:pPr>
       <w:r>
         <w:lastRenderedPageBreak/>
-        <w:t xml:space="preserve">Gmail </w:t>
-      </w:r>
-      <w:r>
-        <w:t>칸이</w:t>
-      </w:r>
-      <w:r>
-        <w:t xml:space="preserve"> </w:t>
-      </w:r>
-      <w:r>
-        <w:t>비어서</w:t>
-      </w:r>
-      <w:r>
-        <w:t xml:space="preserve"> </w:t>
-      </w:r>
-      <w:r>
-        <w:t>열리면</w:t>
+        <w:t>품목이</w:t>
+      </w:r>
+      <w:r>
+        <w:t xml:space="preserve"> </w:t>
+      </w:r>
+      <w:r>
+        <w:t>많으면</w:t>
+      </w:r>
+      <w:r>
+        <w:t xml:space="preserve"> Gmail </w:t>
+      </w:r>
+      <w:r>
+        <w:t>창에</w:t>
+      </w:r>
+      <w:r>
+        <w:t xml:space="preserve"> </w:t>
+      </w:r>
+      <w:r>
+        <w:rPr>
+          <w:b/>
+          <w:bCs/>
+        </w:rPr>
+        <w:t>받는</w:t>
+      </w:r>
+      <w:r>
+        <w:rPr>
+          <w:b/>
+          <w:bCs/>
+        </w:rPr>
+        <w:t xml:space="preserve"> </w:t>
+      </w:r>
+      <w:r>
+        <w:rPr>
+          <w:b/>
+          <w:bCs/>
+        </w:rPr>
+        <w:t>사람</w:t>
+      </w:r>
+      <w:r>
+        <w:rPr>
+          <w:b/>
+          <w:bCs/>
+        </w:rPr>
+        <w:t xml:space="preserve"> · </w:t>
+      </w:r>
+      <w:r>
+        <w:rPr>
+          <w:b/>
+          <w:bCs/>
+        </w:rPr>
+        <w:t>제목만</w:t>
+      </w:r>
+      <w:r>
+        <w:t xml:space="preserve"> </w:t>
+      </w:r>
+      <w:r>
+        <w:t>채워지고</w:t>
       </w:r>
       <w:r>
         <w:t xml:space="preserve">, </w:t>
       </w:r>
       <w:r>
-        <w:t>이</w:t>
-      </w:r>
-      <w:r>
-        <w:t xml:space="preserve"> </w:t>
-      </w:r>
-      <w:r>
-        <w:t>화면의</w:t>
-      </w:r>
-      <w:r>
-        <w:t xml:space="preserve"> </w:t>
-      </w:r>
-      <w:r>
-        <w:rPr>
-          <w:b/>
-          <w:bCs/>
-        </w:rPr>
-        <w:t>받는</w:t>
-      </w:r>
-      <w:r>
-        <w:rPr>
-          <w:b/>
-          <w:bCs/>
-        </w:rPr>
-        <w:t xml:space="preserve"> </w:t>
-      </w:r>
-      <w:r>
-        <w:rPr>
-          <w:b/>
-          <w:bCs/>
-        </w:rPr>
-        <w:t>사람</w:t>
-      </w:r>
-      <w:r>
-        <w:rPr>
-          <w:b/>
-          <w:bCs/>
-        </w:rPr>
-        <w:t xml:space="preserve"> · </w:t>
-      </w:r>
-      <w:r>
-        <w:rPr>
-          <w:b/>
-          <w:bCs/>
-        </w:rPr>
-        <w:t>제목</w:t>
-      </w:r>
-      <w:r>
-        <w:rPr>
-          <w:b/>
-          <w:bCs/>
-        </w:rPr>
-        <w:t xml:space="preserve"> · </w:t>
-      </w:r>
-      <w:r>
-        <w:rPr>
-          <w:b/>
-          <w:bCs/>
-        </w:rPr>
-        <w:t>본문</w:t>
-      </w:r>
-      <w:r>
-        <w:t xml:space="preserve"> </w:t>
-      </w:r>
-      <w:r>
-        <w:t>옆</w:t>
-      </w:r>
-      <w:r>
-        <w:t xml:space="preserve"> </w:t>
-      </w:r>
-      <w:r>
-        <w:rPr>
-          <w:b/>
-          <w:bCs/>
-        </w:rPr>
-        <w:t>복사</w:t>
+        <w:t>발주</w:t>
+      </w:r>
+      <w:r>
+        <w:t xml:space="preserve"> </w:t>
+      </w:r>
+      <w:r>
+        <w:t>내용은</w:t>
+      </w:r>
+      <w:r>
+        <w:t xml:space="preserve"> </w:t>
+      </w:r>
+      <w:r>
+        <w:rPr>
+          <w:b/>
+          <w:bCs/>
+        </w:rPr>
+        <w:t>복사돼</w:t>
+      </w:r>
+      <w:r>
+        <w:rPr>
+          <w:b/>
+          <w:bCs/>
+        </w:rPr>
+        <w:t xml:space="preserve"> </w:t>
+      </w:r>
+      <w:r>
+        <w:rPr>
+          <w:b/>
+          <w:bCs/>
+        </w:rPr>
+        <w:t>있어요</w:t>
+      </w:r>
+      <w:r>
+        <w:t xml:space="preserve">. Gmail </w:t>
+      </w:r>
+      <w:r>
+        <w:t>본</w:t>
+      </w:r>
+      <w:r>
+        <w:t>문</w:t>
+      </w:r>
+      <w:r>
+        <w:t xml:space="preserve"> </w:t>
+      </w:r>
+      <w:r>
+        <w:t>칸</w:t>
+      </w:r>
+      <w:r>
+        <w:t>(</w:t>
+      </w:r>
+      <w:r>
+        <w:t>안내</w:t>
+      </w:r>
+      <w:r>
+        <w:t xml:space="preserve"> </w:t>
+      </w:r>
+      <w:r>
+        <w:t>문구가</w:t>
+      </w:r>
+      <w:r>
+        <w:t xml:space="preserve"> </w:t>
+      </w:r>
+      <w:r>
+        <w:t>적혀</w:t>
+      </w:r>
+      <w:r>
+        <w:t xml:space="preserve"> </w:t>
+      </w:r>
+      <w:r>
+        <w:t>있어요</w:t>
+      </w:r>
+      <w:r>
+        <w:t>)</w:t>
+      </w:r>
+      <w:r>
+        <w:t>을</w:t>
+      </w:r>
+      <w:r>
+        <w:t xml:space="preserve"> </w:t>
+      </w:r>
+      <w:r>
+        <w:t>누르고</w:t>
+      </w:r>
+      <w:r>
+        <w:t xml:space="preserve"> </w:t>
+      </w:r>
+      <w:r>
+        <w:rPr>
+          <w:b/>
+          <w:bCs/>
+        </w:rPr>
+        <w:t>Ctrl + A</w:t>
+      </w:r>
+      <w:r>
+        <w:t xml:space="preserve">, </w:t>
+      </w:r>
+      <w:r>
+        <w:rPr>
+          <w:b/>
+          <w:bCs/>
+        </w:rPr>
+        <w:t>Ctrl + V</w:t>
       </w:r>
       <w:r>
         <w:t>를</w:t>
@@ -17213,68 +17281,13 @@
         <w:t xml:space="preserve"> </w:t>
       </w:r>
       <w:r>
-        <w:t>눌러</w:t>
-      </w:r>
-      <w:r>
-        <w:t xml:space="preserve"> </w:t>
-      </w:r>
-      <w:r>
-        <w:t>하나씩</w:t>
-      </w:r>
-      <w:r>
-        <w:t xml:space="preserve"> </w:t>
-      </w:r>
-      <w:r>
-        <w:t>붙여넣으세</w:t>
-      </w:r>
-      <w:r>
-        <w:t>요</w:t>
-      </w:r>
-      <w:r>
-        <w:t xml:space="preserve"> (</w:t>
-      </w:r>
-      <w:r>
-        <w:rPr>
-          <w:b/>
-          <w:bCs/>
-        </w:rPr>
-        <w:t>Ctrl + V</w:t>
-      </w:r>
-      <w:r>
-        <w:t xml:space="preserve">). </w:t>
-      </w:r>
-      <w:r>
-        <w:t>누르면</w:t>
-      </w:r>
-      <w:r>
-        <w:t xml:space="preserve"> </w:t>
-      </w:r>
-      <w:r>
-        <w:t>버튼이</w:t>
-      </w:r>
-      <w:r>
-        <w:t xml:space="preserve"> </w:t>
-      </w:r>
-      <w:r>
-        <w:t>초록색</w:t>
-      </w:r>
-      <w:r>
-        <w:t xml:space="preserve"> '</w:t>
-      </w:r>
-      <w:r>
-        <w:t>복사됨</w:t>
-      </w:r>
-      <w:r>
-        <w:t xml:space="preserve"> ✓'</w:t>
-      </w:r>
-      <w:r>
-        <w:t>으로</w:t>
-      </w:r>
-      <w:r>
-        <w:t xml:space="preserve"> </w:t>
-      </w:r>
-      <w:r>
-        <w:t>바뀌어요</w:t>
+        <w:t>차례로</w:t>
+      </w:r>
+      <w:r>
+        <w:t xml:space="preserve"> </w:t>
+      </w:r>
+      <w:r>
+        <w:t>누르세요</w:t>
       </w:r>
       <w:r>
         <w:t>.</w:t>
@@ -17602,7 +17615,7 @@
       <w:pPr>
         <w:pStyle w:val="2"/>
       </w:pPr>
-      <w:bookmarkStart w:id="15" w:name="_Toc241683882"/>
+      <w:bookmarkStart w:id="15" w:name="_Toc241832673"/>
       <w:r>
         <w:t xml:space="preserve">4-3. </w:t>
       </w:r>
@@ -19139,7 +19152,7 @@
       <w:pPr>
         <w:pStyle w:val="2"/>
       </w:pPr>
-      <w:bookmarkStart w:id="16" w:name="_Toc241683883"/>
+      <w:bookmarkStart w:id="16" w:name="_Toc241832674"/>
       <w:r>
         <w:t xml:space="preserve">4-4. </w:t>
       </w:r>
@@ -19321,8 +19334,8 @@
         </w:rPr>
         <w:lastRenderedPageBreak/>
         <w:drawing>
-          <wp:inline distT="0" distB="0" distL="0" distR="0" wp14:anchorId="1DF7356E" wp14:editId="2FC98E56">
-            <wp:extent cx="5143500" cy="1295400"/>
+          <wp:inline distT="0" distB="0" distL="0" distR="0" wp14:anchorId="1DA0AE37" wp14:editId="3848480D">
+            <wp:extent cx="5143500" cy="1304925"/>
             <wp:effectExtent l="0" t="0" r="0" b="0"/>
             <wp:docPr id="8" name="그림 8"/>
             <wp:cNvGraphicFramePr>
@@ -19347,7 +19360,7 @@
                   <pic:spPr bwMode="auto">
                     <a:xfrm>
                       <a:off x="0" y="0"/>
-                      <a:ext cx="5143500" cy="1295400"/>
+                      <a:ext cx="5143500" cy="1304925"/>
                     </a:xfrm>
                     <a:prstGeom prst="rect">
                       <a:avLst/>
@@ -20015,7 +20028,7 @@
           <w:noProof/>
         </w:rPr>
         <w:drawing>
-          <wp:inline distT="0" distB="0" distL="0" distR="0" wp14:anchorId="626636C2" wp14:editId="064F8F31">
+          <wp:inline distT="0" distB="0" distL="0" distR="0" wp14:anchorId="4800ECEB" wp14:editId="668DD72C">
             <wp:extent cx="5715000" cy="1876425"/>
             <wp:effectExtent l="0" t="0" r="0" b="0"/>
             <wp:docPr id="9" name="그림 9"/>
@@ -20272,7 +20285,7 @@
       <w:pPr>
         <w:pStyle w:val="2"/>
       </w:pPr>
-      <w:bookmarkStart w:id="17" w:name="_Toc241683884"/>
+      <w:bookmarkStart w:id="17" w:name="_Toc241832675"/>
       <w:r>
         <w:t xml:space="preserve">4-5. </w:t>
       </w:r>
@@ -20949,7 +20962,7 @@
         </w:rPr>
         <w:lastRenderedPageBreak/>
         <w:drawing>
-          <wp:inline distT="0" distB="0" distL="0" distR="0" wp14:anchorId="3534EEB1" wp14:editId="4AB5D65D">
+          <wp:inline distT="0" distB="0" distL="0" distR="0" wp14:anchorId="6A84B116" wp14:editId="7F8A8DBA">
             <wp:extent cx="5143500" cy="4552950"/>
             <wp:effectExtent l="0" t="0" r="0" b="0"/>
             <wp:docPr id="10" name="그림 10"/>
@@ -21799,7 +21812,7 @@
       <w:pPr>
         <w:pStyle w:val="2"/>
       </w:pPr>
-      <w:bookmarkStart w:id="18" w:name="_Toc241683885"/>
+      <w:bookmarkStart w:id="18" w:name="_Toc241832676"/>
       <w:r>
         <w:t xml:space="preserve">4-6. </w:t>
       </w:r>
@@ -21988,7 +22001,7 @@
         </w:rPr>
         <w:lastRenderedPageBreak/>
         <w:drawing>
-          <wp:inline distT="0" distB="0" distL="0" distR="0" wp14:anchorId="3CED945D" wp14:editId="016180D1">
+          <wp:inline distT="0" distB="0" distL="0" distR="0" wp14:anchorId="016C18A0" wp14:editId="2AF975F0">
             <wp:extent cx="4476750" cy="3057525"/>
             <wp:effectExtent l="0" t="0" r="0" b="0"/>
             <wp:docPr id="11" name="그림 11"/>
@@ -22871,7 +22884,7 @@
         <w:pStyle w:val="1"/>
         <w:pageBreakBefore/>
       </w:pPr>
-      <w:bookmarkStart w:id="19" w:name="_Toc241683886"/>
+      <w:bookmarkStart w:id="19" w:name="_Toc241832677"/>
       <w:r>
         <w:lastRenderedPageBreak/>
         <w:t xml:space="preserve">5. </w:t>
@@ -23219,7 +23232,7 @@
       <w:pPr>
         <w:pStyle w:val="2"/>
       </w:pPr>
-      <w:bookmarkStart w:id="20" w:name="_Toc241683887"/>
+      <w:bookmarkStart w:id="20" w:name="_Toc241832678"/>
       <w:r>
         <w:t xml:space="preserve">5-1. </w:t>
       </w:r>
@@ -23272,7 +23285,7 @@
           <w:noProof/>
         </w:rPr>
         <w:drawing>
-          <wp:inline distT="0" distB="0" distL="0" distR="0" wp14:anchorId="14977AEA" wp14:editId="12532433">
+          <wp:inline distT="0" distB="0" distL="0" distR="0" wp14:anchorId="3F2E3A6D" wp14:editId="6B843C74">
             <wp:extent cx="5143500" cy="4552950"/>
             <wp:effectExtent l="0" t="0" r="0" b="0"/>
             <wp:docPr id="12" name="그림 12"/>
@@ -23985,7 +23998,7 @@
       <w:pPr>
         <w:pStyle w:val="2"/>
       </w:pPr>
-      <w:bookmarkStart w:id="21" w:name="_Toc241683888"/>
+      <w:bookmarkStart w:id="21" w:name="_Toc241832679"/>
       <w:r>
         <w:t xml:space="preserve">5-2. </w:t>
       </w:r>
@@ -24047,7 +24060,7 @@
           <w:noProof/>
         </w:rPr>
         <w:drawing>
-          <wp:inline distT="0" distB="0" distL="0" distR="0" wp14:anchorId="1AA0788E" wp14:editId="193DAE60">
+          <wp:inline distT="0" distB="0" distL="0" distR="0" wp14:anchorId="4B100FFF" wp14:editId="42428C2B">
             <wp:extent cx="5143500" cy="4552950"/>
             <wp:effectExtent l="0" t="0" r="0" b="0"/>
             <wp:docPr id="13" name="그림 13"/>
@@ -24766,7 +24779,7 @@
       <w:pPr>
         <w:pStyle w:val="2"/>
       </w:pPr>
-      <w:bookmarkStart w:id="22" w:name="_Toc241683889"/>
+      <w:bookmarkStart w:id="22" w:name="_Toc241832680"/>
       <w:r>
         <w:lastRenderedPageBreak/>
         <w:t xml:space="preserve">5-3. </w:t>
@@ -24811,7 +24824,7 @@
           <w:noProof/>
         </w:rPr>
         <w:drawing>
-          <wp:inline distT="0" distB="0" distL="0" distR="0" wp14:anchorId="6E575F58" wp14:editId="28F19996">
+          <wp:inline distT="0" distB="0" distL="0" distR="0" wp14:anchorId="0E0821FE" wp14:editId="690CD4FA">
             <wp:extent cx="4476750" cy="5819775"/>
             <wp:effectExtent l="0" t="0" r="0" b="0"/>
             <wp:docPr id="14" name="그림 14"/>
@@ -25904,7 +25917,7 @@
       <w:pPr>
         <w:pStyle w:val="2"/>
       </w:pPr>
-      <w:bookmarkStart w:id="23" w:name="_Toc241683890"/>
+      <w:bookmarkStart w:id="23" w:name="_Toc241832681"/>
       <w:r>
         <w:t xml:space="preserve">5-4. </w:t>
       </w:r>
@@ -26481,7 +26494,7 @@
         <w:pStyle w:val="1"/>
         <w:pageBreakBefore/>
       </w:pPr>
-      <w:bookmarkStart w:id="24" w:name="_Toc241683891"/>
+      <w:bookmarkStart w:id="24" w:name="_Toc241832682"/>
       <w:r>
         <w:lastRenderedPageBreak/>
         <w:t xml:space="preserve">6. </w:t>
@@ -26963,7 +26976,7 @@
       <w:pPr>
         <w:pStyle w:val="2"/>
       </w:pPr>
-      <w:bookmarkStart w:id="25" w:name="_Toc241683892"/>
+      <w:bookmarkStart w:id="25" w:name="_Toc241832683"/>
       <w:r>
         <w:t xml:space="preserve">6-1. </w:t>
       </w:r>
@@ -27414,7 +27427,7 @@
       <w:pPr>
         <w:pStyle w:val="2"/>
       </w:pPr>
-      <w:bookmarkStart w:id="26" w:name="_Toc241683893"/>
+      <w:bookmarkStart w:id="26" w:name="_Toc241832684"/>
       <w:r>
         <w:lastRenderedPageBreak/>
         <w:t xml:space="preserve">6-2. </w:t>
@@ -27477,7 +27490,7 @@
           <w:noProof/>
         </w:rPr>
         <w:drawing>
-          <wp:inline distT="0" distB="0" distL="0" distR="0" wp14:anchorId="579DCCDB" wp14:editId="5BC8E4B1">
+          <wp:inline distT="0" distB="0" distL="0" distR="0" wp14:anchorId="2C537481" wp14:editId="18A9521B">
             <wp:extent cx="5143500" cy="4552950"/>
             <wp:effectExtent l="0" t="0" r="0" b="0"/>
             <wp:docPr id="15" name="그림 15"/>
@@ -28106,7 +28119,7 @@
         <w:pStyle w:val="1"/>
         <w:pageBreakBefore/>
       </w:pPr>
-      <w:bookmarkStart w:id="27" w:name="_Toc241683894"/>
+      <w:bookmarkStart w:id="27" w:name="_Toc241832685"/>
       <w:r>
         <w:lastRenderedPageBreak/>
         <w:t xml:space="preserve">7. </w:t>
@@ -28138,7 +28151,7 @@
       <w:pPr>
         <w:pStyle w:val="2"/>
       </w:pPr>
-      <w:bookmarkStart w:id="28" w:name="_Toc241683895"/>
+      <w:bookmarkStart w:id="28" w:name="_Toc241832686"/>
       <w:r>
         <w:t xml:space="preserve">7-1. </w:t>
       </w:r>
@@ -28164,7 +28177,7 @@
           <w:noProof/>
         </w:rPr>
         <w:drawing>
-          <wp:inline distT="0" distB="0" distL="0" distR="0" wp14:anchorId="44FA5329" wp14:editId="52552535">
+          <wp:inline distT="0" distB="0" distL="0" distR="0" wp14:anchorId="32BF9619" wp14:editId="7AEE1113">
             <wp:extent cx="3238500" cy="4181475"/>
             <wp:effectExtent l="0" t="0" r="0" b="0"/>
             <wp:docPr id="16" name="그림 16"/>
@@ -29626,7 +29639,7 @@
       <w:pPr>
         <w:pStyle w:val="2"/>
       </w:pPr>
-      <w:bookmarkStart w:id="29" w:name="_Toc241683896"/>
+      <w:bookmarkStart w:id="29" w:name="_Toc241832687"/>
       <w:r>
         <w:lastRenderedPageBreak/>
         <w:t xml:space="preserve">7-2. </w:t>
@@ -29659,7 +29672,7 @@
           <w:noProof/>
         </w:rPr>
         <w:drawing>
-          <wp:inline distT="0" distB="0" distL="0" distR="0" wp14:anchorId="27814FE0" wp14:editId="26E21440">
+          <wp:inline distT="0" distB="0" distL="0" distR="0" wp14:anchorId="1A11F77F" wp14:editId="3E5084B3">
             <wp:extent cx="3810000" cy="4676775"/>
             <wp:effectExtent l="0" t="0" r="0" b="0"/>
             <wp:docPr id="17" name="그림 17"/>
@@ -31211,7 +31224,7 @@
       <w:pPr>
         <w:pStyle w:val="2"/>
       </w:pPr>
-      <w:bookmarkStart w:id="30" w:name="_Toc241683897"/>
+      <w:bookmarkStart w:id="30" w:name="_Toc241832688"/>
       <w:r>
         <w:t xml:space="preserve">7-3. </w:t>
       </w:r>
@@ -32329,7 +32342,7 @@
         <w:pStyle w:val="1"/>
         <w:pageBreakBefore/>
       </w:pPr>
-      <w:bookmarkStart w:id="31" w:name="_Toc241683898"/>
+      <w:bookmarkStart w:id="31" w:name="_Toc241832689"/>
       <w:r>
         <w:lastRenderedPageBreak/>
         <w:t xml:space="preserve">8. </w:t>
@@ -34426,43 +34439,43 @@
                 <w:sz w:val="19"/>
                 <w:szCs w:val="19"/>
               </w:rPr>
-              <w:t>칸이</w:t>
-            </w:r>
-            <w:r>
-              <w:rPr>
-                <w:b/>
-                <w:bCs/>
-                <w:sz w:val="19"/>
-                <w:szCs w:val="19"/>
-              </w:rPr>
-              <w:t xml:space="preserve"> </w:t>
-            </w:r>
-            <w:r>
-              <w:rPr>
-                <w:b/>
-                <w:bCs/>
-                <w:sz w:val="19"/>
-                <w:szCs w:val="19"/>
-              </w:rPr>
-              <w:t>비어서</w:t>
-            </w:r>
-            <w:r>
-              <w:rPr>
-                <w:b/>
-                <w:bCs/>
-                <w:sz w:val="19"/>
-                <w:szCs w:val="19"/>
-              </w:rPr>
-              <w:t xml:space="preserve"> </w:t>
-            </w:r>
-            <w:r>
-              <w:rPr>
-                <w:b/>
-                <w:bCs/>
-                <w:sz w:val="19"/>
-                <w:szCs w:val="19"/>
-              </w:rPr>
-              <w:t>열림</w:t>
+              <w:t>본문이</w:t>
+            </w:r>
+            <w:r>
+              <w:rPr>
+                <w:b/>
+                <w:bCs/>
+                <w:sz w:val="19"/>
+                <w:szCs w:val="19"/>
+              </w:rPr>
+              <w:t xml:space="preserve"> </w:t>
+            </w:r>
+            <w:r>
+              <w:rPr>
+                <w:b/>
+                <w:bCs/>
+                <w:sz w:val="19"/>
+                <w:szCs w:val="19"/>
+              </w:rPr>
+              <w:t>비어</w:t>
+            </w:r>
+            <w:r>
+              <w:rPr>
+                <w:b/>
+                <w:bCs/>
+                <w:sz w:val="19"/>
+                <w:szCs w:val="19"/>
+              </w:rPr>
+              <w:t xml:space="preserve"> </w:t>
+            </w:r>
+            <w:r>
+              <w:rPr>
+                <w:b/>
+                <w:bCs/>
+                <w:sz w:val="19"/>
+                <w:szCs w:val="19"/>
+              </w:rPr>
+              <w:t>있음</w:t>
             </w:r>
           </w:p>
         </w:tc>
@@ -34493,6 +34506,105 @@
                 <w:sz w:val="19"/>
                 <w:szCs w:val="19"/>
               </w:rPr>
+              <w:t xml:space="preserve">Gmail </w:t>
+            </w:r>
+            <w:r>
+              <w:rPr>
+                <w:b/>
+                <w:bCs/>
+                <w:sz w:val="19"/>
+                <w:szCs w:val="19"/>
+              </w:rPr>
+              <w:t>본문</w:t>
+            </w:r>
+            <w:r>
+              <w:rPr>
+                <w:b/>
+                <w:bCs/>
+                <w:sz w:val="19"/>
+                <w:szCs w:val="19"/>
+              </w:rPr>
+              <w:t xml:space="preserve"> </w:t>
+            </w:r>
+            <w:r>
+              <w:rPr>
+                <w:b/>
+                <w:bCs/>
+                <w:sz w:val="19"/>
+                <w:szCs w:val="19"/>
+              </w:rPr>
+              <w:t>칸을</w:t>
+            </w:r>
+            <w:r>
+              <w:rPr>
+                <w:b/>
+                <w:bCs/>
+                <w:sz w:val="19"/>
+                <w:szCs w:val="19"/>
+              </w:rPr>
+              <w:t xml:space="preserve"> </w:t>
+            </w:r>
+            <w:r>
+              <w:rPr>
+                <w:b/>
+                <w:bCs/>
+                <w:sz w:val="19"/>
+                <w:szCs w:val="19"/>
+              </w:rPr>
+              <w:t>누르고</w:t>
+            </w:r>
+            <w:r>
+              <w:rPr>
+                <w:b/>
+                <w:bCs/>
+                <w:sz w:val="19"/>
+                <w:szCs w:val="19"/>
+              </w:rPr>
+              <w:t xml:space="preserve"> Ctrl + A, Ctrl + V. </w:t>
+            </w:r>
+            <w:r>
+              <w:rPr>
+                <w:b/>
+                <w:bCs/>
+                <w:sz w:val="19"/>
+                <w:szCs w:val="19"/>
+              </w:rPr>
+              <w:t>안</w:t>
+            </w:r>
+            <w:r>
+              <w:rPr>
+                <w:b/>
+                <w:bCs/>
+                <w:sz w:val="19"/>
+                <w:szCs w:val="19"/>
+              </w:rPr>
+              <w:t xml:space="preserve"> </w:t>
+            </w:r>
+            <w:r>
+              <w:rPr>
+                <w:b/>
+                <w:bCs/>
+                <w:sz w:val="19"/>
+                <w:szCs w:val="19"/>
+              </w:rPr>
+              <w:t>들어가면</w:t>
+            </w:r>
+            <w:r>
+              <w:rPr>
+                <w:b/>
+                <w:bCs/>
+                <w:sz w:val="19"/>
+                <w:szCs w:val="19"/>
+              </w:rPr>
+              <w:t xml:space="preserve"> </w:t>
+            </w:r>
+            <w:r>
+              <w:rPr>
+                <w:b/>
+                <w:bCs/>
+                <w:sz w:val="19"/>
+                <w:szCs w:val="19"/>
+              </w:rPr>
               <w:t>메일</w:t>
             </w:r>
             <w:r>
@@ -34529,43 +34641,52 @@
                 <w:sz w:val="19"/>
                 <w:szCs w:val="19"/>
               </w:rPr>
-              <w:t>복사</w:t>
-            </w:r>
-            <w:r>
-              <w:rPr>
-                <w:b/>
-                <w:bCs/>
-                <w:sz w:val="19"/>
-                <w:szCs w:val="19"/>
-              </w:rPr>
-              <w:t xml:space="preserve"> </w:t>
-            </w:r>
-            <w:r>
-              <w:rPr>
-                <w:b/>
-                <w:bCs/>
-                <w:sz w:val="19"/>
-                <w:szCs w:val="19"/>
-              </w:rPr>
-              <w:t>버튼을</w:t>
-            </w:r>
-            <w:r>
-              <w:rPr>
-                <w:b/>
-                <w:bCs/>
-                <w:sz w:val="19"/>
-                <w:szCs w:val="19"/>
-              </w:rPr>
-              <w:t xml:space="preserve"> </w:t>
-            </w:r>
-            <w:r>
-              <w:rPr>
-                <w:b/>
-                <w:bCs/>
-                <w:sz w:val="19"/>
-                <w:szCs w:val="19"/>
-              </w:rPr>
-              <w:t>누르고</w:t>
+              <w:t>본문</w:t>
+            </w:r>
+            <w:r>
+              <w:rPr>
+                <w:b/>
+                <w:bCs/>
+                <w:sz w:val="19"/>
+                <w:szCs w:val="19"/>
+              </w:rPr>
+              <w:t xml:space="preserve"> </w:t>
+            </w:r>
+            <w:r>
+              <w:rPr>
+                <w:b/>
+                <w:bCs/>
+                <w:sz w:val="19"/>
+                <w:szCs w:val="19"/>
+              </w:rPr>
+              <w:t>복사를</w:t>
+            </w:r>
+            <w:r>
+              <w:rPr>
+                <w:b/>
+                <w:bCs/>
+                <w:sz w:val="19"/>
+                <w:szCs w:val="19"/>
+              </w:rPr>
+              <w:t xml:space="preserve"> </w:t>
+            </w:r>
+            <w:r>
+              <w:rPr>
+                <w:b/>
+                <w:bCs/>
+                <w:sz w:val="19"/>
+                <w:szCs w:val="19"/>
+              </w:rPr>
+              <w:t>누르</w:t>
+            </w:r>
+            <w:r>
+              <w:rPr>
+                <w:b/>
+                <w:bCs/>
+                <w:sz w:val="19"/>
+                <w:szCs w:val="19"/>
+              </w:rPr>
+              <w:t>고</w:t>
             </w:r>
             <w:r>
               <w:rPr>
@@ -34592,88 +34713,34 @@
                 <w:sz w:val="19"/>
                 <w:szCs w:val="19"/>
               </w:rPr>
-              <w:t xml:space="preserve"> ✓'), Gmail </w:t>
-            </w:r>
-            <w:r>
-              <w:rPr>
-                <w:b/>
-                <w:bCs/>
-                <w:sz w:val="19"/>
-                <w:szCs w:val="19"/>
-              </w:rPr>
-              <w:t>칸을</w:t>
-            </w:r>
-            <w:r>
-              <w:rPr>
-                <w:b/>
-                <w:bCs/>
-                <w:sz w:val="19"/>
-                <w:szCs w:val="19"/>
-              </w:rPr>
-              <w:t xml:space="preserve"> </w:t>
-            </w:r>
-            <w:r>
-              <w:rPr>
-                <w:b/>
-                <w:bCs/>
-                <w:sz w:val="19"/>
-                <w:szCs w:val="19"/>
-              </w:rPr>
-              <w:t>누른</w:t>
-            </w:r>
-            <w:r>
-              <w:rPr>
-                <w:b/>
-                <w:bCs/>
-                <w:sz w:val="19"/>
-                <w:szCs w:val="19"/>
-              </w:rPr>
-              <w:t xml:space="preserve"> </w:t>
-            </w:r>
-            <w:r>
-              <w:rPr>
-                <w:b/>
-                <w:bCs/>
-                <w:sz w:val="19"/>
-                <w:szCs w:val="19"/>
-              </w:rPr>
-              <w:t>뒤</w:t>
-            </w:r>
-            <w:r>
-              <w:rPr>
-                <w:b/>
-                <w:bCs/>
-                <w:sz w:val="19"/>
-                <w:szCs w:val="19"/>
-              </w:rPr>
-              <w:t xml:space="preserve"> Ctrl + V</w:t>
-            </w:r>
-            <w:r>
-              <w:rPr>
-                <w:b/>
-                <w:bCs/>
-                <w:sz w:val="19"/>
-                <w:szCs w:val="19"/>
-              </w:rPr>
-              <w:t>를</w:t>
-            </w:r>
-            <w:r>
-              <w:rPr>
-                <w:b/>
-                <w:bCs/>
-                <w:sz w:val="19"/>
-                <w:szCs w:val="19"/>
-              </w:rPr>
-              <w:t xml:space="preserve"> </w:t>
-            </w:r>
-            <w:r>
-              <w:rPr>
-                <w:b/>
-                <w:bCs/>
-                <w:sz w:val="19"/>
-                <w:szCs w:val="19"/>
-              </w:rPr>
-              <w:t>누르세요</w:t>
+              <w:t xml:space="preserve"> ✓') </w:t>
+            </w:r>
+            <w:r>
+              <w:rPr>
+                <w:b/>
+                <w:bCs/>
+                <w:sz w:val="19"/>
+                <w:szCs w:val="19"/>
+              </w:rPr>
+              <w:t>다시</w:t>
+            </w:r>
+            <w:r>
+              <w:rPr>
+                <w:b/>
+                <w:bCs/>
+                <w:sz w:val="19"/>
+                <w:szCs w:val="19"/>
+              </w:rPr>
+              <w:t xml:space="preserve"> </w:t>
+            </w:r>
+            <w:r>
+              <w:rPr>
+                <w:b/>
+                <w:bCs/>
+                <w:sz w:val="19"/>
+                <w:szCs w:val="19"/>
+              </w:rPr>
+              <w:t>붙여넣으세요</w:t>
             </w:r>
             <w:r>
               <w:rPr>
@@ -35738,7 +35805,7 @@
         <w:pStyle w:val="1"/>
         <w:pageBreakBefore/>
       </w:pPr>
-      <w:bookmarkStart w:id="32" w:name="_Toc241683899"/>
+      <w:bookmarkStart w:id="32" w:name="_Toc241832690"/>
       <w:r>
         <w:lastRenderedPageBreak/>
         <w:t xml:space="preserve">9. </w:t>
@@ -35758,7 +35825,7 @@
       <w:pPr>
         <w:pStyle w:val="2"/>
       </w:pPr>
-      <w:bookmarkStart w:id="33" w:name="_Toc241683900"/>
+      <w:bookmarkStart w:id="33" w:name="_Toc241832691"/>
       <w:r>
         <w:t xml:space="preserve">9-1. </w:t>
       </w:r>
@@ -36403,10 +36470,7 @@
         <w:t xml:space="preserve"> </w:t>
       </w:r>
       <w:r>
-        <w:t>캡</w:t>
-      </w:r>
-      <w:r>
-        <w:t>처</w:t>
+        <w:t>캡처</w:t>
       </w:r>
       <w:r>
         <w:t xml:space="preserve"> </w:t>
@@ -36422,7 +36486,7 @@
       <w:pPr>
         <w:pStyle w:val="2"/>
       </w:pPr>
-      <w:bookmarkStart w:id="34" w:name="_Toc241683901"/>
+      <w:bookmarkStart w:id="34" w:name="_Toc241832692"/>
       <w:r>
         <w:t xml:space="preserve">9-2. </w:t>
       </w:r>
@@ -36637,7 +36701,10 @@
         <w:t xml:space="preserve"> </w:t>
       </w:r>
       <w:r>
-        <w:t>창을</w:t>
+        <w:t>창</w:t>
+      </w:r>
+      <w:r>
+        <w:t>을</w:t>
       </w:r>
       <w:r>
         <w:t xml:space="preserve"> </w:t>
@@ -36778,14 +36845,7 @@
           <w:b/>
           <w:bCs/>
         </w:rPr>
-        <w:t>넣</w:t>
-      </w:r>
-      <w:r>
-        <w:rPr>
-          <w:b/>
-          <w:bCs/>
-        </w:rPr>
-        <w:t>기</w:t>
+        <w:t>넣기</w:t>
       </w:r>
       <w:r>
         <w:rPr>
@@ -37195,7 +37255,7 @@
       <w:pPr>
         <w:pStyle w:val="2"/>
       </w:pPr>
-      <w:bookmarkStart w:id="35" w:name="_Toc241683902"/>
+      <w:bookmarkStart w:id="35" w:name="_Toc241832693"/>
       <w:r>
         <w:t xml:space="preserve">9-3. </w:t>
       </w:r>
@@ -37438,7 +37498,7 @@
       <w:pPr>
         <w:pStyle w:val="2"/>
       </w:pPr>
-      <w:bookmarkStart w:id="36" w:name="_Toc241683903"/>
+      <w:bookmarkStart w:id="36" w:name="_Toc241832694"/>
       <w:r>
         <w:t xml:space="preserve">9-4. </w:t>
       </w:r>
@@ -37587,7 +37647,16 @@
                 <w:sz w:val="19"/>
                 <w:szCs w:val="19"/>
               </w:rPr>
-              <w:t>data\vendors.json</w:t>
+              <w:t>data\ven</w:t>
+            </w:r>
+            <w:r>
+              <w:rPr>
+                <w:b/>
+                <w:bCs/>
+                <w:sz w:val="19"/>
+                <w:szCs w:val="19"/>
+              </w:rPr>
+              <w:t>dors.json</w:t>
             </w:r>
           </w:p>
         </w:tc>
@@ -38790,10 +38859,10 @@
 <file path=word/numbering.xml><?xml version="1.0" encoding="utf-8"?>
 <w:numbering xmlns:wpc="http://schemas.microsoft.com/office/word/2010/wordprocessingCanvas" xmlns:cx="http://schemas.microsoft.com/office/drawing/2014/chartex" xmlns:cx1="http://schemas.microsoft.com/office/drawing/2015/9/8/chartex" xmlns:cx2="http://schemas.microsoft.com/office/drawing/2015/10/21/chartex" xmlns:cx3="http://schemas.microsoft.com/office/drawing/2016/5/9/chartex" xmlns:cx4="http://schemas.microsoft.com/office/drawing/2016/5/10/chartex" xmlns:cx5="http://schemas.microsoft.com/office/drawing/2016/5/11/chartex" xmlns:cx6="http://schemas.microsoft.com/office/drawing/2016/5/12/chartex" xmlns:cx7="http://schemas.microsoft.com/office/drawing/2016/5/13/chartex" xmlns:cx8="http://schemas.microsoft.com/office/drawing/2016/5/14/chartex" xmlns:mc="http://schemas.openxmlformats.org/markup-compatibility/2006" xmlns:aink="http://schemas.microsoft.com/office/drawing/2016/ink" xmlns:am3d="http://schemas.microsoft.com/office/drawing/2017/model3d" xmlns:o="urn:schemas-microsoft-com:office:office" xmlns:r="http://schemas.openxmlformats.org/officeDocument/2006/relationships" xmlns:m="http://schemas.openxmlformats.org/officeDocument/2006/math" xmlns:v="urn:schemas-microsoft-com:vml" xmlns:wp14="http://schemas.microsoft.com/office/word/2010/wordprocessingDrawing" xmlns:wp="http://schemas.openxmlformats.org/drawingml/2006/wordprocessingDrawing" xmlns:w10="urn:schemas-microsoft-com:office:word" xmlns:w="http://schemas.openxmlformats.org/wordprocessingml/2006/main" xmlns:w14="http://schemas.microsoft.com/office/word/2010/wordml" xmlns:w15="http://schemas.microsoft.com/office/word/2012/wordml" xmlns:w16cex="http://schemas.microsoft.com/office/word/2018/wordml/cex" xmlns:w16cid="http://schemas.microsoft.com/office/word/2016/wordml/cid" xmlns:w16="http://schemas.microsoft.com/office/word/2018/wordml" xmlns:w16sdtdh="http://schemas.microsoft.com/office/word/2020/wordml/sdtdatahash" xmlns:w16se="http://schemas.microsoft.com/office/word/2015/wordml/symex" xmlns:wpg="http://schemas.microsoft.com/office/word/2010/wordprocessingGroup" xmlns:wpi="http://schemas.microsoft.com/office/word/2010/wordprocessingInk" xmlns:wne="http://schemas.microsoft.com/office/word/2006/wordml" xmlns:wps="http://schemas.microsoft.com/office/word/2010/wordprocessingShape" mc:Ignorable="w14 w15 w16se w16cid w16 w16cex w16sdtdh wp14">
   <w:abstractNum w:abstractNumId="0" w15:restartNumberingAfterBreak="0">
-    <w:nsid w:val="0BFE4765"/>
+    <w:nsid w:val="0617568F"/>
     <w:multiLevelType w:val="hybridMultilevel"/>
-    <w:tmpl w:val="3FD66BBA"/>
-    <w:lvl w:ilvl="0" w:tplc="3FCE1720">
+    <w:tmpl w:val="097A0214"/>
+    <w:lvl w:ilvl="0" w:tplc="0A04A3DE">
       <w:start w:val="1"/>
       <w:numFmt w:val="decimal"/>
       <w:lvlText w:val="%1."/>
@@ -38802,52 +38871,52 @@
         <w:ind w:left="440" w:hanging="300"/>
       </w:pPr>
     </w:lvl>
-    <w:lvl w:ilvl="1" w:tplc="AA88BE54">
+    <w:lvl w:ilvl="1" w:tplc="1A28E206">
       <w:numFmt w:val="decimal"/>
       <w:lvlText w:val=""/>
       <w:lvlJc w:val="left"/>
     </w:lvl>
-    <w:lvl w:ilvl="2" w:tplc="183C0E96">
+    <w:lvl w:ilvl="2" w:tplc="92F8D48C">
       <w:numFmt w:val="decimal"/>
       <w:lvlText w:val=""/>
       <w:lvlJc w:val="left"/>
     </w:lvl>
-    <w:lvl w:ilvl="3" w:tplc="126884EC">
+    <w:lvl w:ilvl="3" w:tplc="829C3B8C">
       <w:numFmt w:val="decimal"/>
       <w:lvlText w:val=""/>
       <w:lvlJc w:val="left"/>
     </w:lvl>
-    <w:lvl w:ilvl="4" w:tplc="C1125102">
+    <w:lvl w:ilvl="4" w:tplc="D33C5060">
       <w:numFmt w:val="decimal"/>
       <w:lvlText w:val=""/>
       <w:lvlJc w:val="left"/>
     </w:lvl>
-    <w:lvl w:ilvl="5" w:tplc="51B26B56">
+    <w:lvl w:ilvl="5" w:tplc="0044A898">
       <w:numFmt w:val="decimal"/>
       <w:lvlText w:val=""/>
       <w:lvlJc w:val="left"/>
     </w:lvl>
-    <w:lvl w:ilvl="6" w:tplc="54582DA4">
+    <w:lvl w:ilvl="6" w:tplc="62500022">
       <w:numFmt w:val="decimal"/>
       <w:lvlText w:val=""/>
       <w:lvlJc w:val="left"/>
     </w:lvl>
-    <w:lvl w:ilvl="7" w:tplc="378A3650">
+    <w:lvl w:ilvl="7" w:tplc="6B3C6520">
       <w:numFmt w:val="decimal"/>
       <w:lvlText w:val=""/>
       <w:lvlJc w:val="left"/>
     </w:lvl>
-    <w:lvl w:ilvl="8" w:tplc="F73EBD12">
+    <w:lvl w:ilvl="8" w:tplc="1818AFDE">
       <w:numFmt w:val="decimal"/>
       <w:lvlText w:val=""/>
       <w:lvlJc w:val="left"/>
     </w:lvl>
   </w:abstractNum>
   <w:abstractNum w:abstractNumId="1" w15:restartNumberingAfterBreak="0">
-    <w:nsid w:val="0DE407C5"/>
+    <w:nsid w:val="083752B7"/>
     <w:multiLevelType w:val="hybridMultilevel"/>
-    <w:tmpl w:val="77AA1298"/>
-    <w:lvl w:ilvl="0" w:tplc="BFE2F7F0">
+    <w:tmpl w:val="E530E8AA"/>
+    <w:lvl w:ilvl="0" w:tplc="4D16D262">
       <w:start w:val="1"/>
       <w:numFmt w:val="decimal"/>
       <w:lvlText w:val="%1."/>
@@ -38856,52 +38925,52 @@
         <w:ind w:left="440" w:hanging="300"/>
       </w:pPr>
     </w:lvl>
-    <w:lvl w:ilvl="1" w:tplc="78F4A460">
+    <w:lvl w:ilvl="1" w:tplc="A40CCC26">
       <w:numFmt w:val="decimal"/>
       <w:lvlText w:val=""/>
       <w:lvlJc w:val="left"/>
     </w:lvl>
-    <w:lvl w:ilvl="2" w:tplc="734CBF6C">
+    <w:lvl w:ilvl="2" w:tplc="8AC093F6">
       <w:numFmt w:val="decimal"/>
       <w:lvlText w:val=""/>
       <w:lvlJc w:val="left"/>
     </w:lvl>
-    <w:lvl w:ilvl="3" w:tplc="35880B8A">
+    <w:lvl w:ilvl="3" w:tplc="BFA48978">
       <w:numFmt w:val="decimal"/>
       <w:lvlText w:val=""/>
       <w:lvlJc w:val="left"/>
     </w:lvl>
-    <w:lvl w:ilvl="4" w:tplc="11846DD2">
+    <w:lvl w:ilvl="4" w:tplc="3EA6DD70">
       <w:numFmt w:val="decimal"/>
       <w:lvlText w:val=""/>
       <w:lvlJc w:val="left"/>
     </w:lvl>
-    <w:lvl w:ilvl="5" w:tplc="691E1364">
+    <w:lvl w:ilvl="5" w:tplc="D652AEC6">
       <w:numFmt w:val="decimal"/>
       <w:lvlText w:val=""/>
       <w:lvlJc w:val="left"/>
     </w:lvl>
-    <w:lvl w:ilvl="6" w:tplc="6BE6BA60">
+    <w:lvl w:ilvl="6" w:tplc="5C4C5F8C">
       <w:numFmt w:val="decimal"/>
       <w:lvlText w:val=""/>
       <w:lvlJc w:val="left"/>
     </w:lvl>
-    <w:lvl w:ilvl="7" w:tplc="A5EE23D4">
+    <w:lvl w:ilvl="7" w:tplc="1B222C8C">
       <w:numFmt w:val="decimal"/>
       <w:lvlText w:val=""/>
       <w:lvlJc w:val="left"/>
     </w:lvl>
-    <w:lvl w:ilvl="8" w:tplc="D28E4674">
+    <w:lvl w:ilvl="8" w:tplc="7BE8FCEA">
       <w:numFmt w:val="decimal"/>
       <w:lvlText w:val=""/>
       <w:lvlJc w:val="left"/>
     </w:lvl>
   </w:abstractNum>
   <w:abstractNum w:abstractNumId="2" w15:restartNumberingAfterBreak="0">
-    <w:nsid w:val="185B18EB"/>
+    <w:nsid w:val="0D813101"/>
     <w:multiLevelType w:val="hybridMultilevel"/>
-    <w:tmpl w:val="3464414E"/>
-    <w:lvl w:ilvl="0" w:tplc="B9765DE0">
+    <w:tmpl w:val="3E443F38"/>
+    <w:lvl w:ilvl="0" w:tplc="C07CDE02">
       <w:start w:val="1"/>
       <w:numFmt w:val="decimal"/>
       <w:lvlText w:val="%1."/>
@@ -38910,376 +38979,52 @@
         <w:ind w:left="440" w:hanging="300"/>
       </w:pPr>
     </w:lvl>
-    <w:lvl w:ilvl="1" w:tplc="ECBA5308">
+    <w:lvl w:ilvl="1" w:tplc="7DD4B43C">
       <w:numFmt w:val="decimal"/>
       <w:lvlText w:val=""/>
       <w:lvlJc w:val="left"/>
     </w:lvl>
-    <w:lvl w:ilvl="2" w:tplc="F1D2B89C">
+    <w:lvl w:ilvl="2" w:tplc="D99A6FD0">
       <w:numFmt w:val="decimal"/>
       <w:lvlText w:val=""/>
       <w:lvlJc w:val="left"/>
     </w:lvl>
-    <w:lvl w:ilvl="3" w:tplc="C1FA0C24">
+    <w:lvl w:ilvl="3" w:tplc="F20EB730">
       <w:numFmt w:val="decimal"/>
       <w:lvlText w:val=""/>
       <w:lvlJc w:val="left"/>
     </w:lvl>
-    <w:lvl w:ilvl="4" w:tplc="327C37B2">
+    <w:lvl w:ilvl="4" w:tplc="3B50D322">
       <w:numFmt w:val="decimal"/>
       <w:lvlText w:val=""/>
       <w:lvlJc w:val="left"/>
     </w:lvl>
-    <w:lvl w:ilvl="5" w:tplc="F77C1676">
+    <w:lvl w:ilvl="5" w:tplc="4432AF70">
       <w:numFmt w:val="decimal"/>
       <w:lvlText w:val=""/>
       <w:lvlJc w:val="left"/>
     </w:lvl>
-    <w:lvl w:ilvl="6" w:tplc="00E012AC">
+    <w:lvl w:ilvl="6" w:tplc="01685B7C">
       <w:numFmt w:val="decimal"/>
       <w:lvlText w:val=""/>
       <w:lvlJc w:val="left"/>
     </w:lvl>
-    <w:lvl w:ilvl="7" w:tplc="9E747100">
+    <w:lvl w:ilvl="7" w:tplc="0E46E00C">
       <w:numFmt w:val="decimal"/>
       <w:lvlText w:val=""/>
       <w:lvlJc w:val="left"/>
     </w:lvl>
-    <w:lvl w:ilvl="8" w:tplc="AF4ED718">
+    <w:lvl w:ilvl="8" w:tplc="DA2A3C9A">
       <w:numFmt w:val="decimal"/>
       <w:lvlText w:val=""/>
       <w:lvlJc w:val="left"/>
     </w:lvl>
   </w:abstractNum>
   <w:abstractNum w:abstractNumId="3" w15:restartNumberingAfterBreak="0">
-    <w:nsid w:val="194D4700"/>
+    <w:nsid w:val="110C30B0"/>
     <w:multiLevelType w:val="hybridMultilevel"/>
-    <w:tmpl w:val="2924C454"/>
-    <w:lvl w:ilvl="0" w:tplc="6FF80990">
-      <w:start w:val="1"/>
-      <w:numFmt w:val="decimal"/>
-      <w:lvlText w:val="%1."/>
-      <w:lvlJc w:val="left"/>
-      <w:pPr>
-        <w:ind w:left="440" w:hanging="300"/>
-      </w:pPr>
-    </w:lvl>
-    <w:lvl w:ilvl="1" w:tplc="13EC8EA4">
-      <w:numFmt w:val="decimal"/>
-      <w:lvlText w:val=""/>
-      <w:lvlJc w:val="left"/>
-    </w:lvl>
-    <w:lvl w:ilvl="2" w:tplc="ADC6FAEC">
-      <w:numFmt w:val="decimal"/>
-      <w:lvlText w:val=""/>
-      <w:lvlJc w:val="left"/>
-    </w:lvl>
-    <w:lvl w:ilvl="3" w:tplc="E2989CEC">
-      <w:numFmt w:val="decimal"/>
-      <w:lvlText w:val=""/>
-      <w:lvlJc w:val="left"/>
-    </w:lvl>
-    <w:lvl w:ilvl="4" w:tplc="AE2ECE3C">
-      <w:numFmt w:val="decimal"/>
-      <w:lvlText w:val=""/>
-      <w:lvlJc w:val="left"/>
-    </w:lvl>
-    <w:lvl w:ilvl="5" w:tplc="5D060ACE">
-      <w:numFmt w:val="decimal"/>
-      <w:lvlText w:val=""/>
-      <w:lvlJc w:val="left"/>
-    </w:lvl>
-    <w:lvl w:ilvl="6" w:tplc="C4A2FBB0">
-      <w:numFmt w:val="decimal"/>
-      <w:lvlText w:val=""/>
-      <w:lvlJc w:val="left"/>
-    </w:lvl>
-    <w:lvl w:ilvl="7" w:tplc="12AA5646">
-      <w:numFmt w:val="decimal"/>
-      <w:lvlText w:val=""/>
-      <w:lvlJc w:val="left"/>
-    </w:lvl>
-    <w:lvl w:ilvl="8" w:tplc="3D0E9C28">
-      <w:numFmt w:val="decimal"/>
-      <w:lvlText w:val=""/>
-      <w:lvlJc w:val="left"/>
-    </w:lvl>
-  </w:abstractNum>
-  <w:abstractNum w:abstractNumId="4" w15:restartNumberingAfterBreak="0">
-    <w:nsid w:val="1B9C6C3A"/>
-    <w:multiLevelType w:val="hybridMultilevel"/>
-    <w:tmpl w:val="9D8C6F74"/>
-    <w:lvl w:ilvl="0" w:tplc="17EE5F70">
-      <w:start w:val="1"/>
-      <w:numFmt w:val="decimal"/>
-      <w:lvlText w:val="%1."/>
-      <w:lvlJc w:val="left"/>
-      <w:pPr>
-        <w:ind w:left="440" w:hanging="300"/>
-      </w:pPr>
-    </w:lvl>
-    <w:lvl w:ilvl="1" w:tplc="A73085B0">
-      <w:numFmt w:val="decimal"/>
-      <w:lvlText w:val=""/>
-      <w:lvlJc w:val="left"/>
-    </w:lvl>
-    <w:lvl w:ilvl="2" w:tplc="25048F14">
-      <w:numFmt w:val="decimal"/>
-      <w:lvlText w:val=""/>
-      <w:lvlJc w:val="left"/>
-    </w:lvl>
-    <w:lvl w:ilvl="3" w:tplc="93CED94C">
-      <w:numFmt w:val="decimal"/>
-      <w:lvlText w:val=""/>
-      <w:lvlJc w:val="left"/>
-    </w:lvl>
-    <w:lvl w:ilvl="4" w:tplc="CE9A97D8">
-      <w:numFmt w:val="decimal"/>
-      <w:lvlText w:val=""/>
-      <w:lvlJc w:val="left"/>
-    </w:lvl>
-    <w:lvl w:ilvl="5" w:tplc="DCFE916E">
-      <w:numFmt w:val="decimal"/>
-      <w:lvlText w:val=""/>
-      <w:lvlJc w:val="left"/>
-    </w:lvl>
-    <w:lvl w:ilvl="6" w:tplc="C37C0F02">
-      <w:numFmt w:val="decimal"/>
-      <w:lvlText w:val=""/>
-      <w:lvlJc w:val="left"/>
-    </w:lvl>
-    <w:lvl w:ilvl="7" w:tplc="404270B0">
-      <w:numFmt w:val="decimal"/>
-      <w:lvlText w:val=""/>
-      <w:lvlJc w:val="left"/>
-    </w:lvl>
-    <w:lvl w:ilvl="8" w:tplc="9658292E">
-      <w:numFmt w:val="decimal"/>
-      <w:lvlText w:val=""/>
-      <w:lvlJc w:val="left"/>
-    </w:lvl>
-  </w:abstractNum>
-  <w:abstractNum w:abstractNumId="5" w15:restartNumberingAfterBreak="0">
-    <w:nsid w:val="1C255FBC"/>
-    <w:multiLevelType w:val="hybridMultilevel"/>
-    <w:tmpl w:val="EE3CF4A6"/>
-    <w:lvl w:ilvl="0" w:tplc="27A447BC">
-      <w:start w:val="1"/>
-      <w:numFmt w:val="decimal"/>
-      <w:lvlText w:val="%1."/>
-      <w:lvlJc w:val="left"/>
-      <w:pPr>
-        <w:ind w:left="440" w:hanging="300"/>
-      </w:pPr>
-    </w:lvl>
-    <w:lvl w:ilvl="1" w:tplc="5D98FDBC">
-      <w:numFmt w:val="decimal"/>
-      <w:lvlText w:val=""/>
-      <w:lvlJc w:val="left"/>
-    </w:lvl>
-    <w:lvl w:ilvl="2" w:tplc="C44E8676">
-      <w:numFmt w:val="decimal"/>
-      <w:lvlText w:val=""/>
-      <w:lvlJc w:val="left"/>
-    </w:lvl>
-    <w:lvl w:ilvl="3" w:tplc="F710CBD0">
-      <w:numFmt w:val="decimal"/>
-      <w:lvlText w:val=""/>
-      <w:lvlJc w:val="left"/>
-    </w:lvl>
-    <w:lvl w:ilvl="4" w:tplc="9FB6871E">
-      <w:numFmt w:val="decimal"/>
-      <w:lvlText w:val=""/>
-      <w:lvlJc w:val="left"/>
-    </w:lvl>
-    <w:lvl w:ilvl="5" w:tplc="EEC23968">
-      <w:numFmt w:val="decimal"/>
-      <w:lvlText w:val=""/>
-      <w:lvlJc w:val="left"/>
-    </w:lvl>
-    <w:lvl w:ilvl="6" w:tplc="956CE0B4">
-      <w:numFmt w:val="decimal"/>
-      <w:lvlText w:val=""/>
-      <w:lvlJc w:val="left"/>
-    </w:lvl>
-    <w:lvl w:ilvl="7" w:tplc="D7789BC6">
-      <w:numFmt w:val="decimal"/>
-      <w:lvlText w:val=""/>
-      <w:lvlJc w:val="left"/>
-    </w:lvl>
-    <w:lvl w:ilvl="8" w:tplc="7CEE1CFC">
-      <w:numFmt w:val="decimal"/>
-      <w:lvlText w:val=""/>
-      <w:lvlJc w:val="left"/>
-    </w:lvl>
-  </w:abstractNum>
-  <w:abstractNum w:abstractNumId="6" w15:restartNumberingAfterBreak="0">
-    <w:nsid w:val="1EAE38A7"/>
-    <w:multiLevelType w:val="hybridMultilevel"/>
-    <w:tmpl w:val="20469542"/>
-    <w:lvl w:ilvl="0" w:tplc="A642A3C6">
-      <w:start w:val="1"/>
-      <w:numFmt w:val="decimal"/>
-      <w:lvlText w:val="%1."/>
-      <w:lvlJc w:val="left"/>
-      <w:pPr>
-        <w:ind w:left="440" w:hanging="300"/>
-      </w:pPr>
-    </w:lvl>
-    <w:lvl w:ilvl="1" w:tplc="597C699E">
-      <w:numFmt w:val="decimal"/>
-      <w:lvlText w:val=""/>
-      <w:lvlJc w:val="left"/>
-    </w:lvl>
-    <w:lvl w:ilvl="2" w:tplc="41F01214">
-      <w:numFmt w:val="decimal"/>
-      <w:lvlText w:val=""/>
-      <w:lvlJc w:val="left"/>
-    </w:lvl>
-    <w:lvl w:ilvl="3" w:tplc="E43680B0">
-      <w:numFmt w:val="decimal"/>
-      <w:lvlText w:val=""/>
-      <w:lvlJc w:val="left"/>
-    </w:lvl>
-    <w:lvl w:ilvl="4" w:tplc="83EEDC92">
-      <w:numFmt w:val="decimal"/>
-      <w:lvlText w:val=""/>
-      <w:lvlJc w:val="left"/>
-    </w:lvl>
-    <w:lvl w:ilvl="5" w:tplc="4F20E570">
-      <w:numFmt w:val="decimal"/>
-      <w:lvlText w:val=""/>
-      <w:lvlJc w:val="left"/>
-    </w:lvl>
-    <w:lvl w:ilvl="6" w:tplc="B5086634">
-      <w:numFmt w:val="decimal"/>
-      <w:lvlText w:val=""/>
-      <w:lvlJc w:val="left"/>
-    </w:lvl>
-    <w:lvl w:ilvl="7" w:tplc="4B1AA4B4">
-      <w:numFmt w:val="decimal"/>
-      <w:lvlText w:val=""/>
-      <w:lvlJc w:val="left"/>
-    </w:lvl>
-    <w:lvl w:ilvl="8" w:tplc="24483D86">
-      <w:numFmt w:val="decimal"/>
-      <w:lvlText w:val=""/>
-      <w:lvlJc w:val="left"/>
-    </w:lvl>
-  </w:abstractNum>
-  <w:abstractNum w:abstractNumId="7" w15:restartNumberingAfterBreak="0">
-    <w:nsid w:val="1EF14E29"/>
-    <w:multiLevelType w:val="hybridMultilevel"/>
-    <w:tmpl w:val="833AD6CA"/>
-    <w:lvl w:ilvl="0" w:tplc="7A20C27C">
-      <w:start w:val="1"/>
-      <w:numFmt w:val="decimal"/>
-      <w:lvlText w:val="%1."/>
-      <w:lvlJc w:val="left"/>
-      <w:pPr>
-        <w:ind w:left="440" w:hanging="300"/>
-      </w:pPr>
-    </w:lvl>
-    <w:lvl w:ilvl="1" w:tplc="9A60EBA2">
-      <w:numFmt w:val="decimal"/>
-      <w:lvlText w:val=""/>
-      <w:lvlJc w:val="left"/>
-    </w:lvl>
-    <w:lvl w:ilvl="2" w:tplc="368600AA">
-      <w:numFmt w:val="decimal"/>
-      <w:lvlText w:val=""/>
-      <w:lvlJc w:val="left"/>
-    </w:lvl>
-    <w:lvl w:ilvl="3" w:tplc="FB90495C">
-      <w:numFmt w:val="decimal"/>
-      <w:lvlText w:val=""/>
-      <w:lvlJc w:val="left"/>
-    </w:lvl>
-    <w:lvl w:ilvl="4" w:tplc="D4AC4DC8">
-      <w:numFmt w:val="decimal"/>
-      <w:lvlText w:val=""/>
-      <w:lvlJc w:val="left"/>
-    </w:lvl>
-    <w:lvl w:ilvl="5" w:tplc="58E024FC">
-      <w:numFmt w:val="decimal"/>
-      <w:lvlText w:val=""/>
-      <w:lvlJc w:val="left"/>
-    </w:lvl>
-    <w:lvl w:ilvl="6" w:tplc="33C21E16">
-      <w:numFmt w:val="decimal"/>
-      <w:lvlText w:val=""/>
-      <w:lvlJc w:val="left"/>
-    </w:lvl>
-    <w:lvl w:ilvl="7" w:tplc="9D262BC6">
-      <w:numFmt w:val="decimal"/>
-      <w:lvlText w:val=""/>
-      <w:lvlJc w:val="left"/>
-    </w:lvl>
-    <w:lvl w:ilvl="8" w:tplc="D1EA842A">
-      <w:numFmt w:val="decimal"/>
-      <w:lvlText w:val=""/>
-      <w:lvlJc w:val="left"/>
-    </w:lvl>
-  </w:abstractNum>
-  <w:abstractNum w:abstractNumId="8" w15:restartNumberingAfterBreak="0">
-    <w:nsid w:val="4E7F1AB5"/>
-    <w:multiLevelType w:val="hybridMultilevel"/>
-    <w:tmpl w:val="9BEA1146"/>
-    <w:lvl w:ilvl="0" w:tplc="EF7CE7D0">
-      <w:start w:val="1"/>
-      <w:numFmt w:val="decimal"/>
-      <w:lvlText w:val="%1."/>
-      <w:lvlJc w:val="left"/>
-      <w:pPr>
-        <w:ind w:left="440" w:hanging="300"/>
-      </w:pPr>
-    </w:lvl>
-    <w:lvl w:ilvl="1" w:tplc="9B580FDA">
-      <w:numFmt w:val="decimal"/>
-      <w:lvlText w:val=""/>
-      <w:lvlJc w:val="left"/>
-    </w:lvl>
-    <w:lvl w:ilvl="2" w:tplc="6D0254B4">
-      <w:numFmt w:val="decimal"/>
-      <w:lvlText w:val=""/>
-      <w:lvlJc w:val="left"/>
-    </w:lvl>
-    <w:lvl w:ilvl="3" w:tplc="D10AFEF4">
-      <w:numFmt w:val="decimal"/>
-      <w:lvlText w:val=""/>
-      <w:lvlJc w:val="left"/>
-    </w:lvl>
-    <w:lvl w:ilvl="4" w:tplc="A2423556">
-      <w:numFmt w:val="decimal"/>
-      <w:lvlText w:val=""/>
-      <w:lvlJc w:val="left"/>
-    </w:lvl>
-    <w:lvl w:ilvl="5" w:tplc="A1082222">
-      <w:numFmt w:val="decimal"/>
-      <w:lvlText w:val=""/>
-      <w:lvlJc w:val="left"/>
-    </w:lvl>
-    <w:lvl w:ilvl="6" w:tplc="FB4641A4">
-      <w:numFmt w:val="decimal"/>
-      <w:lvlText w:val=""/>
-      <w:lvlJc w:val="left"/>
-    </w:lvl>
-    <w:lvl w:ilvl="7" w:tplc="928EC998">
-      <w:numFmt w:val="decimal"/>
-      <w:lvlText w:val=""/>
-      <w:lvlJc w:val="left"/>
-    </w:lvl>
-    <w:lvl w:ilvl="8" w:tplc="4A78697C">
-      <w:numFmt w:val="decimal"/>
-      <w:lvlText w:val=""/>
-      <w:lvlJc w:val="left"/>
-    </w:lvl>
-  </w:abstractNum>
-  <w:abstractNum w:abstractNumId="9" w15:restartNumberingAfterBreak="0">
-    <w:nsid w:val="52F41C34"/>
-    <w:multiLevelType w:val="hybridMultilevel"/>
-    <w:tmpl w:val="450642B8"/>
-    <w:lvl w:ilvl="0" w:tplc="1610B5AC" w:tentative="1">
+    <w:tmpl w:val="0268C9A2"/>
+    <w:lvl w:ilvl="0" w:tplc="068C75E0" w:tentative="1">
       <w:start w:val="1"/>
       <w:numFmt w:val="bullet"/>
       <w:lvlText w:val="●"/>
@@ -39288,7 +39033,7 @@
         <w:ind w:left="720" w:hanging="360"/>
       </w:pPr>
     </w:lvl>
-    <w:lvl w:ilvl="1" w:tplc="3098BEF6" w:tentative="1">
+    <w:lvl w:ilvl="1" w:tplc="7C3A517C" w:tentative="1">
       <w:start w:val="1"/>
       <w:numFmt w:val="bullet"/>
       <w:lvlText w:val="○"/>
@@ -39297,7 +39042,7 @@
         <w:ind w:left="1440" w:hanging="360"/>
       </w:pPr>
     </w:lvl>
-    <w:lvl w:ilvl="2" w:tplc="8E6641C2" w:tentative="1">
+    <w:lvl w:ilvl="2" w:tplc="7870061C" w:tentative="1">
       <w:start w:val="1"/>
       <w:numFmt w:val="bullet"/>
       <w:lvlText w:val="■"/>
@@ -39306,7 +39051,7 @@
         <w:ind w:left="2160" w:hanging="360"/>
       </w:pPr>
     </w:lvl>
-    <w:lvl w:ilvl="3" w:tplc="0CE657FC" w:tentative="1">
+    <w:lvl w:ilvl="3" w:tplc="E460D844" w:tentative="1">
       <w:start w:val="1"/>
       <w:numFmt w:val="bullet"/>
       <w:lvlText w:val="●"/>
@@ -39315,7 +39060,7 @@
         <w:ind w:left="2880" w:hanging="360"/>
       </w:pPr>
     </w:lvl>
-    <w:lvl w:ilvl="4" w:tplc="BE2C4ECE" w:tentative="1">
+    <w:lvl w:ilvl="4" w:tplc="427847DA" w:tentative="1">
       <w:start w:val="1"/>
       <w:numFmt w:val="bullet"/>
       <w:lvlText w:val="○"/>
@@ -39324,7 +39069,7 @@
         <w:ind w:left="3600" w:hanging="360"/>
       </w:pPr>
     </w:lvl>
-    <w:lvl w:ilvl="5" w:tplc="960E29E4" w:tentative="1">
+    <w:lvl w:ilvl="5" w:tplc="E290635E" w:tentative="1">
       <w:start w:val="1"/>
       <w:numFmt w:val="bullet"/>
       <w:lvlText w:val="■"/>
@@ -39333,7 +39078,7 @@
         <w:ind w:left="4320" w:hanging="360"/>
       </w:pPr>
     </w:lvl>
-    <w:lvl w:ilvl="6" w:tplc="89C48E30" w:tentative="1">
+    <w:lvl w:ilvl="6" w:tplc="AC3AC906" w:tentative="1">
       <w:start w:val="1"/>
       <w:numFmt w:val="bullet"/>
       <w:lvlText w:val="●"/>
@@ -39342,7 +39087,7 @@
         <w:ind w:left="5040" w:hanging="360"/>
       </w:pPr>
     </w:lvl>
-    <w:lvl w:ilvl="7" w:tplc="70DE5F30" w:tentative="1">
+    <w:lvl w:ilvl="7" w:tplc="7766E07A" w:tentative="1">
       <w:start w:val="1"/>
       <w:numFmt w:val="bullet"/>
       <w:lvlText w:val="●"/>
@@ -39351,7 +39096,7 @@
         <w:ind w:left="5760" w:hanging="360"/>
       </w:pPr>
     </w:lvl>
-    <w:lvl w:ilvl="8" w:tplc="30C2FDD2" w:tentative="1">
+    <w:lvl w:ilvl="8" w:tplc="6CAEC132" w:tentative="1">
       <w:start w:val="1"/>
       <w:numFmt w:val="bullet"/>
       <w:lvlText w:val="●"/>
@@ -39361,11 +39106,65 @@
       </w:pPr>
     </w:lvl>
   </w:abstractNum>
-  <w:abstractNum w:abstractNumId="10" w15:restartNumberingAfterBreak="0">
-    <w:nsid w:val="57B630C1"/>
+  <w:abstractNum w:abstractNumId="4" w15:restartNumberingAfterBreak="0">
+    <w:nsid w:val="137D6127"/>
     <w:multiLevelType w:val="hybridMultilevel"/>
-    <w:tmpl w:val="2476360A"/>
-    <w:lvl w:ilvl="0" w:tplc="AF362992">
+    <w:tmpl w:val="E5B84278"/>
+    <w:lvl w:ilvl="0" w:tplc="6EEA9820">
+      <w:start w:val="1"/>
+      <w:numFmt w:val="bullet"/>
+      <w:lvlText w:val="•"/>
+      <w:lvlJc w:val="left"/>
+      <w:pPr>
+        <w:ind w:left="440" w:hanging="260"/>
+      </w:pPr>
+    </w:lvl>
+    <w:lvl w:ilvl="1" w:tplc="8E3C3C4E">
+      <w:numFmt w:val="decimal"/>
+      <w:lvlText w:val=""/>
+      <w:lvlJc w:val="left"/>
+    </w:lvl>
+    <w:lvl w:ilvl="2" w:tplc="E7F8AF8C">
+      <w:numFmt w:val="decimal"/>
+      <w:lvlText w:val=""/>
+      <w:lvlJc w:val="left"/>
+    </w:lvl>
+    <w:lvl w:ilvl="3" w:tplc="2A685C70">
+      <w:numFmt w:val="decimal"/>
+      <w:lvlText w:val=""/>
+      <w:lvlJc w:val="left"/>
+    </w:lvl>
+    <w:lvl w:ilvl="4" w:tplc="AD76FF90">
+      <w:numFmt w:val="decimal"/>
+      <w:lvlText w:val=""/>
+      <w:lvlJc w:val="left"/>
+    </w:lvl>
+    <w:lvl w:ilvl="5" w:tplc="CCC8B510">
+      <w:numFmt w:val="decimal"/>
+      <w:lvlText w:val=""/>
+      <w:lvlJc w:val="left"/>
+    </w:lvl>
+    <w:lvl w:ilvl="6" w:tplc="CFBE4E66">
+      <w:numFmt w:val="decimal"/>
+      <w:lvlText w:val=""/>
+      <w:lvlJc w:val="left"/>
+    </w:lvl>
+    <w:lvl w:ilvl="7" w:tplc="2B4EC716">
+      <w:numFmt w:val="decimal"/>
+      <w:lvlText w:val=""/>
+      <w:lvlJc w:val="left"/>
+    </w:lvl>
+    <w:lvl w:ilvl="8" w:tplc="16CABFC8">
+      <w:numFmt w:val="decimal"/>
+      <w:lvlText w:val=""/>
+      <w:lvlJc w:val="left"/>
+    </w:lvl>
+  </w:abstractNum>
+  <w:abstractNum w:abstractNumId="5" w15:restartNumberingAfterBreak="0">
+    <w:nsid w:val="1CF23020"/>
+    <w:multiLevelType w:val="hybridMultilevel"/>
+    <w:tmpl w:val="EFD4226C"/>
+    <w:lvl w:ilvl="0" w:tplc="F6BC2258">
       <w:start w:val="1"/>
       <w:numFmt w:val="decimal"/>
       <w:lvlText w:val="%1."/>
@@ -39374,52 +39173,52 @@
         <w:ind w:left="440" w:hanging="300"/>
       </w:pPr>
     </w:lvl>
-    <w:lvl w:ilvl="1" w:tplc="1C5AF094">
+    <w:lvl w:ilvl="1" w:tplc="DCF6886A">
       <w:numFmt w:val="decimal"/>
       <w:lvlText w:val=""/>
       <w:lvlJc w:val="left"/>
     </w:lvl>
-    <w:lvl w:ilvl="2" w:tplc="1EA852C0">
+    <w:lvl w:ilvl="2" w:tplc="E472942A">
       <w:numFmt w:val="decimal"/>
       <w:lvlText w:val=""/>
       <w:lvlJc w:val="left"/>
     </w:lvl>
-    <w:lvl w:ilvl="3" w:tplc="FCB8AF56">
+    <w:lvl w:ilvl="3" w:tplc="B804E6B2">
       <w:numFmt w:val="decimal"/>
       <w:lvlText w:val=""/>
       <w:lvlJc w:val="left"/>
     </w:lvl>
-    <w:lvl w:ilvl="4" w:tplc="FC12D8A8">
+    <w:lvl w:ilvl="4" w:tplc="BC56DBC2">
       <w:numFmt w:val="decimal"/>
       <w:lvlText w:val=""/>
       <w:lvlJc w:val="left"/>
     </w:lvl>
-    <w:lvl w:ilvl="5" w:tplc="41385DC0">
+    <w:lvl w:ilvl="5" w:tplc="55E6BD76">
       <w:numFmt w:val="decimal"/>
       <w:lvlText w:val=""/>
       <w:lvlJc w:val="left"/>
     </w:lvl>
-    <w:lvl w:ilvl="6" w:tplc="F84AF6CA">
+    <w:lvl w:ilvl="6" w:tplc="F2F8B5CE">
       <w:numFmt w:val="decimal"/>
       <w:lvlText w:val=""/>
       <w:lvlJc w:val="left"/>
     </w:lvl>
-    <w:lvl w:ilvl="7" w:tplc="2690B574">
+    <w:lvl w:ilvl="7" w:tplc="547CA7E6">
       <w:numFmt w:val="decimal"/>
       <w:lvlText w:val=""/>
       <w:lvlJc w:val="left"/>
     </w:lvl>
-    <w:lvl w:ilvl="8" w:tplc="CF627344">
+    <w:lvl w:ilvl="8" w:tplc="8DE8A528">
       <w:numFmt w:val="decimal"/>
       <w:lvlText w:val=""/>
       <w:lvlJc w:val="left"/>
     </w:lvl>
   </w:abstractNum>
-  <w:abstractNum w:abstractNumId="11" w15:restartNumberingAfterBreak="0">
-    <w:nsid w:val="680E1BEB"/>
+  <w:abstractNum w:abstractNumId="6" w15:restartNumberingAfterBreak="0">
+    <w:nsid w:val="250C072E"/>
     <w:multiLevelType w:val="hybridMultilevel"/>
-    <w:tmpl w:val="8F32EFF0"/>
-    <w:lvl w:ilvl="0" w:tplc="5C6877B8">
+    <w:tmpl w:val="3064E8BC"/>
+    <w:lvl w:ilvl="0" w:tplc="071ABD38">
       <w:start w:val="1"/>
       <w:numFmt w:val="decimal"/>
       <w:lvlText w:val="%1."/>
@@ -39428,52 +39227,52 @@
         <w:ind w:left="440" w:hanging="300"/>
       </w:pPr>
     </w:lvl>
-    <w:lvl w:ilvl="1" w:tplc="57B060B2">
+    <w:lvl w:ilvl="1" w:tplc="955EDB10">
       <w:numFmt w:val="decimal"/>
       <w:lvlText w:val=""/>
       <w:lvlJc w:val="left"/>
     </w:lvl>
-    <w:lvl w:ilvl="2" w:tplc="208285B2">
+    <w:lvl w:ilvl="2" w:tplc="9C8047A4">
       <w:numFmt w:val="decimal"/>
       <w:lvlText w:val=""/>
       <w:lvlJc w:val="left"/>
     </w:lvl>
-    <w:lvl w:ilvl="3" w:tplc="612E90EE">
+    <w:lvl w:ilvl="3" w:tplc="E1AE65B8">
       <w:numFmt w:val="decimal"/>
       <w:lvlText w:val=""/>
       <w:lvlJc w:val="left"/>
     </w:lvl>
-    <w:lvl w:ilvl="4" w:tplc="8FDA1E84">
+    <w:lvl w:ilvl="4" w:tplc="AE3E1CCC">
       <w:numFmt w:val="decimal"/>
       <w:lvlText w:val=""/>
       <w:lvlJc w:val="left"/>
     </w:lvl>
-    <w:lvl w:ilvl="5" w:tplc="2586C9F0">
+    <w:lvl w:ilvl="5" w:tplc="2DE29D0C">
       <w:numFmt w:val="decimal"/>
       <w:lvlText w:val=""/>
       <w:lvlJc w:val="left"/>
     </w:lvl>
-    <w:lvl w:ilvl="6" w:tplc="85080692">
+    <w:lvl w:ilvl="6" w:tplc="6A84D4C2">
       <w:numFmt w:val="decimal"/>
       <w:lvlText w:val=""/>
       <w:lvlJc w:val="left"/>
     </w:lvl>
-    <w:lvl w:ilvl="7" w:tplc="58400C9C">
+    <w:lvl w:ilvl="7" w:tplc="AE2EC7CA">
       <w:numFmt w:val="decimal"/>
       <w:lvlText w:val=""/>
       <w:lvlJc w:val="left"/>
     </w:lvl>
-    <w:lvl w:ilvl="8" w:tplc="0DA6F932">
+    <w:lvl w:ilvl="8" w:tplc="3F74BB36">
       <w:numFmt w:val="decimal"/>
       <w:lvlText w:val=""/>
       <w:lvlJc w:val="left"/>
     </w:lvl>
   </w:abstractNum>
-  <w:abstractNum w:abstractNumId="12" w15:restartNumberingAfterBreak="0">
-    <w:nsid w:val="6BC9561A"/>
+  <w:abstractNum w:abstractNumId="7" w15:restartNumberingAfterBreak="0">
+    <w:nsid w:val="2D171726"/>
     <w:multiLevelType w:val="hybridMultilevel"/>
-    <w:tmpl w:val="E2FA397C"/>
-    <w:lvl w:ilvl="0" w:tplc="C4A2338E">
+    <w:tmpl w:val="640474FC"/>
+    <w:lvl w:ilvl="0" w:tplc="642A0392">
       <w:start w:val="1"/>
       <w:numFmt w:val="decimal"/>
       <w:lvlText w:val="%1."/>
@@ -39482,52 +39281,52 @@
         <w:ind w:left="440" w:hanging="300"/>
       </w:pPr>
     </w:lvl>
-    <w:lvl w:ilvl="1" w:tplc="59125A7A">
+    <w:lvl w:ilvl="1" w:tplc="53B24D54">
       <w:numFmt w:val="decimal"/>
       <w:lvlText w:val=""/>
       <w:lvlJc w:val="left"/>
     </w:lvl>
-    <w:lvl w:ilvl="2" w:tplc="69181F1C">
+    <w:lvl w:ilvl="2" w:tplc="FDE255C4">
       <w:numFmt w:val="decimal"/>
       <w:lvlText w:val=""/>
       <w:lvlJc w:val="left"/>
     </w:lvl>
-    <w:lvl w:ilvl="3" w:tplc="BFE8ACAC">
+    <w:lvl w:ilvl="3" w:tplc="B99ADC5A">
       <w:numFmt w:val="decimal"/>
       <w:lvlText w:val=""/>
       <w:lvlJc w:val="left"/>
     </w:lvl>
-    <w:lvl w:ilvl="4" w:tplc="D698414E">
+    <w:lvl w:ilvl="4" w:tplc="01C687DA">
       <w:numFmt w:val="decimal"/>
       <w:lvlText w:val=""/>
       <w:lvlJc w:val="left"/>
     </w:lvl>
-    <w:lvl w:ilvl="5" w:tplc="DF44F7F4">
+    <w:lvl w:ilvl="5" w:tplc="1996DFCC">
       <w:numFmt w:val="decimal"/>
       <w:lvlText w:val=""/>
       <w:lvlJc w:val="left"/>
     </w:lvl>
-    <w:lvl w:ilvl="6" w:tplc="D388849A">
+    <w:lvl w:ilvl="6" w:tplc="5900C93A">
       <w:numFmt w:val="decimal"/>
       <w:lvlText w:val=""/>
       <w:lvlJc w:val="left"/>
     </w:lvl>
-    <w:lvl w:ilvl="7" w:tplc="91C496A6">
+    <w:lvl w:ilvl="7" w:tplc="68F4C3C0">
       <w:numFmt w:val="decimal"/>
       <w:lvlText w:val=""/>
       <w:lvlJc w:val="left"/>
     </w:lvl>
-    <w:lvl w:ilvl="8" w:tplc="0D34F75C">
+    <w:lvl w:ilvl="8" w:tplc="41F2629E">
       <w:numFmt w:val="decimal"/>
       <w:lvlText w:val=""/>
       <w:lvlJc w:val="left"/>
     </w:lvl>
   </w:abstractNum>
-  <w:abstractNum w:abstractNumId="13" w15:restartNumberingAfterBreak="0">
-    <w:nsid w:val="6DC90954"/>
+  <w:abstractNum w:abstractNumId="8" w15:restartNumberingAfterBreak="0">
+    <w:nsid w:val="2DC34F03"/>
     <w:multiLevelType w:val="hybridMultilevel"/>
-    <w:tmpl w:val="119284DE"/>
-    <w:lvl w:ilvl="0" w:tplc="C4407012">
+    <w:tmpl w:val="BC220CF0"/>
+    <w:lvl w:ilvl="0" w:tplc="A948E46E">
       <w:start w:val="1"/>
       <w:numFmt w:val="decimal"/>
       <w:lvlText w:val="%1."/>
@@ -39536,52 +39335,52 @@
         <w:ind w:left="440" w:hanging="300"/>
       </w:pPr>
     </w:lvl>
-    <w:lvl w:ilvl="1" w:tplc="C5166DCC">
+    <w:lvl w:ilvl="1" w:tplc="CD1C5554">
       <w:numFmt w:val="decimal"/>
       <w:lvlText w:val=""/>
       <w:lvlJc w:val="left"/>
     </w:lvl>
-    <w:lvl w:ilvl="2" w:tplc="A51A7854">
+    <w:lvl w:ilvl="2" w:tplc="E1729190">
       <w:numFmt w:val="decimal"/>
       <w:lvlText w:val=""/>
       <w:lvlJc w:val="left"/>
     </w:lvl>
-    <w:lvl w:ilvl="3" w:tplc="8DF68430">
+    <w:lvl w:ilvl="3" w:tplc="BC9A0136">
       <w:numFmt w:val="decimal"/>
       <w:lvlText w:val=""/>
       <w:lvlJc w:val="left"/>
     </w:lvl>
-    <w:lvl w:ilvl="4" w:tplc="C65656E0">
+    <w:lvl w:ilvl="4" w:tplc="AD9A6B8E">
       <w:numFmt w:val="decimal"/>
       <w:lvlText w:val=""/>
       <w:lvlJc w:val="left"/>
     </w:lvl>
-    <w:lvl w:ilvl="5" w:tplc="62E45B22">
+    <w:lvl w:ilvl="5" w:tplc="B042788E">
       <w:numFmt w:val="decimal"/>
       <w:lvlText w:val=""/>
       <w:lvlJc w:val="left"/>
     </w:lvl>
-    <w:lvl w:ilvl="6" w:tplc="BB3EF3B2">
+    <w:lvl w:ilvl="6" w:tplc="519407C8">
       <w:numFmt w:val="decimal"/>
       <w:lvlText w:val=""/>
       <w:lvlJc w:val="left"/>
     </w:lvl>
-    <w:lvl w:ilvl="7" w:tplc="8EE0BE52">
+    <w:lvl w:ilvl="7" w:tplc="CEA668D2">
       <w:numFmt w:val="decimal"/>
       <w:lvlText w:val=""/>
       <w:lvlJc w:val="left"/>
     </w:lvl>
-    <w:lvl w:ilvl="8" w:tplc="00E00D28">
+    <w:lvl w:ilvl="8" w:tplc="A6884994">
       <w:numFmt w:val="decimal"/>
       <w:lvlText w:val=""/>
       <w:lvlJc w:val="left"/>
     </w:lvl>
   </w:abstractNum>
-  <w:abstractNum w:abstractNumId="14" w15:restartNumberingAfterBreak="0">
-    <w:nsid w:val="76D636F8"/>
+  <w:abstractNum w:abstractNumId="9" w15:restartNumberingAfterBreak="0">
+    <w:nsid w:val="2E3310F9"/>
     <w:multiLevelType w:val="hybridMultilevel"/>
-    <w:tmpl w:val="0B5E908E"/>
-    <w:lvl w:ilvl="0" w:tplc="0B4E0F6C">
+    <w:tmpl w:val="A9AE003E"/>
+    <w:lvl w:ilvl="0" w:tplc="98CC646A">
       <w:start w:val="1"/>
       <w:numFmt w:val="decimal"/>
       <w:lvlText w:val="%1."/>
@@ -39590,193 +39389,463 @@
         <w:ind w:left="440" w:hanging="300"/>
       </w:pPr>
     </w:lvl>
-    <w:lvl w:ilvl="1" w:tplc="FE2C91BA">
+    <w:lvl w:ilvl="1" w:tplc="934AE860">
       <w:numFmt w:val="decimal"/>
       <w:lvlText w:val=""/>
       <w:lvlJc w:val="left"/>
     </w:lvl>
-    <w:lvl w:ilvl="2" w:tplc="25B88AC6">
+    <w:lvl w:ilvl="2" w:tplc="39B2B208">
       <w:numFmt w:val="decimal"/>
       <w:lvlText w:val=""/>
       <w:lvlJc w:val="left"/>
     </w:lvl>
-    <w:lvl w:ilvl="3" w:tplc="340C33F4">
+    <w:lvl w:ilvl="3" w:tplc="85A0E036">
       <w:numFmt w:val="decimal"/>
       <w:lvlText w:val=""/>
       <w:lvlJc w:val="left"/>
     </w:lvl>
-    <w:lvl w:ilvl="4" w:tplc="7FCAD54A">
+    <w:lvl w:ilvl="4" w:tplc="FC40EE90">
       <w:numFmt w:val="decimal"/>
       <w:lvlText w:val=""/>
       <w:lvlJc w:val="left"/>
     </w:lvl>
-    <w:lvl w:ilvl="5" w:tplc="0682238C">
+    <w:lvl w:ilvl="5" w:tplc="D430B894">
       <w:numFmt w:val="decimal"/>
       <w:lvlText w:val=""/>
       <w:lvlJc w:val="left"/>
     </w:lvl>
-    <w:lvl w:ilvl="6" w:tplc="3A74BCBA">
+    <w:lvl w:ilvl="6" w:tplc="BCA46FE8">
       <w:numFmt w:val="decimal"/>
       <w:lvlText w:val=""/>
       <w:lvlJc w:val="left"/>
     </w:lvl>
-    <w:lvl w:ilvl="7" w:tplc="D4EAC332">
+    <w:lvl w:ilvl="7" w:tplc="A3DCD03C">
       <w:numFmt w:val="decimal"/>
       <w:lvlText w:val=""/>
       <w:lvlJc w:val="left"/>
     </w:lvl>
-    <w:lvl w:ilvl="8" w:tplc="0846C3EE">
+    <w:lvl w:ilvl="8" w:tplc="1336810A">
+      <w:numFmt w:val="decimal"/>
+      <w:lvlText w:val=""/>
+      <w:lvlJc w:val="left"/>
+    </w:lvl>
+  </w:abstractNum>
+  <w:abstractNum w:abstractNumId="10" w15:restartNumberingAfterBreak="0">
+    <w:nsid w:val="3FAB4673"/>
+    <w:multiLevelType w:val="hybridMultilevel"/>
+    <w:tmpl w:val="E398F8CC"/>
+    <w:lvl w:ilvl="0" w:tplc="2AFA306E">
+      <w:start w:val="1"/>
+      <w:numFmt w:val="decimal"/>
+      <w:lvlText w:val="%1."/>
+      <w:lvlJc w:val="left"/>
+      <w:pPr>
+        <w:ind w:left="440" w:hanging="300"/>
+      </w:pPr>
+    </w:lvl>
+    <w:lvl w:ilvl="1" w:tplc="645ED226">
+      <w:numFmt w:val="decimal"/>
+      <w:lvlText w:val=""/>
+      <w:lvlJc w:val="left"/>
+    </w:lvl>
+    <w:lvl w:ilvl="2" w:tplc="AC1E6548">
+      <w:numFmt w:val="decimal"/>
+      <w:lvlText w:val=""/>
+      <w:lvlJc w:val="left"/>
+    </w:lvl>
+    <w:lvl w:ilvl="3" w:tplc="031CC526">
+      <w:numFmt w:val="decimal"/>
+      <w:lvlText w:val=""/>
+      <w:lvlJc w:val="left"/>
+    </w:lvl>
+    <w:lvl w:ilvl="4" w:tplc="BEF2CB96">
+      <w:numFmt w:val="decimal"/>
+      <w:lvlText w:val=""/>
+      <w:lvlJc w:val="left"/>
+    </w:lvl>
+    <w:lvl w:ilvl="5" w:tplc="D2221C48">
+      <w:numFmt w:val="decimal"/>
+      <w:lvlText w:val=""/>
+      <w:lvlJc w:val="left"/>
+    </w:lvl>
+    <w:lvl w:ilvl="6" w:tplc="5F884B90">
+      <w:numFmt w:val="decimal"/>
+      <w:lvlText w:val=""/>
+      <w:lvlJc w:val="left"/>
+    </w:lvl>
+    <w:lvl w:ilvl="7" w:tplc="33C44378">
+      <w:numFmt w:val="decimal"/>
+      <w:lvlText w:val=""/>
+      <w:lvlJc w:val="left"/>
+    </w:lvl>
+    <w:lvl w:ilvl="8" w:tplc="B7944030">
+      <w:numFmt w:val="decimal"/>
+      <w:lvlText w:val=""/>
+      <w:lvlJc w:val="left"/>
+    </w:lvl>
+  </w:abstractNum>
+  <w:abstractNum w:abstractNumId="11" w15:restartNumberingAfterBreak="0">
+    <w:nsid w:val="49063123"/>
+    <w:multiLevelType w:val="hybridMultilevel"/>
+    <w:tmpl w:val="B5FAE542"/>
+    <w:lvl w:ilvl="0" w:tplc="D8C21E56">
+      <w:start w:val="1"/>
+      <w:numFmt w:val="decimal"/>
+      <w:lvlText w:val="%1."/>
+      <w:lvlJc w:val="left"/>
+      <w:pPr>
+        <w:ind w:left="440" w:hanging="300"/>
+      </w:pPr>
+    </w:lvl>
+    <w:lvl w:ilvl="1" w:tplc="521C853C">
+      <w:numFmt w:val="decimal"/>
+      <w:lvlText w:val=""/>
+      <w:lvlJc w:val="left"/>
+    </w:lvl>
+    <w:lvl w:ilvl="2" w:tplc="D59C70D2">
+      <w:numFmt w:val="decimal"/>
+      <w:lvlText w:val=""/>
+      <w:lvlJc w:val="left"/>
+    </w:lvl>
+    <w:lvl w:ilvl="3" w:tplc="A210E0DA">
+      <w:numFmt w:val="decimal"/>
+      <w:lvlText w:val=""/>
+      <w:lvlJc w:val="left"/>
+    </w:lvl>
+    <w:lvl w:ilvl="4" w:tplc="BEC880CA">
+      <w:numFmt w:val="decimal"/>
+      <w:lvlText w:val=""/>
+      <w:lvlJc w:val="left"/>
+    </w:lvl>
+    <w:lvl w:ilvl="5" w:tplc="326A5514">
+      <w:numFmt w:val="decimal"/>
+      <w:lvlText w:val=""/>
+      <w:lvlJc w:val="left"/>
+    </w:lvl>
+    <w:lvl w:ilvl="6" w:tplc="4458330C">
+      <w:numFmt w:val="decimal"/>
+      <w:lvlText w:val=""/>
+      <w:lvlJc w:val="left"/>
+    </w:lvl>
+    <w:lvl w:ilvl="7" w:tplc="E50463FE">
+      <w:numFmt w:val="decimal"/>
+      <w:lvlText w:val=""/>
+      <w:lvlJc w:val="left"/>
+    </w:lvl>
+    <w:lvl w:ilvl="8" w:tplc="7BA624D4">
+      <w:numFmt w:val="decimal"/>
+      <w:lvlText w:val=""/>
+      <w:lvlJc w:val="left"/>
+    </w:lvl>
+  </w:abstractNum>
+  <w:abstractNum w:abstractNumId="12" w15:restartNumberingAfterBreak="0">
+    <w:nsid w:val="55415E09"/>
+    <w:multiLevelType w:val="hybridMultilevel"/>
+    <w:tmpl w:val="B1940BC4"/>
+    <w:lvl w:ilvl="0" w:tplc="CA12B01E">
+      <w:start w:val="1"/>
+      <w:numFmt w:val="decimal"/>
+      <w:lvlText w:val="%1."/>
+      <w:lvlJc w:val="left"/>
+      <w:pPr>
+        <w:ind w:left="440" w:hanging="300"/>
+      </w:pPr>
+    </w:lvl>
+    <w:lvl w:ilvl="1" w:tplc="F408809A">
+      <w:numFmt w:val="decimal"/>
+      <w:lvlText w:val=""/>
+      <w:lvlJc w:val="left"/>
+    </w:lvl>
+    <w:lvl w:ilvl="2" w:tplc="F79A5C38">
+      <w:numFmt w:val="decimal"/>
+      <w:lvlText w:val=""/>
+      <w:lvlJc w:val="left"/>
+    </w:lvl>
+    <w:lvl w:ilvl="3" w:tplc="496E633C">
+      <w:numFmt w:val="decimal"/>
+      <w:lvlText w:val=""/>
+      <w:lvlJc w:val="left"/>
+    </w:lvl>
+    <w:lvl w:ilvl="4" w:tplc="72A6C152">
+      <w:numFmt w:val="decimal"/>
+      <w:lvlText w:val=""/>
+      <w:lvlJc w:val="left"/>
+    </w:lvl>
+    <w:lvl w:ilvl="5" w:tplc="05585162">
+      <w:numFmt w:val="decimal"/>
+      <w:lvlText w:val=""/>
+      <w:lvlJc w:val="left"/>
+    </w:lvl>
+    <w:lvl w:ilvl="6" w:tplc="9C9ED64A">
+      <w:numFmt w:val="decimal"/>
+      <w:lvlText w:val=""/>
+      <w:lvlJc w:val="left"/>
+    </w:lvl>
+    <w:lvl w:ilvl="7" w:tplc="8ED289B4">
+      <w:numFmt w:val="decimal"/>
+      <w:lvlText w:val=""/>
+      <w:lvlJc w:val="left"/>
+    </w:lvl>
+    <w:lvl w:ilvl="8" w:tplc="41D6257A">
+      <w:numFmt w:val="decimal"/>
+      <w:lvlText w:val=""/>
+      <w:lvlJc w:val="left"/>
+    </w:lvl>
+  </w:abstractNum>
+  <w:abstractNum w:abstractNumId="13" w15:restartNumberingAfterBreak="0">
+    <w:nsid w:val="69330735"/>
+    <w:multiLevelType w:val="hybridMultilevel"/>
+    <w:tmpl w:val="7EBEB73A"/>
+    <w:lvl w:ilvl="0" w:tplc="BF84DD12">
+      <w:start w:val="1"/>
+      <w:numFmt w:val="decimal"/>
+      <w:lvlText w:val="%1."/>
+      <w:lvlJc w:val="left"/>
+      <w:pPr>
+        <w:ind w:left="440" w:hanging="300"/>
+      </w:pPr>
+    </w:lvl>
+    <w:lvl w:ilvl="1" w:tplc="7ED06ECA">
+      <w:numFmt w:val="decimal"/>
+      <w:lvlText w:val=""/>
+      <w:lvlJc w:val="left"/>
+    </w:lvl>
+    <w:lvl w:ilvl="2" w:tplc="AB88F760">
+      <w:numFmt w:val="decimal"/>
+      <w:lvlText w:val=""/>
+      <w:lvlJc w:val="left"/>
+    </w:lvl>
+    <w:lvl w:ilvl="3" w:tplc="D1461BAA">
+      <w:numFmt w:val="decimal"/>
+      <w:lvlText w:val=""/>
+      <w:lvlJc w:val="left"/>
+    </w:lvl>
+    <w:lvl w:ilvl="4" w:tplc="B4F00324">
+      <w:numFmt w:val="decimal"/>
+      <w:lvlText w:val=""/>
+      <w:lvlJc w:val="left"/>
+    </w:lvl>
+    <w:lvl w:ilvl="5" w:tplc="F2648EA0">
+      <w:numFmt w:val="decimal"/>
+      <w:lvlText w:val=""/>
+      <w:lvlJc w:val="left"/>
+    </w:lvl>
+    <w:lvl w:ilvl="6" w:tplc="10247488">
+      <w:numFmt w:val="decimal"/>
+      <w:lvlText w:val=""/>
+      <w:lvlJc w:val="left"/>
+    </w:lvl>
+    <w:lvl w:ilvl="7" w:tplc="090C7F3E">
+      <w:numFmt w:val="decimal"/>
+      <w:lvlText w:val=""/>
+      <w:lvlJc w:val="left"/>
+    </w:lvl>
+    <w:lvl w:ilvl="8" w:tplc="E52C57D2">
+      <w:numFmt w:val="decimal"/>
+      <w:lvlText w:val=""/>
+      <w:lvlJc w:val="left"/>
+    </w:lvl>
+  </w:abstractNum>
+  <w:abstractNum w:abstractNumId="14" w15:restartNumberingAfterBreak="0">
+    <w:nsid w:val="78076689"/>
+    <w:multiLevelType w:val="hybridMultilevel"/>
+    <w:tmpl w:val="BF5CDA02"/>
+    <w:lvl w:ilvl="0" w:tplc="F8BA9450">
+      <w:start w:val="1"/>
+      <w:numFmt w:val="decimal"/>
+      <w:lvlText w:val="%1."/>
+      <w:lvlJc w:val="left"/>
+      <w:pPr>
+        <w:ind w:left="440" w:hanging="300"/>
+      </w:pPr>
+    </w:lvl>
+    <w:lvl w:ilvl="1" w:tplc="64C69786">
+      <w:numFmt w:val="decimal"/>
+      <w:lvlText w:val=""/>
+      <w:lvlJc w:val="left"/>
+    </w:lvl>
+    <w:lvl w:ilvl="2" w:tplc="956E0EF4">
+      <w:numFmt w:val="decimal"/>
+      <w:lvlText w:val=""/>
+      <w:lvlJc w:val="left"/>
+    </w:lvl>
+    <w:lvl w:ilvl="3" w:tplc="0834FE78">
+      <w:numFmt w:val="decimal"/>
+      <w:lvlText w:val=""/>
+      <w:lvlJc w:val="left"/>
+    </w:lvl>
+    <w:lvl w:ilvl="4" w:tplc="F7A0790E">
+      <w:numFmt w:val="decimal"/>
+      <w:lvlText w:val=""/>
+      <w:lvlJc w:val="left"/>
+    </w:lvl>
+    <w:lvl w:ilvl="5" w:tplc="A4060F46">
+      <w:numFmt w:val="decimal"/>
+      <w:lvlText w:val=""/>
+      <w:lvlJc w:val="left"/>
+    </w:lvl>
+    <w:lvl w:ilvl="6" w:tplc="5B92595C">
+      <w:numFmt w:val="decimal"/>
+      <w:lvlText w:val=""/>
+      <w:lvlJc w:val="left"/>
+    </w:lvl>
+    <w:lvl w:ilvl="7" w:tplc="7564E33A">
+      <w:numFmt w:val="decimal"/>
+      <w:lvlText w:val=""/>
+      <w:lvlJc w:val="left"/>
+    </w:lvl>
+    <w:lvl w:ilvl="8" w:tplc="E65CDCE8">
       <w:numFmt w:val="decimal"/>
       <w:lvlText w:val=""/>
       <w:lvlJc w:val="left"/>
     </w:lvl>
   </w:abstractNum>
   <w:abstractNum w:abstractNumId="15" w15:restartNumberingAfterBreak="0">
-    <w:nsid w:val="791E4B46"/>
+    <w:nsid w:val="7931114C"/>
     <w:multiLevelType w:val="hybridMultilevel"/>
-    <w:tmpl w:val="07405E98"/>
-    <w:lvl w:ilvl="0" w:tplc="49A0F30A">
+    <w:tmpl w:val="8E04C16E"/>
+    <w:lvl w:ilvl="0" w:tplc="36D86824">
       <w:start w:val="1"/>
-      <w:numFmt w:val="bullet"/>
-      <w:lvlText w:val="•"/>
+      <w:numFmt w:val="decimal"/>
+      <w:lvlText w:val="%1."/>
       <w:lvlJc w:val="left"/>
       <w:pPr>
-        <w:ind w:left="440" w:hanging="260"/>
+        <w:ind w:left="440" w:hanging="300"/>
       </w:pPr>
     </w:lvl>
-    <w:lvl w:ilvl="1" w:tplc="8FD0A960">
+    <w:lvl w:ilvl="1" w:tplc="8C4A9564">
       <w:numFmt w:val="decimal"/>
       <w:lvlText w:val=""/>
       <w:lvlJc w:val="left"/>
     </w:lvl>
-    <w:lvl w:ilvl="2" w:tplc="53DEFED6">
+    <w:lvl w:ilvl="2" w:tplc="9F224150">
       <w:numFmt w:val="decimal"/>
       <w:lvlText w:val=""/>
       <w:lvlJc w:val="left"/>
     </w:lvl>
-    <w:lvl w:ilvl="3" w:tplc="DE7CFC58">
+    <w:lvl w:ilvl="3" w:tplc="EE32B954">
       <w:numFmt w:val="decimal"/>
       <w:lvlText w:val=""/>
       <w:lvlJc w:val="left"/>
     </w:lvl>
-    <w:lvl w:ilvl="4" w:tplc="6F56A4DA">
+    <w:lvl w:ilvl="4" w:tplc="5B428C78">
       <w:numFmt w:val="decimal"/>
       <w:lvlText w:val=""/>
       <w:lvlJc w:val="left"/>
     </w:lvl>
-    <w:lvl w:ilvl="5" w:tplc="D3E2239C">
+    <w:lvl w:ilvl="5" w:tplc="71F07D10">
       <w:numFmt w:val="decimal"/>
       <w:lvlText w:val=""/>
       <w:lvlJc w:val="left"/>
     </w:lvl>
-    <w:lvl w:ilvl="6" w:tplc="62049FB8">
+    <w:lvl w:ilvl="6" w:tplc="34145A2E">
       <w:numFmt w:val="decimal"/>
       <w:lvlText w:val=""/>
       <w:lvlJc w:val="left"/>
     </w:lvl>
-    <w:lvl w:ilvl="7" w:tplc="C2D4EC3A">
+    <w:lvl w:ilvl="7" w:tplc="0BCE3782">
       <w:numFmt w:val="decimal"/>
       <w:lvlText w:val=""/>
       <w:lvlJc w:val="left"/>
     </w:lvl>
-    <w:lvl w:ilvl="8" w:tplc="EB607B76">
+    <w:lvl w:ilvl="8" w:tplc="C8201594">
       <w:numFmt w:val="decimal"/>
       <w:lvlText w:val=""/>
       <w:lvlJc w:val="left"/>
     </w:lvl>
   </w:abstractNum>
   <w:num w:numId="1">
+    <w:abstractNumId w:val="3"/>
+    <w:lvlOverride w:ilvl="0">
+      <w:startOverride w:val="1"/>
+    </w:lvlOverride>
+  </w:num>
+  <w:num w:numId="2">
+    <w:abstractNumId w:val="13"/>
+    <w:lvlOverride w:ilvl="0">
+      <w:startOverride w:val="1"/>
+    </w:lvlOverride>
+  </w:num>
+  <w:num w:numId="3">
+    <w:abstractNumId w:val="12"/>
+    <w:lvlOverride w:ilvl="0">
+      <w:startOverride w:val="1"/>
+    </w:lvlOverride>
+  </w:num>
+  <w:num w:numId="4">
+    <w:abstractNumId w:val="1"/>
+    <w:lvlOverride w:ilvl="0">
+      <w:startOverride w:val="1"/>
+    </w:lvlOverride>
+  </w:num>
+  <w:num w:numId="5">
+    <w:abstractNumId w:val="4"/>
+    <w:lvlOverride w:ilvl="0">
+      <w:startOverride w:val="1"/>
+    </w:lvlOverride>
+  </w:num>
+  <w:num w:numId="6">
+    <w:abstractNumId w:val="6"/>
+    <w:lvlOverride w:ilvl="0">
+      <w:startOverride w:val="1"/>
+    </w:lvlOverride>
+  </w:num>
+  <w:num w:numId="7">
+    <w:abstractNumId w:val="11"/>
+    <w:lvlOverride w:ilvl="0">
+      <w:startOverride w:val="1"/>
+    </w:lvlOverride>
+  </w:num>
+  <w:num w:numId="8">
+    <w:abstractNumId w:val="5"/>
+    <w:lvlOverride w:ilvl="0">
+      <w:startOverride w:val="1"/>
+    </w:lvlOverride>
+  </w:num>
+  <w:num w:numId="9">
+    <w:abstractNumId w:val="10"/>
+    <w:lvlOverride w:ilvl="0">
+      <w:startOverride w:val="1"/>
+    </w:lvlOverride>
+  </w:num>
+  <w:num w:numId="10">
+    <w:abstractNumId w:val="15"/>
+    <w:lvlOverride w:ilvl="0">
+      <w:startOverride w:val="1"/>
+    </w:lvlOverride>
+  </w:num>
+  <w:num w:numId="11">
+    <w:abstractNumId w:val="0"/>
+    <w:lvlOverride w:ilvl="0">
+      <w:startOverride w:val="1"/>
+    </w:lvlOverride>
+  </w:num>
+  <w:num w:numId="12">
     <w:abstractNumId w:val="9"/>
     <w:lvlOverride w:ilvl="0">
       <w:startOverride w:val="1"/>
     </w:lvlOverride>
   </w:num>
-  <w:num w:numId="2">
-    <w:abstractNumId w:val="12"/>
+  <w:num w:numId="13">
+    <w:abstractNumId w:val="14"/>
     <w:lvlOverride w:ilvl="0">
       <w:startOverride w:val="1"/>
     </w:lvlOverride>
   </w:num>
-  <w:num w:numId="3">
-    <w:abstractNumId w:val="1"/>
+  <w:num w:numId="14">
+    <w:abstractNumId w:val="8"/>
     <w:lvlOverride w:ilvl="0">
       <w:startOverride w:val="1"/>
     </w:lvlOverride>
   </w:num>
-  <w:num w:numId="4">
+  <w:num w:numId="15">
     <w:abstractNumId w:val="2"/>
     <w:lvlOverride w:ilvl="0">
       <w:startOverride w:val="1"/>
     </w:lvlOverride>
   </w:num>
-  <w:num w:numId="5">
-    <w:abstractNumId w:val="15"/>
-    <w:lvlOverride w:ilvl="0">
-      <w:startOverride w:val="1"/>
-    </w:lvlOverride>
-  </w:num>
-  <w:num w:numId="6">
+  <w:num w:numId="16">
     <w:abstractNumId w:val="7"/>
-    <w:lvlOverride w:ilvl="0">
-      <w:startOverride w:val="1"/>
-    </w:lvlOverride>
-  </w:num>
-  <w:num w:numId="7">
-    <w:abstractNumId w:val="13"/>
-    <w:lvlOverride w:ilvl="0">
-      <w:startOverride w:val="1"/>
-    </w:lvlOverride>
-  </w:num>
-  <w:num w:numId="8">
-    <w:abstractNumId w:val="0"/>
-    <w:lvlOverride w:ilvl="0">
-      <w:startOverride w:val="1"/>
-    </w:lvlOverride>
-  </w:num>
-  <w:num w:numId="9">
-    <w:abstractNumId w:val="14"/>
-    <w:lvlOverride w:ilvl="0">
-      <w:startOverride w:val="1"/>
-    </w:lvlOverride>
-  </w:num>
-  <w:num w:numId="10">
-    <w:abstractNumId w:val="5"/>
-    <w:lvlOverride w:ilvl="0">
-      <w:startOverride w:val="1"/>
-    </w:lvlOverride>
-  </w:num>
-  <w:num w:numId="11">
-    <w:abstractNumId w:val="4"/>
-    <w:lvlOverride w:ilvl="0">
-      <w:startOverride w:val="1"/>
-    </w:lvlOverride>
-  </w:num>
-  <w:num w:numId="12">
-    <w:abstractNumId w:val="6"/>
-    <w:lvlOverride w:ilvl="0">
-      <w:startOverride w:val="1"/>
-    </w:lvlOverride>
-  </w:num>
-  <w:num w:numId="13">
-    <w:abstractNumId w:val="11"/>
-    <w:lvlOverride w:ilvl="0">
-      <w:startOverride w:val="1"/>
-    </w:lvlOverride>
-  </w:num>
-  <w:num w:numId="14">
-    <w:abstractNumId w:val="10"/>
-    <w:lvlOverride w:ilvl="0">
-      <w:startOverride w:val="1"/>
-    </w:lvlOverride>
-  </w:num>
-  <w:num w:numId="15">
-    <w:abstractNumId w:val="8"/>
-    <w:lvlOverride w:ilvl="0">
-      <w:startOverride w:val="1"/>
-    </w:lvlOverride>
-  </w:num>
-  <w:num w:numId="16">
-    <w:abstractNumId w:val="3"/>
     <w:lvlOverride w:ilvl="0">
       <w:startOverride w:val="1"/>
     </w:lvlOverride>
@@ -40407,7 +40476,7 @@
     <w:autoRedefine/>
     <w:uiPriority w:val="39"/>
     <w:unhideWhenUsed/>
-    <w:rsid w:val="00E95CAB"/>
+    <w:rsid w:val="005802D3"/>
   </w:style>
   <w:style w:type="paragraph" w:styleId="20">
     <w:name w:val="toc 2"/>
@@ -40416,7 +40485,7 @@
     <w:autoRedefine/>
     <w:uiPriority w:val="39"/>
     <w:unhideWhenUsed/>
-    <w:rsid w:val="00E95CAB"/>
+    <w:rsid w:val="005802D3"/>
     <w:pPr>
       <w:ind w:leftChars="200" w:left="425"/>
     </w:pPr>
@@ -40427,7 +40496,7 @@
     <w:link w:val="Char1"/>
     <w:uiPriority w:val="99"/>
     <w:unhideWhenUsed/>
-    <w:rsid w:val="00E95CAB"/>
+    <w:rsid w:val="005802D3"/>
     <w:pPr>
       <w:tabs>
         <w:tab w:val="center" w:pos="4513"/>
@@ -40441,7 +40510,7 @@
     <w:basedOn w:val="a0"/>
     <w:link w:val="aa"/>
     <w:uiPriority w:val="99"/>
-    <w:rsid w:val="00E95CAB"/>
+    <w:rsid w:val="005802D3"/>
   </w:style>
   <w:style w:type="paragraph" w:styleId="ab">
     <w:name w:val="footer"/>
@@ -40449,7 +40518,7 @@
     <w:link w:val="Char2"/>
     <w:uiPriority w:val="99"/>
     <w:unhideWhenUsed/>
-    <w:rsid w:val="00E95CAB"/>
+    <w:rsid w:val="005802D3"/>
     <w:pPr>
       <w:tabs>
         <w:tab w:val="center" w:pos="4513"/>
@@ -40463,7 +40532,7 @@
     <w:basedOn w:val="a0"/>
     <w:link w:val="ab"/>
     <w:uiPriority w:val="99"/>
-    <w:rsid w:val="00E95CAB"/>
+    <w:rsid w:val="005802D3"/>
   </w:style>
 </w:styles>
 </file>

</xml_diff>

<commit_message>
New stained-glass app icon, explain the separate search key
- Desktop shortcut and browser tab use a generated suncatcher icon
  (docs/tools/build-icon.js -> windows-autostart/app.ico, public/favicon.png);
  create-shortcut.ps1 falls back to the old shell32 icon if missing
- Market key screen: self-service wording and a box explaining the search
  key is different from the Commerce API key
- Manual: icon description updated

Co-Authored-By: Claude Opus 5.5 <noreply@anthropic.com>
</commit_message>
<xml_diff>
--- a/docs/아틀리에말리-사용설명서.docx
+++ b/docs/아틀리에말리-사용설명서.docx
@@ -877,7 +877,7 @@
     <w:sdt>
       <w:sdtPr>
         <w:alias w:val="목차"/>
-        <w:id w:val="-914620132"/>
+        <w:id w:val="-1144035799"/>
       </w:sdtPr>
       <w:sdtEndPr/>
       <w:sdtContent>
@@ -904,7 +904,7 @@
           <w:r>
             <w:fldChar w:fldCharType="separate"/>
           </w:r>
-          <w:hyperlink w:anchor="_Toc241832658" w:history="1">
+          <w:hyperlink w:anchor="_Toc242967349" w:history="1">
             <w:r>
               <w:rPr>
                 <w:rStyle w:val="a5"/>
@@ -928,7 +928,7 @@
               <w:rPr>
                 <w:noProof/>
               </w:rPr>
-              <w:instrText xml:space="preserve"> PAGEREF _Toc241832658 \h </w:instrText>
+              <w:instrText xml:space="preserve"> PAGEREF _Toc242967349 \h </w:instrText>
             </w:r>
             <w:r>
               <w:rPr>
@@ -969,7 +969,7 @@
               <w:szCs w:val="22"/>
             </w:rPr>
           </w:pPr>
-          <w:hyperlink w:anchor="_Toc241832659" w:history="1">
+          <w:hyperlink w:anchor="_Toc242967350" w:history="1">
             <w:r>
               <w:rPr>
                 <w:rStyle w:val="a5"/>
@@ -993,7 +993,7 @@
               <w:rPr>
                 <w:noProof/>
               </w:rPr>
-              <w:instrText xml:space="preserve"> PAGEREF _Toc241832659 \h </w:instrText>
+              <w:instrText xml:space="preserve"> PAGEREF _Toc242967350 \h </w:instrText>
             </w:r>
             <w:r>
               <w:rPr>
@@ -1035,7 +1035,7 @@
               <w:szCs w:val="22"/>
             </w:rPr>
           </w:pPr>
-          <w:hyperlink w:anchor="_Toc241832660" w:history="1">
+          <w:hyperlink w:anchor="_Toc242967351" w:history="1">
             <w:r>
               <w:rPr>
                 <w:rStyle w:val="a5"/>
@@ -1059,7 +1059,7 @@
               <w:rPr>
                 <w:noProof/>
               </w:rPr>
-              <w:instrText xml:space="preserve"> PAGEREF _Toc241832660 \h </w:instrText>
+              <w:instrText xml:space="preserve"> PAGEREF _Toc242967351 \h </w:instrText>
             </w:r>
             <w:r>
               <w:rPr>
@@ -1101,7 +1101,7 @@
               <w:szCs w:val="22"/>
             </w:rPr>
           </w:pPr>
-          <w:hyperlink w:anchor="_Toc241832661" w:history="1">
+          <w:hyperlink w:anchor="_Toc242967352" w:history="1">
             <w:r>
               <w:rPr>
                 <w:rStyle w:val="a5"/>
@@ -1125,7 +1125,7 @@
               <w:rPr>
                 <w:noProof/>
               </w:rPr>
-              <w:instrText xml:space="preserve"> PAGEREF _Toc241832661 \h </w:instrText>
+              <w:instrText xml:space="preserve"> PAGEREF _Toc242967352 \h </w:instrText>
             </w:r>
             <w:r>
               <w:rPr>
@@ -1167,7 +1167,7 @@
               <w:szCs w:val="22"/>
             </w:rPr>
           </w:pPr>
-          <w:hyperlink w:anchor="_Toc241832662" w:history="1">
+          <w:hyperlink w:anchor="_Toc242967353" w:history="1">
             <w:r>
               <w:rPr>
                 <w:rStyle w:val="a5"/>
@@ -1191,7 +1191,7 @@
               <w:rPr>
                 <w:noProof/>
               </w:rPr>
-              <w:instrText xml:space="preserve"> PAGEREF _Toc241832662 \h </w:instrText>
+              <w:instrText xml:space="preserve"> PAGEREF _Toc242967353 \h </w:instrText>
             </w:r>
             <w:r>
               <w:rPr>
@@ -1233,7 +1233,7 @@
               <w:szCs w:val="22"/>
             </w:rPr>
           </w:pPr>
-          <w:hyperlink w:anchor="_Toc241832663" w:history="1">
+          <w:hyperlink w:anchor="_Toc242967354" w:history="1">
             <w:r>
               <w:rPr>
                 <w:rStyle w:val="a5"/>
@@ -1257,7 +1257,7 @@
               <w:rPr>
                 <w:noProof/>
               </w:rPr>
-              <w:instrText xml:space="preserve"> PAGEREF _Toc241832663 \h </w:instrText>
+              <w:instrText xml:space="preserve"> PAGEREF _Toc242967354 \h </w:instrText>
             </w:r>
             <w:r>
               <w:rPr>
@@ -1298,7 +1298,7 @@
               <w:szCs w:val="22"/>
             </w:rPr>
           </w:pPr>
-          <w:hyperlink w:anchor="_Toc241832664" w:history="1">
+          <w:hyperlink w:anchor="_Toc242967355" w:history="1">
             <w:r>
               <w:rPr>
                 <w:rStyle w:val="a5"/>
@@ -1322,7 +1322,7 @@
               <w:rPr>
                 <w:noProof/>
               </w:rPr>
-              <w:instrText xml:space="preserve"> PAGEREF _Toc241832664 \h </w:instrText>
+              <w:instrText xml:space="preserve"> PAGEREF _Toc242967355 \h </w:instrText>
             </w:r>
             <w:r>
               <w:rPr>
@@ -1364,7 +1364,7 @@
               <w:szCs w:val="22"/>
             </w:rPr>
           </w:pPr>
-          <w:hyperlink w:anchor="_Toc241832665" w:history="1">
+          <w:hyperlink w:anchor="_Toc242967356" w:history="1">
             <w:r>
               <w:rPr>
                 <w:rStyle w:val="a5"/>
@@ -1388,7 +1388,7 @@
               <w:rPr>
                 <w:noProof/>
               </w:rPr>
-              <w:instrText xml:space="preserve"> PAGEREF _Toc241832665 \h </w:instrText>
+              <w:instrText xml:space="preserve"> PAGEREF _Toc242967356 \h </w:instrText>
             </w:r>
             <w:r>
               <w:rPr>
@@ -1430,7 +1430,7 @@
               <w:szCs w:val="22"/>
             </w:rPr>
           </w:pPr>
-          <w:hyperlink w:anchor="_Toc241832666" w:history="1">
+          <w:hyperlink w:anchor="_Toc242967357" w:history="1">
             <w:r>
               <w:rPr>
                 <w:rStyle w:val="a5"/>
@@ -1454,7 +1454,7 @@
               <w:rPr>
                 <w:noProof/>
               </w:rPr>
-              <w:instrText xml:space="preserve"> PAGEREF _Toc241832666 \h </w:instrText>
+              <w:instrText xml:space="preserve"> PAGEREF _Toc242967357 \h </w:instrText>
             </w:r>
             <w:r>
               <w:rPr>
@@ -1496,7 +1496,7 @@
               <w:szCs w:val="22"/>
             </w:rPr>
           </w:pPr>
-          <w:hyperlink w:anchor="_Toc241832667" w:history="1">
+          <w:hyperlink w:anchor="_Toc242967358" w:history="1">
             <w:r>
               <w:rPr>
                 <w:rStyle w:val="a5"/>
@@ -1520,7 +1520,7 @@
               <w:rPr>
                 <w:noProof/>
               </w:rPr>
-              <w:instrText xml:space="preserve"> PAGEREF _Toc241832667 \h </w:instrText>
+              <w:instrText xml:space="preserve"> PAGEREF _Toc242967358 \h </w:instrText>
             </w:r>
             <w:r>
               <w:rPr>
@@ -1562,7 +1562,7 @@
               <w:szCs w:val="22"/>
             </w:rPr>
           </w:pPr>
-          <w:hyperlink w:anchor="_Toc241832668" w:history="1">
+          <w:hyperlink w:anchor="_Toc242967359" w:history="1">
             <w:r>
               <w:rPr>
                 <w:rStyle w:val="a5"/>
@@ -1586,7 +1586,7 @@
               <w:rPr>
                 <w:noProof/>
               </w:rPr>
-              <w:instrText xml:space="preserve"> PAGEREF _Toc241832668 \h </w:instrText>
+              <w:instrText xml:space="preserve"> PAGEREF _Toc242967359 \h </w:instrText>
             </w:r>
             <w:r>
               <w:rPr>
@@ -1628,7 +1628,7 @@
               <w:szCs w:val="22"/>
             </w:rPr>
           </w:pPr>
-          <w:hyperlink w:anchor="_Toc241832669" w:history="1">
+          <w:hyperlink w:anchor="_Toc242967360" w:history="1">
             <w:r>
               <w:rPr>
                 <w:rStyle w:val="a5"/>
@@ -1652,7 +1652,7 @@
               <w:rPr>
                 <w:noProof/>
               </w:rPr>
-              <w:instrText xml:space="preserve"> PAGEREF _Toc241832669 \h </w:instrText>
+              <w:instrText xml:space="preserve"> PAGEREF _Toc242967360 \h </w:instrText>
             </w:r>
             <w:r>
               <w:rPr>
@@ -1693,7 +1693,7 @@
               <w:szCs w:val="22"/>
             </w:rPr>
           </w:pPr>
-          <w:hyperlink w:anchor="_Toc241832670" w:history="1">
+          <w:hyperlink w:anchor="_Toc242967361" w:history="1">
             <w:r>
               <w:rPr>
                 <w:rStyle w:val="a5"/>
@@ -1717,7 +1717,7 @@
               <w:rPr>
                 <w:noProof/>
               </w:rPr>
-              <w:instrText xml:space="preserve"> PAGEREF _Toc241832670 \h </w:instrText>
+              <w:instrText xml:space="preserve"> PAGEREF _Toc242967361 \h </w:instrText>
             </w:r>
             <w:r>
               <w:rPr>
@@ -1759,7 +1759,7 @@
               <w:szCs w:val="22"/>
             </w:rPr>
           </w:pPr>
-          <w:hyperlink w:anchor="_Toc241832671" w:history="1">
+          <w:hyperlink w:anchor="_Toc242967362" w:history="1">
             <w:r>
               <w:rPr>
                 <w:rStyle w:val="a5"/>
@@ -1783,7 +1783,7 @@
               <w:rPr>
                 <w:noProof/>
               </w:rPr>
-              <w:instrText xml:space="preserve"> PAGEREF _Toc241832671 \h </w:instrText>
+              <w:instrText xml:space="preserve"> PAGEREF _Toc242967362 \h </w:instrText>
             </w:r>
             <w:r>
               <w:rPr>
@@ -1825,7 +1825,7 @@
               <w:szCs w:val="22"/>
             </w:rPr>
           </w:pPr>
-          <w:hyperlink w:anchor="_Toc241832672" w:history="1">
+          <w:hyperlink w:anchor="_Toc242967363" w:history="1">
             <w:r>
               <w:rPr>
                 <w:rStyle w:val="a5"/>
@@ -1849,7 +1849,7 @@
               <w:rPr>
                 <w:noProof/>
               </w:rPr>
-              <w:instrText xml:space="preserve"> PAGEREF _Toc241832672 \h </w:instrText>
+              <w:instrText xml:space="preserve"> PAGEREF _Toc242967363 \h </w:instrText>
             </w:r>
             <w:r>
               <w:rPr>
@@ -1891,7 +1891,7 @@
               <w:szCs w:val="22"/>
             </w:rPr>
           </w:pPr>
-          <w:hyperlink w:anchor="_Toc241832673" w:history="1">
+          <w:hyperlink w:anchor="_Toc242967364" w:history="1">
             <w:r>
               <w:rPr>
                 <w:rStyle w:val="a5"/>
@@ -1915,7 +1915,7 @@
               <w:rPr>
                 <w:noProof/>
               </w:rPr>
-              <w:instrText xml:space="preserve"> PAGEREF _Toc241832673 \h </w:instrText>
+              <w:instrText xml:space="preserve"> PAGEREF _Toc242967364 \h </w:instrText>
             </w:r>
             <w:r>
               <w:rPr>
@@ -1957,7 +1957,7 @@
               <w:szCs w:val="22"/>
             </w:rPr>
           </w:pPr>
-          <w:hyperlink w:anchor="_Toc241832674" w:history="1">
+          <w:hyperlink w:anchor="_Toc242967365" w:history="1">
             <w:r>
               <w:rPr>
                 <w:rStyle w:val="a5"/>
@@ -1981,7 +1981,7 @@
               <w:rPr>
                 <w:noProof/>
               </w:rPr>
-              <w:instrText xml:space="preserve"> PAGEREF _Toc241832674 \h </w:instrText>
+              <w:instrText xml:space="preserve"> PAGEREF _Toc242967365 \h </w:instrText>
             </w:r>
             <w:r>
               <w:rPr>
@@ -2023,7 +2023,7 @@
               <w:szCs w:val="22"/>
             </w:rPr>
           </w:pPr>
-          <w:hyperlink w:anchor="_Toc241832675" w:history="1">
+          <w:hyperlink w:anchor="_Toc242967366" w:history="1">
             <w:r>
               <w:rPr>
                 <w:rStyle w:val="a5"/>
@@ -2047,7 +2047,7 @@
               <w:rPr>
                 <w:noProof/>
               </w:rPr>
-              <w:instrText xml:space="preserve"> PAGEREF _Toc241832675 \h </w:instrText>
+              <w:instrText xml:space="preserve"> PAGEREF _Toc242967366 \h </w:instrText>
             </w:r>
             <w:r>
               <w:rPr>
@@ -2089,7 +2089,7 @@
               <w:szCs w:val="22"/>
             </w:rPr>
           </w:pPr>
-          <w:hyperlink w:anchor="_Toc241832676" w:history="1">
+          <w:hyperlink w:anchor="_Toc242967367" w:history="1">
             <w:r>
               <w:rPr>
                 <w:rStyle w:val="a5"/>
@@ -2113,7 +2113,7 @@
               <w:rPr>
                 <w:noProof/>
               </w:rPr>
-              <w:instrText xml:space="preserve"> PAGEREF _Toc241832676 \h </w:instrText>
+              <w:instrText xml:space="preserve"> PAGEREF _Toc242967367 \h </w:instrText>
             </w:r>
             <w:r>
               <w:rPr>
@@ -2154,7 +2154,7 @@
               <w:szCs w:val="22"/>
             </w:rPr>
           </w:pPr>
-          <w:hyperlink w:anchor="_Toc241832677" w:history="1">
+          <w:hyperlink w:anchor="_Toc242967368" w:history="1">
             <w:r>
               <w:rPr>
                 <w:rStyle w:val="a5"/>
@@ -2178,7 +2178,7 @@
               <w:rPr>
                 <w:noProof/>
               </w:rPr>
-              <w:instrText xml:space="preserve"> PAGEREF _Toc241832677 \h </w:instrText>
+              <w:instrText xml:space="preserve"> PAGEREF _Toc242967368 \h </w:instrText>
             </w:r>
             <w:r>
               <w:rPr>
@@ -2220,7 +2220,7 @@
               <w:szCs w:val="22"/>
             </w:rPr>
           </w:pPr>
-          <w:hyperlink w:anchor="_Toc241832678" w:history="1">
+          <w:hyperlink w:anchor="_Toc242967369" w:history="1">
             <w:r>
               <w:rPr>
                 <w:rStyle w:val="a5"/>
@@ -2244,7 +2244,7 @@
               <w:rPr>
                 <w:noProof/>
               </w:rPr>
-              <w:instrText xml:space="preserve"> PAGEREF _Toc241832678 \h </w:instrText>
+              <w:instrText xml:space="preserve"> PAGEREF _Toc242967369 \h </w:instrText>
             </w:r>
             <w:r>
               <w:rPr>
@@ -2286,7 +2286,7 @@
               <w:szCs w:val="22"/>
             </w:rPr>
           </w:pPr>
-          <w:hyperlink w:anchor="_Toc241832679" w:history="1">
+          <w:hyperlink w:anchor="_Toc242967370" w:history="1">
             <w:r>
               <w:rPr>
                 <w:rStyle w:val="a5"/>
@@ -2310,7 +2310,7 @@
               <w:rPr>
                 <w:noProof/>
               </w:rPr>
-              <w:instrText xml:space="preserve"> PAGEREF _Toc241832679 \h </w:instrText>
+              <w:instrText xml:space="preserve"> PAGEREF _Toc242967370 \h </w:instrText>
             </w:r>
             <w:r>
               <w:rPr>
@@ -2352,7 +2352,7 @@
               <w:szCs w:val="22"/>
             </w:rPr>
           </w:pPr>
-          <w:hyperlink w:anchor="_Toc241832680" w:history="1">
+          <w:hyperlink w:anchor="_Toc242967371" w:history="1">
             <w:r>
               <w:rPr>
                 <w:rStyle w:val="a5"/>
@@ -2376,7 +2376,7 @@
               <w:rPr>
                 <w:noProof/>
               </w:rPr>
-              <w:instrText xml:space="preserve"> PAGEREF _Toc241832680 \h </w:instrText>
+              <w:instrText xml:space="preserve"> PAGEREF _Toc242967371 \h </w:instrText>
             </w:r>
             <w:r>
               <w:rPr>
@@ -2418,7 +2418,7 @@
               <w:szCs w:val="22"/>
             </w:rPr>
           </w:pPr>
-          <w:hyperlink w:anchor="_Toc241832681" w:history="1">
+          <w:hyperlink w:anchor="_Toc242967372" w:history="1">
             <w:r>
               <w:rPr>
                 <w:rStyle w:val="a5"/>
@@ -2442,7 +2442,7 @@
               <w:rPr>
                 <w:noProof/>
               </w:rPr>
-              <w:instrText xml:space="preserve"> PAGEREF _Toc241832681 \h </w:instrText>
+              <w:instrText xml:space="preserve"> PAGEREF _Toc242967372 \h </w:instrText>
             </w:r>
             <w:r>
               <w:rPr>
@@ -2483,7 +2483,7 @@
               <w:szCs w:val="22"/>
             </w:rPr>
           </w:pPr>
-          <w:hyperlink w:anchor="_Toc241832682" w:history="1">
+          <w:hyperlink w:anchor="_Toc242967373" w:history="1">
             <w:r>
               <w:rPr>
                 <w:rStyle w:val="a5"/>
@@ -2507,7 +2507,7 @@
               <w:rPr>
                 <w:noProof/>
               </w:rPr>
-              <w:instrText xml:space="preserve"> PAGEREF _Toc241832682 \h </w:instrText>
+              <w:instrText xml:space="preserve"> PAGEREF _Toc242967373 \h </w:instrText>
             </w:r>
             <w:r>
               <w:rPr>
@@ -2549,7 +2549,7 @@
               <w:szCs w:val="22"/>
             </w:rPr>
           </w:pPr>
-          <w:hyperlink w:anchor="_Toc241832683" w:history="1">
+          <w:hyperlink w:anchor="_Toc242967374" w:history="1">
             <w:r>
               <w:rPr>
                 <w:rStyle w:val="a5"/>
@@ -2573,7 +2573,7 @@
               <w:rPr>
                 <w:noProof/>
               </w:rPr>
-              <w:instrText xml:space="preserve"> PAGEREF _Toc241832683 \h </w:instrText>
+              <w:instrText xml:space="preserve"> PAGEREF _Toc242967374 \h </w:instrText>
             </w:r>
             <w:r>
               <w:rPr>
@@ -2615,7 +2615,7 @@
               <w:szCs w:val="22"/>
             </w:rPr>
           </w:pPr>
-          <w:hyperlink w:anchor="_Toc241832684" w:history="1">
+          <w:hyperlink w:anchor="_Toc242967375" w:history="1">
             <w:r>
               <w:rPr>
                 <w:rStyle w:val="a5"/>
@@ -2639,7 +2639,7 @@
               <w:rPr>
                 <w:noProof/>
               </w:rPr>
-              <w:instrText xml:space="preserve"> PAGEREF _Toc241832684 \h </w:instrText>
+              <w:instrText xml:space="preserve"> PAGEREF _Toc242967375 \h </w:instrText>
             </w:r>
             <w:r>
               <w:rPr>
@@ -2680,7 +2680,7 @@
               <w:szCs w:val="22"/>
             </w:rPr>
           </w:pPr>
-          <w:hyperlink w:anchor="_Toc241832685" w:history="1">
+          <w:hyperlink w:anchor="_Toc242967376" w:history="1">
             <w:r>
               <w:rPr>
                 <w:rStyle w:val="a5"/>
@@ -2704,7 +2704,7 @@
               <w:rPr>
                 <w:noProof/>
               </w:rPr>
-              <w:instrText xml:space="preserve"> PAGEREF _Toc241832685 \h </w:instrText>
+              <w:instrText xml:space="preserve"> PAGEREF _Toc242967376 \h </w:instrText>
             </w:r>
             <w:r>
               <w:rPr>
@@ -2746,7 +2746,7 @@
               <w:szCs w:val="22"/>
             </w:rPr>
           </w:pPr>
-          <w:hyperlink w:anchor="_Toc241832686" w:history="1">
+          <w:hyperlink w:anchor="_Toc242967377" w:history="1">
             <w:r>
               <w:rPr>
                 <w:rStyle w:val="a5"/>
@@ -2770,7 +2770,7 @@
               <w:rPr>
                 <w:noProof/>
               </w:rPr>
-              <w:instrText xml:space="preserve"> PAGEREF _Toc241832686 \h </w:instrText>
+              <w:instrText xml:space="preserve"> PAGEREF _Toc242967377 \h </w:instrText>
             </w:r>
             <w:r>
               <w:rPr>
@@ -2812,7 +2812,7 @@
               <w:szCs w:val="22"/>
             </w:rPr>
           </w:pPr>
-          <w:hyperlink w:anchor="_Toc241832687" w:history="1">
+          <w:hyperlink w:anchor="_Toc242967378" w:history="1">
             <w:r>
               <w:rPr>
                 <w:rStyle w:val="a5"/>
@@ -2836,7 +2836,7 @@
               <w:rPr>
                 <w:noProof/>
               </w:rPr>
-              <w:instrText xml:space="preserve"> PAGEREF _Toc241832687 \h </w:instrText>
+              <w:instrText xml:space="preserve"> PAGEREF _Toc242967378 \h </w:instrText>
             </w:r>
             <w:r>
               <w:rPr>
@@ -2878,7 +2878,7 @@
               <w:szCs w:val="22"/>
             </w:rPr>
           </w:pPr>
-          <w:hyperlink w:anchor="_Toc241832688" w:history="1">
+          <w:hyperlink w:anchor="_Toc242967379" w:history="1">
             <w:r>
               <w:rPr>
                 <w:rStyle w:val="a5"/>
@@ -2902,7 +2902,7 @@
               <w:rPr>
                 <w:noProof/>
               </w:rPr>
-              <w:instrText xml:space="preserve"> PAGEREF _Toc241832688 \h </w:instrText>
+              <w:instrText xml:space="preserve"> PAGEREF _Toc242967379 \h </w:instrText>
             </w:r>
             <w:r>
               <w:rPr>
@@ -2943,7 +2943,7 @@
               <w:szCs w:val="22"/>
             </w:rPr>
           </w:pPr>
-          <w:hyperlink w:anchor="_Toc241832689" w:history="1">
+          <w:hyperlink w:anchor="_Toc242967380" w:history="1">
             <w:r>
               <w:rPr>
                 <w:rStyle w:val="a5"/>
@@ -2967,7 +2967,7 @@
               <w:rPr>
                 <w:noProof/>
               </w:rPr>
-              <w:instrText xml:space="preserve"> PAGEREF _Toc241832689 \h </w:instrText>
+              <w:instrText xml:space="preserve"> PAGEREF _Toc242967380 \h </w:instrText>
             </w:r>
             <w:r>
               <w:rPr>
@@ -3008,7 +3008,7 @@
               <w:szCs w:val="22"/>
             </w:rPr>
           </w:pPr>
-          <w:hyperlink w:anchor="_Toc241832690" w:history="1">
+          <w:hyperlink w:anchor="_Toc242967381" w:history="1">
             <w:r>
               <w:rPr>
                 <w:rStyle w:val="a5"/>
@@ -3032,7 +3032,7 @@
               <w:rPr>
                 <w:noProof/>
               </w:rPr>
-              <w:instrText xml:space="preserve"> PAGEREF _Toc241832690 \h </w:instrText>
+              <w:instrText xml:space="preserve"> PAGEREF _Toc242967381 \h </w:instrText>
             </w:r>
             <w:r>
               <w:rPr>
@@ -3074,7 +3074,7 @@
               <w:szCs w:val="22"/>
             </w:rPr>
           </w:pPr>
-          <w:hyperlink w:anchor="_Toc241832691" w:history="1">
+          <w:hyperlink w:anchor="_Toc242967382" w:history="1">
             <w:r>
               <w:rPr>
                 <w:rStyle w:val="a5"/>
@@ -3098,7 +3098,7 @@
               <w:rPr>
                 <w:noProof/>
               </w:rPr>
-              <w:instrText xml:space="preserve"> PAGEREF _Toc241832691 \h </w:instrText>
+              <w:instrText xml:space="preserve"> PAGEREF _Toc242967382 \h </w:instrText>
             </w:r>
             <w:r>
               <w:rPr>
@@ -3140,7 +3140,7 @@
               <w:szCs w:val="22"/>
             </w:rPr>
           </w:pPr>
-          <w:hyperlink w:anchor="_Toc241832692" w:history="1">
+          <w:hyperlink w:anchor="_Toc242967383" w:history="1">
             <w:r>
               <w:rPr>
                 <w:rStyle w:val="a5"/>
@@ -3164,7 +3164,7 @@
               <w:rPr>
                 <w:noProof/>
               </w:rPr>
-              <w:instrText xml:space="preserve"> PAGEREF _Toc241832692 \h </w:instrText>
+              <w:instrText xml:space="preserve"> PAGEREF _Toc242967383 \h </w:instrText>
             </w:r>
             <w:r>
               <w:rPr>
@@ -3206,7 +3206,7 @@
               <w:szCs w:val="22"/>
             </w:rPr>
           </w:pPr>
-          <w:hyperlink w:anchor="_Toc241832693" w:history="1">
+          <w:hyperlink w:anchor="_Toc242967384" w:history="1">
             <w:r>
               <w:rPr>
                 <w:rStyle w:val="a5"/>
@@ -3230,7 +3230,7 @@
               <w:rPr>
                 <w:noProof/>
               </w:rPr>
-              <w:instrText xml:space="preserve"> PAGEREF _Toc241832693 \h </w:instrText>
+              <w:instrText xml:space="preserve"> PAGEREF _Toc242967384 \h </w:instrText>
             </w:r>
             <w:r>
               <w:rPr>
@@ -3272,7 +3272,7 @@
               <w:szCs w:val="22"/>
             </w:rPr>
           </w:pPr>
-          <w:hyperlink w:anchor="_Toc241832694" w:history="1">
+          <w:hyperlink w:anchor="_Toc242967385" w:history="1">
             <w:r>
               <w:rPr>
                 <w:rStyle w:val="a5"/>
@@ -3296,7 +3296,7 @@
               <w:rPr>
                 <w:noProof/>
               </w:rPr>
-              <w:instrText xml:space="preserve"> PAGEREF _Toc241832694 \h </w:instrText>
+              <w:instrText xml:space="preserve"> PAGEREF _Toc242967385 \h </w:instrText>
             </w:r>
             <w:r>
               <w:rPr>
@@ -3335,7 +3335,7 @@
         <w:pStyle w:val="1"/>
         <w:pageBreakBefore/>
       </w:pPr>
-      <w:bookmarkStart w:id="0" w:name="_Toc241832658"/>
+      <w:bookmarkStart w:id="0" w:name="_Toc242967349"/>
       <w:r>
         <w:lastRenderedPageBreak/>
         <w:t xml:space="preserve">1. </w:t>
@@ -5735,7 +5735,7 @@
         <w:pStyle w:val="1"/>
         <w:pageBreakBefore/>
       </w:pPr>
-      <w:bookmarkStart w:id="1" w:name="_Toc241832659"/>
+      <w:bookmarkStart w:id="1" w:name="_Toc242967350"/>
       <w:r>
         <w:lastRenderedPageBreak/>
         <w:t xml:space="preserve">2. </w:t>
@@ -5755,7 +5755,7 @@
       <w:pPr>
         <w:pStyle w:val="2"/>
       </w:pPr>
-      <w:bookmarkStart w:id="2" w:name="_Toc241832660"/>
+      <w:bookmarkStart w:id="2" w:name="_Toc242967351"/>
       <w:r>
         <w:t xml:space="preserve">2-1. </w:t>
       </w:r>
@@ -5844,13 +5844,13 @@
         <w:t>(</w:t>
       </w:r>
       <w:r>
-        <w:t>모니터에</w:t>
-      </w:r>
-      <w:r>
-        <w:t xml:space="preserve"> </w:t>
-      </w:r>
-      <w:r>
-        <w:t>그래프</w:t>
+        <w:t>색유리</w:t>
+      </w:r>
+      <w:r>
+        <w:t xml:space="preserve"> </w:t>
+      </w:r>
+      <w:r>
+        <w:t>썬캐쳐</w:t>
       </w:r>
       <w:r>
         <w:t xml:space="preserve"> </w:t>
@@ -6116,7 +6116,7 @@
       <w:pPr>
         <w:pStyle w:val="2"/>
       </w:pPr>
-      <w:bookmarkStart w:id="3" w:name="_Toc241832661"/>
+      <w:bookmarkStart w:id="3" w:name="_Toc242967352"/>
       <w:r>
         <w:t xml:space="preserve">2-2. </w:t>
       </w:r>
@@ -6454,7 +6454,7 @@
       <w:pPr>
         <w:pStyle w:val="2"/>
       </w:pPr>
-      <w:bookmarkStart w:id="4" w:name="_Toc241832662"/>
+      <w:bookmarkStart w:id="4" w:name="_Toc242967353"/>
       <w:r>
         <w:t xml:space="preserve">2-3. </w:t>
       </w:r>
@@ -6538,7 +6538,7 @@
       <w:pPr>
         <w:pStyle w:val="2"/>
       </w:pPr>
-      <w:bookmarkStart w:id="5" w:name="_Toc241832663"/>
+      <w:bookmarkStart w:id="5" w:name="_Toc242967354"/>
       <w:r>
         <w:t xml:space="preserve">2-4. </w:t>
       </w:r>
@@ -6707,7 +6707,7 @@
           <w:noProof/>
         </w:rPr>
         <w:drawing>
-          <wp:inline distT="0" distB="0" distL="0" distR="0" wp14:anchorId="069E8FBF" wp14:editId="0BFD39CD">
+          <wp:inline distT="0" distB="0" distL="0" distR="0" wp14:anchorId="0926D9CB" wp14:editId="327DFD37">
             <wp:extent cx="5715000" cy="1343025"/>
             <wp:effectExtent l="0" t="0" r="0" b="0"/>
             <wp:docPr id="1" name="그림 1"/>
@@ -7392,7 +7392,7 @@
           <w:noProof/>
         </w:rPr>
         <w:drawing>
-          <wp:inline distT="0" distB="0" distL="0" distR="0" wp14:anchorId="0C9F35C8" wp14:editId="52DEF7FF">
+          <wp:inline distT="0" distB="0" distL="0" distR="0" wp14:anchorId="266807DB" wp14:editId="000221D6">
             <wp:extent cx="4476750" cy="3962400"/>
             <wp:effectExtent l="0" t="0" r="0" b="0"/>
             <wp:docPr id="2" name="그림 2"/>
@@ -7498,7 +7498,7 @@
         <w:pStyle w:val="1"/>
         <w:pageBreakBefore/>
       </w:pPr>
-      <w:bookmarkStart w:id="6" w:name="_Toc241832664"/>
+      <w:bookmarkStart w:id="6" w:name="_Toc242967355"/>
       <w:r>
         <w:lastRenderedPageBreak/>
         <w:t xml:space="preserve">3. </w:t>
@@ -7537,7 +7537,7 @@
           <w:noProof/>
         </w:rPr>
         <w:drawing>
-          <wp:inline distT="0" distB="0" distL="0" distR="0" wp14:anchorId="4EDCD045" wp14:editId="082ED0B8">
+          <wp:inline distT="0" distB="0" distL="0" distR="0" wp14:anchorId="6CD8AC39" wp14:editId="4F5405F9">
             <wp:extent cx="5715000" cy="3657600"/>
             <wp:effectExtent l="0" t="0" r="0" b="0"/>
             <wp:docPr id="3" name="그림 3"/>
@@ -7658,7 +7658,7 @@
       <w:pPr>
         <w:pStyle w:val="2"/>
       </w:pPr>
-      <w:bookmarkStart w:id="7" w:name="_Toc241832665"/>
+      <w:bookmarkStart w:id="7" w:name="_Toc242967356"/>
       <w:r>
         <w:t xml:space="preserve">3-1. </w:t>
       </w:r>
@@ -10830,7 +10830,7 @@
       <w:pPr>
         <w:pStyle w:val="2"/>
       </w:pPr>
-      <w:bookmarkStart w:id="8" w:name="_Toc241832666"/>
+      <w:bookmarkStart w:id="8" w:name="_Toc242967357"/>
       <w:r>
         <w:t xml:space="preserve">3-2. </w:t>
       </w:r>
@@ -13743,7 +13743,7 @@
       <w:pPr>
         <w:pStyle w:val="2"/>
       </w:pPr>
-      <w:bookmarkStart w:id="9" w:name="_Toc241832667"/>
+      <w:bookmarkStart w:id="9" w:name="_Toc242967358"/>
       <w:r>
         <w:t xml:space="preserve">3-3. </w:t>
       </w:r>
@@ -14366,7 +14366,7 @@
           <w:noProof/>
         </w:rPr>
         <w:drawing>
-          <wp:inline distT="0" distB="0" distL="0" distR="0" wp14:anchorId="0709DAAB" wp14:editId="201691F6">
+          <wp:inline distT="0" distB="0" distL="0" distR="0" wp14:anchorId="657609D5" wp14:editId="7C640B30">
             <wp:extent cx="5715000" cy="1876425"/>
             <wp:effectExtent l="0" t="0" r="0" b="0"/>
             <wp:docPr id="4" name="그림 4"/>
@@ -14479,7 +14479,7 @@
       <w:pPr>
         <w:pStyle w:val="2"/>
       </w:pPr>
-      <w:bookmarkStart w:id="10" w:name="_Toc241832668"/>
+      <w:bookmarkStart w:id="10" w:name="_Toc242967359"/>
       <w:r>
         <w:t xml:space="preserve">3-4. </w:t>
       </w:r>
@@ -14633,7 +14633,7 @@
         </w:rPr>
         <w:lastRenderedPageBreak/>
         <w:drawing>
-          <wp:inline distT="0" distB="0" distL="0" distR="0" wp14:anchorId="1CEA5AEB" wp14:editId="65AEA6F6">
+          <wp:inline distT="0" distB="0" distL="0" distR="0" wp14:anchorId="250E3656" wp14:editId="2D474B7F">
             <wp:extent cx="5715000" cy="3390900"/>
             <wp:effectExtent l="0" t="0" r="0" b="0"/>
             <wp:docPr id="5" name="그림 5"/>
@@ -15203,7 +15203,7 @@
       <w:pPr>
         <w:pStyle w:val="2"/>
       </w:pPr>
-      <w:bookmarkStart w:id="11" w:name="_Toc241832669"/>
+      <w:bookmarkStart w:id="11" w:name="_Toc242967360"/>
       <w:r>
         <w:t xml:space="preserve">3-5. </w:t>
       </w:r>
@@ -15325,7 +15325,7 @@
         <w:pStyle w:val="1"/>
         <w:pageBreakBefore/>
       </w:pPr>
-      <w:bookmarkStart w:id="12" w:name="_Toc241832670"/>
+      <w:bookmarkStart w:id="12" w:name="_Toc242967361"/>
       <w:r>
         <w:lastRenderedPageBreak/>
         <w:t xml:space="preserve">4. </w:t>
@@ -15552,7 +15552,7 @@
       <w:pPr>
         <w:pStyle w:val="2"/>
       </w:pPr>
-      <w:bookmarkStart w:id="13" w:name="_Toc241832671"/>
+      <w:bookmarkStart w:id="13" w:name="_Toc242967362"/>
       <w:r>
         <w:t xml:space="preserve">4-1. </w:t>
       </w:r>
@@ -15584,7 +15584,7 @@
           <w:noProof/>
         </w:rPr>
         <w:drawing>
-          <wp:inline distT="0" distB="0" distL="0" distR="0" wp14:anchorId="7848110B" wp14:editId="7FC2BF7D">
+          <wp:inline distT="0" distB="0" distL="0" distR="0" wp14:anchorId="23282134" wp14:editId="558E881A">
             <wp:extent cx="5143500" cy="4648200"/>
             <wp:effectExtent l="0" t="0" r="0" b="0"/>
             <wp:docPr id="6" name="그림 6"/>
@@ -16546,7 +16546,7 @@
       <w:pPr>
         <w:pStyle w:val="2"/>
       </w:pPr>
-      <w:bookmarkStart w:id="14" w:name="_Toc241832672"/>
+      <w:bookmarkStart w:id="14" w:name="_Toc242967363"/>
       <w:r>
         <w:t>4-2. Gmail</w:t>
       </w:r>
@@ -16572,7 +16572,7 @@
           <w:noProof/>
         </w:rPr>
         <w:drawing>
-          <wp:inline distT="0" distB="0" distL="0" distR="0" wp14:anchorId="6D391F36" wp14:editId="436F3DBF">
+          <wp:inline distT="0" distB="0" distL="0" distR="0" wp14:anchorId="580840D5" wp14:editId="4FAC2117">
             <wp:extent cx="5143500" cy="5962650"/>
             <wp:effectExtent l="0" t="0" r="0" b="0"/>
             <wp:docPr id="7" name="그림 7"/>
@@ -17615,7 +17615,7 @@
       <w:pPr>
         <w:pStyle w:val="2"/>
       </w:pPr>
-      <w:bookmarkStart w:id="15" w:name="_Toc241832673"/>
+      <w:bookmarkStart w:id="15" w:name="_Toc242967364"/>
       <w:r>
         <w:t xml:space="preserve">4-3. </w:t>
       </w:r>
@@ -19152,7 +19152,7 @@
       <w:pPr>
         <w:pStyle w:val="2"/>
       </w:pPr>
-      <w:bookmarkStart w:id="16" w:name="_Toc241832674"/>
+      <w:bookmarkStart w:id="16" w:name="_Toc242967365"/>
       <w:r>
         <w:t xml:space="preserve">4-4. </w:t>
       </w:r>
@@ -19334,7 +19334,7 @@
         </w:rPr>
         <w:lastRenderedPageBreak/>
         <w:drawing>
-          <wp:inline distT="0" distB="0" distL="0" distR="0" wp14:anchorId="1DA0AE37" wp14:editId="3848480D">
+          <wp:inline distT="0" distB="0" distL="0" distR="0" wp14:anchorId="197E56E9" wp14:editId="1ED8DD2C">
             <wp:extent cx="5143500" cy="1304925"/>
             <wp:effectExtent l="0" t="0" r="0" b="0"/>
             <wp:docPr id="8" name="그림 8"/>
@@ -20028,7 +20028,7 @@
           <w:noProof/>
         </w:rPr>
         <w:drawing>
-          <wp:inline distT="0" distB="0" distL="0" distR="0" wp14:anchorId="4800ECEB" wp14:editId="668DD72C">
+          <wp:inline distT="0" distB="0" distL="0" distR="0" wp14:anchorId="00A9A121" wp14:editId="06970EB0">
             <wp:extent cx="5715000" cy="1876425"/>
             <wp:effectExtent l="0" t="0" r="0" b="0"/>
             <wp:docPr id="9" name="그림 9"/>
@@ -20285,7 +20285,7 @@
       <w:pPr>
         <w:pStyle w:val="2"/>
       </w:pPr>
-      <w:bookmarkStart w:id="17" w:name="_Toc241832675"/>
+      <w:bookmarkStart w:id="17" w:name="_Toc242967366"/>
       <w:r>
         <w:t xml:space="preserve">4-5. </w:t>
       </w:r>
@@ -20962,7 +20962,7 @@
         </w:rPr>
         <w:lastRenderedPageBreak/>
         <w:drawing>
-          <wp:inline distT="0" distB="0" distL="0" distR="0" wp14:anchorId="6A84B116" wp14:editId="7F8A8DBA">
+          <wp:inline distT="0" distB="0" distL="0" distR="0" wp14:anchorId="6C1B230B" wp14:editId="681C4FAB">
             <wp:extent cx="5143500" cy="4552950"/>
             <wp:effectExtent l="0" t="0" r="0" b="0"/>
             <wp:docPr id="10" name="그림 10"/>
@@ -21812,7 +21812,7 @@
       <w:pPr>
         <w:pStyle w:val="2"/>
       </w:pPr>
-      <w:bookmarkStart w:id="18" w:name="_Toc241832676"/>
+      <w:bookmarkStart w:id="18" w:name="_Toc242967367"/>
       <w:r>
         <w:t xml:space="preserve">4-6. </w:t>
       </w:r>
@@ -22001,7 +22001,7 @@
         </w:rPr>
         <w:lastRenderedPageBreak/>
         <w:drawing>
-          <wp:inline distT="0" distB="0" distL="0" distR="0" wp14:anchorId="016C18A0" wp14:editId="2AF975F0">
+          <wp:inline distT="0" distB="0" distL="0" distR="0" wp14:anchorId="212938A7" wp14:editId="456F16DD">
             <wp:extent cx="4476750" cy="3057525"/>
             <wp:effectExtent l="0" t="0" r="0" b="0"/>
             <wp:docPr id="11" name="그림 11"/>
@@ -22884,7 +22884,7 @@
         <w:pStyle w:val="1"/>
         <w:pageBreakBefore/>
       </w:pPr>
-      <w:bookmarkStart w:id="19" w:name="_Toc241832677"/>
+      <w:bookmarkStart w:id="19" w:name="_Toc242967368"/>
       <w:r>
         <w:lastRenderedPageBreak/>
         <w:t xml:space="preserve">5. </w:t>
@@ -23232,7 +23232,7 @@
       <w:pPr>
         <w:pStyle w:val="2"/>
       </w:pPr>
-      <w:bookmarkStart w:id="20" w:name="_Toc241832678"/>
+      <w:bookmarkStart w:id="20" w:name="_Toc242967369"/>
       <w:r>
         <w:t xml:space="preserve">5-1. </w:t>
       </w:r>
@@ -23285,7 +23285,7 @@
           <w:noProof/>
         </w:rPr>
         <w:drawing>
-          <wp:inline distT="0" distB="0" distL="0" distR="0" wp14:anchorId="3F2E3A6D" wp14:editId="6B843C74">
+          <wp:inline distT="0" distB="0" distL="0" distR="0" wp14:anchorId="51CCFEF7" wp14:editId="405E2C09">
             <wp:extent cx="5143500" cy="4552950"/>
             <wp:effectExtent l="0" t="0" r="0" b="0"/>
             <wp:docPr id="12" name="그림 12"/>
@@ -23998,7 +23998,7 @@
       <w:pPr>
         <w:pStyle w:val="2"/>
       </w:pPr>
-      <w:bookmarkStart w:id="21" w:name="_Toc241832679"/>
+      <w:bookmarkStart w:id="21" w:name="_Toc242967370"/>
       <w:r>
         <w:t xml:space="preserve">5-2. </w:t>
       </w:r>
@@ -24060,7 +24060,7 @@
           <w:noProof/>
         </w:rPr>
         <w:drawing>
-          <wp:inline distT="0" distB="0" distL="0" distR="0" wp14:anchorId="4B100FFF" wp14:editId="42428C2B">
+          <wp:inline distT="0" distB="0" distL="0" distR="0" wp14:anchorId="77CC3B18" wp14:editId="71040226">
             <wp:extent cx="5143500" cy="4552950"/>
             <wp:effectExtent l="0" t="0" r="0" b="0"/>
             <wp:docPr id="13" name="그림 13"/>
@@ -24779,7 +24779,7 @@
       <w:pPr>
         <w:pStyle w:val="2"/>
       </w:pPr>
-      <w:bookmarkStart w:id="22" w:name="_Toc241832680"/>
+      <w:bookmarkStart w:id="22" w:name="_Toc242967371"/>
       <w:r>
         <w:lastRenderedPageBreak/>
         <w:t xml:space="preserve">5-3. </w:t>
@@ -24824,7 +24824,7 @@
           <w:noProof/>
         </w:rPr>
         <w:drawing>
-          <wp:inline distT="0" distB="0" distL="0" distR="0" wp14:anchorId="0E0821FE" wp14:editId="690CD4FA">
+          <wp:inline distT="0" distB="0" distL="0" distR="0" wp14:anchorId="41D36484" wp14:editId="65C3E767">
             <wp:extent cx="4476750" cy="5819775"/>
             <wp:effectExtent l="0" t="0" r="0" b="0"/>
             <wp:docPr id="14" name="그림 14"/>
@@ -25917,7 +25917,7 @@
       <w:pPr>
         <w:pStyle w:val="2"/>
       </w:pPr>
-      <w:bookmarkStart w:id="23" w:name="_Toc241832681"/>
+      <w:bookmarkStart w:id="23" w:name="_Toc242967372"/>
       <w:r>
         <w:t xml:space="preserve">5-4. </w:t>
       </w:r>
@@ -26494,7 +26494,7 @@
         <w:pStyle w:val="1"/>
         <w:pageBreakBefore/>
       </w:pPr>
-      <w:bookmarkStart w:id="24" w:name="_Toc241832682"/>
+      <w:bookmarkStart w:id="24" w:name="_Toc242967373"/>
       <w:r>
         <w:lastRenderedPageBreak/>
         <w:t xml:space="preserve">6. </w:t>
@@ -26976,7 +26976,7 @@
       <w:pPr>
         <w:pStyle w:val="2"/>
       </w:pPr>
-      <w:bookmarkStart w:id="25" w:name="_Toc241832683"/>
+      <w:bookmarkStart w:id="25" w:name="_Toc242967374"/>
       <w:r>
         <w:t xml:space="preserve">6-1. </w:t>
       </w:r>
@@ -27427,7 +27427,7 @@
       <w:pPr>
         <w:pStyle w:val="2"/>
       </w:pPr>
-      <w:bookmarkStart w:id="26" w:name="_Toc241832684"/>
+      <w:bookmarkStart w:id="26" w:name="_Toc242967375"/>
       <w:r>
         <w:lastRenderedPageBreak/>
         <w:t xml:space="preserve">6-2. </w:t>
@@ -27490,7 +27490,7 @@
           <w:noProof/>
         </w:rPr>
         <w:drawing>
-          <wp:inline distT="0" distB="0" distL="0" distR="0" wp14:anchorId="2C537481" wp14:editId="18A9521B">
+          <wp:inline distT="0" distB="0" distL="0" distR="0" wp14:anchorId="27915740" wp14:editId="0DCCFD42">
             <wp:extent cx="5143500" cy="4552950"/>
             <wp:effectExtent l="0" t="0" r="0" b="0"/>
             <wp:docPr id="15" name="그림 15"/>
@@ -28119,7 +28119,7 @@
         <w:pStyle w:val="1"/>
         <w:pageBreakBefore/>
       </w:pPr>
-      <w:bookmarkStart w:id="27" w:name="_Toc241832685"/>
+      <w:bookmarkStart w:id="27" w:name="_Toc242967376"/>
       <w:r>
         <w:lastRenderedPageBreak/>
         <w:t xml:space="preserve">7. </w:t>
@@ -28151,7 +28151,7 @@
       <w:pPr>
         <w:pStyle w:val="2"/>
       </w:pPr>
-      <w:bookmarkStart w:id="28" w:name="_Toc241832686"/>
+      <w:bookmarkStart w:id="28" w:name="_Toc242967377"/>
       <w:r>
         <w:t xml:space="preserve">7-1. </w:t>
       </w:r>
@@ -28177,7 +28177,7 @@
           <w:noProof/>
         </w:rPr>
         <w:drawing>
-          <wp:inline distT="0" distB="0" distL="0" distR="0" wp14:anchorId="32BF9619" wp14:editId="7AEE1113">
+          <wp:inline distT="0" distB="0" distL="0" distR="0" wp14:anchorId="0C1C79A3" wp14:editId="3B731F95">
             <wp:extent cx="3238500" cy="4181475"/>
             <wp:effectExtent l="0" t="0" r="0" b="0"/>
             <wp:docPr id="16" name="그림 16"/>
@@ -29639,7 +29639,7 @@
       <w:pPr>
         <w:pStyle w:val="2"/>
       </w:pPr>
-      <w:bookmarkStart w:id="29" w:name="_Toc241832687"/>
+      <w:bookmarkStart w:id="29" w:name="_Toc242967378"/>
       <w:r>
         <w:lastRenderedPageBreak/>
         <w:t xml:space="preserve">7-2. </w:t>
@@ -29672,7 +29672,7 @@
           <w:noProof/>
         </w:rPr>
         <w:drawing>
-          <wp:inline distT="0" distB="0" distL="0" distR="0" wp14:anchorId="1A11F77F" wp14:editId="3E5084B3">
+          <wp:inline distT="0" distB="0" distL="0" distR="0" wp14:anchorId="4A8F67E7" wp14:editId="7A91DB69">
             <wp:extent cx="3810000" cy="4676775"/>
             <wp:effectExtent l="0" t="0" r="0" b="0"/>
             <wp:docPr id="17" name="그림 17"/>
@@ -31224,7 +31224,7 @@
       <w:pPr>
         <w:pStyle w:val="2"/>
       </w:pPr>
-      <w:bookmarkStart w:id="30" w:name="_Toc241832688"/>
+      <w:bookmarkStart w:id="30" w:name="_Toc242967379"/>
       <w:r>
         <w:t xml:space="preserve">7-3. </w:t>
       </w:r>
@@ -32342,7 +32342,7 @@
         <w:pStyle w:val="1"/>
         <w:pageBreakBefore/>
       </w:pPr>
-      <w:bookmarkStart w:id="31" w:name="_Toc241832689"/>
+      <w:bookmarkStart w:id="31" w:name="_Toc242967380"/>
       <w:r>
         <w:lastRenderedPageBreak/>
         <w:t xml:space="preserve">8. </w:t>
@@ -35805,7 +35805,7 @@
         <w:pStyle w:val="1"/>
         <w:pageBreakBefore/>
       </w:pPr>
-      <w:bookmarkStart w:id="32" w:name="_Toc241832690"/>
+      <w:bookmarkStart w:id="32" w:name="_Toc242967381"/>
       <w:r>
         <w:lastRenderedPageBreak/>
         <w:t xml:space="preserve">9. </w:t>
@@ -35825,7 +35825,7 @@
       <w:pPr>
         <w:pStyle w:val="2"/>
       </w:pPr>
-      <w:bookmarkStart w:id="33" w:name="_Toc241832691"/>
+      <w:bookmarkStart w:id="33" w:name="_Toc242967382"/>
       <w:r>
         <w:t xml:space="preserve">9-1. </w:t>
       </w:r>
@@ -36486,7 +36486,7 @@
       <w:pPr>
         <w:pStyle w:val="2"/>
       </w:pPr>
-      <w:bookmarkStart w:id="34" w:name="_Toc241832692"/>
+      <w:bookmarkStart w:id="34" w:name="_Toc242967383"/>
       <w:r>
         <w:t xml:space="preserve">9-2. </w:t>
       </w:r>
@@ -37255,7 +37255,7 @@
       <w:pPr>
         <w:pStyle w:val="2"/>
       </w:pPr>
-      <w:bookmarkStart w:id="35" w:name="_Toc241832693"/>
+      <w:bookmarkStart w:id="35" w:name="_Toc242967384"/>
       <w:r>
         <w:t xml:space="preserve">9-3. </w:t>
       </w:r>
@@ -37498,7 +37498,7 @@
       <w:pPr>
         <w:pStyle w:val="2"/>
       </w:pPr>
-      <w:bookmarkStart w:id="36" w:name="_Toc241832694"/>
+      <w:bookmarkStart w:id="36" w:name="_Toc242967385"/>
       <w:r>
         <w:t xml:space="preserve">9-4. </w:t>
       </w:r>
@@ -38859,10 +38859,10 @@
 <file path=word/numbering.xml><?xml version="1.0" encoding="utf-8"?>
 <w:numbering xmlns:wpc="http://schemas.microsoft.com/office/word/2010/wordprocessingCanvas" xmlns:cx="http://schemas.microsoft.com/office/drawing/2014/chartex" xmlns:cx1="http://schemas.microsoft.com/office/drawing/2015/9/8/chartex" xmlns:cx2="http://schemas.microsoft.com/office/drawing/2015/10/21/chartex" xmlns:cx3="http://schemas.microsoft.com/office/drawing/2016/5/9/chartex" xmlns:cx4="http://schemas.microsoft.com/office/drawing/2016/5/10/chartex" xmlns:cx5="http://schemas.microsoft.com/office/drawing/2016/5/11/chartex" xmlns:cx6="http://schemas.microsoft.com/office/drawing/2016/5/12/chartex" xmlns:cx7="http://schemas.microsoft.com/office/drawing/2016/5/13/chartex" xmlns:cx8="http://schemas.microsoft.com/office/drawing/2016/5/14/chartex" xmlns:mc="http://schemas.openxmlformats.org/markup-compatibility/2006" xmlns:aink="http://schemas.microsoft.com/office/drawing/2016/ink" xmlns:am3d="http://schemas.microsoft.com/office/drawing/2017/model3d" xmlns:o="urn:schemas-microsoft-com:office:office" xmlns:r="http://schemas.openxmlformats.org/officeDocument/2006/relationships" xmlns:m="http://schemas.openxmlformats.org/officeDocument/2006/math" xmlns:v="urn:schemas-microsoft-com:vml" xmlns:wp14="http://schemas.microsoft.com/office/word/2010/wordprocessingDrawing" xmlns:wp="http://schemas.openxmlformats.org/drawingml/2006/wordprocessingDrawing" xmlns:w10="urn:schemas-microsoft-com:office:word" xmlns:w="http://schemas.openxmlformats.org/wordprocessingml/2006/main" xmlns:w14="http://schemas.microsoft.com/office/word/2010/wordml" xmlns:w15="http://schemas.microsoft.com/office/word/2012/wordml" xmlns:w16cex="http://schemas.microsoft.com/office/word/2018/wordml/cex" xmlns:w16cid="http://schemas.microsoft.com/office/word/2016/wordml/cid" xmlns:w16="http://schemas.microsoft.com/office/word/2018/wordml" xmlns:w16sdtdh="http://schemas.microsoft.com/office/word/2020/wordml/sdtdatahash" xmlns:w16se="http://schemas.microsoft.com/office/word/2015/wordml/symex" xmlns:wpg="http://schemas.microsoft.com/office/word/2010/wordprocessingGroup" xmlns:wpi="http://schemas.microsoft.com/office/word/2010/wordprocessingInk" xmlns:wne="http://schemas.microsoft.com/office/word/2006/wordml" xmlns:wps="http://schemas.microsoft.com/office/word/2010/wordprocessingShape" mc:Ignorable="w14 w15 w16se w16cid w16 w16cex w16sdtdh wp14">
   <w:abstractNum w:abstractNumId="0" w15:restartNumberingAfterBreak="0">
-    <w:nsid w:val="0617568F"/>
+    <w:nsid w:val="07EA5DAF"/>
     <w:multiLevelType w:val="hybridMultilevel"/>
-    <w:tmpl w:val="097A0214"/>
-    <w:lvl w:ilvl="0" w:tplc="0A04A3DE">
+    <w:tmpl w:val="B736369E"/>
+    <w:lvl w:ilvl="0" w:tplc="B3344E76">
       <w:start w:val="1"/>
       <w:numFmt w:val="decimal"/>
       <w:lvlText w:val="%1."/>
@@ -38871,52 +38871,52 @@
         <w:ind w:left="440" w:hanging="300"/>
       </w:pPr>
     </w:lvl>
-    <w:lvl w:ilvl="1" w:tplc="1A28E206">
+    <w:lvl w:ilvl="1" w:tplc="7DBC3582">
       <w:numFmt w:val="decimal"/>
       <w:lvlText w:val=""/>
       <w:lvlJc w:val="left"/>
     </w:lvl>
-    <w:lvl w:ilvl="2" w:tplc="92F8D48C">
+    <w:lvl w:ilvl="2" w:tplc="051E9702">
       <w:numFmt w:val="decimal"/>
       <w:lvlText w:val=""/>
       <w:lvlJc w:val="left"/>
     </w:lvl>
-    <w:lvl w:ilvl="3" w:tplc="829C3B8C">
+    <w:lvl w:ilvl="3" w:tplc="C45A387A">
       <w:numFmt w:val="decimal"/>
       <w:lvlText w:val=""/>
       <w:lvlJc w:val="left"/>
     </w:lvl>
-    <w:lvl w:ilvl="4" w:tplc="D33C5060">
+    <w:lvl w:ilvl="4" w:tplc="FD10D856">
       <w:numFmt w:val="decimal"/>
       <w:lvlText w:val=""/>
       <w:lvlJc w:val="left"/>
     </w:lvl>
-    <w:lvl w:ilvl="5" w:tplc="0044A898">
+    <w:lvl w:ilvl="5" w:tplc="14C8B432">
       <w:numFmt w:val="decimal"/>
       <w:lvlText w:val=""/>
       <w:lvlJc w:val="left"/>
     </w:lvl>
-    <w:lvl w:ilvl="6" w:tplc="62500022">
+    <w:lvl w:ilvl="6" w:tplc="8B04A288">
       <w:numFmt w:val="decimal"/>
       <w:lvlText w:val=""/>
       <w:lvlJc w:val="left"/>
     </w:lvl>
-    <w:lvl w:ilvl="7" w:tplc="6B3C6520">
+    <w:lvl w:ilvl="7" w:tplc="B8D08912">
       <w:numFmt w:val="decimal"/>
       <w:lvlText w:val=""/>
       <w:lvlJc w:val="left"/>
     </w:lvl>
-    <w:lvl w:ilvl="8" w:tplc="1818AFDE">
+    <w:lvl w:ilvl="8" w:tplc="FD9849E2">
       <w:numFmt w:val="decimal"/>
       <w:lvlText w:val=""/>
       <w:lvlJc w:val="left"/>
     </w:lvl>
   </w:abstractNum>
   <w:abstractNum w:abstractNumId="1" w15:restartNumberingAfterBreak="0">
-    <w:nsid w:val="083752B7"/>
+    <w:nsid w:val="095E1DE6"/>
     <w:multiLevelType w:val="hybridMultilevel"/>
-    <w:tmpl w:val="E530E8AA"/>
-    <w:lvl w:ilvl="0" w:tplc="4D16D262">
+    <w:tmpl w:val="5B761146"/>
+    <w:lvl w:ilvl="0" w:tplc="FA400EA6">
       <w:start w:val="1"/>
       <w:numFmt w:val="decimal"/>
       <w:lvlText w:val="%1."/>
@@ -38925,52 +38925,106 @@
         <w:ind w:left="440" w:hanging="300"/>
       </w:pPr>
     </w:lvl>
-    <w:lvl w:ilvl="1" w:tplc="A40CCC26">
+    <w:lvl w:ilvl="1" w:tplc="701C600A">
       <w:numFmt w:val="decimal"/>
       <w:lvlText w:val=""/>
       <w:lvlJc w:val="left"/>
     </w:lvl>
-    <w:lvl w:ilvl="2" w:tplc="8AC093F6">
+    <w:lvl w:ilvl="2" w:tplc="E4366CDC">
       <w:numFmt w:val="decimal"/>
       <w:lvlText w:val=""/>
       <w:lvlJc w:val="left"/>
     </w:lvl>
-    <w:lvl w:ilvl="3" w:tplc="BFA48978">
+    <w:lvl w:ilvl="3" w:tplc="942E2520">
       <w:numFmt w:val="decimal"/>
       <w:lvlText w:val=""/>
       <w:lvlJc w:val="left"/>
     </w:lvl>
-    <w:lvl w:ilvl="4" w:tplc="3EA6DD70">
+    <w:lvl w:ilvl="4" w:tplc="9DB6E9F0">
       <w:numFmt w:val="decimal"/>
       <w:lvlText w:val=""/>
       <w:lvlJc w:val="left"/>
     </w:lvl>
-    <w:lvl w:ilvl="5" w:tplc="D652AEC6">
+    <w:lvl w:ilvl="5" w:tplc="527827A2">
       <w:numFmt w:val="decimal"/>
       <w:lvlText w:val=""/>
       <w:lvlJc w:val="left"/>
     </w:lvl>
-    <w:lvl w:ilvl="6" w:tplc="5C4C5F8C">
+    <w:lvl w:ilvl="6" w:tplc="DF265446">
       <w:numFmt w:val="decimal"/>
       <w:lvlText w:val=""/>
       <w:lvlJc w:val="left"/>
     </w:lvl>
-    <w:lvl w:ilvl="7" w:tplc="1B222C8C">
+    <w:lvl w:ilvl="7" w:tplc="6E0C2966">
       <w:numFmt w:val="decimal"/>
       <w:lvlText w:val=""/>
       <w:lvlJc w:val="left"/>
     </w:lvl>
-    <w:lvl w:ilvl="8" w:tplc="7BE8FCEA">
+    <w:lvl w:ilvl="8" w:tplc="9EF6EEDC">
       <w:numFmt w:val="decimal"/>
       <w:lvlText w:val=""/>
       <w:lvlJc w:val="left"/>
     </w:lvl>
   </w:abstractNum>
   <w:abstractNum w:abstractNumId="2" w15:restartNumberingAfterBreak="0">
-    <w:nsid w:val="0D813101"/>
+    <w:nsid w:val="0F347E8E"/>
     <w:multiLevelType w:val="hybridMultilevel"/>
-    <w:tmpl w:val="3E443F38"/>
-    <w:lvl w:ilvl="0" w:tplc="C07CDE02">
+    <w:tmpl w:val="E75C7A90"/>
+    <w:lvl w:ilvl="0" w:tplc="74C08F1C">
+      <w:start w:val="1"/>
+      <w:numFmt w:val="bullet"/>
+      <w:lvlText w:val="•"/>
+      <w:lvlJc w:val="left"/>
+      <w:pPr>
+        <w:ind w:left="440" w:hanging="260"/>
+      </w:pPr>
+    </w:lvl>
+    <w:lvl w:ilvl="1" w:tplc="972E682E">
+      <w:numFmt w:val="decimal"/>
+      <w:lvlText w:val=""/>
+      <w:lvlJc w:val="left"/>
+    </w:lvl>
+    <w:lvl w:ilvl="2" w:tplc="4AFE3F4C">
+      <w:numFmt w:val="decimal"/>
+      <w:lvlText w:val=""/>
+      <w:lvlJc w:val="left"/>
+    </w:lvl>
+    <w:lvl w:ilvl="3" w:tplc="C58E83FA">
+      <w:numFmt w:val="decimal"/>
+      <w:lvlText w:val=""/>
+      <w:lvlJc w:val="left"/>
+    </w:lvl>
+    <w:lvl w:ilvl="4" w:tplc="6DA83066">
+      <w:numFmt w:val="decimal"/>
+      <w:lvlText w:val=""/>
+      <w:lvlJc w:val="left"/>
+    </w:lvl>
+    <w:lvl w:ilvl="5" w:tplc="22905806">
+      <w:numFmt w:val="decimal"/>
+      <w:lvlText w:val=""/>
+      <w:lvlJc w:val="left"/>
+    </w:lvl>
+    <w:lvl w:ilvl="6" w:tplc="465A4246">
+      <w:numFmt w:val="decimal"/>
+      <w:lvlText w:val=""/>
+      <w:lvlJc w:val="left"/>
+    </w:lvl>
+    <w:lvl w:ilvl="7" w:tplc="F6D874E2">
+      <w:numFmt w:val="decimal"/>
+      <w:lvlText w:val=""/>
+      <w:lvlJc w:val="left"/>
+    </w:lvl>
+    <w:lvl w:ilvl="8" w:tplc="6D3C286A">
+      <w:numFmt w:val="decimal"/>
+      <w:lvlText w:val=""/>
+      <w:lvlJc w:val="left"/>
+    </w:lvl>
+  </w:abstractNum>
+  <w:abstractNum w:abstractNumId="3" w15:restartNumberingAfterBreak="0">
+    <w:nsid w:val="227D4772"/>
+    <w:multiLevelType w:val="hybridMultilevel"/>
+    <w:tmpl w:val="26DAEB00"/>
+    <w:lvl w:ilvl="0" w:tplc="12E07616">
       <w:start w:val="1"/>
       <w:numFmt w:val="decimal"/>
       <w:lvlText w:val="%1."/>
@@ -38979,52 +39033,214 @@
         <w:ind w:left="440" w:hanging="300"/>
       </w:pPr>
     </w:lvl>
-    <w:lvl w:ilvl="1" w:tplc="7DD4B43C">
+    <w:lvl w:ilvl="1" w:tplc="C8DA0EF2">
       <w:numFmt w:val="decimal"/>
       <w:lvlText w:val=""/>
       <w:lvlJc w:val="left"/>
     </w:lvl>
-    <w:lvl w:ilvl="2" w:tplc="D99A6FD0">
+    <w:lvl w:ilvl="2" w:tplc="D1FEBBAC">
       <w:numFmt w:val="decimal"/>
       <w:lvlText w:val=""/>
       <w:lvlJc w:val="left"/>
     </w:lvl>
-    <w:lvl w:ilvl="3" w:tplc="F20EB730">
+    <w:lvl w:ilvl="3" w:tplc="5652E40C">
       <w:numFmt w:val="decimal"/>
       <w:lvlText w:val=""/>
       <w:lvlJc w:val="left"/>
     </w:lvl>
-    <w:lvl w:ilvl="4" w:tplc="3B50D322">
+    <w:lvl w:ilvl="4" w:tplc="62F6CF4E">
       <w:numFmt w:val="decimal"/>
       <w:lvlText w:val=""/>
       <w:lvlJc w:val="left"/>
     </w:lvl>
-    <w:lvl w:ilvl="5" w:tplc="4432AF70">
+    <w:lvl w:ilvl="5" w:tplc="608A226A">
       <w:numFmt w:val="decimal"/>
       <w:lvlText w:val=""/>
       <w:lvlJc w:val="left"/>
     </w:lvl>
-    <w:lvl w:ilvl="6" w:tplc="01685B7C">
+    <w:lvl w:ilvl="6" w:tplc="8C5E9466">
       <w:numFmt w:val="decimal"/>
       <w:lvlText w:val=""/>
       <w:lvlJc w:val="left"/>
     </w:lvl>
-    <w:lvl w:ilvl="7" w:tplc="0E46E00C">
+    <w:lvl w:ilvl="7" w:tplc="B24469CE">
       <w:numFmt w:val="decimal"/>
       <w:lvlText w:val=""/>
       <w:lvlJc w:val="left"/>
     </w:lvl>
-    <w:lvl w:ilvl="8" w:tplc="DA2A3C9A">
+    <w:lvl w:ilvl="8" w:tplc="90A6A96A">
       <w:numFmt w:val="decimal"/>
       <w:lvlText w:val=""/>
       <w:lvlJc w:val="left"/>
     </w:lvl>
   </w:abstractNum>
-  <w:abstractNum w:abstractNumId="3" w15:restartNumberingAfterBreak="0">
-    <w:nsid w:val="110C30B0"/>
+  <w:abstractNum w:abstractNumId="4" w15:restartNumberingAfterBreak="0">
+    <w:nsid w:val="23BD4CEB"/>
     <w:multiLevelType w:val="hybridMultilevel"/>
-    <w:tmpl w:val="0268C9A2"/>
-    <w:lvl w:ilvl="0" w:tplc="068C75E0" w:tentative="1">
+    <w:tmpl w:val="3FD65832"/>
+    <w:lvl w:ilvl="0" w:tplc="D3142628">
+      <w:start w:val="1"/>
+      <w:numFmt w:val="decimal"/>
+      <w:lvlText w:val="%1."/>
+      <w:lvlJc w:val="left"/>
+      <w:pPr>
+        <w:ind w:left="440" w:hanging="300"/>
+      </w:pPr>
+    </w:lvl>
+    <w:lvl w:ilvl="1" w:tplc="4C244ED8">
+      <w:numFmt w:val="decimal"/>
+      <w:lvlText w:val=""/>
+      <w:lvlJc w:val="left"/>
+    </w:lvl>
+    <w:lvl w:ilvl="2" w:tplc="1F8C9ACC">
+      <w:numFmt w:val="decimal"/>
+      <w:lvlText w:val=""/>
+      <w:lvlJc w:val="left"/>
+    </w:lvl>
+    <w:lvl w:ilvl="3" w:tplc="08120F0E">
+      <w:numFmt w:val="decimal"/>
+      <w:lvlText w:val=""/>
+      <w:lvlJc w:val="left"/>
+    </w:lvl>
+    <w:lvl w:ilvl="4" w:tplc="0A42ED2C">
+      <w:numFmt w:val="decimal"/>
+      <w:lvlText w:val=""/>
+      <w:lvlJc w:val="left"/>
+    </w:lvl>
+    <w:lvl w:ilvl="5" w:tplc="30184D78">
+      <w:numFmt w:val="decimal"/>
+      <w:lvlText w:val=""/>
+      <w:lvlJc w:val="left"/>
+    </w:lvl>
+    <w:lvl w:ilvl="6" w:tplc="461C1030">
+      <w:numFmt w:val="decimal"/>
+      <w:lvlText w:val=""/>
+      <w:lvlJc w:val="left"/>
+    </w:lvl>
+    <w:lvl w:ilvl="7" w:tplc="5790A5CA">
+      <w:numFmt w:val="decimal"/>
+      <w:lvlText w:val=""/>
+      <w:lvlJc w:val="left"/>
+    </w:lvl>
+    <w:lvl w:ilvl="8" w:tplc="A106D13E">
+      <w:numFmt w:val="decimal"/>
+      <w:lvlText w:val=""/>
+      <w:lvlJc w:val="left"/>
+    </w:lvl>
+  </w:abstractNum>
+  <w:abstractNum w:abstractNumId="5" w15:restartNumberingAfterBreak="0">
+    <w:nsid w:val="2DEF6AF1"/>
+    <w:multiLevelType w:val="hybridMultilevel"/>
+    <w:tmpl w:val="F69EB4BC"/>
+    <w:lvl w:ilvl="0" w:tplc="45A06CF8">
+      <w:start w:val="1"/>
+      <w:numFmt w:val="decimal"/>
+      <w:lvlText w:val="%1."/>
+      <w:lvlJc w:val="left"/>
+      <w:pPr>
+        <w:ind w:left="440" w:hanging="300"/>
+      </w:pPr>
+    </w:lvl>
+    <w:lvl w:ilvl="1" w:tplc="C602CCD6">
+      <w:numFmt w:val="decimal"/>
+      <w:lvlText w:val=""/>
+      <w:lvlJc w:val="left"/>
+    </w:lvl>
+    <w:lvl w:ilvl="2" w:tplc="D826B258">
+      <w:numFmt w:val="decimal"/>
+      <w:lvlText w:val=""/>
+      <w:lvlJc w:val="left"/>
+    </w:lvl>
+    <w:lvl w:ilvl="3" w:tplc="65B088F4">
+      <w:numFmt w:val="decimal"/>
+      <w:lvlText w:val=""/>
+      <w:lvlJc w:val="left"/>
+    </w:lvl>
+    <w:lvl w:ilvl="4" w:tplc="776ABD84">
+      <w:numFmt w:val="decimal"/>
+      <w:lvlText w:val=""/>
+      <w:lvlJc w:val="left"/>
+    </w:lvl>
+    <w:lvl w:ilvl="5" w:tplc="E2461F18">
+      <w:numFmt w:val="decimal"/>
+      <w:lvlText w:val=""/>
+      <w:lvlJc w:val="left"/>
+    </w:lvl>
+    <w:lvl w:ilvl="6" w:tplc="23BC61D6">
+      <w:numFmt w:val="decimal"/>
+      <w:lvlText w:val=""/>
+      <w:lvlJc w:val="left"/>
+    </w:lvl>
+    <w:lvl w:ilvl="7" w:tplc="E6BA1EFA">
+      <w:numFmt w:val="decimal"/>
+      <w:lvlText w:val=""/>
+      <w:lvlJc w:val="left"/>
+    </w:lvl>
+    <w:lvl w:ilvl="8" w:tplc="C0761E20">
+      <w:numFmt w:val="decimal"/>
+      <w:lvlText w:val=""/>
+      <w:lvlJc w:val="left"/>
+    </w:lvl>
+  </w:abstractNum>
+  <w:abstractNum w:abstractNumId="6" w15:restartNumberingAfterBreak="0">
+    <w:nsid w:val="388C0625"/>
+    <w:multiLevelType w:val="hybridMultilevel"/>
+    <w:tmpl w:val="E746F5B8"/>
+    <w:lvl w:ilvl="0" w:tplc="5CEAFBEC">
+      <w:start w:val="1"/>
+      <w:numFmt w:val="decimal"/>
+      <w:lvlText w:val="%1."/>
+      <w:lvlJc w:val="left"/>
+      <w:pPr>
+        <w:ind w:left="440" w:hanging="300"/>
+      </w:pPr>
+    </w:lvl>
+    <w:lvl w:ilvl="1" w:tplc="4D041396">
+      <w:numFmt w:val="decimal"/>
+      <w:lvlText w:val=""/>
+      <w:lvlJc w:val="left"/>
+    </w:lvl>
+    <w:lvl w:ilvl="2" w:tplc="C7361220">
+      <w:numFmt w:val="decimal"/>
+      <w:lvlText w:val=""/>
+      <w:lvlJc w:val="left"/>
+    </w:lvl>
+    <w:lvl w:ilvl="3" w:tplc="DD72E59E">
+      <w:numFmt w:val="decimal"/>
+      <w:lvlText w:val=""/>
+      <w:lvlJc w:val="left"/>
+    </w:lvl>
+    <w:lvl w:ilvl="4" w:tplc="9AEE21B4">
+      <w:numFmt w:val="decimal"/>
+      <w:lvlText w:val=""/>
+      <w:lvlJc w:val="left"/>
+    </w:lvl>
+    <w:lvl w:ilvl="5" w:tplc="8348FD1E">
+      <w:numFmt w:val="decimal"/>
+      <w:lvlText w:val=""/>
+      <w:lvlJc w:val="left"/>
+    </w:lvl>
+    <w:lvl w:ilvl="6" w:tplc="2D08F170">
+      <w:numFmt w:val="decimal"/>
+      <w:lvlText w:val=""/>
+      <w:lvlJc w:val="left"/>
+    </w:lvl>
+    <w:lvl w:ilvl="7" w:tplc="F7144B06">
+      <w:numFmt w:val="decimal"/>
+      <w:lvlText w:val=""/>
+      <w:lvlJc w:val="left"/>
+    </w:lvl>
+    <w:lvl w:ilvl="8" w:tplc="89B8E3C4">
+      <w:numFmt w:val="decimal"/>
+      <w:lvlText w:val=""/>
+      <w:lvlJc w:val="left"/>
+    </w:lvl>
+  </w:abstractNum>
+  <w:abstractNum w:abstractNumId="7" w15:restartNumberingAfterBreak="0">
+    <w:nsid w:val="3AA20824"/>
+    <w:multiLevelType w:val="hybridMultilevel"/>
+    <w:tmpl w:val="002A838A"/>
+    <w:lvl w:ilvl="0" w:tplc="B5924174" w:tentative="1">
       <w:start w:val="1"/>
       <w:numFmt w:val="bullet"/>
       <w:lvlText w:val="●"/>
@@ -39033,7 +39249,7 @@
         <w:ind w:left="720" w:hanging="360"/>
       </w:pPr>
     </w:lvl>
-    <w:lvl w:ilvl="1" w:tplc="7C3A517C" w:tentative="1">
+    <w:lvl w:ilvl="1" w:tplc="8506BC00" w:tentative="1">
       <w:start w:val="1"/>
       <w:numFmt w:val="bullet"/>
       <w:lvlText w:val="○"/>
@@ -39042,7 +39258,7 @@
         <w:ind w:left="1440" w:hanging="360"/>
       </w:pPr>
     </w:lvl>
-    <w:lvl w:ilvl="2" w:tplc="7870061C" w:tentative="1">
+    <w:lvl w:ilvl="2" w:tplc="06A687B4" w:tentative="1">
       <w:start w:val="1"/>
       <w:numFmt w:val="bullet"/>
       <w:lvlText w:val="■"/>
@@ -39051,7 +39267,7 @@
         <w:ind w:left="2160" w:hanging="360"/>
       </w:pPr>
     </w:lvl>
-    <w:lvl w:ilvl="3" w:tplc="E460D844" w:tentative="1">
+    <w:lvl w:ilvl="3" w:tplc="A302ECB0" w:tentative="1">
       <w:start w:val="1"/>
       <w:numFmt w:val="bullet"/>
       <w:lvlText w:val="●"/>
@@ -39060,7 +39276,7 @@
         <w:ind w:left="2880" w:hanging="360"/>
       </w:pPr>
     </w:lvl>
-    <w:lvl w:ilvl="4" w:tplc="427847DA" w:tentative="1">
+    <w:lvl w:ilvl="4" w:tplc="C0C026B4" w:tentative="1">
       <w:start w:val="1"/>
       <w:numFmt w:val="bullet"/>
       <w:lvlText w:val="○"/>
@@ -39069,7 +39285,7 @@
         <w:ind w:left="3600" w:hanging="360"/>
       </w:pPr>
     </w:lvl>
-    <w:lvl w:ilvl="5" w:tplc="E290635E" w:tentative="1">
+    <w:lvl w:ilvl="5" w:tplc="11100146" w:tentative="1">
       <w:start w:val="1"/>
       <w:numFmt w:val="bullet"/>
       <w:lvlText w:val="■"/>
@@ -39078,7 +39294,7 @@
         <w:ind w:left="4320" w:hanging="360"/>
       </w:pPr>
     </w:lvl>
-    <w:lvl w:ilvl="6" w:tplc="AC3AC906" w:tentative="1">
+    <w:lvl w:ilvl="6" w:tplc="2B84BDB2" w:tentative="1">
       <w:start w:val="1"/>
       <w:numFmt w:val="bullet"/>
       <w:lvlText w:val="●"/>
@@ -39087,7 +39303,7 @@
         <w:ind w:left="5040" w:hanging="360"/>
       </w:pPr>
     </w:lvl>
-    <w:lvl w:ilvl="7" w:tplc="7766E07A" w:tentative="1">
+    <w:lvl w:ilvl="7" w:tplc="0B8E826A" w:tentative="1">
       <w:start w:val="1"/>
       <w:numFmt w:val="bullet"/>
       <w:lvlText w:val="●"/>
@@ -39096,7 +39312,7 @@
         <w:ind w:left="5760" w:hanging="360"/>
       </w:pPr>
     </w:lvl>
-    <w:lvl w:ilvl="8" w:tplc="6CAEC132" w:tentative="1">
+    <w:lvl w:ilvl="8" w:tplc="9134F4F6" w:tentative="1">
       <w:start w:val="1"/>
       <w:numFmt w:val="bullet"/>
       <w:lvlText w:val="●"/>
@@ -39106,65 +39322,11 @@
       </w:pPr>
     </w:lvl>
   </w:abstractNum>
-  <w:abstractNum w:abstractNumId="4" w15:restartNumberingAfterBreak="0">
-    <w:nsid w:val="137D6127"/>
+  <w:abstractNum w:abstractNumId="8" w15:restartNumberingAfterBreak="0">
+    <w:nsid w:val="478D2B5D"/>
     <w:multiLevelType w:val="hybridMultilevel"/>
-    <w:tmpl w:val="E5B84278"/>
-    <w:lvl w:ilvl="0" w:tplc="6EEA9820">
-      <w:start w:val="1"/>
-      <w:numFmt w:val="bullet"/>
-      <w:lvlText w:val="•"/>
-      <w:lvlJc w:val="left"/>
-      <w:pPr>
-        <w:ind w:left="440" w:hanging="260"/>
-      </w:pPr>
-    </w:lvl>
-    <w:lvl w:ilvl="1" w:tplc="8E3C3C4E">
-      <w:numFmt w:val="decimal"/>
-      <w:lvlText w:val=""/>
-      <w:lvlJc w:val="left"/>
-    </w:lvl>
-    <w:lvl w:ilvl="2" w:tplc="E7F8AF8C">
-      <w:numFmt w:val="decimal"/>
-      <w:lvlText w:val=""/>
-      <w:lvlJc w:val="left"/>
-    </w:lvl>
-    <w:lvl w:ilvl="3" w:tplc="2A685C70">
-      <w:numFmt w:val="decimal"/>
-      <w:lvlText w:val=""/>
-      <w:lvlJc w:val="left"/>
-    </w:lvl>
-    <w:lvl w:ilvl="4" w:tplc="AD76FF90">
-      <w:numFmt w:val="decimal"/>
-      <w:lvlText w:val=""/>
-      <w:lvlJc w:val="left"/>
-    </w:lvl>
-    <w:lvl w:ilvl="5" w:tplc="CCC8B510">
-      <w:numFmt w:val="decimal"/>
-      <w:lvlText w:val=""/>
-      <w:lvlJc w:val="left"/>
-    </w:lvl>
-    <w:lvl w:ilvl="6" w:tplc="CFBE4E66">
-      <w:numFmt w:val="decimal"/>
-      <w:lvlText w:val=""/>
-      <w:lvlJc w:val="left"/>
-    </w:lvl>
-    <w:lvl w:ilvl="7" w:tplc="2B4EC716">
-      <w:numFmt w:val="decimal"/>
-      <w:lvlText w:val=""/>
-      <w:lvlJc w:val="left"/>
-    </w:lvl>
-    <w:lvl w:ilvl="8" w:tplc="16CABFC8">
-      <w:numFmt w:val="decimal"/>
-      <w:lvlText w:val=""/>
-      <w:lvlJc w:val="left"/>
-    </w:lvl>
-  </w:abstractNum>
-  <w:abstractNum w:abstractNumId="5" w15:restartNumberingAfterBreak="0">
-    <w:nsid w:val="1CF23020"/>
-    <w:multiLevelType w:val="hybridMultilevel"/>
-    <w:tmpl w:val="EFD4226C"/>
-    <w:lvl w:ilvl="0" w:tplc="F6BC2258">
+    <w:tmpl w:val="83A26584"/>
+    <w:lvl w:ilvl="0" w:tplc="D6C6F2BE">
       <w:start w:val="1"/>
       <w:numFmt w:val="decimal"/>
       <w:lvlText w:val="%1."/>
@@ -39173,52 +39335,52 @@
         <w:ind w:left="440" w:hanging="300"/>
       </w:pPr>
     </w:lvl>
-    <w:lvl w:ilvl="1" w:tplc="DCF6886A">
+    <w:lvl w:ilvl="1" w:tplc="F2A64C1C">
       <w:numFmt w:val="decimal"/>
       <w:lvlText w:val=""/>
       <w:lvlJc w:val="left"/>
     </w:lvl>
-    <w:lvl w:ilvl="2" w:tplc="E472942A">
+    <w:lvl w:ilvl="2" w:tplc="3C422FA8">
       <w:numFmt w:val="decimal"/>
       <w:lvlText w:val=""/>
       <w:lvlJc w:val="left"/>
     </w:lvl>
-    <w:lvl w:ilvl="3" w:tplc="B804E6B2">
+    <w:lvl w:ilvl="3" w:tplc="9A96EED6">
       <w:numFmt w:val="decimal"/>
       <w:lvlText w:val=""/>
       <w:lvlJc w:val="left"/>
     </w:lvl>
-    <w:lvl w:ilvl="4" w:tplc="BC56DBC2">
+    <w:lvl w:ilvl="4" w:tplc="165664BC">
       <w:numFmt w:val="decimal"/>
       <w:lvlText w:val=""/>
       <w:lvlJc w:val="left"/>
     </w:lvl>
-    <w:lvl w:ilvl="5" w:tplc="55E6BD76">
+    <w:lvl w:ilvl="5" w:tplc="04E62C32">
       <w:numFmt w:val="decimal"/>
       <w:lvlText w:val=""/>
       <w:lvlJc w:val="left"/>
     </w:lvl>
-    <w:lvl w:ilvl="6" w:tplc="F2F8B5CE">
+    <w:lvl w:ilvl="6" w:tplc="BF969234">
       <w:numFmt w:val="decimal"/>
       <w:lvlText w:val=""/>
       <w:lvlJc w:val="left"/>
     </w:lvl>
-    <w:lvl w:ilvl="7" w:tplc="547CA7E6">
+    <w:lvl w:ilvl="7" w:tplc="821CCE9E">
       <w:numFmt w:val="decimal"/>
       <w:lvlText w:val=""/>
       <w:lvlJc w:val="left"/>
     </w:lvl>
-    <w:lvl w:ilvl="8" w:tplc="8DE8A528">
+    <w:lvl w:ilvl="8" w:tplc="355ED646">
       <w:numFmt w:val="decimal"/>
       <w:lvlText w:val=""/>
       <w:lvlJc w:val="left"/>
     </w:lvl>
   </w:abstractNum>
-  <w:abstractNum w:abstractNumId="6" w15:restartNumberingAfterBreak="0">
-    <w:nsid w:val="250C072E"/>
+  <w:abstractNum w:abstractNumId="9" w15:restartNumberingAfterBreak="0">
+    <w:nsid w:val="4DBA2B96"/>
     <w:multiLevelType w:val="hybridMultilevel"/>
-    <w:tmpl w:val="3064E8BC"/>
-    <w:lvl w:ilvl="0" w:tplc="071ABD38">
+    <w:tmpl w:val="B0A8BFE6"/>
+    <w:lvl w:ilvl="0" w:tplc="92EA944C">
       <w:start w:val="1"/>
       <w:numFmt w:val="decimal"/>
       <w:lvlText w:val="%1."/>
@@ -39227,52 +39389,52 @@
         <w:ind w:left="440" w:hanging="300"/>
       </w:pPr>
     </w:lvl>
-    <w:lvl w:ilvl="1" w:tplc="955EDB10">
+    <w:lvl w:ilvl="1" w:tplc="93E8B488">
       <w:numFmt w:val="decimal"/>
       <w:lvlText w:val=""/>
       <w:lvlJc w:val="left"/>
     </w:lvl>
-    <w:lvl w:ilvl="2" w:tplc="9C8047A4">
+    <w:lvl w:ilvl="2" w:tplc="65FA806A">
       <w:numFmt w:val="decimal"/>
       <w:lvlText w:val=""/>
       <w:lvlJc w:val="left"/>
     </w:lvl>
-    <w:lvl w:ilvl="3" w:tplc="E1AE65B8">
+    <w:lvl w:ilvl="3" w:tplc="C6762472">
       <w:numFmt w:val="decimal"/>
       <w:lvlText w:val=""/>
       <w:lvlJc w:val="left"/>
     </w:lvl>
-    <w:lvl w:ilvl="4" w:tplc="AE3E1CCC">
+    <w:lvl w:ilvl="4" w:tplc="75A4A77E">
       <w:numFmt w:val="decimal"/>
       <w:lvlText w:val=""/>
       <w:lvlJc w:val="left"/>
     </w:lvl>
-    <w:lvl w:ilvl="5" w:tplc="2DE29D0C">
+    <w:lvl w:ilvl="5" w:tplc="400220B0">
       <w:numFmt w:val="decimal"/>
       <w:lvlText w:val=""/>
       <w:lvlJc w:val="left"/>
     </w:lvl>
-    <w:lvl w:ilvl="6" w:tplc="6A84D4C2">
+    <w:lvl w:ilvl="6" w:tplc="8B269434">
       <w:numFmt w:val="decimal"/>
       <w:lvlText w:val=""/>
       <w:lvlJc w:val="left"/>
     </w:lvl>
-    <w:lvl w:ilvl="7" w:tplc="AE2EC7CA">
+    <w:lvl w:ilvl="7" w:tplc="23086716">
       <w:numFmt w:val="decimal"/>
       <w:lvlText w:val=""/>
       <w:lvlJc w:val="left"/>
     </w:lvl>
-    <w:lvl w:ilvl="8" w:tplc="3F74BB36">
+    <w:lvl w:ilvl="8" w:tplc="19D6A9A0">
       <w:numFmt w:val="decimal"/>
       <w:lvlText w:val=""/>
       <w:lvlJc w:val="left"/>
     </w:lvl>
   </w:abstractNum>
-  <w:abstractNum w:abstractNumId="7" w15:restartNumberingAfterBreak="0">
-    <w:nsid w:val="2D171726"/>
+  <w:abstractNum w:abstractNumId="10" w15:restartNumberingAfterBreak="0">
+    <w:nsid w:val="63521785"/>
     <w:multiLevelType w:val="hybridMultilevel"/>
-    <w:tmpl w:val="640474FC"/>
-    <w:lvl w:ilvl="0" w:tplc="642A0392">
+    <w:tmpl w:val="070A63A0"/>
+    <w:lvl w:ilvl="0" w:tplc="5858A7EE">
       <w:start w:val="1"/>
       <w:numFmt w:val="decimal"/>
       <w:lvlText w:val="%1."/>
@@ -39281,52 +39443,52 @@
         <w:ind w:left="440" w:hanging="300"/>
       </w:pPr>
     </w:lvl>
-    <w:lvl w:ilvl="1" w:tplc="53B24D54">
+    <w:lvl w:ilvl="1" w:tplc="D7CA2382">
       <w:numFmt w:val="decimal"/>
       <w:lvlText w:val=""/>
       <w:lvlJc w:val="left"/>
     </w:lvl>
-    <w:lvl w:ilvl="2" w:tplc="FDE255C4">
+    <w:lvl w:ilvl="2" w:tplc="B746866C">
       <w:numFmt w:val="decimal"/>
       <w:lvlText w:val=""/>
       <w:lvlJc w:val="left"/>
     </w:lvl>
-    <w:lvl w:ilvl="3" w:tplc="B99ADC5A">
+    <w:lvl w:ilvl="3" w:tplc="6FA0A6DA">
       <w:numFmt w:val="decimal"/>
       <w:lvlText w:val=""/>
       <w:lvlJc w:val="left"/>
     </w:lvl>
-    <w:lvl w:ilvl="4" w:tplc="01C687DA">
+    <w:lvl w:ilvl="4" w:tplc="85E2C532">
       <w:numFmt w:val="decimal"/>
       <w:lvlText w:val=""/>
       <w:lvlJc w:val="left"/>
     </w:lvl>
-    <w:lvl w:ilvl="5" w:tplc="1996DFCC">
+    <w:lvl w:ilvl="5" w:tplc="B820546E">
       <w:numFmt w:val="decimal"/>
       <w:lvlText w:val=""/>
       <w:lvlJc w:val="left"/>
     </w:lvl>
-    <w:lvl w:ilvl="6" w:tplc="5900C93A">
+    <w:lvl w:ilvl="6" w:tplc="977051D6">
       <w:numFmt w:val="decimal"/>
       <w:lvlText w:val=""/>
       <w:lvlJc w:val="left"/>
     </w:lvl>
-    <w:lvl w:ilvl="7" w:tplc="68F4C3C0">
+    <w:lvl w:ilvl="7" w:tplc="F68E6ACE">
       <w:numFmt w:val="decimal"/>
       <w:lvlText w:val=""/>
       <w:lvlJc w:val="left"/>
     </w:lvl>
-    <w:lvl w:ilvl="8" w:tplc="41F2629E">
+    <w:lvl w:ilvl="8" w:tplc="C0E0EA30">
       <w:numFmt w:val="decimal"/>
       <w:lvlText w:val=""/>
       <w:lvlJc w:val="left"/>
     </w:lvl>
   </w:abstractNum>
-  <w:abstractNum w:abstractNumId="8" w15:restartNumberingAfterBreak="0">
-    <w:nsid w:val="2DC34F03"/>
+  <w:abstractNum w:abstractNumId="11" w15:restartNumberingAfterBreak="0">
+    <w:nsid w:val="64B120BB"/>
     <w:multiLevelType w:val="hybridMultilevel"/>
-    <w:tmpl w:val="BC220CF0"/>
-    <w:lvl w:ilvl="0" w:tplc="A948E46E">
+    <w:tmpl w:val="C714D710"/>
+    <w:lvl w:ilvl="0" w:tplc="2102C180">
       <w:start w:val="1"/>
       <w:numFmt w:val="decimal"/>
       <w:lvlText w:val="%1."/>
@@ -39335,52 +39497,52 @@
         <w:ind w:left="440" w:hanging="300"/>
       </w:pPr>
     </w:lvl>
-    <w:lvl w:ilvl="1" w:tplc="CD1C5554">
+    <w:lvl w:ilvl="1" w:tplc="0772F412">
       <w:numFmt w:val="decimal"/>
       <w:lvlText w:val=""/>
       <w:lvlJc w:val="left"/>
     </w:lvl>
-    <w:lvl w:ilvl="2" w:tplc="E1729190">
+    <w:lvl w:ilvl="2" w:tplc="F1FE2B08">
       <w:numFmt w:val="decimal"/>
       <w:lvlText w:val=""/>
       <w:lvlJc w:val="left"/>
     </w:lvl>
-    <w:lvl w:ilvl="3" w:tplc="BC9A0136">
+    <w:lvl w:ilvl="3" w:tplc="15B89AD4">
       <w:numFmt w:val="decimal"/>
       <w:lvlText w:val=""/>
       <w:lvlJc w:val="left"/>
     </w:lvl>
-    <w:lvl w:ilvl="4" w:tplc="AD9A6B8E">
+    <w:lvl w:ilvl="4" w:tplc="31806338">
       <w:numFmt w:val="decimal"/>
       <w:lvlText w:val=""/>
       <w:lvlJc w:val="left"/>
     </w:lvl>
-    <w:lvl w:ilvl="5" w:tplc="B042788E">
+    <w:lvl w:ilvl="5" w:tplc="E690E0B6">
       <w:numFmt w:val="decimal"/>
       <w:lvlText w:val=""/>
       <w:lvlJc w:val="left"/>
     </w:lvl>
-    <w:lvl w:ilvl="6" w:tplc="519407C8">
+    <w:lvl w:ilvl="6" w:tplc="686EE328">
       <w:numFmt w:val="decimal"/>
       <w:lvlText w:val=""/>
       <w:lvlJc w:val="left"/>
     </w:lvl>
-    <w:lvl w:ilvl="7" w:tplc="CEA668D2">
+    <w:lvl w:ilvl="7" w:tplc="103631C4">
       <w:numFmt w:val="decimal"/>
       <w:lvlText w:val=""/>
       <w:lvlJc w:val="left"/>
     </w:lvl>
-    <w:lvl w:ilvl="8" w:tplc="A6884994">
+    <w:lvl w:ilvl="8" w:tplc="7B247C0E">
       <w:numFmt w:val="decimal"/>
       <w:lvlText w:val=""/>
       <w:lvlJc w:val="left"/>
     </w:lvl>
   </w:abstractNum>
-  <w:abstractNum w:abstractNumId="9" w15:restartNumberingAfterBreak="0">
-    <w:nsid w:val="2E3310F9"/>
+  <w:abstractNum w:abstractNumId="12" w15:restartNumberingAfterBreak="0">
+    <w:nsid w:val="6B2E08A0"/>
     <w:multiLevelType w:val="hybridMultilevel"/>
-    <w:tmpl w:val="A9AE003E"/>
-    <w:lvl w:ilvl="0" w:tplc="98CC646A">
+    <w:tmpl w:val="368050B6"/>
+    <w:lvl w:ilvl="0" w:tplc="E5CC6A18">
       <w:start w:val="1"/>
       <w:numFmt w:val="decimal"/>
       <w:lvlText w:val="%1."/>
@@ -39389,52 +39551,52 @@
         <w:ind w:left="440" w:hanging="300"/>
       </w:pPr>
     </w:lvl>
-    <w:lvl w:ilvl="1" w:tplc="934AE860">
+    <w:lvl w:ilvl="1" w:tplc="B566B88E">
       <w:numFmt w:val="decimal"/>
       <w:lvlText w:val=""/>
       <w:lvlJc w:val="left"/>
     </w:lvl>
-    <w:lvl w:ilvl="2" w:tplc="39B2B208">
+    <w:lvl w:ilvl="2" w:tplc="C434A34C">
       <w:numFmt w:val="decimal"/>
       <w:lvlText w:val=""/>
       <w:lvlJc w:val="left"/>
     </w:lvl>
-    <w:lvl w:ilvl="3" w:tplc="85A0E036">
+    <w:lvl w:ilvl="3" w:tplc="19B82C02">
       <w:numFmt w:val="decimal"/>
       <w:lvlText w:val=""/>
       <w:lvlJc w:val="left"/>
     </w:lvl>
-    <w:lvl w:ilvl="4" w:tplc="FC40EE90">
+    <w:lvl w:ilvl="4" w:tplc="C636876C">
       <w:numFmt w:val="decimal"/>
       <w:lvlText w:val=""/>
       <w:lvlJc w:val="left"/>
     </w:lvl>
-    <w:lvl w:ilvl="5" w:tplc="D430B894">
+    <w:lvl w:ilvl="5" w:tplc="A926B1CC">
       <w:numFmt w:val="decimal"/>
       <w:lvlText w:val=""/>
       <w:lvlJc w:val="left"/>
     </w:lvl>
-    <w:lvl w:ilvl="6" w:tplc="BCA46FE8">
+    <w:lvl w:ilvl="6" w:tplc="5AA86F0C">
       <w:numFmt w:val="decimal"/>
       <w:lvlText w:val=""/>
       <w:lvlJc w:val="left"/>
     </w:lvl>
-    <w:lvl w:ilvl="7" w:tplc="A3DCD03C">
+    <w:lvl w:ilvl="7" w:tplc="9FB432C0">
       <w:numFmt w:val="decimal"/>
       <w:lvlText w:val=""/>
       <w:lvlJc w:val="left"/>
     </w:lvl>
-    <w:lvl w:ilvl="8" w:tplc="1336810A">
+    <w:lvl w:ilvl="8" w:tplc="4ECE91AE">
       <w:numFmt w:val="decimal"/>
       <w:lvlText w:val=""/>
       <w:lvlJc w:val="left"/>
     </w:lvl>
   </w:abstractNum>
-  <w:abstractNum w:abstractNumId="10" w15:restartNumberingAfterBreak="0">
-    <w:nsid w:val="3FAB4673"/>
+  <w:abstractNum w:abstractNumId="13" w15:restartNumberingAfterBreak="0">
+    <w:nsid w:val="76946847"/>
     <w:multiLevelType w:val="hybridMultilevel"/>
-    <w:tmpl w:val="E398F8CC"/>
-    <w:lvl w:ilvl="0" w:tplc="2AFA306E">
+    <w:tmpl w:val="899E194E"/>
+    <w:lvl w:ilvl="0" w:tplc="2A5A1DEC">
       <w:start w:val="1"/>
       <w:numFmt w:val="decimal"/>
       <w:lvlText w:val="%1."/>
@@ -39443,52 +39605,52 @@
         <w:ind w:left="440" w:hanging="300"/>
       </w:pPr>
     </w:lvl>
-    <w:lvl w:ilvl="1" w:tplc="645ED226">
+    <w:lvl w:ilvl="1" w:tplc="5CF47840">
       <w:numFmt w:val="decimal"/>
       <w:lvlText w:val=""/>
       <w:lvlJc w:val="left"/>
     </w:lvl>
-    <w:lvl w:ilvl="2" w:tplc="AC1E6548">
+    <w:lvl w:ilvl="2" w:tplc="C9821A66">
       <w:numFmt w:val="decimal"/>
       <w:lvlText w:val=""/>
       <w:lvlJc w:val="left"/>
     </w:lvl>
-    <w:lvl w:ilvl="3" w:tplc="031CC526">
+    <w:lvl w:ilvl="3" w:tplc="0C2425BA">
       <w:numFmt w:val="decimal"/>
       <w:lvlText w:val=""/>
       <w:lvlJc w:val="left"/>
     </w:lvl>
-    <w:lvl w:ilvl="4" w:tplc="BEF2CB96">
+    <w:lvl w:ilvl="4" w:tplc="D1B0D522">
       <w:numFmt w:val="decimal"/>
       <w:lvlText w:val=""/>
       <w:lvlJc w:val="left"/>
     </w:lvl>
-    <w:lvl w:ilvl="5" w:tplc="D2221C48">
+    <w:lvl w:ilvl="5" w:tplc="23388160">
       <w:numFmt w:val="decimal"/>
       <w:lvlText w:val=""/>
       <w:lvlJc w:val="left"/>
     </w:lvl>
-    <w:lvl w:ilvl="6" w:tplc="5F884B90">
+    <w:lvl w:ilvl="6" w:tplc="D4CAFC0A">
       <w:numFmt w:val="decimal"/>
       <w:lvlText w:val=""/>
       <w:lvlJc w:val="left"/>
     </w:lvl>
-    <w:lvl w:ilvl="7" w:tplc="33C44378">
+    <w:lvl w:ilvl="7" w:tplc="ABBAAC5A">
       <w:numFmt w:val="decimal"/>
       <w:lvlText w:val=""/>
       <w:lvlJc w:val="left"/>
     </w:lvl>
-    <w:lvl w:ilvl="8" w:tplc="B7944030">
+    <w:lvl w:ilvl="8" w:tplc="95C664C4">
       <w:numFmt w:val="decimal"/>
       <w:lvlText w:val=""/>
       <w:lvlJc w:val="left"/>
     </w:lvl>
   </w:abstractNum>
-  <w:abstractNum w:abstractNumId="11" w15:restartNumberingAfterBreak="0">
-    <w:nsid w:val="49063123"/>
+  <w:abstractNum w:abstractNumId="14" w15:restartNumberingAfterBreak="0">
+    <w:nsid w:val="79FF05F1"/>
     <w:multiLevelType w:val="hybridMultilevel"/>
-    <w:tmpl w:val="B5FAE542"/>
-    <w:lvl w:ilvl="0" w:tplc="D8C21E56">
+    <w:tmpl w:val="2BA85072"/>
+    <w:lvl w:ilvl="0" w:tplc="A72478C6">
       <w:start w:val="1"/>
       <w:numFmt w:val="decimal"/>
       <w:lvlText w:val="%1."/>
@@ -39497,52 +39659,52 @@
         <w:ind w:left="440" w:hanging="300"/>
       </w:pPr>
     </w:lvl>
-    <w:lvl w:ilvl="1" w:tplc="521C853C">
+    <w:lvl w:ilvl="1" w:tplc="CDA6E0CE">
       <w:numFmt w:val="decimal"/>
       <w:lvlText w:val=""/>
       <w:lvlJc w:val="left"/>
     </w:lvl>
-    <w:lvl w:ilvl="2" w:tplc="D59C70D2">
+    <w:lvl w:ilvl="2" w:tplc="E4763278">
       <w:numFmt w:val="decimal"/>
       <w:lvlText w:val=""/>
       <w:lvlJc w:val="left"/>
     </w:lvl>
-    <w:lvl w:ilvl="3" w:tplc="A210E0DA">
+    <w:lvl w:ilvl="3" w:tplc="ABFECF0E">
       <w:numFmt w:val="decimal"/>
       <w:lvlText w:val=""/>
       <w:lvlJc w:val="left"/>
     </w:lvl>
-    <w:lvl w:ilvl="4" w:tplc="BEC880CA">
+    <w:lvl w:ilvl="4" w:tplc="DEAC0B96">
       <w:numFmt w:val="decimal"/>
       <w:lvlText w:val=""/>
       <w:lvlJc w:val="left"/>
     </w:lvl>
-    <w:lvl w:ilvl="5" w:tplc="326A5514">
+    <w:lvl w:ilvl="5" w:tplc="CFACAD60">
       <w:numFmt w:val="decimal"/>
       <w:lvlText w:val=""/>
       <w:lvlJc w:val="left"/>
     </w:lvl>
-    <w:lvl w:ilvl="6" w:tplc="4458330C">
+    <w:lvl w:ilvl="6" w:tplc="B2E6CCC6">
       <w:numFmt w:val="decimal"/>
       <w:lvlText w:val=""/>
       <w:lvlJc w:val="left"/>
     </w:lvl>
-    <w:lvl w:ilvl="7" w:tplc="E50463FE">
+    <w:lvl w:ilvl="7" w:tplc="80FEF7EE">
       <w:numFmt w:val="decimal"/>
       <w:lvlText w:val=""/>
       <w:lvlJc w:val="left"/>
     </w:lvl>
-    <w:lvl w:ilvl="8" w:tplc="7BA624D4">
+    <w:lvl w:ilvl="8" w:tplc="F2E62094">
       <w:numFmt w:val="decimal"/>
       <w:lvlText w:val=""/>
       <w:lvlJc w:val="left"/>
     </w:lvl>
   </w:abstractNum>
-  <w:abstractNum w:abstractNumId="12" w15:restartNumberingAfterBreak="0">
-    <w:nsid w:val="55415E09"/>
+  <w:abstractNum w:abstractNumId="15" w15:restartNumberingAfterBreak="0">
+    <w:nsid w:val="7E6A78D7"/>
     <w:multiLevelType w:val="hybridMultilevel"/>
-    <w:tmpl w:val="B1940BC4"/>
-    <w:lvl w:ilvl="0" w:tplc="CA12B01E">
+    <w:tmpl w:val="34E49DDE"/>
+    <w:lvl w:ilvl="0" w:tplc="F3FCBBF4">
       <w:start w:val="1"/>
       <w:numFmt w:val="decimal"/>
       <w:lvlText w:val="%1."/>
@@ -39551,211 +39713,49 @@
         <w:ind w:left="440" w:hanging="300"/>
       </w:pPr>
     </w:lvl>
-    <w:lvl w:ilvl="1" w:tplc="F408809A">
+    <w:lvl w:ilvl="1" w:tplc="0778DAA6">
       <w:numFmt w:val="decimal"/>
       <w:lvlText w:val=""/>
       <w:lvlJc w:val="left"/>
     </w:lvl>
-    <w:lvl w:ilvl="2" w:tplc="F79A5C38">
+    <w:lvl w:ilvl="2" w:tplc="D2A46CD4">
       <w:numFmt w:val="decimal"/>
       <w:lvlText w:val=""/>
       <w:lvlJc w:val="left"/>
     </w:lvl>
-    <w:lvl w:ilvl="3" w:tplc="496E633C">
+    <w:lvl w:ilvl="3" w:tplc="8B3C0A34">
       <w:numFmt w:val="decimal"/>
       <w:lvlText w:val=""/>
       <w:lvlJc w:val="left"/>
     </w:lvl>
-    <w:lvl w:ilvl="4" w:tplc="72A6C152">
+    <w:lvl w:ilvl="4" w:tplc="B4D0FC74">
       <w:numFmt w:val="decimal"/>
       <w:lvlText w:val=""/>
       <w:lvlJc w:val="left"/>
     </w:lvl>
-    <w:lvl w:ilvl="5" w:tplc="05585162">
+    <w:lvl w:ilvl="5" w:tplc="9814AEB8">
       <w:numFmt w:val="decimal"/>
       <w:lvlText w:val=""/>
       <w:lvlJc w:val="left"/>
     </w:lvl>
-    <w:lvl w:ilvl="6" w:tplc="9C9ED64A">
+    <w:lvl w:ilvl="6" w:tplc="33825D1E">
       <w:numFmt w:val="decimal"/>
       <w:lvlText w:val=""/>
       <w:lvlJc w:val="left"/>
     </w:lvl>
-    <w:lvl w:ilvl="7" w:tplc="8ED289B4">
+    <w:lvl w:ilvl="7" w:tplc="C4185538">
       <w:numFmt w:val="decimal"/>
       <w:lvlText w:val=""/>
       <w:lvlJc w:val="left"/>
     </w:lvl>
-    <w:lvl w:ilvl="8" w:tplc="41D6257A">
-      <w:numFmt w:val="decimal"/>
-      <w:lvlText w:val=""/>
-      <w:lvlJc w:val="left"/>
-    </w:lvl>
-  </w:abstractNum>
-  <w:abstractNum w:abstractNumId="13" w15:restartNumberingAfterBreak="0">
-    <w:nsid w:val="69330735"/>
-    <w:multiLevelType w:val="hybridMultilevel"/>
-    <w:tmpl w:val="7EBEB73A"/>
-    <w:lvl w:ilvl="0" w:tplc="BF84DD12">
-      <w:start w:val="1"/>
-      <w:numFmt w:val="decimal"/>
-      <w:lvlText w:val="%1."/>
-      <w:lvlJc w:val="left"/>
-      <w:pPr>
-        <w:ind w:left="440" w:hanging="300"/>
-      </w:pPr>
-    </w:lvl>
-    <w:lvl w:ilvl="1" w:tplc="7ED06ECA">
-      <w:numFmt w:val="decimal"/>
-      <w:lvlText w:val=""/>
-      <w:lvlJc w:val="left"/>
-    </w:lvl>
-    <w:lvl w:ilvl="2" w:tplc="AB88F760">
-      <w:numFmt w:val="decimal"/>
-      <w:lvlText w:val=""/>
-      <w:lvlJc w:val="left"/>
-    </w:lvl>
-    <w:lvl w:ilvl="3" w:tplc="D1461BAA">
-      <w:numFmt w:val="decimal"/>
-      <w:lvlText w:val=""/>
-      <w:lvlJc w:val="left"/>
-    </w:lvl>
-    <w:lvl w:ilvl="4" w:tplc="B4F00324">
-      <w:numFmt w:val="decimal"/>
-      <w:lvlText w:val=""/>
-      <w:lvlJc w:val="left"/>
-    </w:lvl>
-    <w:lvl w:ilvl="5" w:tplc="F2648EA0">
-      <w:numFmt w:val="decimal"/>
-      <w:lvlText w:val=""/>
-      <w:lvlJc w:val="left"/>
-    </w:lvl>
-    <w:lvl w:ilvl="6" w:tplc="10247488">
-      <w:numFmt w:val="decimal"/>
-      <w:lvlText w:val=""/>
-      <w:lvlJc w:val="left"/>
-    </w:lvl>
-    <w:lvl w:ilvl="7" w:tplc="090C7F3E">
-      <w:numFmt w:val="decimal"/>
-      <w:lvlText w:val=""/>
-      <w:lvlJc w:val="left"/>
-    </w:lvl>
-    <w:lvl w:ilvl="8" w:tplc="E52C57D2">
-      <w:numFmt w:val="decimal"/>
-      <w:lvlText w:val=""/>
-      <w:lvlJc w:val="left"/>
-    </w:lvl>
-  </w:abstractNum>
-  <w:abstractNum w:abstractNumId="14" w15:restartNumberingAfterBreak="0">
-    <w:nsid w:val="78076689"/>
-    <w:multiLevelType w:val="hybridMultilevel"/>
-    <w:tmpl w:val="BF5CDA02"/>
-    <w:lvl w:ilvl="0" w:tplc="F8BA9450">
-      <w:start w:val="1"/>
-      <w:numFmt w:val="decimal"/>
-      <w:lvlText w:val="%1."/>
-      <w:lvlJc w:val="left"/>
-      <w:pPr>
-        <w:ind w:left="440" w:hanging="300"/>
-      </w:pPr>
-    </w:lvl>
-    <w:lvl w:ilvl="1" w:tplc="64C69786">
-      <w:numFmt w:val="decimal"/>
-      <w:lvlText w:val=""/>
-      <w:lvlJc w:val="left"/>
-    </w:lvl>
-    <w:lvl w:ilvl="2" w:tplc="956E0EF4">
-      <w:numFmt w:val="decimal"/>
-      <w:lvlText w:val=""/>
-      <w:lvlJc w:val="left"/>
-    </w:lvl>
-    <w:lvl w:ilvl="3" w:tplc="0834FE78">
-      <w:numFmt w:val="decimal"/>
-      <w:lvlText w:val=""/>
-      <w:lvlJc w:val="left"/>
-    </w:lvl>
-    <w:lvl w:ilvl="4" w:tplc="F7A0790E">
-      <w:numFmt w:val="decimal"/>
-      <w:lvlText w:val=""/>
-      <w:lvlJc w:val="left"/>
-    </w:lvl>
-    <w:lvl w:ilvl="5" w:tplc="A4060F46">
-      <w:numFmt w:val="decimal"/>
-      <w:lvlText w:val=""/>
-      <w:lvlJc w:val="left"/>
-    </w:lvl>
-    <w:lvl w:ilvl="6" w:tplc="5B92595C">
-      <w:numFmt w:val="decimal"/>
-      <w:lvlText w:val=""/>
-      <w:lvlJc w:val="left"/>
-    </w:lvl>
-    <w:lvl w:ilvl="7" w:tplc="7564E33A">
-      <w:numFmt w:val="decimal"/>
-      <w:lvlText w:val=""/>
-      <w:lvlJc w:val="left"/>
-    </w:lvl>
-    <w:lvl w:ilvl="8" w:tplc="E65CDCE8">
-      <w:numFmt w:val="decimal"/>
-      <w:lvlText w:val=""/>
-      <w:lvlJc w:val="left"/>
-    </w:lvl>
-  </w:abstractNum>
-  <w:abstractNum w:abstractNumId="15" w15:restartNumberingAfterBreak="0">
-    <w:nsid w:val="7931114C"/>
-    <w:multiLevelType w:val="hybridMultilevel"/>
-    <w:tmpl w:val="8E04C16E"/>
-    <w:lvl w:ilvl="0" w:tplc="36D86824">
-      <w:start w:val="1"/>
-      <w:numFmt w:val="decimal"/>
-      <w:lvlText w:val="%1."/>
-      <w:lvlJc w:val="left"/>
-      <w:pPr>
-        <w:ind w:left="440" w:hanging="300"/>
-      </w:pPr>
-    </w:lvl>
-    <w:lvl w:ilvl="1" w:tplc="8C4A9564">
-      <w:numFmt w:val="decimal"/>
-      <w:lvlText w:val=""/>
-      <w:lvlJc w:val="left"/>
-    </w:lvl>
-    <w:lvl w:ilvl="2" w:tplc="9F224150">
-      <w:numFmt w:val="decimal"/>
-      <w:lvlText w:val=""/>
-      <w:lvlJc w:val="left"/>
-    </w:lvl>
-    <w:lvl w:ilvl="3" w:tplc="EE32B954">
-      <w:numFmt w:val="decimal"/>
-      <w:lvlText w:val=""/>
-      <w:lvlJc w:val="left"/>
-    </w:lvl>
-    <w:lvl w:ilvl="4" w:tplc="5B428C78">
-      <w:numFmt w:val="decimal"/>
-      <w:lvlText w:val=""/>
-      <w:lvlJc w:val="left"/>
-    </w:lvl>
-    <w:lvl w:ilvl="5" w:tplc="71F07D10">
-      <w:numFmt w:val="decimal"/>
-      <w:lvlText w:val=""/>
-      <w:lvlJc w:val="left"/>
-    </w:lvl>
-    <w:lvl w:ilvl="6" w:tplc="34145A2E">
-      <w:numFmt w:val="decimal"/>
-      <w:lvlText w:val=""/>
-      <w:lvlJc w:val="left"/>
-    </w:lvl>
-    <w:lvl w:ilvl="7" w:tplc="0BCE3782">
-      <w:numFmt w:val="decimal"/>
-      <w:lvlText w:val=""/>
-      <w:lvlJc w:val="left"/>
-    </w:lvl>
-    <w:lvl w:ilvl="8" w:tplc="C8201594">
+    <w:lvl w:ilvl="8" w:tplc="A220357E">
       <w:numFmt w:val="decimal"/>
       <w:lvlText w:val=""/>
       <w:lvlJc w:val="left"/>
     </w:lvl>
   </w:abstractNum>
   <w:num w:numId="1">
-    <w:abstractNumId w:val="3"/>
+    <w:abstractNumId w:val="7"/>
     <w:lvlOverride w:ilvl="0">
       <w:startOverride w:val="1"/>
     </w:lvlOverride>
@@ -39767,19 +39767,19 @@
     </w:lvlOverride>
   </w:num>
   <w:num w:numId="3">
-    <w:abstractNumId w:val="12"/>
+    <w:abstractNumId w:val="3"/>
     <w:lvlOverride w:ilvl="0">
       <w:startOverride w:val="1"/>
     </w:lvlOverride>
   </w:num>
   <w:num w:numId="4">
-    <w:abstractNumId w:val="1"/>
+    <w:abstractNumId w:val="15"/>
     <w:lvlOverride w:ilvl="0">
       <w:startOverride w:val="1"/>
     </w:lvlOverride>
   </w:num>
   <w:num w:numId="5">
-    <w:abstractNumId w:val="4"/>
+    <w:abstractNumId w:val="2"/>
     <w:lvlOverride w:ilvl="0">
       <w:startOverride w:val="1"/>
     </w:lvlOverride>
@@ -39791,61 +39791,61 @@
     </w:lvlOverride>
   </w:num>
   <w:num w:numId="7">
+    <w:abstractNumId w:val="9"/>
+    <w:lvlOverride w:ilvl="0">
+      <w:startOverride w:val="1"/>
+    </w:lvlOverride>
+  </w:num>
+  <w:num w:numId="8">
+    <w:abstractNumId w:val="14"/>
+    <w:lvlOverride w:ilvl="0">
+      <w:startOverride w:val="1"/>
+    </w:lvlOverride>
+  </w:num>
+  <w:num w:numId="9">
+    <w:abstractNumId w:val="4"/>
+    <w:lvlOverride w:ilvl="0">
+      <w:startOverride w:val="1"/>
+    </w:lvlOverride>
+  </w:num>
+  <w:num w:numId="10">
+    <w:abstractNumId w:val="10"/>
+    <w:lvlOverride w:ilvl="0">
+      <w:startOverride w:val="1"/>
+    </w:lvlOverride>
+  </w:num>
+  <w:num w:numId="11">
     <w:abstractNumId w:val="11"/>
     <w:lvlOverride w:ilvl="0">
       <w:startOverride w:val="1"/>
     </w:lvlOverride>
   </w:num>
-  <w:num w:numId="8">
+  <w:num w:numId="12">
+    <w:abstractNumId w:val="8"/>
+    <w:lvlOverride w:ilvl="0">
+      <w:startOverride w:val="1"/>
+    </w:lvlOverride>
+  </w:num>
+  <w:num w:numId="13">
+    <w:abstractNumId w:val="12"/>
+    <w:lvlOverride w:ilvl="0">
+      <w:startOverride w:val="1"/>
+    </w:lvlOverride>
+  </w:num>
+  <w:num w:numId="14">
     <w:abstractNumId w:val="5"/>
     <w:lvlOverride w:ilvl="0">
       <w:startOverride w:val="1"/>
     </w:lvlOverride>
   </w:num>
-  <w:num w:numId="9">
-    <w:abstractNumId w:val="10"/>
-    <w:lvlOverride w:ilvl="0">
-      <w:startOverride w:val="1"/>
-    </w:lvlOverride>
-  </w:num>
-  <w:num w:numId="10">
-    <w:abstractNumId w:val="15"/>
-    <w:lvlOverride w:ilvl="0">
-      <w:startOverride w:val="1"/>
-    </w:lvlOverride>
-  </w:num>
-  <w:num w:numId="11">
-    <w:abstractNumId w:val="0"/>
-    <w:lvlOverride w:ilvl="0">
-      <w:startOverride w:val="1"/>
-    </w:lvlOverride>
-  </w:num>
-  <w:num w:numId="12">
-    <w:abstractNumId w:val="9"/>
-    <w:lvlOverride w:ilvl="0">
-      <w:startOverride w:val="1"/>
-    </w:lvlOverride>
-  </w:num>
-  <w:num w:numId="13">
-    <w:abstractNumId w:val="14"/>
-    <w:lvlOverride w:ilvl="0">
-      <w:startOverride w:val="1"/>
-    </w:lvlOverride>
-  </w:num>
-  <w:num w:numId="14">
-    <w:abstractNumId w:val="8"/>
-    <w:lvlOverride w:ilvl="0">
-      <w:startOverride w:val="1"/>
-    </w:lvlOverride>
-  </w:num>
   <w:num w:numId="15">
-    <w:abstractNumId w:val="2"/>
+    <w:abstractNumId w:val="1"/>
     <w:lvlOverride w:ilvl="0">
       <w:startOverride w:val="1"/>
     </w:lvlOverride>
   </w:num>
   <w:num w:numId="16">
-    <w:abstractNumId w:val="7"/>
+    <w:abstractNumId w:val="0"/>
     <w:lvlOverride w:ilvl="0">
       <w:startOverride w:val="1"/>
     </w:lvlOverride>
@@ -40476,7 +40476,7 @@
     <w:autoRedefine/>
     <w:uiPriority w:val="39"/>
     <w:unhideWhenUsed/>
-    <w:rsid w:val="005802D3"/>
+    <w:rsid w:val="00734A74"/>
   </w:style>
   <w:style w:type="paragraph" w:styleId="20">
     <w:name w:val="toc 2"/>
@@ -40485,7 +40485,7 @@
     <w:autoRedefine/>
     <w:uiPriority w:val="39"/>
     <w:unhideWhenUsed/>
-    <w:rsid w:val="005802D3"/>
+    <w:rsid w:val="00734A74"/>
     <w:pPr>
       <w:ind w:leftChars="200" w:left="425"/>
     </w:pPr>
@@ -40496,7 +40496,7 @@
     <w:link w:val="Char1"/>
     <w:uiPriority w:val="99"/>
     <w:unhideWhenUsed/>
-    <w:rsid w:val="005802D3"/>
+    <w:rsid w:val="00734A74"/>
     <w:pPr>
       <w:tabs>
         <w:tab w:val="center" w:pos="4513"/>
@@ -40510,7 +40510,7 @@
     <w:basedOn w:val="a0"/>
     <w:link w:val="aa"/>
     <w:uiPriority w:val="99"/>
-    <w:rsid w:val="005802D3"/>
+    <w:rsid w:val="00734A74"/>
   </w:style>
   <w:style w:type="paragraph" w:styleId="ab">
     <w:name w:val="footer"/>
@@ -40518,7 +40518,7 @@
     <w:link w:val="Char2"/>
     <w:uiPriority w:val="99"/>
     <w:unhideWhenUsed/>
-    <w:rsid w:val="005802D3"/>
+    <w:rsid w:val="00734A74"/>
     <w:pPr>
       <w:tabs>
         <w:tab w:val="center" w:pos="4513"/>
@@ -40532,7 +40532,7 @@
     <w:basedOn w:val="a0"/>
     <w:link w:val="ab"/>
     <w:uiPriority w:val="99"/>
-    <w:rsid w:val="005802D3"/>
+    <w:rsid w:val="00734A74"/>
   </w:style>
 </w:styles>
 </file>

</xml_diff>